<commit_message>
Video script: each person speaks on their own field
</commit_message>
<xml_diff>
--- a/docs/submission/VIDEO_SCRIPT.docx
+++ b/docs/submission/VIDEO_SCRIPT.docx
@@ -23,7 +23,7 @@
         <w:spacing w:after="120"/>
       </w:pPr>
       <w:r>
-        <w:t xml:space="preserve">Hard limit 4:30. Target 4:18. English. Burned-in subtitles on every spoken line. Every member speaks at least twice.</w:t>
+        <w:t xml:space="preserve">Hard limit 4:30. Target 4:23. English. Burned-in subtitles on every spoken line. Every member speaks at least twice.</w:t>
       </w:r>
     </w:p>
     <w:p>
@@ -803,7 +803,7 @@
                 <w:sz w:val="18"/>
                 <w:szCs w:val="18"/>
               </w:rPr>
-              <w:t xml:space="preserve">3:30 to 4:10</w:t>
+              <w:t xml:space="preserve">3:30 to 4:15</w:t>
             </w:r>
           </w:p>
         </w:tc>
@@ -917,7 +917,7 @@
                 <w:sz w:val="18"/>
                 <w:szCs w:val="18"/>
               </w:rPr>
-              <w:t xml:space="preserve">4:10 to 4:18</w:t>
+              <w:t xml:space="preserve">4:15 to 4:23</w:t>
             </w:r>
           </w:p>
         </w:tc>
@@ -2326,7 +2326,7 @@
                 <w:sz w:val="18"/>
                 <w:szCs w:val="18"/>
               </w:rPr>
-              <w:t xml:space="preserve">Karina</w:t>
+              <w:t xml:space="preserve">Maalon</w:t>
             </w:r>
           </w:p>
         </w:tc>
@@ -2353,7 +2353,7 @@
                 <w:sz w:val="18"/>
                 <w:szCs w:val="18"/>
               </w:rPr>
-              <w:t xml:space="preserve">Nobody can say without evidence. That gap is occupational health, and no other challenge covers it.</w:t>
+              <w:t xml:space="preserve">Nobody can say without evidence. That is an occupational health gap, and no other challenge covers it.</w:t>
             </w:r>
           </w:p>
         </w:tc>
@@ -2380,7 +2380,7 @@
                 <w:sz w:val="18"/>
                 <w:szCs w:val="18"/>
               </w:rPr>
-              <w:t xml:space="preserve">Desk, laptop open on the README</w:t>
+              <w:t xml:space="preserve">Hospital or clinic entrance</w:t>
             </w:r>
           </w:p>
         </w:tc>
@@ -3776,7 +3776,7 @@
         <w:spacing w:after="120"/>
       </w:pPr>
       <w:r>
-        <w:t xml:space="preserve">One continuous story on the live site, cut tight. Simone narrates over it, voice only. Phone shots are screen recordings from a real phone. Laptop shots at 1440 by 900, cursor visible, no browser chrome.</w:t>
+        <w:t xml:space="preserve">One continuous story on the live site, cut tight. Voice over only, each part read by the person who owns it. Phone shots are screen recordings from a real phone. Laptop shots at 1440 by 900, cursor visible, no browser chrome.</w:t>
       </w:r>
     </w:p>
     <w:tbl>
@@ -3887,7 +3887,7 @@
                 <w:sz w:val="18"/>
                 <w:szCs w:val="18"/>
               </w:rPr>
-              <w:t xml:space="preserve">Narration (Simone)</w:t>
+              <w:t xml:space="preserve">Voice over</w:t>
             </w:r>
           </w:p>
         </w:tc>
@@ -3974,7 +3974,7 @@
                 <w:sz w:val="18"/>
                 <w:szCs w:val="18"/>
               </w:rPr>
-              <w:t xml:space="preserve">"This is the rider's app, in English, Cantonese, Nepali and Urdu. Consent comes first."</w:t>
+              <w:t xml:space="preserve">Simone: "This is the rider's app, in English, Cantonese, Nepali and Urdu. Consent comes first."</w:t>
             </w:r>
           </w:p>
         </w:tc>
@@ -4061,7 +4061,7 @@
                 <w:sz w:val="18"/>
                 <w:szCs w:val="18"/>
               </w:rPr>
-              <w:t xml:space="preserve">"On shift, the phone streams its motion. Off shift, nothing is read."</w:t>
+              <w:t xml:space="preserve">Simone: "On shift, the phone streams its motion. Off shift, nothing is read."</w:t>
             </w:r>
           </w:p>
         </w:tc>
@@ -4148,7 +4148,7 @@
                 <w:sz w:val="18"/>
                 <w:szCs w:val="18"/>
               </w:rPr>
-              <w:t xml:space="preserve">"A drop like a fall. Thirty seconds to cancel, with a button you can hit wearing gloves."</w:t>
+              <w:t xml:space="preserve">Simone: "A drop like a fall. Thirty seconds to cancel, with a button you can hit wearing gloves."</w:t>
             </w:r>
           </w:p>
         </w:tc>
@@ -4235,7 +4235,7 @@
                 <w:sz w:val="18"/>
                 <w:szCs w:val="18"/>
               </w:rPr>
-              <w:t xml:space="preserve">"On the full demo, the rider has orders open on two apps. The model reads the crash."</w:t>
+              <w:t xml:space="preserve">Karina: "On the full demo, the rider has orders open on two apps. The model reads the crash."</w:t>
             </w:r>
           </w:p>
         </w:tc>
@@ -4322,7 +4322,7 @@
                 <w:sz w:val="18"/>
                 <w:szCs w:val="18"/>
               </w:rPr>
-              <w:t xml:space="preserve">"Dispatch sees what happened, where, the likely injury and how to reach the rider."</w:t>
+              <w:t xml:space="preserve">Maalon: "Dispatch sees what happened, where, the likely injury and how to reach the rider."</w:t>
             </w:r>
           </w:p>
         </w:tc>
@@ -4409,7 +4409,7 @@
                 <w:sz w:val="18"/>
                 <w:szCs w:val="18"/>
               </w:rPr>
-              <w:t xml:space="preserve">"No answer, so tier one pays, split across both apps."</w:t>
+              <w:t xml:space="preserve">Alysa: "No answer, so tier one pays, split across both apps."</w:t>
             </w:r>
           </w:p>
         </w:tc>
@@ -4496,7 +4496,7 @@
                 <w:sz w:val="18"/>
                 <w:szCs w:val="18"/>
               </w:rPr>
-              <w:t xml:space="preserve">"The rider gets a signed copy they own, with a claim reference and the deadline."</w:t>
+              <w:t xml:space="preserve">Simone: "The rider gets a signed copy they own, with a claim reference and the deadline."</w:t>
             </w:r>
           </w:p>
         </w:tc>
@@ -4583,7 +4583,7 @@
                 <w:sz w:val="18"/>
                 <w:szCs w:val="18"/>
               </w:rPr>
-              <w:t xml:space="preserve">"Change one number and the signature fails. Nobody can quietly edit a claim, including us."</w:t>
+              <w:t xml:space="preserve">Simone: "Change one number and the signature fails. Nobody can quietly edit a claim, including us."</w:t>
             </w:r>
           </w:p>
         </w:tc>
@@ -4670,7 +4670,7 @@
                 <w:sz w:val="18"/>
                 <w:szCs w:val="18"/>
               </w:rPr>
-              <w:t xml:space="preserve">"The Labour Department sees totals only. No names, no routes. And for the first time, injuries set against delivery deadlines."</w:t>
+              <w:t xml:space="preserve">Karina: "The Labour Department sees totals only. No names, no routes. And for the first time, injuries set against delivery deadlines."</w:t>
             </w:r>
           </w:p>
         </w:tc>
@@ -4757,7 +4757,7 @@
                 <w:sz w:val="18"/>
                 <w:szCs w:val="18"/>
               </w:rPr>
-              <w:t xml:space="preserve">"Ninety-three percent of falls caught, at ninety-three percent precision, on people the model never saw."</w:t>
+              <w:t xml:space="preserve">Karina: "Ninety-three percent of falls caught, at ninety-three percent precision, on people the model never saw."</w:t>
             </w:r>
           </w:p>
         </w:tc>
@@ -5411,7 +5411,7 @@
         <w:pStyle w:val="Heading1"/>
       </w:pPr>
       <w:r>
-        <w:t xml:space="preserve">Part 6. Risks and next steps (3:30 to 4:10)</w:t>
+        <w:t xml:space="preserve">Part 6. Risks and next steps (3:30 to 4:15)</w:t>
       </w:r>
     </w:p>
     <w:p>
@@ -6104,7 +6104,7 @@
                 <w:sz w:val="18"/>
                 <w:szCs w:val="18"/>
               </w:rPr>
-              <w:t xml:space="preserve">Next: helmet drop tests, a stronger sensor, and real rides from riders who opt in.</w:t>
+              <w:t xml:space="preserve">Next on the hardware: helmet drop tests on a rig, and a stronger sensor so hard impacts do not clip.</w:t>
             </w:r>
           </w:p>
         </w:tc>
@@ -6131,7 +6131,7 @@
                 <w:sz w:val="18"/>
                 <w:szCs w:val="18"/>
               </w:rPr>
-              <w:t xml:space="preserve">Drop test protocol page; research mode toggle</w:t>
+              <w:t xml:space="preserve">Drop test protocol page; helmet on the bench</w:t>
             </w:r>
           </w:p>
         </w:tc>
@@ -6192,6 +6192,120 @@
                 <w:szCs w:val="18"/>
               </w:rPr>
               <w:t xml:space="preserve">Karina</w:t>
+            </w:r>
+          </w:p>
+        </w:tc>
+        <w:tc>
+          <w:tcPr>
+            <w:tcW w:type="dxa" w:w="6347"/>
+            <w:tcBorders>
+              <w:top w:val="single" w:color="C9C9C4" w:sz="4"/>
+              <w:left w:val="single" w:color="C9C9C4" w:sz="4"/>
+              <w:bottom w:val="single" w:color="C9C9C4" w:sz="4"/>
+              <w:right w:val="single" w:color="C9C9C4" w:sz="4"/>
+            </w:tcBorders>
+            <w:tcMar>
+              <w:top w:type="dxa" w:w="60"/>
+              <w:left w:type="dxa" w:w="100"/>
+              <w:bottom w:type="dxa" w:w="60"/>
+              <w:right w:type="dxa" w:w="100"/>
+            </w:tcMar>
+          </w:tcPr>
+          <w:p>
+            <w:r>
+              <w:rPr>
+                <w:color w:val="0A0A0A"/>
+                <w:sz w:val="18"/>
+                <w:szCs w:val="18"/>
+              </w:rPr>
+              <w:t xml:space="preserve">Next on the model: real rides from riders who opt in, and retraining on their own labels.</w:t>
+            </w:r>
+          </w:p>
+        </w:tc>
+        <w:tc>
+          <w:tcPr>
+            <w:tcW w:type="dxa" w:w="6350"/>
+            <w:tcBorders>
+              <w:top w:val="single" w:color="C9C9C4" w:sz="4"/>
+              <w:left w:val="single" w:color="C9C9C4" w:sz="4"/>
+              <w:bottom w:val="single" w:color="C9C9C4" w:sz="4"/>
+              <w:right w:val="single" w:color="C9C9C4" w:sz="4"/>
+            </w:tcBorders>
+            <w:tcMar>
+              <w:top w:type="dxa" w:w="60"/>
+              <w:left w:type="dxa" w:w="100"/>
+              <w:bottom w:type="dxa" w:w="60"/>
+              <w:right w:type="dxa" w:w="100"/>
+            </w:tcMar>
+          </w:tcPr>
+          <w:p>
+            <w:r>
+              <w:rPr>
+                <w:color w:val="0A0A0A"/>
+                <w:sz w:val="18"/>
+                <w:szCs w:val="18"/>
+              </w:rPr>
+              <w:t xml:space="preserve">Research mode toggle on /rider</w:t>
+            </w:r>
+          </w:p>
+        </w:tc>
+      </w:tr>
+      <w:tr>
+        <w:trPr>
+          <w:cantSplit/>
+          <w:tblHeader w:val="off"/>
+        </w:trPr>
+        <w:tc>
+          <w:tcPr>
+            <w:tcW w:type="dxa" w:w="892"/>
+            <w:tcBorders>
+              <w:top w:val="single" w:color="C9C9C4" w:sz="4"/>
+              <w:left w:val="single" w:color="C9C9C4" w:sz="4"/>
+              <w:bottom w:val="single" w:color="C9C9C4" w:sz="4"/>
+              <w:right w:val="single" w:color="C9C9C4" w:sz="4"/>
+            </w:tcBorders>
+            <w:tcMar>
+              <w:top w:type="dxa" w:w="60"/>
+              <w:left w:type="dxa" w:w="100"/>
+              <w:bottom w:type="dxa" w:w="60"/>
+              <w:right w:type="dxa" w:w="100"/>
+            </w:tcMar>
+          </w:tcPr>
+          <w:p>
+            <w:r>
+              <w:rPr>
+                <w:color w:val="0A0A0A"/>
+                <w:sz w:val="18"/>
+                <w:szCs w:val="18"/>
+              </w:rPr>
+              <w:t xml:space="preserve">16</w:t>
+            </w:r>
+          </w:p>
+        </w:tc>
+        <w:tc>
+          <w:tcPr>
+            <w:tcW w:type="dxa" w:w="1249"/>
+            <w:tcBorders>
+              <w:top w:val="single" w:color="C9C9C4" w:sz="4"/>
+              <w:left w:val="single" w:color="C9C9C4" w:sz="4"/>
+              <w:bottom w:val="single" w:color="C9C9C4" w:sz="4"/>
+              <w:right w:val="single" w:color="C9C9C4" w:sz="4"/>
+            </w:tcBorders>
+            <w:tcMar>
+              <w:top w:type="dxa" w:w="60"/>
+              <w:left w:type="dxa" w:w="100"/>
+              <w:bottom w:type="dxa" w:w="60"/>
+              <w:right w:type="dxa" w:w="100"/>
+            </w:tcMar>
+          </w:tcPr>
+          <w:p>
+            <w:r>
+              <w:rPr>
+                <w:color w:val="0A0A0A"/>
+                <w:sz w:val="18"/>
+                <w:szCs w:val="18"/>
+              </w:rPr>
+              <w:t xml:space="preserve">Alysa</w:t>
             </w:r>
           </w:p>
         </w:tc>
@@ -6261,7 +6375,7 @@
         <w:spacing w:after="120"/>
       </w:pPr>
       <w:r>
-        <w:t xml:space="preserve">About 100 words, 40 seconds.</w:t>
+        <w:t xml:space="preserve">About 115 words, 45 seconds.</w:t>
       </w:r>
     </w:p>
     <w:p>
@@ -6269,7 +6383,7 @@
         <w:pStyle w:val="Heading1"/>
       </w:pPr>
       <w:r>
-        <w:t xml:space="preserve">Part 7. End card (4:10 to 4:18)</w:t>
+        <w:t xml:space="preserve">Part 7. End card (4:15 to 4:23)</w:t>
       </w:r>
     </w:p>
     <w:p>
@@ -6593,7 +6707,7 @@
                 <w:sz w:val="18"/>
                 <w:szCs w:val="18"/>
               </w:rPr>
-              <w:t xml:space="preserve">Line 3</w:t>
+              <w:t xml:space="preserve">Line 3 (Maalon)</w:t>
             </w:r>
           </w:p>
         </w:tc>
@@ -7433,7 +7547,7 @@
                 <w:sz w:val="18"/>
                 <w:szCs w:val="18"/>
               </w:rPr>
-              <w:t xml:space="preserve">Line 15</w:t>
+              <w:t xml:space="preserve">Lines 14 to 16</w:t>
             </w:r>
           </w:p>
         </w:tc>
@@ -7452,6 +7566,14 @@
         <w:t xml:space="preserve">Speaking count</w:t>
       </w:r>
     </w:p>
+    <w:p>
+      <w:pPr>
+        <w:spacing w:after="120"/>
+      </w:pPr>
+      <w:r>
+        <w:t xml:space="preserve">Each person speaks only on their own field.</w:t>
+      </w:r>
+    </w:p>
     <w:tbl>
       <w:tblPr>
         <w:tblW w:type="dxa" w:w="14838"/>
@@ -7465,8 +7587,9 @@
         </w:tblBorders>
       </w:tblPr>
       <w:tblGrid>
-        <w:gridCol w:w="4485"/>
-        <w:gridCol w:w="10353"/>
+        <w:gridCol w:w="1483"/>
+        <w:gridCol w:w="5821"/>
+        <w:gridCol w:w="7534"/>
       </w:tblGrid>
       <w:tr>
         <w:trPr>
@@ -7475,7 +7598,7 @@
         </w:trPr>
         <w:tc>
           <w:tcPr>
-            <w:tcW w:type="dxa" w:w="4485"/>
+            <w:tcW w:type="dxa" w:w="1483"/>
             <w:tcBorders>
               <w:top w:val="single" w:color="C9C9C4" w:sz="4"/>
               <w:left w:val="single" w:color="C9C9C4" w:sz="4"/>
@@ -7505,7 +7628,37 @@
         </w:tc>
         <w:tc>
           <w:tcPr>
-            <w:tcW w:type="dxa" w:w="10353"/>
+            <w:tcW w:type="dxa" w:w="5821"/>
+            <w:tcBorders>
+              <w:top w:val="single" w:color="C9C9C4" w:sz="4"/>
+              <w:left w:val="single" w:color="C9C9C4" w:sz="4"/>
+              <w:bottom w:val="single" w:color="C9C9C4" w:sz="4"/>
+              <w:right w:val="single" w:color="C9C9C4" w:sz="4"/>
+            </w:tcBorders>
+            <w:shd w:fill="EDE9FF" w:color="auto" w:val="clear"/>
+            <w:tcMar>
+              <w:top w:type="dxa" w:w="60"/>
+              <w:left w:type="dxa" w:w="100"/>
+              <w:bottom w:type="dxa" w:w="60"/>
+              <w:right w:type="dxa" w:w="100"/>
+            </w:tcMar>
+          </w:tcPr>
+          <w:p>
+            <w:r>
+              <w:rPr>
+                <w:b/>
+                <w:bCs/>
+                <w:color w:val="0A0A0A"/>
+                <w:sz w:val="18"/>
+                <w:szCs w:val="18"/>
+              </w:rPr>
+              <w:t xml:space="preserve">Field</w:t>
+            </w:r>
+          </w:p>
+        </w:tc>
+        <w:tc>
+          <w:tcPr>
+            <w:tcW w:type="dxa" w:w="7534"/>
             <w:tcBorders>
               <w:top w:val="single" w:color="C9C9C4" w:sz="4"/>
               <w:left w:val="single" w:color="C9C9C4" w:sz="4"/>
@@ -7541,55 +7694,82 @@
         </w:trPr>
         <w:tc>
           <w:tcPr>
-            <w:tcW w:type="dxa" w:w="4485"/>
-            <w:tcBorders>
-              <w:top w:val="single" w:color="C9C9C4" w:sz="4"/>
-              <w:left w:val="single" w:color="C9C9C4" w:sz="4"/>
-              <w:bottom w:val="single" w:color="C9C9C4" w:sz="4"/>
-              <w:right w:val="single" w:color="C9C9C4" w:sz="4"/>
-            </w:tcBorders>
-            <w:tcMar>
-              <w:top w:type="dxa" w:w="60"/>
-              <w:left w:type="dxa" w:w="100"/>
-              <w:bottom w:type="dxa" w:w="60"/>
-              <w:right w:type="dxa" w:w="100"/>
-            </w:tcMar>
-          </w:tcPr>
-          <w:p>
-            <w:r>
-              <w:rPr>
-                <w:color w:val="0A0A0A"/>
-                <w:sz w:val="18"/>
-                <w:szCs w:val="18"/>
-              </w:rPr>
-              <w:t xml:space="preserve">Karina</w:t>
-            </w:r>
-          </w:p>
-        </w:tc>
-        <w:tc>
-          <w:tcPr>
-            <w:tcW w:type="dxa" w:w="10353"/>
-            <w:tcBorders>
-              <w:top w:val="single" w:color="C9C9C4" w:sz="4"/>
-              <w:left w:val="single" w:color="C9C9C4" w:sz="4"/>
-              <w:bottom w:val="single" w:color="C9C9C4" w:sz="4"/>
-              <w:right w:val="single" w:color="C9C9C4" w:sz="4"/>
-            </w:tcBorders>
-            <w:tcMar>
-              <w:top w:type="dxa" w:w="60"/>
-              <w:left w:type="dxa" w:w="100"/>
-              <w:bottom w:type="dxa" w:w="60"/>
-              <w:right w:type="dxa" w:w="100"/>
-            </w:tcMar>
-          </w:tcPr>
-          <w:p>
-            <w:r>
-              <w:rPr>
-                <w:color w:val="0A0A0A"/>
-                <w:sz w:val="18"/>
-                <w:szCs w:val="18"/>
-              </w:rPr>
-              <w:t xml:space="preserve">3, 6, Part 5, 10, 15</w:t>
+            <w:tcW w:type="dxa" w:w="1483"/>
+            <w:tcBorders>
+              <w:top w:val="single" w:color="C9C9C4" w:sz="4"/>
+              <w:left w:val="single" w:color="C9C9C4" w:sz="4"/>
+              <w:bottom w:val="single" w:color="C9C9C4" w:sz="4"/>
+              <w:right w:val="single" w:color="C9C9C4" w:sz="4"/>
+            </w:tcBorders>
+            <w:tcMar>
+              <w:top w:type="dxa" w:w="60"/>
+              <w:left w:type="dxa" w:w="100"/>
+              <w:bottom w:type="dxa" w:w="60"/>
+              <w:right w:type="dxa" w:w="100"/>
+            </w:tcMar>
+          </w:tcPr>
+          <w:p>
+            <w:r>
+              <w:rPr>
+                <w:color w:val="0A0A0A"/>
+                <w:sz w:val="18"/>
+                <w:szCs w:val="18"/>
+              </w:rPr>
+              <w:t xml:space="preserve">Alysa</w:t>
+            </w:r>
+          </w:p>
+        </w:tc>
+        <w:tc>
+          <w:tcPr>
+            <w:tcW w:type="dxa" w:w="5821"/>
+            <w:tcBorders>
+              <w:top w:val="single" w:color="C9C9C4" w:sz="4"/>
+              <w:left w:val="single" w:color="C9C9C4" w:sz="4"/>
+              <w:bottom w:val="single" w:color="C9C9C4" w:sz="4"/>
+              <w:right w:val="single" w:color="C9C9C4" w:sz="4"/>
+            </w:tcBorders>
+            <w:tcMar>
+              <w:top w:type="dxa" w:w="60"/>
+              <w:left w:type="dxa" w:w="100"/>
+              <w:bottom w:type="dxa" w:w="60"/>
+              <w:right w:type="dxa" w:w="100"/>
+            </w:tcMar>
+          </w:tcPr>
+          <w:p>
+            <w:r>
+              <w:rPr>
+                <w:color w:val="0A0A0A"/>
+                <w:sz w:val="18"/>
+                <w:szCs w:val="18"/>
+              </w:rPr>
+              <w:t xml:space="preserve">Business: law, market, money</w:t>
+            </w:r>
+          </w:p>
+        </w:tc>
+        <w:tc>
+          <w:tcPr>
+            <w:tcW w:type="dxa" w:w="7534"/>
+            <w:tcBorders>
+              <w:top w:val="single" w:color="C9C9C4" w:sz="4"/>
+              <w:left w:val="single" w:color="C9C9C4" w:sz="4"/>
+              <w:bottom w:val="single" w:color="C9C9C4" w:sz="4"/>
+              <w:right w:val="single" w:color="C9C9C4" w:sz="4"/>
+            </w:tcBorders>
+            <w:tcMar>
+              <w:top w:type="dxa" w:w="60"/>
+              <w:left w:type="dxa" w:w="100"/>
+              <w:bottom w:type="dxa" w:w="60"/>
+              <w:right w:type="dxa" w:w="100"/>
+            </w:tcMar>
+          </w:tcPr>
+          <w:p>
+            <w:r>
+              <w:rPr>
+                <w:color w:val="0A0A0A"/>
+                <w:sz w:val="18"/>
+                <w:szCs w:val="18"/>
+              </w:rPr>
+              <w:t xml:space="preserve">2, 8, Part 3, Part 4 payout, Part 5 (twice), 12, 16</w:t>
             </w:r>
           </w:p>
         </w:tc>
@@ -7601,55 +7781,82 @@
         </w:trPr>
         <w:tc>
           <w:tcPr>
-            <w:tcW w:type="dxa" w:w="4485"/>
-            <w:tcBorders>
-              <w:top w:val="single" w:color="C9C9C4" w:sz="4"/>
-              <w:left w:val="single" w:color="C9C9C4" w:sz="4"/>
-              <w:bottom w:val="single" w:color="C9C9C4" w:sz="4"/>
-              <w:right w:val="single" w:color="C9C9C4" w:sz="4"/>
-            </w:tcBorders>
-            <w:tcMar>
-              <w:top w:type="dxa" w:w="60"/>
-              <w:left w:type="dxa" w:w="100"/>
-              <w:bottom w:type="dxa" w:w="60"/>
-              <w:right w:type="dxa" w:w="100"/>
-            </w:tcMar>
-          </w:tcPr>
-          <w:p>
-            <w:r>
-              <w:rPr>
-                <w:color w:val="0A0A0A"/>
-                <w:sz w:val="18"/>
-                <w:szCs w:val="18"/>
-              </w:rPr>
-              <w:t xml:space="preserve">Simone</w:t>
-            </w:r>
-          </w:p>
-        </w:tc>
-        <w:tc>
-          <w:tcPr>
-            <w:tcW w:type="dxa" w:w="10353"/>
-            <w:tcBorders>
-              <w:top w:val="single" w:color="C9C9C4" w:sz="4"/>
-              <w:left w:val="single" w:color="C9C9C4" w:sz="4"/>
-              <w:bottom w:val="single" w:color="C9C9C4" w:sz="4"/>
-              <w:right w:val="single" w:color="C9C9C4" w:sz="4"/>
-            </w:tcBorders>
-            <w:tcMar>
-              <w:top w:type="dxa" w:w="60"/>
-              <w:left w:type="dxa" w:w="100"/>
-              <w:bottom w:type="dxa" w:w="60"/>
-              <w:right w:type="dxa" w:w="100"/>
-            </w:tcMar>
-          </w:tcPr>
-          <w:p>
-            <w:r>
-              <w:rPr>
-                <w:color w:val="0A0A0A"/>
-                <w:sz w:val="18"/>
-                <w:szCs w:val="18"/>
-              </w:rPr>
-              <w:t xml:space="preserve">4, Part 4 narration, 11</w:t>
+            <w:tcW w:type="dxa" w:w="1483"/>
+            <w:tcBorders>
+              <w:top w:val="single" w:color="C9C9C4" w:sz="4"/>
+              <w:left w:val="single" w:color="C9C9C4" w:sz="4"/>
+              <w:bottom w:val="single" w:color="C9C9C4" w:sz="4"/>
+              <w:right w:val="single" w:color="C9C9C4" w:sz="4"/>
+            </w:tcBorders>
+            <w:tcMar>
+              <w:top w:type="dxa" w:w="60"/>
+              <w:left w:type="dxa" w:w="100"/>
+              <w:bottom w:type="dxa" w:w="60"/>
+              <w:right w:type="dxa" w:w="100"/>
+            </w:tcMar>
+          </w:tcPr>
+          <w:p>
+            <w:r>
+              <w:rPr>
+                <w:color w:val="0A0A0A"/>
+                <w:sz w:val="18"/>
+                <w:szCs w:val="18"/>
+              </w:rPr>
+              <w:t xml:space="preserve">Maalon</w:t>
+            </w:r>
+          </w:p>
+        </w:tc>
+        <w:tc>
+          <w:tcPr>
+            <w:tcW w:type="dxa" w:w="5821"/>
+            <w:tcBorders>
+              <w:top w:val="single" w:color="C9C9C4" w:sz="4"/>
+              <w:left w:val="single" w:color="C9C9C4" w:sz="4"/>
+              <w:bottom w:val="single" w:color="C9C9C4" w:sz="4"/>
+              <w:right w:val="single" w:color="C9C9C4" w:sz="4"/>
+            </w:tcBorders>
+            <w:tcMar>
+              <w:top w:type="dxa" w:w="60"/>
+              <w:left w:type="dxa" w:w="100"/>
+              <w:bottom w:type="dxa" w:w="60"/>
+              <w:right w:type="dxa" w:w="100"/>
+            </w:tcMar>
+          </w:tcPr>
+          <w:p>
+            <w:r>
+              <w:rPr>
+                <w:color w:val="0A0A0A"/>
+                <w:sz w:val="18"/>
+                <w:szCs w:val="18"/>
+              </w:rPr>
+              <w:t xml:space="preserve">Medicine and health: injury, triage, ethics</w:t>
+            </w:r>
+          </w:p>
+        </w:tc>
+        <w:tc>
+          <w:tcPr>
+            <w:tcW w:type="dxa" w:w="7534"/>
+            <w:tcBorders>
+              <w:top w:val="single" w:color="C9C9C4" w:sz="4"/>
+              <w:left w:val="single" w:color="C9C9C4" w:sz="4"/>
+              <w:bottom w:val="single" w:color="C9C9C4" w:sz="4"/>
+              <w:right w:val="single" w:color="C9C9C4" w:sz="4"/>
+            </w:tcBorders>
+            <w:tcMar>
+              <w:top w:type="dxa" w:w="60"/>
+              <w:left w:type="dxa" w:w="100"/>
+              <w:bottom w:type="dxa" w:w="60"/>
+              <w:right w:type="dxa" w:w="100"/>
+            </w:tcMar>
+          </w:tcPr>
+          <w:p>
+            <w:r>
+              <w:rPr>
+                <w:color w:val="0A0A0A"/>
+                <w:sz w:val="18"/>
+                <w:szCs w:val="18"/>
+              </w:rPr>
+              <w:t xml:space="preserve">1, 3, 7, Part 4 dispatch, Part 5, 13</w:t>
             </w:r>
           </w:p>
         </w:tc>
@@ -7661,7 +7868,7 @@
         </w:trPr>
         <w:tc>
           <w:tcPr>
-            <w:tcW w:type="dxa" w:w="4485"/>
+            <w:tcW w:type="dxa" w:w="1483"/>
             <w:tcBorders>
               <w:top w:val="single" w:color="C9C9C4" w:sz="4"/>
               <w:left w:val="single" w:color="C9C9C4" w:sz="4"/>
@@ -7688,7 +7895,34 @@
         </w:tc>
         <w:tc>
           <w:tcPr>
-            <w:tcW w:type="dxa" w:w="10353"/>
+            <w:tcW w:type="dxa" w:w="5821"/>
+            <w:tcBorders>
+              <w:top w:val="single" w:color="C9C9C4" w:sz="4"/>
+              <w:left w:val="single" w:color="C9C9C4" w:sz="4"/>
+              <w:bottom w:val="single" w:color="C9C9C4" w:sz="4"/>
+              <w:right w:val="single" w:color="C9C9C4" w:sz="4"/>
+            </w:tcBorders>
+            <w:tcMar>
+              <w:top w:type="dxa" w:w="60"/>
+              <w:left w:type="dxa" w:w="100"/>
+              <w:bottom w:type="dxa" w:w="60"/>
+              <w:right w:type="dxa" w:w="100"/>
+            </w:tcMar>
+          </w:tcPr>
+          <w:p>
+            <w:r>
+              <w:rPr>
+                <w:color w:val="0A0A0A"/>
+                <w:sz w:val="18"/>
+                <w:szCs w:val="18"/>
+              </w:rPr>
+              <w:t xml:space="preserve">Engineering: sensors, helmet clip, drop tests</w:t>
+            </w:r>
+          </w:p>
+        </w:tc>
+        <w:tc>
+          <w:tcPr>
+            <w:tcW w:type="dxa" w:w="7534"/>
             <w:tcBorders>
               <w:top w:val="single" w:color="C9C9C4" w:sz="4"/>
               <w:left w:val="single" w:color="C9C9C4" w:sz="4"/>
@@ -7721,55 +7955,82 @@
         </w:trPr>
         <w:tc>
           <w:tcPr>
-            <w:tcW w:type="dxa" w:w="4485"/>
-            <w:tcBorders>
-              <w:top w:val="single" w:color="C9C9C4" w:sz="4"/>
-              <w:left w:val="single" w:color="C9C9C4" w:sz="4"/>
-              <w:bottom w:val="single" w:color="C9C9C4" w:sz="4"/>
-              <w:right w:val="single" w:color="C9C9C4" w:sz="4"/>
-            </w:tcBorders>
-            <w:tcMar>
-              <w:top w:type="dxa" w:w="60"/>
-              <w:left w:type="dxa" w:w="100"/>
-              <w:bottom w:type="dxa" w:w="60"/>
-              <w:right w:type="dxa" w:w="100"/>
-            </w:tcMar>
-          </w:tcPr>
-          <w:p>
-            <w:r>
-              <w:rPr>
-                <w:color w:val="0A0A0A"/>
-                <w:sz w:val="18"/>
-                <w:szCs w:val="18"/>
-              </w:rPr>
-              <w:t xml:space="preserve">Maalon</w:t>
-            </w:r>
-          </w:p>
-        </w:tc>
-        <w:tc>
-          <w:tcPr>
-            <w:tcW w:type="dxa" w:w="10353"/>
-            <w:tcBorders>
-              <w:top w:val="single" w:color="C9C9C4" w:sz="4"/>
-              <w:left w:val="single" w:color="C9C9C4" w:sz="4"/>
-              <w:bottom w:val="single" w:color="C9C9C4" w:sz="4"/>
-              <w:right w:val="single" w:color="C9C9C4" w:sz="4"/>
-            </w:tcBorders>
-            <w:tcMar>
-              <w:top w:type="dxa" w:w="60"/>
-              <w:left w:type="dxa" w:w="100"/>
-              <w:bottom w:type="dxa" w:w="60"/>
-              <w:right w:type="dxa" w:w="100"/>
-            </w:tcMar>
-          </w:tcPr>
-          <w:p>
-            <w:r>
-              <w:rPr>
-                <w:color w:val="0A0A0A"/>
-                <w:sz w:val="18"/>
-                <w:szCs w:val="18"/>
-              </w:rPr>
-              <w:t xml:space="preserve">1, 7, Part 5, 13</w:t>
+            <w:tcW w:type="dxa" w:w="1483"/>
+            <w:tcBorders>
+              <w:top w:val="single" w:color="C9C9C4" w:sz="4"/>
+              <w:left w:val="single" w:color="C9C9C4" w:sz="4"/>
+              <w:bottom w:val="single" w:color="C9C9C4" w:sz="4"/>
+              <w:right w:val="single" w:color="C9C9C4" w:sz="4"/>
+            </w:tcBorders>
+            <w:tcMar>
+              <w:top w:type="dxa" w:w="60"/>
+              <w:left w:type="dxa" w:w="100"/>
+              <w:bottom w:type="dxa" w:w="60"/>
+              <w:right w:type="dxa" w:w="100"/>
+            </w:tcMar>
+          </w:tcPr>
+          <w:p>
+            <w:r>
+              <w:rPr>
+                <w:color w:val="0A0A0A"/>
+                <w:sz w:val="18"/>
+                <w:szCs w:val="18"/>
+              </w:rPr>
+              <w:t xml:space="preserve">Karina</w:t>
+            </w:r>
+          </w:p>
+        </w:tc>
+        <w:tc>
+          <w:tcPr>
+            <w:tcW w:type="dxa" w:w="5821"/>
+            <w:tcBorders>
+              <w:top w:val="single" w:color="C9C9C4" w:sz="4"/>
+              <w:left w:val="single" w:color="C9C9C4" w:sz="4"/>
+              <w:bottom w:val="single" w:color="C9C9C4" w:sz="4"/>
+              <w:right w:val="single" w:color="C9C9C4" w:sz="4"/>
+            </w:tcBorders>
+            <w:tcMar>
+              <w:top w:type="dxa" w:w="60"/>
+              <w:left w:type="dxa" w:w="100"/>
+              <w:bottom w:type="dxa" w:w="60"/>
+              <w:right w:type="dxa" w:w="100"/>
+            </w:tcMar>
+          </w:tcPr>
+          <w:p>
+            <w:r>
+              <w:rPr>
+                <w:color w:val="0A0A0A"/>
+                <w:sz w:val="18"/>
+                <w:szCs w:val="18"/>
+              </w:rPr>
+              <w:t xml:space="preserve">ML and software: the model, the data</w:t>
+            </w:r>
+          </w:p>
+        </w:tc>
+        <w:tc>
+          <w:tcPr>
+            <w:tcW w:type="dxa" w:w="7534"/>
+            <w:tcBorders>
+              <w:top w:val="single" w:color="C9C9C4" w:sz="4"/>
+              <w:left w:val="single" w:color="C9C9C4" w:sz="4"/>
+              <w:bottom w:val="single" w:color="C9C9C4" w:sz="4"/>
+              <w:right w:val="single" w:color="C9C9C4" w:sz="4"/>
+            </w:tcBorders>
+            <w:tcMar>
+              <w:top w:type="dxa" w:w="60"/>
+              <w:left w:type="dxa" w:w="100"/>
+              <w:bottom w:type="dxa" w:w="60"/>
+              <w:right w:type="dxa" w:w="100"/>
+            </w:tcMar>
+          </w:tcPr>
+          <w:p>
+            <w:r>
+              <w:rPr>
+                <w:color w:val="0A0A0A"/>
+                <w:sz w:val="18"/>
+                <w:szCs w:val="18"/>
+              </w:rPr>
+              <w:t xml:space="preserve">6, Part 4 detection, labour data and results, Part 5, 10, 15</w:t>
             </w:r>
           </w:p>
         </w:tc>
@@ -7781,55 +8042,82 @@
         </w:trPr>
         <w:tc>
           <w:tcPr>
-            <w:tcW w:type="dxa" w:w="4485"/>
-            <w:tcBorders>
-              <w:top w:val="single" w:color="C9C9C4" w:sz="4"/>
-              <w:left w:val="single" w:color="C9C9C4" w:sz="4"/>
-              <w:bottom w:val="single" w:color="C9C9C4" w:sz="4"/>
-              <w:right w:val="single" w:color="C9C9C4" w:sz="4"/>
-            </w:tcBorders>
-            <w:tcMar>
-              <w:top w:type="dxa" w:w="60"/>
-              <w:left w:type="dxa" w:w="100"/>
-              <w:bottom w:type="dxa" w:w="60"/>
-              <w:right w:type="dxa" w:w="100"/>
-            </w:tcMar>
-          </w:tcPr>
-          <w:p>
-            <w:r>
-              <w:rPr>
-                <w:color w:val="0A0A0A"/>
-                <w:sz w:val="18"/>
-                <w:szCs w:val="18"/>
-              </w:rPr>
-              <w:t xml:space="preserve">Alysa</w:t>
-            </w:r>
-          </w:p>
-        </w:tc>
-        <w:tc>
-          <w:tcPr>
-            <w:tcW w:type="dxa" w:w="10353"/>
-            <w:tcBorders>
-              <w:top w:val="single" w:color="C9C9C4" w:sz="4"/>
-              <w:left w:val="single" w:color="C9C9C4" w:sz="4"/>
-              <w:bottom w:val="single" w:color="C9C9C4" w:sz="4"/>
-              <w:right w:val="single" w:color="C9C9C4" w:sz="4"/>
-            </w:tcBorders>
-            <w:tcMar>
-              <w:top w:type="dxa" w:w="60"/>
-              <w:left w:type="dxa" w:w="100"/>
-              <w:bottom w:type="dxa" w:w="60"/>
-              <w:right w:type="dxa" w:w="100"/>
-            </w:tcMar>
-          </w:tcPr>
-          <w:p>
-            <w:r>
-              <w:rPr>
-                <w:color w:val="0A0A0A"/>
-                <w:sz w:val="18"/>
-                <w:szCs w:val="18"/>
-              </w:rPr>
-              <w:t xml:space="preserve">2, 8, Part 3, Part 5, 12</w:t>
+            <w:tcW w:type="dxa" w:w="1483"/>
+            <w:tcBorders>
+              <w:top w:val="single" w:color="C9C9C4" w:sz="4"/>
+              <w:left w:val="single" w:color="C9C9C4" w:sz="4"/>
+              <w:bottom w:val="single" w:color="C9C9C4" w:sz="4"/>
+              <w:right w:val="single" w:color="C9C9C4" w:sz="4"/>
+            </w:tcBorders>
+            <w:tcMar>
+              <w:top w:type="dxa" w:w="60"/>
+              <w:left w:type="dxa" w:w="100"/>
+              <w:bottom w:type="dxa" w:w="60"/>
+              <w:right w:type="dxa" w:w="100"/>
+            </w:tcMar>
+          </w:tcPr>
+          <w:p>
+            <w:r>
+              <w:rPr>
+                <w:color w:val="0A0A0A"/>
+                <w:sz w:val="18"/>
+                <w:szCs w:val="18"/>
+              </w:rPr>
+              <w:t xml:space="preserve">Simone</w:t>
+            </w:r>
+          </w:p>
+        </w:tc>
+        <w:tc>
+          <w:tcPr>
+            <w:tcW w:type="dxa" w:w="5821"/>
+            <w:tcBorders>
+              <w:top w:val="single" w:color="C9C9C4" w:sz="4"/>
+              <w:left w:val="single" w:color="C9C9C4" w:sz="4"/>
+              <w:bottom w:val="single" w:color="C9C9C4" w:sz="4"/>
+              <w:right w:val="single" w:color="C9C9C4" w:sz="4"/>
+            </w:tcBorders>
+            <w:tcMar>
+              <w:top w:type="dxa" w:w="60"/>
+              <w:left w:type="dxa" w:w="100"/>
+              <w:bottom w:type="dxa" w:w="60"/>
+              <w:right w:type="dxa" w:w="100"/>
+            </w:tcMar>
+          </w:tcPr>
+          <w:p>
+            <w:r>
+              <w:rPr>
+                <w:color w:val="0A0A0A"/>
+                <w:sz w:val="18"/>
+                <w:szCs w:val="18"/>
+              </w:rPr>
+              <w:t xml:space="preserve">ML and software: the app and the backend</w:t>
+            </w:r>
+          </w:p>
+        </w:tc>
+        <w:tc>
+          <w:tcPr>
+            <w:tcW w:type="dxa" w:w="7534"/>
+            <w:tcBorders>
+              <w:top w:val="single" w:color="C9C9C4" w:sz="4"/>
+              <w:left w:val="single" w:color="C9C9C4" w:sz="4"/>
+              <w:bottom w:val="single" w:color="C9C9C4" w:sz="4"/>
+              <w:right w:val="single" w:color="C9C9C4" w:sz="4"/>
+            </w:tcBorders>
+            <w:tcMar>
+              <w:top w:type="dxa" w:w="60"/>
+              <w:left w:type="dxa" w:w="100"/>
+              <w:bottom w:type="dxa" w:w="60"/>
+              <w:right w:type="dxa" w:w="100"/>
+            </w:tcMar>
+          </w:tcPr>
+          <w:p>
+            <w:r>
+              <w:rPr>
+                <w:color w:val="0A0A0A"/>
+                <w:sz w:val="18"/>
+                <w:szCs w:val="18"/>
+              </w:rPr>
+              <w:t xml:space="preserve">4, Part 4 app, signed record and verification, 11</w:t>
             </w:r>
           </w:p>
         </w:tc>

</xml_diff>

<commit_message>
Video script: 50 second technical screen recording with a floating head, total 3:58
</commit_message>
<xml_diff>
--- a/docs/submission/VIDEO_SCRIPT.docx
+++ b/docs/submission/VIDEO_SCRIPT.docx
@@ -23,7 +23,7 @@
         <w:spacing w:after="120"/>
       </w:pPr>
       <w:r>
-        <w:t xml:space="preserve">Hard limit 4:30. Target 4:23. English. Burned-in subtitles on every spoken line. Every member speaks at least twice.</w:t>
+        <w:t xml:space="preserve">Hard limit 4:30. Target 3:58. English. Burned-in subtitles on every spoken line. Every member speaks at least twice.</w:t>
       </w:r>
     </w:p>
     <w:p>
@@ -575,7 +575,7 @@
                 <w:sz w:val="18"/>
                 <w:szCs w:val="18"/>
               </w:rPr>
-              <w:t xml:space="preserve">1:50 to 3:05</w:t>
+              <w:t xml:space="preserve">1:50 to 2:40</w:t>
             </w:r>
           </w:p>
         </w:tc>
@@ -602,7 +602,7 @@
                 <w:sz w:val="18"/>
                 <w:szCs w:val="18"/>
               </w:rPr>
-              <w:t xml:space="preserve">The real app, start to finish, one narrator</w:t>
+              <w:t xml:space="preserve">Karina walks through the live app, face in the corner</w:t>
             </w:r>
           </w:p>
         </w:tc>
@@ -629,7 +629,7 @@
                 <w:sz w:val="18"/>
                 <w:szCs w:val="18"/>
               </w:rPr>
-              <w:t xml:space="preserve">Design and build, innovation, validation</w:t>
+              <w:t xml:space="preserve">Design and build, innovation, validation, ethics</w:t>
             </w:r>
           </w:p>
         </w:tc>
@@ -689,7 +689,7 @@
                 <w:sz w:val="18"/>
                 <w:szCs w:val="18"/>
               </w:rPr>
-              <w:t xml:space="preserve">3:05 to 3:30</w:t>
+              <w:t xml:space="preserve">2:40 to 3:05</w:t>
             </w:r>
           </w:p>
         </w:tc>
@@ -803,7 +803,7 @@
                 <w:sz w:val="18"/>
                 <w:szCs w:val="18"/>
               </w:rPr>
-              <w:t xml:space="preserve">3:30 to 4:15</w:t>
+              <w:t xml:space="preserve">3:05 to 3:50</w:t>
             </w:r>
           </w:p>
         </w:tc>
@@ -917,7 +917,7 @@
                 <w:sz w:val="18"/>
                 <w:szCs w:val="18"/>
               </w:rPr>
-              <w:t xml:space="preserve">4:15 to 4:23</w:t>
+              <w:t xml:space="preserve">3:50 to 3:58</w:t>
             </w:r>
           </w:p>
         </w:tc>
@@ -3768,7 +3768,7 @@
         <w:pStyle w:val="Heading1"/>
       </w:pPr>
       <w:r>
-        <w:t xml:space="preserve">Part 4. Screen recording (1:50 to 3:05)</w:t>
+        <w:t xml:space="preserve">Part 4. Screen recording (1:50 to 2:40)</w:t>
       </w:r>
     </w:p>
     <w:p>
@@ -3776,7 +3776,7 @@
         <w:spacing w:after="120"/>
       </w:pPr>
       <w:r>
-        <w:t xml:space="preserve">One continuous story on the live site, cut tight. Voice over only, each part read by the person who owns it. Phone shots are screen recordings from a real phone. Laptop shots at 1440 by 900, cursor visible, no browser chrome.</w:t>
+        <w:t xml:space="preserve">50 seconds, technical. Karina narrates, with her face in a floating circle in the bottom right corner (about a fifth of the frame width). It opens full screen on her phone running the app, then moves to the laptop screen. Record three files at the same time: the laptop screen, the face camera, and the phone screen. They are combined in the edit.</w:t>
       </w:r>
     </w:p>
     <w:tbl>
@@ -3792,9 +3792,10 @@
         </w:tblBorders>
       </w:tblPr>
       <w:tblGrid>
-        <w:gridCol w:w="1044"/>
-        <w:gridCol w:w="6896"/>
-        <w:gridCol w:w="6898"/>
+        <w:gridCol w:w="889"/>
+        <w:gridCol w:w="4769"/>
+        <w:gridCol w:w="4769"/>
+        <w:gridCol w:w="4411"/>
       </w:tblGrid>
       <w:tr>
         <w:trPr>
@@ -3803,7 +3804,7 @@
         </w:trPr>
         <w:tc>
           <w:tcPr>
-            <w:tcW w:type="dxa" w:w="1044"/>
+            <w:tcW w:type="dxa" w:w="889"/>
             <w:tcBorders>
               <w:top w:val="single" w:color="C9C9C4" w:sz="4"/>
               <w:left w:val="single" w:color="C9C9C4" w:sz="4"/>
@@ -3833,7 +3834,7 @@
         </w:tc>
         <w:tc>
           <w:tcPr>
-            <w:tcW w:type="dxa" w:w="6896"/>
+            <w:tcW w:type="dxa" w:w="4769"/>
             <w:tcBorders>
               <w:top w:val="single" w:color="C9C9C4" w:sz="4"/>
               <w:left w:val="single" w:color="C9C9C4" w:sz="4"/>
@@ -3863,7 +3864,7 @@
         </w:tc>
         <w:tc>
           <w:tcPr>
-            <w:tcW w:type="dxa" w:w="6898"/>
+            <w:tcW w:type="dxa" w:w="4769"/>
             <w:tcBorders>
               <w:top w:val="single" w:color="C9C9C4" w:sz="4"/>
               <w:left w:val="single" w:color="C9C9C4" w:sz="4"/>
@@ -3887,7 +3888,37 @@
                 <w:sz w:val="18"/>
                 <w:szCs w:val="18"/>
               </w:rPr>
-              <w:t xml:space="preserve">Voice over</w:t>
+              <w:t xml:space="preserve">Karina</w:t>
+            </w:r>
+          </w:p>
+        </w:tc>
+        <w:tc>
+          <w:tcPr>
+            <w:tcW w:type="dxa" w:w="4411"/>
+            <w:tcBorders>
+              <w:top w:val="single" w:color="C9C9C4" w:sz="4"/>
+              <w:left w:val="single" w:color="C9C9C4" w:sz="4"/>
+              <w:bottom w:val="single" w:color="C9C9C4" w:sz="4"/>
+              <w:right w:val="single" w:color="C9C9C4" w:sz="4"/>
+            </w:tcBorders>
+            <w:shd w:fill="EDE9FF" w:color="auto" w:val="clear"/>
+            <w:tcMar>
+              <w:top w:type="dxa" w:w="60"/>
+              <w:left w:type="dxa" w:w="100"/>
+              <w:bottom w:type="dxa" w:w="60"/>
+              <w:right w:type="dxa" w:w="100"/>
+            </w:tcMar>
+          </w:tcPr>
+          <w:p>
+            <w:r>
+              <w:rPr>
+                <w:b/>
+                <w:bCs/>
+                <w:color w:val="0A0A0A"/>
+                <w:sz w:val="18"/>
+                <w:szCs w:val="18"/>
+              </w:rPr>
+              <w:t xml:space="preserve">Source corner or caption</w:t>
             </w:r>
           </w:p>
         </w:tc>
@@ -3899,7 +3930,7 @@
         </w:trPr>
         <w:tc>
           <w:tcPr>
-            <w:tcW w:type="dxa" w:w="1044"/>
+            <w:tcW w:type="dxa" w:w="889"/>
             <w:tcBorders>
               <w:top w:val="single" w:color="C9C9C4" w:sz="4"/>
               <w:left w:val="single" w:color="C9C9C4" w:sz="4"/>
@@ -3926,55 +3957,82 @@
         </w:tc>
         <w:tc>
           <w:tcPr>
-            <w:tcW w:type="dxa" w:w="6896"/>
-            <w:tcBorders>
-              <w:top w:val="single" w:color="C9C9C4" w:sz="4"/>
-              <w:left w:val="single" w:color="C9C9C4" w:sz="4"/>
-              <w:bottom w:val="single" w:color="C9C9C4" w:sz="4"/>
-              <w:right w:val="single" w:color="C9C9C4" w:sz="4"/>
-            </w:tcBorders>
-            <w:tcMar>
-              <w:top w:type="dxa" w:w="60"/>
-              <w:left w:type="dxa" w:w="100"/>
-              <w:bottom w:type="dxa" w:w="60"/>
-              <w:right w:type="dxa" w:w="100"/>
-            </w:tcMar>
-          </w:tcPr>
-          <w:p>
-            <w:r>
-              <w:rPr>
-                <w:color w:val="0A0A0A"/>
-                <w:sz w:val="18"/>
-                <w:szCs w:val="18"/>
-              </w:rPr>
-              <w:t xml:space="preserve">Phone, metricsfile.vercel.app/rider. Consent screen, tap 中文 to show Cantonese, back to English, tap continue</w:t>
-            </w:r>
-          </w:p>
-        </w:tc>
-        <w:tc>
-          <w:tcPr>
-            <w:tcW w:type="dxa" w:w="6898"/>
-            <w:tcBorders>
-              <w:top w:val="single" w:color="C9C9C4" w:sz="4"/>
-              <w:left w:val="single" w:color="C9C9C4" w:sz="4"/>
-              <w:bottom w:val="single" w:color="C9C9C4" w:sz="4"/>
-              <w:right w:val="single" w:color="C9C9C4" w:sz="4"/>
-            </w:tcBorders>
-            <w:tcMar>
-              <w:top w:type="dxa" w:w="60"/>
-              <w:left w:type="dxa" w:w="100"/>
-              <w:bottom w:type="dxa" w:w="60"/>
-              <w:right w:type="dxa" w:w="100"/>
-            </w:tcMar>
-          </w:tcPr>
-          <w:p>
-            <w:r>
-              <w:rPr>
-                <w:color w:val="0A0A0A"/>
-                <w:sz w:val="18"/>
-                <w:szCs w:val="18"/>
-              </w:rPr>
-              <w:t xml:space="preserve">Simone: "This is the rider's app, in English, Cantonese, Nepali and Urdu. Consent comes first."</w:t>
+            <w:tcW w:type="dxa" w:w="4769"/>
+            <w:tcBorders>
+              <w:top w:val="single" w:color="C9C9C4" w:sz="4"/>
+              <w:left w:val="single" w:color="C9C9C4" w:sz="4"/>
+              <w:bottom w:val="single" w:color="C9C9C4" w:sz="4"/>
+              <w:right w:val="single" w:color="C9C9C4" w:sz="4"/>
+            </w:tcBorders>
+            <w:tcMar>
+              <w:top w:type="dxa" w:w="60"/>
+              <w:left w:type="dxa" w:w="100"/>
+              <w:bottom w:type="dxa" w:w="60"/>
+              <w:right w:type="dxa" w:w="100"/>
+            </w:tcMar>
+          </w:tcPr>
+          <w:p>
+            <w:r>
+              <w:rPr>
+                <w:color w:val="0A0A0A"/>
+                <w:sz w:val="18"/>
+                <w:szCs w:val="18"/>
+              </w:rPr>
+              <w:t xml:space="preserve">Phone full screen, metricsfile.vercel.app/rider: consent, On shift, live sensor trace. Face circle appears</w:t>
+            </w:r>
+          </w:p>
+        </w:tc>
+        <w:tc>
+          <w:tcPr>
+            <w:tcW w:type="dxa" w:w="4769"/>
+            <w:tcBorders>
+              <w:top w:val="single" w:color="C9C9C4" w:sz="4"/>
+              <w:left w:val="single" w:color="C9C9C4" w:sz="4"/>
+              <w:bottom w:val="single" w:color="C9C9C4" w:sz="4"/>
+              <w:right w:val="single" w:color="C9C9C4" w:sz="4"/>
+            </w:tcBorders>
+            <w:tcMar>
+              <w:top w:type="dxa" w:w="60"/>
+              <w:left w:type="dxa" w:w="100"/>
+              <w:bottom w:type="dxa" w:w="60"/>
+              <w:right w:type="dxa" w:w="100"/>
+            </w:tcMar>
+          </w:tcPr>
+          <w:p>
+            <w:r>
+              <w:rPr>
+                <w:color w:val="0A0A0A"/>
+                <w:sz w:val="18"/>
+                <w:szCs w:val="18"/>
+              </w:rPr>
+              <w:t xml:space="preserve">"This is the live app. My phone is the sensor, streaming motion to our server while I'm on shift."</w:t>
+            </w:r>
+          </w:p>
+        </w:tc>
+        <w:tc>
+          <w:tcPr>
+            <w:tcW w:type="dxa" w:w="4411"/>
+            <w:tcBorders>
+              <w:top w:val="single" w:color="C9C9C4" w:sz="4"/>
+              <w:left w:val="single" w:color="C9C9C4" w:sz="4"/>
+              <w:bottom w:val="single" w:color="C9C9C4" w:sz="4"/>
+              <w:right w:val="single" w:color="C9C9C4" w:sz="4"/>
+            </w:tcBorders>
+            <w:tcMar>
+              <w:top w:type="dxa" w:w="60"/>
+              <w:left w:type="dxa" w:w="100"/>
+              <w:bottom w:type="dxa" w:w="60"/>
+              <w:right w:type="dxa" w:w="100"/>
+            </w:tcMar>
+          </w:tcPr>
+          <w:p>
+            <w:r>
+              <w:rPr>
+                <w:color w:val="0A0A0A"/>
+                <w:sz w:val="18"/>
+                <w:szCs w:val="18"/>
+              </w:rPr>
+              <w:t xml:space="preserve"/>
             </w:r>
           </w:p>
         </w:tc>
@@ -3986,7 +4044,7 @@
         </w:trPr>
         <w:tc>
           <w:tcPr>
-            <w:tcW w:type="dxa" w:w="1044"/>
+            <w:tcW w:type="dxa" w:w="889"/>
             <w:tcBorders>
               <w:top w:val="single" w:color="C9C9C4" w:sz="4"/>
               <w:left w:val="single" w:color="C9C9C4" w:sz="4"/>
@@ -4013,55 +4071,82 @@
         </w:tc>
         <w:tc>
           <w:tcPr>
-            <w:tcW w:type="dxa" w:w="6896"/>
-            <w:tcBorders>
-              <w:top w:val="single" w:color="C9C9C4" w:sz="4"/>
-              <w:left w:val="single" w:color="C9C9C4" w:sz="4"/>
-              <w:bottom w:val="single" w:color="C9C9C4" w:sz="4"/>
-              <w:right w:val="single" w:color="C9C9C4" w:sz="4"/>
-            </w:tcBorders>
-            <w:tcMar>
-              <w:top w:type="dxa" w:w="60"/>
-              <w:left w:type="dxa" w:w="100"/>
-              <w:bottom w:type="dxa" w:w="60"/>
-              <w:right w:type="dxa" w:w="100"/>
-            </w:tcMar>
-          </w:tcPr>
-          <w:p>
-            <w:r>
-              <w:rPr>
-                <w:color w:val="0A0A0A"/>
-                <w:sz w:val="18"/>
-                <w:szCs w:val="18"/>
-              </w:rPr>
-              <w:t xml:space="preserve">Allow motion, tap On shift. Live sensor trace moving</w:t>
-            </w:r>
-          </w:p>
-        </w:tc>
-        <w:tc>
-          <w:tcPr>
-            <w:tcW w:type="dxa" w:w="6898"/>
-            <w:tcBorders>
-              <w:top w:val="single" w:color="C9C9C4" w:sz="4"/>
-              <w:left w:val="single" w:color="C9C9C4" w:sz="4"/>
-              <w:bottom w:val="single" w:color="C9C9C4" w:sz="4"/>
-              <w:right w:val="single" w:color="C9C9C4" w:sz="4"/>
-            </w:tcBorders>
-            <w:tcMar>
-              <w:top w:type="dxa" w:w="60"/>
-              <w:left w:type="dxa" w:w="100"/>
-              <w:bottom w:type="dxa" w:w="60"/>
-              <w:right w:type="dxa" w:w="100"/>
-            </w:tcMar>
-          </w:tcPr>
-          <w:p>
-            <w:r>
-              <w:rPr>
-                <w:color w:val="0A0A0A"/>
-                <w:sz w:val="18"/>
-                <w:szCs w:val="18"/>
-              </w:rPr>
-              <w:t xml:space="preserve">Simone: "On shift, the phone streams its motion. Off shift, nothing is read."</w:t>
+            <w:tcW w:type="dxa" w:w="4769"/>
+            <w:tcBorders>
+              <w:top w:val="single" w:color="C9C9C4" w:sz="4"/>
+              <w:left w:val="single" w:color="C9C9C4" w:sz="4"/>
+              <w:bottom w:val="single" w:color="C9C9C4" w:sz="4"/>
+              <w:right w:val="single" w:color="C9C9C4" w:sz="4"/>
+            </w:tcBorders>
+            <w:tcMar>
+              <w:top w:type="dxa" w:w="60"/>
+              <w:left w:type="dxa" w:w="100"/>
+              <w:bottom w:type="dxa" w:w="60"/>
+              <w:right w:type="dxa" w:w="100"/>
+            </w:tcMar>
+          </w:tcPr>
+          <w:p>
+            <w:r>
+              <w:rPr>
+                <w:color w:val="0A0A0A"/>
+                <w:sz w:val="18"/>
+                <w:szCs w:val="18"/>
+              </w:rPr>
+              <w:t xml:space="preserve">Phone dropped onto a cushion: 30 second countdown, large I'm OK button. Cut to the laptop</w:t>
+            </w:r>
+          </w:p>
+        </w:tc>
+        <w:tc>
+          <w:tcPr>
+            <w:tcW w:type="dxa" w:w="4769"/>
+            <w:tcBorders>
+              <w:top w:val="single" w:color="C9C9C4" w:sz="4"/>
+              <w:left w:val="single" w:color="C9C9C4" w:sz="4"/>
+              <w:bottom w:val="single" w:color="C9C9C4" w:sz="4"/>
+              <w:right w:val="single" w:color="C9C9C4" w:sz="4"/>
+            </w:tcBorders>
+            <w:tcMar>
+              <w:top w:type="dxa" w:w="60"/>
+              <w:left w:type="dxa" w:w="100"/>
+              <w:bottom w:type="dxa" w:w="60"/>
+              <w:right w:type="dxa" w:w="100"/>
+            </w:tcMar>
+          </w:tcPr>
+          <w:p>
+            <w:r>
+              <w:rPr>
+                <w:color w:val="0A0A0A"/>
+                <w:sz w:val="18"/>
+                <w:szCs w:val="18"/>
+              </w:rPr>
+              <w:t xml:space="preserve">"Our model catches 93 percent of falls on people it never saw, at 93 percent precision."</w:t>
+            </w:r>
+          </w:p>
+        </w:tc>
+        <w:tc>
+          <w:tcPr>
+            <w:tcW w:type="dxa" w:w="4411"/>
+            <w:tcBorders>
+              <w:top w:val="single" w:color="C9C9C4" w:sz="4"/>
+              <w:left w:val="single" w:color="C9C9C4" w:sz="4"/>
+              <w:bottom w:val="single" w:color="C9C9C4" w:sz="4"/>
+              <w:right w:val="single" w:color="C9C9C4" w:sz="4"/>
+            </w:tcBorders>
+            <w:tcMar>
+              <w:top w:type="dxa" w:w="60"/>
+              <w:left w:type="dxa" w:w="100"/>
+              <w:bottom w:type="dxa" w:w="60"/>
+              <w:right w:type="dxa" w:w="100"/>
+            </w:tcMar>
+          </w:tcPr>
+          <w:p>
+            <w:r>
+              <w:rPr>
+                <w:color w:val="0A0A0A"/>
+                <w:sz w:val="18"/>
+                <w:szCs w:val="18"/>
+              </w:rPr>
+              <w:t xml:space="preserve">UMAFall, leave-subjects-out, 95% CIs, ml/out/results.md</w:t>
             </w:r>
           </w:p>
         </w:tc>
@@ -4073,82 +4158,109 @@
         </w:trPr>
         <w:tc>
           <w:tcPr>
-            <w:tcW w:type="dxa" w:w="1044"/>
-            <w:tcBorders>
-              <w:top w:val="single" w:color="C9C9C4" w:sz="4"/>
-              <w:left w:val="single" w:color="C9C9C4" w:sz="4"/>
-              <w:bottom w:val="single" w:color="C9C9C4" w:sz="4"/>
-              <w:right w:val="single" w:color="C9C9C4" w:sz="4"/>
-            </w:tcBorders>
-            <w:tcMar>
-              <w:top w:type="dxa" w:w="60"/>
-              <w:left w:type="dxa" w:w="100"/>
-              <w:bottom w:type="dxa" w:w="60"/>
-              <w:right w:type="dxa" w:w="100"/>
-            </w:tcMar>
-          </w:tcPr>
-          <w:p>
-            <w:r>
-              <w:rPr>
-                <w:color w:val="0A0A0A"/>
-                <w:sz w:val="18"/>
-                <w:szCs w:val="18"/>
-              </w:rPr>
-              <w:t xml:space="preserve">2:02</w:t>
-            </w:r>
-          </w:p>
-        </w:tc>
-        <w:tc>
-          <w:tcPr>
-            <w:tcW w:type="dxa" w:w="6896"/>
-            <w:tcBorders>
-              <w:top w:val="single" w:color="C9C9C4" w:sz="4"/>
-              <w:left w:val="single" w:color="C9C9C4" w:sz="4"/>
-              <w:bottom w:val="single" w:color="C9C9C4" w:sz="4"/>
-              <w:right w:val="single" w:color="C9C9C4" w:sz="4"/>
-            </w:tcBorders>
-            <w:tcMar>
-              <w:top w:type="dxa" w:w="60"/>
-              <w:left w:type="dxa" w:w="100"/>
-              <w:bottom w:type="dxa" w:w="60"/>
-              <w:right w:type="dxa" w:w="100"/>
-            </w:tcMar>
-          </w:tcPr>
-          <w:p>
-            <w:r>
-              <w:rPr>
-                <w:color w:val="0A0A0A"/>
-                <w:sz w:val="18"/>
-                <w:szCs w:val="18"/>
-              </w:rPr>
-              <w:t xml:space="preserve">Drop the phone onto a cushion. The 30 second countdown and the large I'm OK button appear</w:t>
-            </w:r>
-          </w:p>
-        </w:tc>
-        <w:tc>
-          <w:tcPr>
-            <w:tcW w:type="dxa" w:w="6898"/>
-            <w:tcBorders>
-              <w:top w:val="single" w:color="C9C9C4" w:sz="4"/>
-              <w:left w:val="single" w:color="C9C9C4" w:sz="4"/>
-              <w:bottom w:val="single" w:color="C9C9C4" w:sz="4"/>
-              <w:right w:val="single" w:color="C9C9C4" w:sz="4"/>
-            </w:tcBorders>
-            <w:tcMar>
-              <w:top w:type="dxa" w:w="60"/>
-              <w:left w:type="dxa" w:w="100"/>
-              <w:bottom w:type="dxa" w:w="60"/>
-              <w:right w:type="dxa" w:w="100"/>
-            </w:tcMar>
-          </w:tcPr>
-          <w:p>
-            <w:r>
-              <w:rPr>
-                <w:color w:val="0A0A0A"/>
-                <w:sz w:val="18"/>
-                <w:szCs w:val="18"/>
-              </w:rPr>
-              <w:t xml:space="preserve">Simone: "A drop like a fall. Thirty seconds to cancel, with a button you can hit wearing gloves."</w:t>
+            <w:tcW w:type="dxa" w:w="889"/>
+            <w:tcBorders>
+              <w:top w:val="single" w:color="C9C9C4" w:sz="4"/>
+              <w:left w:val="single" w:color="C9C9C4" w:sz="4"/>
+              <w:bottom w:val="single" w:color="C9C9C4" w:sz="4"/>
+              <w:right w:val="single" w:color="C9C9C4" w:sz="4"/>
+            </w:tcBorders>
+            <w:tcMar>
+              <w:top w:type="dxa" w:w="60"/>
+              <w:left w:type="dxa" w:w="100"/>
+              <w:bottom w:type="dxa" w:w="60"/>
+              <w:right w:type="dxa" w:w="100"/>
+            </w:tcMar>
+          </w:tcPr>
+          <w:p>
+            <w:r>
+              <w:rPr>
+                <w:color w:val="0A0A0A"/>
+                <w:sz w:val="18"/>
+                <w:szCs w:val="18"/>
+              </w:rPr>
+              <w:t xml:space="preserve">2:03</w:t>
+            </w:r>
+          </w:p>
+        </w:tc>
+        <w:tc>
+          <w:tcPr>
+            <w:tcW w:type="dxa" w:w="4769"/>
+            <w:tcBorders>
+              <w:top w:val="single" w:color="C9C9C4" w:sz="4"/>
+              <w:left w:val="single" w:color="C9C9C4" w:sz="4"/>
+              <w:bottom w:val="single" w:color="C9C9C4" w:sz="4"/>
+              <w:right w:val="single" w:color="C9C9C4" w:sz="4"/>
+            </w:tcBorders>
+            <w:tcMar>
+              <w:top w:type="dxa" w:w="60"/>
+              <w:left w:type="dxa" w:w="100"/>
+              <w:bottom w:type="dxa" w:w="60"/>
+              <w:right w:type="dxa" w:w="100"/>
+            </w:tcMar>
+          </w:tcPr>
+          <w:p>
+            <w:r>
+              <w:rPr>
+                <w:color w:val="0A0A0A"/>
+                <w:sz w:val="18"/>
+                <w:szCs w:val="18"/>
+              </w:rPr>
+              <w:t xml:space="preserve">Laptop /demo: Second app on, Crash, dispatcher card slides in</w:t>
+            </w:r>
+          </w:p>
+        </w:tc>
+        <w:tc>
+          <w:tcPr>
+            <w:tcW w:type="dxa" w:w="4769"/>
+            <w:tcBorders>
+              <w:top w:val="single" w:color="C9C9C4" w:sz="4"/>
+              <w:left w:val="single" w:color="C9C9C4" w:sz="4"/>
+              <w:bottom w:val="single" w:color="C9C9C4" w:sz="4"/>
+              <w:right w:val="single" w:color="C9C9C4" w:sz="4"/>
+            </w:tcBorders>
+            <w:tcMar>
+              <w:top w:type="dxa" w:w="60"/>
+              <w:left w:type="dxa" w:w="100"/>
+              <w:bottom w:type="dxa" w:w="60"/>
+              <w:right w:type="dxa" w:w="100"/>
+            </w:tcMar>
+          </w:tcPr>
+          <w:p>
+            <w:r>
+              <w:rPr>
+                <w:color w:val="0A0A0A"/>
+                <w:sz w:val="18"/>
+                <w:szCs w:val="18"/>
+              </w:rPr>
+              <w:t xml:space="preserve">"Thirty seconds without a tap, and dispatch gets the location and likely injury. The record names both apps."</w:t>
+            </w:r>
+          </w:p>
+        </w:tc>
+        <w:tc>
+          <w:tcPr>
+            <w:tcW w:type="dxa" w:w="4411"/>
+            <w:tcBorders>
+              <w:top w:val="single" w:color="C9C9C4" w:sz="4"/>
+              <w:left w:val="single" w:color="C9C9C4" w:sz="4"/>
+              <w:bottom w:val="single" w:color="C9C9C4" w:sz="4"/>
+              <w:right w:val="single" w:color="C9C9C4" w:sz="4"/>
+            </w:tcBorders>
+            <w:tcMar>
+              <w:top w:type="dxa" w:w="60"/>
+              <w:left w:type="dxa" w:w="100"/>
+              <w:bottom w:type="dxa" w:w="60"/>
+              <w:right w:type="dxa" w:w="100"/>
+            </w:tcMar>
+          </w:tcPr>
+          <w:p>
+            <w:r>
+              <w:rPr>
+                <w:color w:val="0A0A0A"/>
+                <w:sz w:val="18"/>
+                <w:szCs w:val="18"/>
+              </w:rPr>
+              <w:t xml:space="preserve">Demo rider, synthetic crash window</w:t>
             </w:r>
           </w:p>
         </w:tc>
@@ -4160,82 +4272,109 @@
         </w:trPr>
         <w:tc>
           <w:tcPr>
-            <w:tcW w:type="dxa" w:w="1044"/>
-            <w:tcBorders>
-              <w:top w:val="single" w:color="C9C9C4" w:sz="4"/>
-              <w:left w:val="single" w:color="C9C9C4" w:sz="4"/>
-              <w:bottom w:val="single" w:color="C9C9C4" w:sz="4"/>
-              <w:right w:val="single" w:color="C9C9C4" w:sz="4"/>
-            </w:tcBorders>
-            <w:tcMar>
-              <w:top w:type="dxa" w:w="60"/>
-              <w:left w:type="dxa" w:w="100"/>
-              <w:bottom w:type="dxa" w:w="60"/>
-              <w:right w:type="dxa" w:w="100"/>
-            </w:tcMar>
-          </w:tcPr>
-          <w:p>
-            <w:r>
-              <w:rPr>
-                <w:color w:val="0A0A0A"/>
-                <w:sz w:val="18"/>
-                <w:szCs w:val="18"/>
-              </w:rPr>
-              <w:t xml:space="preserve">2:09</w:t>
-            </w:r>
-          </w:p>
-        </w:tc>
-        <w:tc>
-          <w:tcPr>
-            <w:tcW w:type="dxa" w:w="6896"/>
-            <w:tcBorders>
-              <w:top w:val="single" w:color="C9C9C4" w:sz="4"/>
-              <w:left w:val="single" w:color="C9C9C4" w:sz="4"/>
-              <w:bottom w:val="single" w:color="C9C9C4" w:sz="4"/>
-              <w:right w:val="single" w:color="C9C9C4" w:sz="4"/>
-            </w:tcBorders>
-            <w:tcMar>
-              <w:top w:type="dxa" w:w="60"/>
-              <w:left w:type="dxa" w:w="100"/>
-              <w:bottom w:type="dxa" w:w="60"/>
-              <w:right w:type="dxa" w:w="100"/>
-            </w:tcMar>
-          </w:tcPr>
-          <w:p>
-            <w:r>
-              <w:rPr>
-                <w:color w:val="0A0A0A"/>
-                <w:sz w:val="18"/>
-                <w:szCs w:val="18"/>
-              </w:rPr>
-              <w:t xml:space="preserve">Laptop, /demo. Second app toggle on. Press Crash under Feed the detector. Sensor panel spikes, probability readout. Caption: "Demo rider, synthetic crash window"</w:t>
-            </w:r>
-          </w:p>
-        </w:tc>
-        <w:tc>
-          <w:tcPr>
-            <w:tcW w:type="dxa" w:w="6898"/>
-            <w:tcBorders>
-              <w:top w:val="single" w:color="C9C9C4" w:sz="4"/>
-              <w:left w:val="single" w:color="C9C9C4" w:sz="4"/>
-              <w:bottom w:val="single" w:color="C9C9C4" w:sz="4"/>
-              <w:right w:val="single" w:color="C9C9C4" w:sz="4"/>
-            </w:tcBorders>
-            <w:tcMar>
-              <w:top w:type="dxa" w:w="60"/>
-              <w:left w:type="dxa" w:w="100"/>
-              <w:bottom w:type="dxa" w:w="60"/>
-              <w:right w:type="dxa" w:w="100"/>
-            </w:tcMar>
-          </w:tcPr>
-          <w:p>
-            <w:r>
-              <w:rPr>
-                <w:color w:val="0A0A0A"/>
-                <w:sz w:val="18"/>
-                <w:szCs w:val="18"/>
-              </w:rPr>
-              <w:t xml:space="preserve">Karina: "On the full demo, the rider has orders open on two apps. The model reads the crash."</w:t>
+            <w:tcW w:type="dxa" w:w="889"/>
+            <w:tcBorders>
+              <w:top w:val="single" w:color="C9C9C4" w:sz="4"/>
+              <w:left w:val="single" w:color="C9C9C4" w:sz="4"/>
+              <w:bottom w:val="single" w:color="C9C9C4" w:sz="4"/>
+              <w:right w:val="single" w:color="C9C9C4" w:sz="4"/>
+            </w:tcBorders>
+            <w:tcMar>
+              <w:top w:type="dxa" w:w="60"/>
+              <w:left w:type="dxa" w:w="100"/>
+              <w:bottom w:type="dxa" w:w="60"/>
+              <w:right w:type="dxa" w:w="100"/>
+            </w:tcMar>
+          </w:tcPr>
+          <w:p>
+            <w:r>
+              <w:rPr>
+                <w:color w:val="0A0A0A"/>
+                <w:sz w:val="18"/>
+                <w:szCs w:val="18"/>
+              </w:rPr>
+              <w:t xml:space="preserve">2:11</w:t>
+            </w:r>
+          </w:p>
+        </w:tc>
+        <w:tc>
+          <w:tcPr>
+            <w:tcW w:type="dxa" w:w="4769"/>
+            <w:tcBorders>
+              <w:top w:val="single" w:color="C9C9C4" w:sz="4"/>
+              <w:left w:val="single" w:color="C9C9C4" w:sz="4"/>
+              <w:bottom w:val="single" w:color="C9C9C4" w:sz="4"/>
+              <w:right w:val="single" w:color="C9C9C4" w:sz="4"/>
+            </w:tcBorders>
+            <w:tcMar>
+              <w:top w:type="dxa" w:w="60"/>
+              <w:left w:type="dxa" w:w="100"/>
+              <w:bottom w:type="dxa" w:w="60"/>
+              <w:right w:type="dxa" w:w="100"/>
+            </w:tcMar>
+          </w:tcPr>
+          <w:p>
+            <w:r>
+              <w:rPr>
+                <w:color w:val="0A0A0A"/>
+                <w:sz w:val="18"/>
+                <w:szCs w:val="18"/>
+              </w:rPr>
+              <w:t xml:space="preserve">Underwriter panel: Paid, split 50 and 50 between Platform A and B, "Settlement verified"</w:t>
+            </w:r>
+          </w:p>
+        </w:tc>
+        <w:tc>
+          <w:tcPr>
+            <w:tcW w:type="dxa" w:w="4769"/>
+            <w:tcBorders>
+              <w:top w:val="single" w:color="C9C9C4" w:sz="4"/>
+              <w:left w:val="single" w:color="C9C9C4" w:sz="4"/>
+              <w:bottom w:val="single" w:color="C9C9C4" w:sz="4"/>
+              <w:right w:val="single" w:color="C9C9C4" w:sz="4"/>
+            </w:tcBorders>
+            <w:tcMar>
+              <w:top w:type="dxa" w:w="60"/>
+              <w:left w:type="dxa" w:w="100"/>
+              <w:bottom w:type="dxa" w:w="60"/>
+              <w:right w:type="dxa" w:w="100"/>
+            </w:tcMar>
+          </w:tcPr>
+          <w:p>
+            <w:r>
+              <w:rPr>
+                <w:color w:val="0A0A0A"/>
+                <w:sz w:val="18"/>
+                <w:szCs w:val="18"/>
+              </w:rPr>
+              <w:t xml:space="preserve">"Tier one pays and splits between platforms. Every record and payout is signed and hash-chained."</w:t>
+            </w:r>
+          </w:p>
+        </w:tc>
+        <w:tc>
+          <w:tcPr>
+            <w:tcW w:type="dxa" w:w="4411"/>
+            <w:tcBorders>
+              <w:top w:val="single" w:color="C9C9C4" w:sz="4"/>
+              <w:left w:val="single" w:color="C9C9C4" w:sz="4"/>
+              <w:bottom w:val="single" w:color="C9C9C4" w:sz="4"/>
+              <w:right w:val="single" w:color="C9C9C4" w:sz="4"/>
+            </w:tcBorders>
+            <w:tcMar>
+              <w:top w:type="dxa" w:w="60"/>
+              <w:left w:type="dxa" w:w="100"/>
+              <w:bottom w:type="dxa" w:w="60"/>
+              <w:right w:type="dxa" w:w="100"/>
+            </w:tcMar>
+          </w:tcPr>
+          <w:p>
+            <w:r>
+              <w:rPr>
+                <w:color w:val="0A0A0A"/>
+                <w:sz w:val="18"/>
+                <w:szCs w:val="18"/>
+              </w:rPr>
+              <w:t xml:space="preserve">Placeholder amounts</w:t>
             </w:r>
           </w:p>
         </w:tc>
@@ -4247,7 +4386,7 @@
         </w:trPr>
         <w:tc>
           <w:tcPr>
-            <w:tcW w:type="dxa" w:w="1044"/>
+            <w:tcW w:type="dxa" w:w="889"/>
             <w:tcBorders>
               <w:top w:val="single" w:color="C9C9C4" w:sz="4"/>
               <w:left w:val="single" w:color="C9C9C4" w:sz="4"/>
@@ -4274,55 +4413,82 @@
         </w:tc>
         <w:tc>
           <w:tcPr>
-            <w:tcW w:type="dxa" w:w="6896"/>
-            <w:tcBorders>
-              <w:top w:val="single" w:color="C9C9C4" w:sz="4"/>
-              <w:left w:val="single" w:color="C9C9C4" w:sz="4"/>
-              <w:bottom w:val="single" w:color="C9C9C4" w:sz="4"/>
-              <w:right w:val="single" w:color="C9C9C4" w:sz="4"/>
-            </w:tcBorders>
-            <w:tcMar>
-              <w:top w:type="dxa" w:w="60"/>
-              <w:left w:type="dxa" w:w="100"/>
-              <w:bottom w:type="dxa" w:w="60"/>
-              <w:right w:type="dxa" w:w="100"/>
-            </w:tcMar>
-          </w:tcPr>
-          <w:p>
-            <w:r>
-              <w:rPr>
-                <w:color w:val="0A0A0A"/>
-                <w:sz w:val="18"/>
-                <w:szCs w:val="18"/>
-              </w:rPr>
-              <w:t xml:space="preserve">Dispatcher card slides in. Hover "Copy for 999"</w:t>
-            </w:r>
-          </w:p>
-        </w:tc>
-        <w:tc>
-          <w:tcPr>
-            <w:tcW w:type="dxa" w:w="6898"/>
-            <w:tcBorders>
-              <w:top w:val="single" w:color="C9C9C4" w:sz="4"/>
-              <w:left w:val="single" w:color="C9C9C4" w:sz="4"/>
-              <w:bottom w:val="single" w:color="C9C9C4" w:sz="4"/>
-              <w:right w:val="single" w:color="C9C9C4" w:sz="4"/>
-            </w:tcBorders>
-            <w:tcMar>
-              <w:top w:type="dxa" w:w="60"/>
-              <w:left w:type="dxa" w:w="100"/>
-              <w:bottom w:type="dxa" w:w="60"/>
-              <w:right w:type="dxa" w:w="100"/>
-            </w:tcMar>
-          </w:tcPr>
-          <w:p>
-            <w:r>
-              <w:rPr>
-                <w:color w:val="0A0A0A"/>
-                <w:sz w:val="18"/>
-                <w:szCs w:val="18"/>
-              </w:rPr>
-              <w:t xml:space="preserve">Maalon: "Dispatch sees what happened, where, the likely injury and how to reach the rider."</w:t>
+            <w:tcW w:type="dxa" w:w="4769"/>
+            <w:tcBorders>
+              <w:top w:val="single" w:color="C9C9C4" w:sz="4"/>
+              <w:left w:val="single" w:color="C9C9C4" w:sz="4"/>
+              <w:bottom w:val="single" w:color="C9C9C4" w:sz="4"/>
+              <w:right w:val="single" w:color="C9C9C4" w:sz="4"/>
+            </w:tcBorders>
+            <w:tcMar>
+              <w:top w:type="dxa" w:w="60"/>
+              <w:left w:type="dxa" w:w="100"/>
+              <w:bottom w:type="dxa" w:w="60"/>
+              <w:right w:type="dxa" w:w="100"/>
+            </w:tcMar>
+          </w:tcPr>
+          <w:p>
+            <w:r>
+              <w:rPr>
+                <w:color w:val="0A0A0A"/>
+                <w:sz w:val="18"/>
+                <w:szCs w:val="18"/>
+              </w:rPr>
+              <w:t xml:space="preserve">Terminal beside the browser: /api/verify returns valid; payoutHkd edited to 80000, returns invalid</w:t>
+            </w:r>
+          </w:p>
+        </w:tc>
+        <w:tc>
+          <w:tcPr>
+            <w:tcW w:type="dxa" w:w="4769"/>
+            <w:tcBorders>
+              <w:top w:val="single" w:color="C9C9C4" w:sz="4"/>
+              <w:left w:val="single" w:color="C9C9C4" w:sz="4"/>
+              <w:bottom w:val="single" w:color="C9C9C4" w:sz="4"/>
+              <w:right w:val="single" w:color="C9C9C4" w:sz="4"/>
+            </w:tcBorders>
+            <w:tcMar>
+              <w:top w:type="dxa" w:w="60"/>
+              <w:left w:type="dxa" w:w="100"/>
+              <w:bottom w:type="dxa" w:w="60"/>
+              <w:right w:type="dxa" w:w="100"/>
+            </w:tcMar>
+          </w:tcPr>
+          <w:p>
+            <w:r>
+              <w:rPr>
+                <w:color w:val="0A0A0A"/>
+                <w:sz w:val="18"/>
+                <w:szCs w:val="18"/>
+              </w:rPr>
+              <w:t xml:space="preserve">"Edit one number and verification fails. Nobody can quietly change a claim."</w:t>
+            </w:r>
+          </w:p>
+        </w:tc>
+        <w:tc>
+          <w:tcPr>
+            <w:tcW w:type="dxa" w:w="4411"/>
+            <w:tcBorders>
+              <w:top w:val="single" w:color="C9C9C4" w:sz="4"/>
+              <w:left w:val="single" w:color="C9C9C4" w:sz="4"/>
+              <w:bottom w:val="single" w:color="C9C9C4" w:sz="4"/>
+              <w:right w:val="single" w:color="C9C9C4" w:sz="4"/>
+            </w:tcBorders>
+            <w:tcMar>
+              <w:top w:type="dxa" w:w="60"/>
+              <w:left w:type="dxa" w:w="100"/>
+              <w:bottom w:type="dxa" w:w="60"/>
+              <w:right w:type="dxa" w:w="100"/>
+            </w:tcMar>
+          </w:tcPr>
+          <w:p>
+            <w:r>
+              <w:rPr>
+                <w:color w:val="0A0A0A"/>
+                <w:sz w:val="18"/>
+                <w:szCs w:val="18"/>
+              </w:rPr>
+              <w:t xml:space="preserve"/>
             </w:r>
           </w:p>
         </w:tc>
@@ -4334,82 +4500,109 @@
         </w:trPr>
         <w:tc>
           <w:tcPr>
-            <w:tcW w:type="dxa" w:w="1044"/>
-            <w:tcBorders>
-              <w:top w:val="single" w:color="C9C9C4" w:sz="4"/>
-              <w:left w:val="single" w:color="C9C9C4" w:sz="4"/>
-              <w:bottom w:val="single" w:color="C9C9C4" w:sz="4"/>
-              <w:right w:val="single" w:color="C9C9C4" w:sz="4"/>
-            </w:tcBorders>
-            <w:tcMar>
-              <w:top w:type="dxa" w:w="60"/>
-              <w:left w:type="dxa" w:w="100"/>
-              <w:bottom w:type="dxa" w:w="60"/>
-              <w:right w:type="dxa" w:w="100"/>
-            </w:tcMar>
-          </w:tcPr>
-          <w:p>
-            <w:r>
-              <w:rPr>
-                <w:color w:val="0A0A0A"/>
-                <w:sz w:val="18"/>
-                <w:szCs w:val="18"/>
-              </w:rPr>
-              <w:t xml:space="preserve">2:25</w:t>
-            </w:r>
-          </w:p>
-        </w:tc>
-        <w:tc>
-          <w:tcPr>
-            <w:tcW w:type="dxa" w:w="6896"/>
-            <w:tcBorders>
-              <w:top w:val="single" w:color="C9C9C4" w:sz="4"/>
-              <w:left w:val="single" w:color="C9C9C4" w:sz="4"/>
-              <w:bottom w:val="single" w:color="C9C9C4" w:sz="4"/>
-              <w:right w:val="single" w:color="C9C9C4" w:sz="4"/>
-            </w:tcBorders>
-            <w:tcMar>
-              <w:top w:type="dxa" w:w="60"/>
-              <w:left w:type="dxa" w:w="100"/>
-              <w:bottom w:type="dxa" w:w="60"/>
-              <w:right w:type="dxa" w:w="100"/>
-            </w:tcMar>
-          </w:tcPr>
-          <w:p>
-            <w:r>
-              <w:rPr>
-                <w:color w:val="0A0A0A"/>
-                <w:sz w:val="18"/>
-                <w:szCs w:val="18"/>
-              </w:rPr>
-              <w:t xml:space="preserve">Let the 30 s run out. Underwriter panel: Paid, HK$8,000, split 50 and 50 between Platform A and B, "Settlement verified". Caption: "Placeholder amounts"</w:t>
-            </w:r>
-          </w:p>
-        </w:tc>
-        <w:tc>
-          <w:tcPr>
-            <w:tcW w:type="dxa" w:w="6898"/>
-            <w:tcBorders>
-              <w:top w:val="single" w:color="C9C9C4" w:sz="4"/>
-              <w:left w:val="single" w:color="C9C9C4" w:sz="4"/>
-              <w:bottom w:val="single" w:color="C9C9C4" w:sz="4"/>
-              <w:right w:val="single" w:color="C9C9C4" w:sz="4"/>
-            </w:tcBorders>
-            <w:tcMar>
-              <w:top w:type="dxa" w:w="60"/>
-              <w:left w:type="dxa" w:w="100"/>
-              <w:bottom w:type="dxa" w:w="60"/>
-              <w:right w:type="dxa" w:w="100"/>
-            </w:tcMar>
-          </w:tcPr>
-          <w:p>
-            <w:r>
-              <w:rPr>
-                <w:color w:val="0A0A0A"/>
-                <w:sz w:val="18"/>
-                <w:szCs w:val="18"/>
-              </w:rPr>
-              <w:t xml:space="preserve">Alysa: "No answer, so tier one pays, split across both apps."</w:t>
+            <w:tcW w:type="dxa" w:w="889"/>
+            <w:tcBorders>
+              <w:top w:val="single" w:color="C9C9C4" w:sz="4"/>
+              <w:left w:val="single" w:color="C9C9C4" w:sz="4"/>
+              <w:bottom w:val="single" w:color="C9C9C4" w:sz="4"/>
+              <w:right w:val="single" w:color="C9C9C4" w:sz="4"/>
+            </w:tcBorders>
+            <w:tcMar>
+              <w:top w:type="dxa" w:w="60"/>
+              <w:left w:type="dxa" w:w="100"/>
+              <w:bottom w:type="dxa" w:w="60"/>
+              <w:right w:type="dxa" w:w="100"/>
+            </w:tcMar>
+          </w:tcPr>
+          <w:p>
+            <w:r>
+              <w:rPr>
+                <w:color w:val="0A0A0A"/>
+                <w:sz w:val="18"/>
+                <w:szCs w:val="18"/>
+              </w:rPr>
+              <w:t xml:space="preserve">2:24</w:t>
+            </w:r>
+          </w:p>
+        </w:tc>
+        <w:tc>
+          <w:tcPr>
+            <w:tcW w:type="dxa" w:w="4769"/>
+            <w:tcBorders>
+              <w:top w:val="single" w:color="C9C9C4" w:sz="4"/>
+              <w:left w:val="single" w:color="C9C9C4" w:sz="4"/>
+              <w:bottom w:val="single" w:color="C9C9C4" w:sz="4"/>
+              <w:right w:val="single" w:color="C9C9C4" w:sz="4"/>
+            </w:tcBorders>
+            <w:tcMar>
+              <w:top w:type="dxa" w:w="60"/>
+              <w:left w:type="dxa" w:w="100"/>
+              <w:bottom w:type="dxa" w:w="60"/>
+              <w:right w:type="dxa" w:w="100"/>
+            </w:tcMar>
+          </w:tcPr>
+          <w:p>
+            <w:r>
+              <w:rPr>
+                <w:color w:val="0A0A0A"/>
+                <w:sz w:val="18"/>
+                <w:szCs w:val="18"/>
+              </w:rPr>
+              <w:t xml:space="preserve">/labour: injuries by time left on the delivery clock, hazard cells ranked by rate</w:t>
+            </w:r>
+          </w:p>
+        </w:tc>
+        <w:tc>
+          <w:tcPr>
+            <w:tcW w:type="dxa" w:w="4769"/>
+            <w:tcBorders>
+              <w:top w:val="single" w:color="C9C9C4" w:sz="4"/>
+              <w:left w:val="single" w:color="C9C9C4" w:sz="4"/>
+              <w:bottom w:val="single" w:color="C9C9C4" w:sz="4"/>
+              <w:right w:val="single" w:color="C9C9C4" w:sz="4"/>
+            </w:tcBorders>
+            <w:tcMar>
+              <w:top w:type="dxa" w:w="60"/>
+              <w:left w:type="dxa" w:w="100"/>
+              <w:bottom w:type="dxa" w:w="60"/>
+              <w:right w:type="dxa" w:w="100"/>
+            </w:tcMar>
+          </w:tcPr>
+          <w:p>
+            <w:r>
+              <w:rPr>
+                <w:color w:val="0A0A0A"/>
+                <w:sz w:val="18"/>
+                <w:szCs w:val="18"/>
+              </w:rPr>
+              <w:t xml:space="preserve">"The Labour Department sees aggregates only: no rider ids, no routes."</w:t>
+            </w:r>
+          </w:p>
+        </w:tc>
+        <w:tc>
+          <w:tcPr>
+            <w:tcW w:type="dxa" w:w="4411"/>
+            <w:tcBorders>
+              <w:top w:val="single" w:color="C9C9C4" w:sz="4"/>
+              <w:left w:val="single" w:color="C9C9C4" w:sz="4"/>
+              <w:bottom w:val="single" w:color="C9C9C4" w:sz="4"/>
+              <w:right w:val="single" w:color="C9C9C4" w:sz="4"/>
+            </w:tcBorders>
+            <w:tcMar>
+              <w:top w:type="dxa" w:w="60"/>
+              <w:left w:type="dxa" w:w="100"/>
+              <w:bottom w:type="dxa" w:w="60"/>
+              <w:right w:type="dxa" w:w="100"/>
+            </w:tcMar>
+          </w:tcPr>
+          <w:p>
+            <w:r>
+              <w:rPr>
+                <w:color w:val="0A0A0A"/>
+                <w:sz w:val="18"/>
+                <w:szCs w:val="18"/>
+              </w:rPr>
+              <w:t xml:space="preserve"/>
             </w:r>
           </w:p>
         </w:tc>
@@ -4421,343 +4614,109 @@
         </w:trPr>
         <w:tc>
           <w:tcPr>
-            <w:tcW w:type="dxa" w:w="1044"/>
-            <w:tcBorders>
-              <w:top w:val="single" w:color="C9C9C4" w:sz="4"/>
-              <w:left w:val="single" w:color="C9C9C4" w:sz="4"/>
-              <w:bottom w:val="single" w:color="C9C9C4" w:sz="4"/>
-              <w:right w:val="single" w:color="C9C9C4" w:sz="4"/>
-            </w:tcBorders>
-            <w:tcMar>
-              <w:top w:type="dxa" w:w="60"/>
-              <w:left w:type="dxa" w:w="100"/>
-              <w:bottom w:type="dxa" w:w="60"/>
-              <w:right w:type="dxa" w:w="100"/>
-            </w:tcMar>
-          </w:tcPr>
-          <w:p>
-            <w:r>
-              <w:rPr>
-                <w:color w:val="0A0A0A"/>
-                <w:sz w:val="18"/>
-                <w:szCs w:val="18"/>
-              </w:rPr>
-              <w:t xml:space="preserve">2:35</w:t>
-            </w:r>
-          </w:p>
-        </w:tc>
-        <w:tc>
-          <w:tcPr>
-            <w:tcW w:type="dxa" w:w="6896"/>
-            <w:tcBorders>
-              <w:top w:val="single" w:color="C9C9C4" w:sz="4"/>
-              <w:left w:val="single" w:color="C9C9C4" w:sz="4"/>
-              <w:bottom w:val="single" w:color="C9C9C4" w:sz="4"/>
-              <w:right w:val="single" w:color="C9C9C4" w:sz="4"/>
-            </w:tcBorders>
-            <w:tcMar>
-              <w:top w:type="dxa" w:w="60"/>
-              <w:left w:type="dxa" w:w="100"/>
-              <w:bottom w:type="dxa" w:w="60"/>
-              <w:right w:type="dxa" w:w="100"/>
-            </w:tcMar>
-          </w:tcPr>
-          <w:p>
-            <w:r>
-              <w:rPr>
-                <w:color w:val="0A0A0A"/>
-                <w:sz w:val="18"/>
-                <w:szCs w:val="18"/>
-              </w:rPr>
-              <w:t xml:space="preserve">/r/EVT-... rider's signed copy: open orders, the split, "Signature verified", claim block with the one-year deadline</w:t>
-            </w:r>
-          </w:p>
-        </w:tc>
-        <w:tc>
-          <w:tcPr>
-            <w:tcW w:type="dxa" w:w="6898"/>
-            <w:tcBorders>
-              <w:top w:val="single" w:color="C9C9C4" w:sz="4"/>
-              <w:left w:val="single" w:color="C9C9C4" w:sz="4"/>
-              <w:bottom w:val="single" w:color="C9C9C4" w:sz="4"/>
-              <w:right w:val="single" w:color="C9C9C4" w:sz="4"/>
-            </w:tcBorders>
-            <w:tcMar>
-              <w:top w:type="dxa" w:w="60"/>
-              <w:left w:type="dxa" w:w="100"/>
-              <w:bottom w:type="dxa" w:w="60"/>
-              <w:right w:type="dxa" w:w="100"/>
-            </w:tcMar>
-          </w:tcPr>
-          <w:p>
-            <w:r>
-              <w:rPr>
-                <w:color w:val="0A0A0A"/>
-                <w:sz w:val="18"/>
-                <w:szCs w:val="18"/>
-              </w:rPr>
-              <w:t xml:space="preserve">Simone: "The rider gets a signed copy they own, with a claim reference and the deadline."</w:t>
-            </w:r>
-          </w:p>
-        </w:tc>
-      </w:tr>
-      <w:tr>
-        <w:trPr>
-          <w:cantSplit/>
-          <w:tblHeader w:val="off"/>
-        </w:trPr>
-        <w:tc>
-          <w:tcPr>
-            <w:tcW w:type="dxa" w:w="1044"/>
-            <w:tcBorders>
-              <w:top w:val="single" w:color="C9C9C4" w:sz="4"/>
-              <w:left w:val="single" w:color="C9C9C4" w:sz="4"/>
-              <w:bottom w:val="single" w:color="C9C9C4" w:sz="4"/>
-              <w:right w:val="single" w:color="C9C9C4" w:sz="4"/>
-            </w:tcBorders>
-            <w:tcMar>
-              <w:top w:type="dxa" w:w="60"/>
-              <w:left w:type="dxa" w:w="100"/>
-              <w:bottom w:type="dxa" w:w="60"/>
-              <w:right w:type="dxa" w:w="100"/>
-            </w:tcMar>
-          </w:tcPr>
-          <w:p>
-            <w:r>
-              <w:rPr>
-                <w:color w:val="0A0A0A"/>
-                <w:sz w:val="18"/>
-                <w:szCs w:val="18"/>
-              </w:rPr>
-              <w:t xml:space="preserve">2:43</w:t>
-            </w:r>
-          </w:p>
-        </w:tc>
-        <w:tc>
-          <w:tcPr>
-            <w:tcW w:type="dxa" w:w="6896"/>
-            <w:tcBorders>
-              <w:top w:val="single" w:color="C9C9C4" w:sz="4"/>
-              <w:left w:val="single" w:color="C9C9C4" w:sz="4"/>
-              <w:bottom w:val="single" w:color="C9C9C4" w:sz="4"/>
-              <w:right w:val="single" w:color="C9C9C4" w:sz="4"/>
-            </w:tcBorders>
-            <w:tcMar>
-              <w:top w:type="dxa" w:w="60"/>
-              <w:left w:type="dxa" w:w="100"/>
-              <w:bottom w:type="dxa" w:w="60"/>
-              <w:right w:type="dxa" w:w="100"/>
-            </w:tcMar>
-          </w:tcPr>
-          <w:p>
-            <w:r>
-              <w:rPr>
-                <w:color w:val="0A0A0A"/>
-                <w:sz w:val="18"/>
-                <w:szCs w:val="18"/>
-              </w:rPr>
-              <w:t xml:space="preserve">Terminal beside the browser: POST the record to /api/verify, "valid": true. Change payoutHkd to 80000, post again, "settlementValid": false</w:t>
-            </w:r>
-          </w:p>
-        </w:tc>
-        <w:tc>
-          <w:tcPr>
-            <w:tcW w:type="dxa" w:w="6898"/>
-            <w:tcBorders>
-              <w:top w:val="single" w:color="C9C9C4" w:sz="4"/>
-              <w:left w:val="single" w:color="C9C9C4" w:sz="4"/>
-              <w:bottom w:val="single" w:color="C9C9C4" w:sz="4"/>
-              <w:right w:val="single" w:color="C9C9C4" w:sz="4"/>
-            </w:tcBorders>
-            <w:tcMar>
-              <w:top w:type="dxa" w:w="60"/>
-              <w:left w:type="dxa" w:w="100"/>
-              <w:bottom w:type="dxa" w:w="60"/>
-              <w:right w:type="dxa" w:w="100"/>
-            </w:tcMar>
-          </w:tcPr>
-          <w:p>
-            <w:r>
-              <w:rPr>
-                <w:color w:val="0A0A0A"/>
-                <w:sz w:val="18"/>
-                <w:szCs w:val="18"/>
-              </w:rPr>
-              <w:t xml:space="preserve">Simone: "Change one number and the signature fails. Nobody can quietly edit a claim, including us."</w:t>
-            </w:r>
-          </w:p>
-        </w:tc>
-      </w:tr>
-      <w:tr>
-        <w:trPr>
-          <w:cantSplit/>
-          <w:tblHeader w:val="off"/>
-        </w:trPr>
-        <w:tc>
-          <w:tcPr>
-            <w:tcW w:type="dxa" w:w="1044"/>
-            <w:tcBorders>
-              <w:top w:val="single" w:color="C9C9C4" w:sz="4"/>
-              <w:left w:val="single" w:color="C9C9C4" w:sz="4"/>
-              <w:bottom w:val="single" w:color="C9C9C4" w:sz="4"/>
-              <w:right w:val="single" w:color="C9C9C4" w:sz="4"/>
-            </w:tcBorders>
-            <w:tcMar>
-              <w:top w:type="dxa" w:w="60"/>
-              <w:left w:type="dxa" w:w="100"/>
-              <w:bottom w:type="dxa" w:w="60"/>
-              <w:right w:type="dxa" w:w="100"/>
-            </w:tcMar>
-          </w:tcPr>
-          <w:p>
-            <w:r>
-              <w:rPr>
-                <w:color w:val="0A0A0A"/>
-                <w:sz w:val="18"/>
-                <w:szCs w:val="18"/>
-              </w:rPr>
-              <w:t xml:space="preserve">2:52</w:t>
-            </w:r>
-          </w:p>
-        </w:tc>
-        <w:tc>
-          <w:tcPr>
-            <w:tcW w:type="dxa" w:w="6896"/>
-            <w:tcBorders>
-              <w:top w:val="single" w:color="C9C9C4" w:sz="4"/>
-              <w:left w:val="single" w:color="C9C9C4" w:sz="4"/>
-              <w:bottom w:val="single" w:color="C9C9C4" w:sz="4"/>
-              <w:right w:val="single" w:color="C9C9C4" w:sz="4"/>
-            </w:tcBorders>
-            <w:tcMar>
-              <w:top w:type="dxa" w:w="60"/>
-              <w:left w:type="dxa" w:w="100"/>
-              <w:bottom w:type="dxa" w:w="60"/>
-              <w:right w:type="dxa" w:w="100"/>
-            </w:tcMar>
-          </w:tcPr>
-          <w:p>
-            <w:r>
-              <w:rPr>
-                <w:color w:val="0A0A0A"/>
-                <w:sz w:val="18"/>
-                <w:szCs w:val="18"/>
-              </w:rPr>
-              <w:t xml:space="preserve">/labour: injuries by time left on the delivery clock, hazard cells ranked by rate</w:t>
-            </w:r>
-          </w:p>
-        </w:tc>
-        <w:tc>
-          <w:tcPr>
-            <w:tcW w:type="dxa" w:w="6898"/>
-            <w:tcBorders>
-              <w:top w:val="single" w:color="C9C9C4" w:sz="4"/>
-              <w:left w:val="single" w:color="C9C9C4" w:sz="4"/>
-              <w:bottom w:val="single" w:color="C9C9C4" w:sz="4"/>
-              <w:right w:val="single" w:color="C9C9C4" w:sz="4"/>
-            </w:tcBorders>
-            <w:tcMar>
-              <w:top w:type="dxa" w:w="60"/>
-              <w:left w:type="dxa" w:w="100"/>
-              <w:bottom w:type="dxa" w:w="60"/>
-              <w:right w:type="dxa" w:w="100"/>
-            </w:tcMar>
-          </w:tcPr>
-          <w:p>
-            <w:r>
-              <w:rPr>
-                <w:color w:val="0A0A0A"/>
-                <w:sz w:val="18"/>
-                <w:szCs w:val="18"/>
-              </w:rPr>
-              <w:t xml:space="preserve">Karina: "The Labour Department sees totals only. No names, no routes. And for the first time, injuries set against delivery deadlines."</w:t>
-            </w:r>
-          </w:p>
-        </w:tc>
-      </w:tr>
-      <w:tr>
-        <w:trPr>
-          <w:cantSplit/>
-          <w:tblHeader w:val="off"/>
-        </w:trPr>
-        <w:tc>
-          <w:tcPr>
-            <w:tcW w:type="dxa" w:w="1044"/>
-            <w:tcBorders>
-              <w:top w:val="single" w:color="C9C9C4" w:sz="4"/>
-              <w:left w:val="single" w:color="C9C9C4" w:sz="4"/>
-              <w:bottom w:val="single" w:color="C9C9C4" w:sz="4"/>
-              <w:right w:val="single" w:color="C9C9C4" w:sz="4"/>
-            </w:tcBorders>
-            <w:tcMar>
-              <w:top w:type="dxa" w:w="60"/>
-              <w:left w:type="dxa" w:w="100"/>
-              <w:bottom w:type="dxa" w:w="60"/>
-              <w:right w:type="dxa" w:w="100"/>
-            </w:tcMar>
-          </w:tcPr>
-          <w:p>
-            <w:r>
-              <w:rPr>
-                <w:color w:val="0A0A0A"/>
-                <w:sz w:val="18"/>
-                <w:szCs w:val="18"/>
-              </w:rPr>
-              <w:t xml:space="preserve">2:59</w:t>
-            </w:r>
-          </w:p>
-        </w:tc>
-        <w:tc>
-          <w:tcPr>
-            <w:tcW w:type="dxa" w:w="6896"/>
-            <w:tcBorders>
-              <w:top w:val="single" w:color="C9C9C4" w:sz="4"/>
-              <w:left w:val="single" w:color="C9C9C4" w:sz="4"/>
-              <w:bottom w:val="single" w:color="C9C9C4" w:sz="4"/>
-              <w:right w:val="single" w:color="C9C9C4" w:sz="4"/>
-            </w:tcBorders>
-            <w:tcMar>
-              <w:top w:type="dxa" w:w="60"/>
-              <w:left w:type="dxa" w:w="100"/>
-              <w:bottom w:type="dxa" w:w="60"/>
-              <w:right w:type="dxa" w:w="100"/>
-            </w:tcMar>
-          </w:tcPr>
-          <w:p>
-            <w:r>
-              <w:rPr>
-                <w:color w:val="0A0A0A"/>
-                <w:sz w:val="18"/>
-                <w:szCs w:val="18"/>
-              </w:rPr>
-              <w:t xml:space="preserve">Landing page model section: recall and precision bars animate in</w:t>
-            </w:r>
-          </w:p>
-        </w:tc>
-        <w:tc>
-          <w:tcPr>
-            <w:tcW w:type="dxa" w:w="6898"/>
-            <w:tcBorders>
-              <w:top w:val="single" w:color="C9C9C4" w:sz="4"/>
-              <w:left w:val="single" w:color="C9C9C4" w:sz="4"/>
-              <w:bottom w:val="single" w:color="C9C9C4" w:sz="4"/>
-              <w:right w:val="single" w:color="C9C9C4" w:sz="4"/>
-            </w:tcBorders>
-            <w:tcMar>
-              <w:top w:type="dxa" w:w="60"/>
-              <w:left w:type="dxa" w:w="100"/>
-              <w:bottom w:type="dxa" w:w="60"/>
-              <w:right w:type="dxa" w:w="100"/>
-            </w:tcMar>
-          </w:tcPr>
-          <w:p>
-            <w:r>
-              <w:rPr>
-                <w:color w:val="0A0A0A"/>
-                <w:sz w:val="18"/>
-                <w:szCs w:val="18"/>
-              </w:rPr>
-              <w:t xml:space="preserve">Karina: "Ninety-three percent of falls caught, at ninety-three percent precision, on people the model never saw."</w:t>
+            <w:tcW w:type="dxa" w:w="889"/>
+            <w:tcBorders>
+              <w:top w:val="single" w:color="C9C9C4" w:sz="4"/>
+              <w:left w:val="single" w:color="C9C9C4" w:sz="4"/>
+              <w:bottom w:val="single" w:color="C9C9C4" w:sz="4"/>
+              <w:right w:val="single" w:color="C9C9C4" w:sz="4"/>
+            </w:tcBorders>
+            <w:tcMar>
+              <w:top w:type="dxa" w:w="60"/>
+              <w:left w:type="dxa" w:w="100"/>
+              <w:bottom w:type="dxa" w:w="60"/>
+              <w:right w:type="dxa" w:w="100"/>
+            </w:tcMar>
+          </w:tcPr>
+          <w:p>
+            <w:r>
+              <w:rPr>
+                <w:color w:val="0A0A0A"/>
+                <w:sz w:val="18"/>
+                <w:szCs w:val="18"/>
+              </w:rPr>
+              <w:t xml:space="preserve">2:30</w:t>
+            </w:r>
+          </w:p>
+        </w:tc>
+        <w:tc>
+          <w:tcPr>
+            <w:tcW w:type="dxa" w:w="4769"/>
+            <w:tcBorders>
+              <w:top w:val="single" w:color="C9C9C4" w:sz="4"/>
+              <w:left w:val="single" w:color="C9C9C4" w:sz="4"/>
+              <w:bottom w:val="single" w:color="C9C9C4" w:sz="4"/>
+              <w:right w:val="single" w:color="C9C9C4" w:sz="4"/>
+            </w:tcBorders>
+            <w:tcMar>
+              <w:top w:type="dxa" w:w="60"/>
+              <w:left w:type="dxa" w:w="100"/>
+              <w:bottom w:type="dxa" w:w="60"/>
+              <w:right w:type="dxa" w:w="100"/>
+            </w:tcMar>
+          </w:tcPr>
+          <w:p>
+            <w:r>
+              <w:rPr>
+                <w:color w:val="0A0A0A"/>
+                <w:sz w:val="18"/>
+                <w:szCs w:val="18"/>
+              </w:rPr>
+              <w:t xml:space="preserve">README section "Are the numbers real?": results table with intervals, the real riding rows</w:t>
+            </w:r>
+          </w:p>
+        </w:tc>
+        <w:tc>
+          <w:tcPr>
+            <w:tcW w:type="dxa" w:w="4769"/>
+            <w:tcBorders>
+              <w:top w:val="single" w:color="C9C9C4" w:sz="4"/>
+              <w:left w:val="single" w:color="C9C9C4" w:sz="4"/>
+              <w:bottom w:val="single" w:color="C9C9C4" w:sz="4"/>
+              <w:right w:val="single" w:color="C9C9C4" w:sz="4"/>
+            </w:tcBorders>
+            <w:tcMar>
+              <w:top w:type="dxa" w:w="60"/>
+              <w:left w:type="dxa" w:w="100"/>
+              <w:bottom w:type="dxa" w:w="60"/>
+              <w:right w:type="dxa" w:w="100"/>
+            </w:tcMar>
+          </w:tcPr>
+          <w:p>
+            <w:r>
+              <w:rPr>
+                <w:color w:val="0A0A0A"/>
+                <w:sz w:val="18"/>
+                <w:szCs w:val="18"/>
+              </w:rPr>
+              <w:t xml:space="preserve">"Every number is published with confidence intervals. On fifteen hours of real motorbike riding, one false alarm every five hours."</w:t>
+            </w:r>
+          </w:p>
+        </w:tc>
+        <w:tc>
+          <w:tcPr>
+            <w:tcW w:type="dxa" w:w="4411"/>
+            <w:tcBorders>
+              <w:top w:val="single" w:color="C9C9C4" w:sz="4"/>
+              <w:left w:val="single" w:color="C9C9C4" w:sz="4"/>
+              <w:bottom w:val="single" w:color="C9C9C4" w:sz="4"/>
+              <w:right w:val="single" w:color="C9C9C4" w:sz="4"/>
+            </w:tcBorders>
+            <w:tcMar>
+              <w:top w:type="dxa" w:w="60"/>
+              <w:left w:type="dxa" w:w="100"/>
+              <w:bottom w:type="dxa" w:w="60"/>
+              <w:right w:type="dxa" w:w="100"/>
+            </w:tcMar>
+          </w:tcPr>
+          <w:p>
+            <w:r>
+              <w:rPr>
+                <w:color w:val="0A0A0A"/>
+                <w:sz w:val="18"/>
+                <w:szCs w:val="18"/>
+              </w:rPr>
+              <w:t xml:space="preserve">TU Wien motorcyclist IMU dataset, ml/PUBLIC_RIDES.md</w:t>
             </w:r>
           </w:p>
         </w:tc>
@@ -4773,7 +4732,591 @@
         <w:spacing w:after="120"/>
       </w:pPr>
       <w:r>
-        <w:t xml:space="preserve">About 170 words, 75 seconds. Source corner on the last shot: "UMAFall, leave-subjects-out, 95% CIs, ml/out/results.md".</w:t>
+        <w:t xml:space="preserve">About 115 words, 47 seconds at a natural pace.</w:t>
+      </w:r>
+    </w:p>
+    <w:p>
+      <w:pPr>
+        <w:spacing w:after="120"/>
+      </w:pPr>
+      <w:r>
+        <w:t xml:space="preserve">What each beat shows the judges:</w:t>
+      </w:r>
+    </w:p>
+    <w:tbl>
+      <w:tblPr>
+        <w:tblW w:type="dxa" w:w="14838"/>
+        <w:tblBorders>
+          <w:top w:val="single" w:color="auto" w:sz="4"/>
+          <w:left w:val="single" w:color="auto" w:sz="4"/>
+          <w:bottom w:val="single" w:color="auto" w:sz="4"/>
+          <w:right w:val="single" w:color="auto" w:sz="4"/>
+          <w:insideH w:val="single" w:color="auto" w:sz="4"/>
+          <w:insideV w:val="single" w:color="auto" w:sz="4"/>
+        </w:tblBorders>
+      </w:tblPr>
+      <w:tblGrid>
+        <w:gridCol w:w="6171"/>
+        <w:gridCol w:w="8667"/>
+      </w:tblGrid>
+      <w:tr>
+        <w:trPr>
+          <w:cantSplit/>
+          <w:tblHeader/>
+        </w:trPr>
+        <w:tc>
+          <w:tcPr>
+            <w:tcW w:type="dxa" w:w="6171"/>
+            <w:tcBorders>
+              <w:top w:val="single" w:color="C9C9C4" w:sz="4"/>
+              <w:left w:val="single" w:color="C9C9C4" w:sz="4"/>
+              <w:bottom w:val="single" w:color="C9C9C4" w:sz="4"/>
+              <w:right w:val="single" w:color="C9C9C4" w:sz="4"/>
+            </w:tcBorders>
+            <w:shd w:fill="EDE9FF" w:color="auto" w:val="clear"/>
+            <w:tcMar>
+              <w:top w:type="dxa" w:w="60"/>
+              <w:left w:type="dxa" w:w="100"/>
+              <w:bottom w:type="dxa" w:w="60"/>
+              <w:right w:type="dxa" w:w="100"/>
+            </w:tcMar>
+          </w:tcPr>
+          <w:p>
+            <w:r>
+              <w:rPr>
+                <w:b/>
+                <w:bCs/>
+                <w:color w:val="0A0A0A"/>
+                <w:sz w:val="18"/>
+                <w:szCs w:val="18"/>
+              </w:rPr>
+              <w:t xml:space="preserve">Beat</w:t>
+            </w:r>
+          </w:p>
+        </w:tc>
+        <w:tc>
+          <w:tcPr>
+            <w:tcW w:type="dxa" w:w="8667"/>
+            <w:tcBorders>
+              <w:top w:val="single" w:color="C9C9C4" w:sz="4"/>
+              <w:left w:val="single" w:color="C9C9C4" w:sz="4"/>
+              <w:bottom w:val="single" w:color="C9C9C4" w:sz="4"/>
+              <w:right w:val="single" w:color="C9C9C4" w:sz="4"/>
+            </w:tcBorders>
+            <w:shd w:fill="EDE9FF" w:color="auto" w:val="clear"/>
+            <w:tcMar>
+              <w:top w:type="dxa" w:w="60"/>
+              <w:left w:type="dxa" w:w="100"/>
+              <w:bottom w:type="dxa" w:w="60"/>
+              <w:right w:type="dxa" w:w="100"/>
+            </w:tcMar>
+          </w:tcPr>
+          <w:p>
+            <w:r>
+              <w:rPr>
+                <w:b/>
+                <w:bCs/>
+                <w:color w:val="0A0A0A"/>
+                <w:sz w:val="18"/>
+                <w:szCs w:val="18"/>
+              </w:rPr>
+              <w:t xml:space="preserve">Criterion</w:t>
+            </w:r>
+          </w:p>
+        </w:tc>
+      </w:tr>
+      <w:tr>
+        <w:trPr>
+          <w:cantSplit/>
+          <w:tblHeader w:val="off"/>
+        </w:trPr>
+        <w:tc>
+          <w:tcPr>
+            <w:tcW w:type="dxa" w:w="6171"/>
+            <w:tcBorders>
+              <w:top w:val="single" w:color="C9C9C4" w:sz="4"/>
+              <w:left w:val="single" w:color="C9C9C4" w:sz="4"/>
+              <w:bottom w:val="single" w:color="C9C9C4" w:sz="4"/>
+              <w:right w:val="single" w:color="C9C9C4" w:sz="4"/>
+            </w:tcBorders>
+            <w:tcMar>
+              <w:top w:type="dxa" w:w="60"/>
+              <w:left w:type="dxa" w:w="100"/>
+              <w:bottom w:type="dxa" w:w="60"/>
+              <w:right w:type="dxa" w:w="100"/>
+            </w:tcMar>
+          </w:tcPr>
+          <w:p>
+            <w:r>
+              <w:rPr>
+                <w:color w:val="0A0A0A"/>
+                <w:sz w:val="18"/>
+                <w:szCs w:val="18"/>
+              </w:rPr>
+              <w:t xml:space="preserve">Live app, phone as sensor</w:t>
+            </w:r>
+          </w:p>
+        </w:tc>
+        <w:tc>
+          <w:tcPr>
+            <w:tcW w:type="dxa" w:w="8667"/>
+            <w:tcBorders>
+              <w:top w:val="single" w:color="C9C9C4" w:sz="4"/>
+              <w:left w:val="single" w:color="C9C9C4" w:sz="4"/>
+              <w:bottom w:val="single" w:color="C9C9C4" w:sz="4"/>
+              <w:right w:val="single" w:color="C9C9C4" w:sz="4"/>
+            </w:tcBorders>
+            <w:tcMar>
+              <w:top w:type="dxa" w:w="60"/>
+              <w:left w:type="dxa" w:w="100"/>
+              <w:bottom w:type="dxa" w:w="60"/>
+              <w:right w:type="dxa" w:w="100"/>
+            </w:tcMar>
+          </w:tcPr>
+          <w:p>
+            <w:r>
+              <w:rPr>
+                <w:color w:val="0A0A0A"/>
+                <w:sz w:val="18"/>
+                <w:szCs w:val="18"/>
+              </w:rPr>
+              <w:t xml:space="preserve">Design and build: a working prototype, not a mock-up</w:t>
+            </w:r>
+          </w:p>
+        </w:tc>
+      </w:tr>
+      <w:tr>
+        <w:trPr>
+          <w:cantSplit/>
+          <w:tblHeader w:val="off"/>
+        </w:trPr>
+        <w:tc>
+          <w:tcPr>
+            <w:tcW w:type="dxa" w:w="6171"/>
+            <w:tcBorders>
+              <w:top w:val="single" w:color="C9C9C4" w:sz="4"/>
+              <w:left w:val="single" w:color="C9C9C4" w:sz="4"/>
+              <w:bottom w:val="single" w:color="C9C9C4" w:sz="4"/>
+              <w:right w:val="single" w:color="C9C9C4" w:sz="4"/>
+            </w:tcBorders>
+            <w:tcMar>
+              <w:top w:type="dxa" w:w="60"/>
+              <w:left w:type="dxa" w:w="100"/>
+              <w:bottom w:type="dxa" w:w="60"/>
+              <w:right w:type="dxa" w:w="100"/>
+            </w:tcMar>
+          </w:tcPr>
+          <w:p>
+            <w:r>
+              <w:rPr>
+                <w:color w:val="0A0A0A"/>
+                <w:sz w:val="18"/>
+                <w:szCs w:val="18"/>
+              </w:rPr>
+              <w:t xml:space="preserve">93% at 93% on unseen people</w:t>
+            </w:r>
+          </w:p>
+        </w:tc>
+        <w:tc>
+          <w:tcPr>
+            <w:tcW w:type="dxa" w:w="8667"/>
+            <w:tcBorders>
+              <w:top w:val="single" w:color="C9C9C4" w:sz="4"/>
+              <w:left w:val="single" w:color="C9C9C4" w:sz="4"/>
+              <w:bottom w:val="single" w:color="C9C9C4" w:sz="4"/>
+              <w:right w:val="single" w:color="C9C9C4" w:sz="4"/>
+            </w:tcBorders>
+            <w:tcMar>
+              <w:top w:type="dxa" w:w="60"/>
+              <w:left w:type="dxa" w:w="100"/>
+              <w:bottom w:type="dxa" w:w="60"/>
+              <w:right w:type="dxa" w:w="100"/>
+            </w:tcMar>
+          </w:tcPr>
+          <w:p>
+            <w:r>
+              <w:rPr>
+                <w:color w:val="0A0A0A"/>
+                <w:sz w:val="18"/>
+                <w:szCs w:val="18"/>
+              </w:rPr>
+              <w:t xml:space="preserve">Validation: held-out people, confidence intervals</w:t>
+            </w:r>
+          </w:p>
+        </w:tc>
+      </w:tr>
+      <w:tr>
+        <w:trPr>
+          <w:cantSplit/>
+          <w:tblHeader w:val="off"/>
+        </w:trPr>
+        <w:tc>
+          <w:tcPr>
+            <w:tcW w:type="dxa" w:w="6171"/>
+            <w:tcBorders>
+              <w:top w:val="single" w:color="C9C9C4" w:sz="4"/>
+              <w:left w:val="single" w:color="C9C9C4" w:sz="4"/>
+              <w:bottom w:val="single" w:color="C9C9C4" w:sz="4"/>
+              <w:right w:val="single" w:color="C9C9C4" w:sz="4"/>
+            </w:tcBorders>
+            <w:tcMar>
+              <w:top w:type="dxa" w:w="60"/>
+              <w:left w:type="dxa" w:w="100"/>
+              <w:bottom w:type="dxa" w:w="60"/>
+              <w:right w:type="dxa" w:w="100"/>
+            </w:tcMar>
+          </w:tcPr>
+          <w:p>
+            <w:r>
+              <w:rPr>
+                <w:color w:val="0A0A0A"/>
+                <w:sz w:val="18"/>
+                <w:szCs w:val="18"/>
+              </w:rPr>
+              <w:t xml:space="preserve">Dispatch and the record naming both apps</w:t>
+            </w:r>
+          </w:p>
+        </w:tc>
+        <w:tc>
+          <w:tcPr>
+            <w:tcW w:type="dxa" w:w="8667"/>
+            <w:tcBorders>
+              <w:top w:val="single" w:color="C9C9C4" w:sz="4"/>
+              <w:left w:val="single" w:color="C9C9C4" w:sz="4"/>
+              <w:bottom w:val="single" w:color="C9C9C4" w:sz="4"/>
+              <w:right w:val="single" w:color="C9C9C4" w:sz="4"/>
+            </w:tcBorders>
+            <w:tcMar>
+              <w:top w:type="dxa" w:w="60"/>
+              <w:left w:type="dxa" w:w="100"/>
+              <w:bottom w:type="dxa" w:w="60"/>
+              <w:right w:type="dxa" w:w="100"/>
+            </w:tcMar>
+          </w:tcPr>
+          <w:p>
+            <w:r>
+              <w:rPr>
+                <w:color w:val="0A0A0A"/>
+                <w:sz w:val="18"/>
+                <w:szCs w:val="18"/>
+              </w:rPr>
+              <w:t xml:space="preserve">Problem fit: triage, and multi-app apportionment from the July 2026 proposal</w:t>
+            </w:r>
+          </w:p>
+        </w:tc>
+      </w:tr>
+      <w:tr>
+        <w:trPr>
+          <w:cantSplit/>
+          <w:tblHeader w:val="off"/>
+        </w:trPr>
+        <w:tc>
+          <w:tcPr>
+            <w:tcW w:type="dxa" w:w="6171"/>
+            <w:tcBorders>
+              <w:top w:val="single" w:color="C9C9C4" w:sz="4"/>
+              <w:left w:val="single" w:color="C9C9C4" w:sz="4"/>
+              <w:bottom w:val="single" w:color="C9C9C4" w:sz="4"/>
+              <w:right w:val="single" w:color="C9C9C4" w:sz="4"/>
+            </w:tcBorders>
+            <w:tcMar>
+              <w:top w:type="dxa" w:w="60"/>
+              <w:left w:type="dxa" w:w="100"/>
+              <w:bottom w:type="dxa" w:w="60"/>
+              <w:right w:type="dxa" w:w="100"/>
+            </w:tcMar>
+          </w:tcPr>
+          <w:p>
+            <w:r>
+              <w:rPr>
+                <w:color w:val="0A0A0A"/>
+                <w:sz w:val="18"/>
+                <w:szCs w:val="18"/>
+              </w:rPr>
+              <w:t xml:space="preserve">Tier one, split, signed and chained</w:t>
+            </w:r>
+          </w:p>
+        </w:tc>
+        <w:tc>
+          <w:tcPr>
+            <w:tcW w:type="dxa" w:w="8667"/>
+            <w:tcBorders>
+              <w:top w:val="single" w:color="C9C9C4" w:sz="4"/>
+              <w:left w:val="single" w:color="C9C9C4" w:sz="4"/>
+              <w:bottom w:val="single" w:color="C9C9C4" w:sz="4"/>
+              <w:right w:val="single" w:color="C9C9C4" w:sz="4"/>
+            </w:tcBorders>
+            <w:tcMar>
+              <w:top w:type="dxa" w:w="60"/>
+              <w:left w:type="dxa" w:w="100"/>
+              <w:bottom w:type="dxa" w:w="60"/>
+              <w:right w:type="dxa" w:w="100"/>
+            </w:tcMar>
+          </w:tcPr>
+          <w:p>
+            <w:r>
+              <w:rPr>
+                <w:color w:val="0A0A0A"/>
+                <w:sz w:val="18"/>
+                <w:szCs w:val="18"/>
+              </w:rPr>
+              <w:t xml:space="preserve">Innovation and translation: the parametric trigger and the data standard</w:t>
+            </w:r>
+          </w:p>
+        </w:tc>
+      </w:tr>
+      <w:tr>
+        <w:trPr>
+          <w:cantSplit/>
+          <w:tblHeader w:val="off"/>
+        </w:trPr>
+        <w:tc>
+          <w:tcPr>
+            <w:tcW w:type="dxa" w:w="6171"/>
+            <w:tcBorders>
+              <w:top w:val="single" w:color="C9C9C4" w:sz="4"/>
+              <w:left w:val="single" w:color="C9C9C4" w:sz="4"/>
+              <w:bottom w:val="single" w:color="C9C9C4" w:sz="4"/>
+              <w:right w:val="single" w:color="C9C9C4" w:sz="4"/>
+            </w:tcBorders>
+            <w:tcMar>
+              <w:top w:type="dxa" w:w="60"/>
+              <w:left w:type="dxa" w:w="100"/>
+              <w:bottom w:type="dxa" w:w="60"/>
+              <w:right w:type="dxa" w:w="100"/>
+            </w:tcMar>
+          </w:tcPr>
+          <w:p>
+            <w:r>
+              <w:rPr>
+                <w:color w:val="0A0A0A"/>
+                <w:sz w:val="18"/>
+                <w:szCs w:val="18"/>
+              </w:rPr>
+              <w:t xml:space="preserve">Verification fails on one edit</w:t>
+            </w:r>
+          </w:p>
+        </w:tc>
+        <w:tc>
+          <w:tcPr>
+            <w:tcW w:type="dxa" w:w="8667"/>
+            <w:tcBorders>
+              <w:top w:val="single" w:color="C9C9C4" w:sz="4"/>
+              <w:left w:val="single" w:color="C9C9C4" w:sz="4"/>
+              <w:bottom w:val="single" w:color="C9C9C4" w:sz="4"/>
+              <w:right w:val="single" w:color="C9C9C4" w:sz="4"/>
+            </w:tcBorders>
+            <w:tcMar>
+              <w:top w:type="dxa" w:w="60"/>
+              <w:left w:type="dxa" w:w="100"/>
+              <w:bottom w:type="dxa" w:w="60"/>
+              <w:right w:type="dxa" w:w="100"/>
+            </w:tcMar>
+          </w:tcPr>
+          <w:p>
+            <w:r>
+              <w:rPr>
+                <w:color w:val="0A0A0A"/>
+                <w:sz w:val="18"/>
+                <w:szCs w:val="18"/>
+              </w:rPr>
+              <w:t xml:space="preserve">Trust: tamper evidence anyone can check</w:t>
+            </w:r>
+          </w:p>
+        </w:tc>
+      </w:tr>
+      <w:tr>
+        <w:trPr>
+          <w:cantSplit/>
+          <w:tblHeader w:val="off"/>
+        </w:trPr>
+        <w:tc>
+          <w:tcPr>
+            <w:tcW w:type="dxa" w:w="6171"/>
+            <w:tcBorders>
+              <w:top w:val="single" w:color="C9C9C4" w:sz="4"/>
+              <w:left w:val="single" w:color="C9C9C4" w:sz="4"/>
+              <w:bottom w:val="single" w:color="C9C9C4" w:sz="4"/>
+              <w:right w:val="single" w:color="C9C9C4" w:sz="4"/>
+            </w:tcBorders>
+            <w:tcMar>
+              <w:top w:type="dxa" w:w="60"/>
+              <w:left w:type="dxa" w:w="100"/>
+              <w:bottom w:type="dxa" w:w="60"/>
+              <w:right w:type="dxa" w:w="100"/>
+            </w:tcMar>
+          </w:tcPr>
+          <w:p>
+            <w:r>
+              <w:rPr>
+                <w:color w:val="0A0A0A"/>
+                <w:sz w:val="18"/>
+                <w:szCs w:val="18"/>
+              </w:rPr>
+              <w:t xml:space="preserve">Aggregates only for the Labour Department</w:t>
+            </w:r>
+          </w:p>
+        </w:tc>
+        <w:tc>
+          <w:tcPr>
+            <w:tcW w:type="dxa" w:w="8667"/>
+            <w:tcBorders>
+              <w:top w:val="single" w:color="C9C9C4" w:sz="4"/>
+              <w:left w:val="single" w:color="C9C9C4" w:sz="4"/>
+              <w:bottom w:val="single" w:color="C9C9C4" w:sz="4"/>
+              <w:right w:val="single" w:color="C9C9C4" w:sz="4"/>
+            </w:tcBorders>
+            <w:tcMar>
+              <w:top w:type="dxa" w:w="60"/>
+              <w:left w:type="dxa" w:w="100"/>
+              <w:bottom w:type="dxa" w:w="60"/>
+              <w:right w:type="dxa" w:w="100"/>
+            </w:tcMar>
+          </w:tcPr>
+          <w:p>
+            <w:r>
+              <w:rPr>
+                <w:color w:val="0A0A0A"/>
+                <w:sz w:val="18"/>
+                <w:szCs w:val="18"/>
+              </w:rPr>
+              <w:t xml:space="preserve">Ethics and governance: no surveillance, a stakeholder view for government</w:t>
+            </w:r>
+          </w:p>
+        </w:tc>
+      </w:tr>
+      <w:tr>
+        <w:trPr>
+          <w:cantSplit/>
+          <w:tblHeader w:val="off"/>
+        </w:trPr>
+        <w:tc>
+          <w:tcPr>
+            <w:tcW w:type="dxa" w:w="6171"/>
+            <w:tcBorders>
+              <w:top w:val="single" w:color="C9C9C4" w:sz="4"/>
+              <w:left w:val="single" w:color="C9C9C4" w:sz="4"/>
+              <w:bottom w:val="single" w:color="C9C9C4" w:sz="4"/>
+              <w:right w:val="single" w:color="C9C9C4" w:sz="4"/>
+            </w:tcBorders>
+            <w:tcMar>
+              <w:top w:type="dxa" w:w="60"/>
+              <w:left w:type="dxa" w:w="100"/>
+              <w:bottom w:type="dxa" w:w="60"/>
+              <w:right w:type="dxa" w:w="100"/>
+            </w:tcMar>
+          </w:tcPr>
+          <w:p>
+            <w:r>
+              <w:rPr>
+                <w:color w:val="0A0A0A"/>
+                <w:sz w:val="18"/>
+                <w:szCs w:val="18"/>
+              </w:rPr>
+              <w:t xml:space="preserve">Real riding false alarms</w:t>
+            </w:r>
+          </w:p>
+        </w:tc>
+        <w:tc>
+          <w:tcPr>
+            <w:tcW w:type="dxa" w:w="8667"/>
+            <w:tcBorders>
+              <w:top w:val="single" w:color="C9C9C4" w:sz="4"/>
+              <w:left w:val="single" w:color="C9C9C4" w:sz="4"/>
+              <w:bottom w:val="single" w:color="C9C9C4" w:sz="4"/>
+              <w:right w:val="single" w:color="C9C9C4" w:sz="4"/>
+            </w:tcBorders>
+            <w:tcMar>
+              <w:top w:type="dxa" w:w="60"/>
+              <w:left w:type="dxa" w:w="100"/>
+              <w:bottom w:type="dxa" w:w="60"/>
+              <w:right w:type="dxa" w:w="100"/>
+            </w:tcMar>
+          </w:tcPr>
+          <w:p>
+            <w:r>
+              <w:rPr>
+                <w:color w:val="0A0A0A"/>
+                <w:sz w:val="18"/>
+                <w:szCs w:val="18"/>
+              </w:rPr>
+              <w:t xml:space="preserve">Validation and limits: real-world data, stated honestly</w:t>
+            </w:r>
+          </w:p>
+        </w:tc>
+      </w:tr>
+    </w:tbl>
+    <w:p>
+      <w:pPr>
+        <w:spacing w:after="120"/>
+      </w:pPr>
+    </w:p>
+    <w:p>
+      <w:pPr>
+        <w:spacing w:after="120"/>
+      </w:pPr>
+      <w:r>
+        <w:t xml:space="preserve">Recording setup:</w:t>
+      </w:r>
+    </w:p>
+    <w:p>
+      <w:pPr>
+        <w:pStyle w:val="ListParagraph"/>
+        <w:numPr>
+          <w:ilvl w:val="0"/>
+          <w:numId w:val="2"/>
+        </w:numPr>
+      </w:pPr>
+      <w:r>
+        <w:t xml:space="preserve">Laptop: Chrome window at 1440 by 900, zoom 110%, bookmarks bar hidden, notifications off. Record with QuickTime (File, New Screen Recording) or OBS.</w:t>
+      </w:r>
+    </w:p>
+    <w:p>
+      <w:pPr>
+        <w:pStyle w:val="ListParagraph"/>
+        <w:numPr>
+          <w:ilvl w:val="0"/>
+          <w:numId w:val="2"/>
+        </w:numPr>
+      </w:pPr>
+      <w:r>
+        <w:t xml:space="preserve">Face: the laptop camera or a phone on a stand, recorded at the same time. Plain background, face lit from the front.</w:t>
+      </w:r>
+    </w:p>
+    <w:p>
+      <w:pPr>
+        <w:pStyle w:val="ListParagraph"/>
+        <w:numPr>
+          <w:ilvl w:val="0"/>
+          <w:numId w:val="2"/>
+        </w:numPr>
+      </w:pPr>
+      <w:r>
+        <w:t xml:space="preserve">Phone: connect an iPhone by cable and record it in QuickTime (New Movie Recording, choose the iPhone as camera), or use the phone's own screen recorder.</w:t>
+      </w:r>
+    </w:p>
+    <w:p>
+      <w:pPr>
+        <w:pStyle w:val="ListParagraph"/>
+        <w:numPr>
+          <w:ilvl w:val="0"/>
+          <w:numId w:val="2"/>
+        </w:numPr>
+      </w:pPr>
+      <w:r>
+        <w:t xml:space="preserve">Before recording: open /demo?key=... and press Reset, so the demo starts clean. Save the record for the terminal shot from /api/events/EVT-... as record.json.</w:t>
+      </w:r>
+    </w:p>
+    <w:p>
+      <w:pPr>
+        <w:pStyle w:val="ListParagraph"/>
+        <w:numPr>
+          <w:ilvl w:val="0"/>
+          <w:numId w:val="2"/>
+        </w:numPr>
+      </w:pPr>
+      <w:r>
+        <w:t xml:space="preserve">Do each beat as its own take if easier. Name files part4_01_phone.mov, part4_02_demo.mov and so on.</w:t>
       </w:r>
     </w:p>
     <w:p>
@@ -4781,7 +5324,7 @@
         <w:pStyle w:val="Heading1"/>
       </w:pPr>
       <w:r>
-        <w:t xml:space="preserve">Part 5. Split screen (3:05 to 3:30)</w:t>
+        <w:t xml:space="preserve">Part 5. Split screen (2:40 to 3:05)</w:t>
       </w:r>
     </w:p>
     <w:p>
@@ -4964,7 +5507,7 @@
                 <w:sz w:val="18"/>
                 <w:szCs w:val="18"/>
               </w:rPr>
-              <w:t xml:space="preserve">3:05</w:t>
+              <w:t xml:space="preserve">2:40</w:t>
             </w:r>
           </w:p>
         </w:tc>
@@ -5078,7 +5621,7 @@
                 <w:sz w:val="18"/>
                 <w:szCs w:val="18"/>
               </w:rPr>
-              <w:t xml:space="preserve">3:11</w:t>
+              <w:t xml:space="preserve">2:46</w:t>
             </w:r>
           </w:p>
         </w:tc>
@@ -5192,7 +5735,7 @@
                 <w:sz w:val="18"/>
                 <w:szCs w:val="18"/>
               </w:rPr>
-              <w:t xml:space="preserve">3:17</w:t>
+              <w:t xml:space="preserve">2:52</w:t>
             </w:r>
           </w:p>
         </w:tc>
@@ -5306,7 +5849,7 @@
                 <w:sz w:val="18"/>
                 <w:szCs w:val="18"/>
               </w:rPr>
-              <w:t xml:space="preserve">3:23</w:t>
+              <w:t xml:space="preserve">2:58</w:t>
             </w:r>
           </w:p>
         </w:tc>
@@ -5411,7 +5954,7 @@
         <w:pStyle w:val="Heading1"/>
       </w:pPr>
       <w:r>
-        <w:t xml:space="preserve">Part 6. Risks and next steps (3:30 to 4:15)</w:t>
+        <w:t xml:space="preserve">Part 6. Risks and next steps (3:05 to 3:50)</w:t>
       </w:r>
     </w:p>
     <w:p>
@@ -6383,7 +6926,7 @@
         <w:pStyle w:val="Heading1"/>
       </w:pPr>
       <w:r>
-        <w:t xml:space="preserve">Part 7. End card (4:15 to 4:23)</w:t>
+        <w:t xml:space="preserve">Part 7. End card (3:50 to 3:58)</w:t>
       </w:r>
     </w:p>
     <w:p>
@@ -6947,7 +7490,7 @@
                 <w:sz w:val="18"/>
                 <w:szCs w:val="18"/>
               </w:rPr>
-              <w:t xml:space="preserve">Part 4 on the live site; open repo on the end card</w:t>
+              <w:t xml:space="preserve">Part 4, the live app on a real phone and laptop; open repo on the end card</w:t>
             </w:r>
           </w:p>
         </w:tc>
@@ -7067,7 +7610,7 @@
                 <w:sz w:val="18"/>
                 <w:szCs w:val="18"/>
               </w:rPr>
-              <w:t xml:space="preserve">Part 4 last shot (held-out people, 95% CIs); line 11 (real riding hours)</w:t>
+              <w:t xml:space="preserve">Part 4 (held-out people, 95% CIs, real riding hours); line 11</w:t>
             </w:r>
           </w:p>
         </w:tc>
@@ -7367,7 +7910,7 @@
                 <w:sz w:val="18"/>
                 <w:szCs w:val="18"/>
               </w:rPr>
-              <w:t xml:space="preserve">Line 13: no route history, no risk score, no platform surveillance</w:t>
+              <w:t xml:space="preserve">Line 13 and Part 4 labour view: no route history, no risk score, no platform surveillance</w:t>
             </w:r>
           </w:p>
         </w:tc>
@@ -7769,7 +8312,7 @@
                 <w:sz w:val="18"/>
                 <w:szCs w:val="18"/>
               </w:rPr>
-              <w:t xml:space="preserve">2, 8, Part 3, Part 4 payout, Part 5 (twice), 12, 16</w:t>
+              <w:t xml:space="preserve">2, 8, Part 3, Part 5 (twice), 12, 16</w:t>
             </w:r>
           </w:p>
         </w:tc>
@@ -7856,7 +8399,7 @@
                 <w:sz w:val="18"/>
                 <w:szCs w:val="18"/>
               </w:rPr>
-              <w:t xml:space="preserve">1, 3, 7, Part 4 dispatch, Part 5, 13</w:t>
+              <w:t xml:space="preserve">1, 3, 7, Part 5, 13</w:t>
             </w:r>
           </w:p>
         </w:tc>
@@ -8030,7 +8573,7 @@
                 <w:sz w:val="18"/>
                 <w:szCs w:val="18"/>
               </w:rPr>
-              <w:t xml:space="preserve">6, Part 4 detection, labour data and results, Part 5, 10, 15</w:t>
+              <w:t xml:space="preserve">6, Part 4 (all of it, on camera in the corner), Part 5, 10, 15</w:t>
             </w:r>
           </w:p>
         </w:tc>
@@ -8117,7 +8660,7 @@
                 <w:sz w:val="18"/>
                 <w:szCs w:val="18"/>
               </w:rPr>
-              <w:t xml:space="preserve">4, Part 4 app, signed record and verification, 11</w:t>
+              <w:t xml:space="preserve">4, 11</w:t>
             </w:r>
           </w:p>
         </w:tc>
@@ -8149,10 +8692,10 @@
         </w:tblBorders>
       </w:tblPr>
       <w:tblGrid>
-        <w:gridCol w:w="1313"/>
-        <w:gridCol w:w="3545"/>
-        <w:gridCol w:w="8666"/>
-        <w:gridCol w:w="1314"/>
+        <w:gridCol w:w="1196"/>
+        <w:gridCol w:w="4547"/>
+        <w:gridCol w:w="7898"/>
+        <w:gridCol w:w="1197"/>
       </w:tblGrid>
       <w:tr>
         <w:trPr>
@@ -8161,7 +8704,7 @@
         </w:trPr>
         <w:tc>
           <w:tcPr>
-            <w:tcW w:type="dxa" w:w="1313"/>
+            <w:tcW w:type="dxa" w:w="1196"/>
             <w:tcBorders>
               <w:top w:val="single" w:color="C9C9C4" w:sz="4"/>
               <w:left w:val="single" w:color="C9C9C4" w:sz="4"/>
@@ -8191,7 +8734,7 @@
         </w:tc>
         <w:tc>
           <w:tcPr>
-            <w:tcW w:type="dxa" w:w="3545"/>
+            <w:tcW w:type="dxa" w:w="4547"/>
             <w:tcBorders>
               <w:top w:val="single" w:color="C9C9C4" w:sz="4"/>
               <w:left w:val="single" w:color="C9C9C4" w:sz="4"/>
@@ -8221,7 +8764,7 @@
         </w:tc>
         <w:tc>
           <w:tcPr>
-            <w:tcW w:type="dxa" w:w="8666"/>
+            <w:tcW w:type="dxa" w:w="7898"/>
             <w:tcBorders>
               <w:top w:val="single" w:color="C9C9C4" w:sz="4"/>
               <w:left w:val="single" w:color="C9C9C4" w:sz="4"/>
@@ -8251,7 +8794,7 @@
         </w:tc>
         <w:tc>
           <w:tcPr>
-            <w:tcW w:type="dxa" w:w="1314"/>
+            <w:tcW w:type="dxa" w:w="1197"/>
             <w:tcBorders>
               <w:top w:val="single" w:color="C9C9C4" w:sz="4"/>
               <w:left w:val="single" w:color="C9C9C4" w:sz="4"/>
@@ -8287,7 +8830,7 @@
         </w:trPr>
         <w:tc>
           <w:tcPr>
-            <w:tcW w:type="dxa" w:w="1313"/>
+            <w:tcW w:type="dxa" w:w="1196"/>
             <w:tcBorders>
               <w:top w:val="single" w:color="C9C9C4" w:sz="4"/>
               <w:left w:val="single" w:color="C9C9C4" w:sz="4"/>
@@ -8314,61 +8857,61 @@
         </w:tc>
         <w:tc>
           <w:tcPr>
-            <w:tcW w:type="dxa" w:w="3545"/>
-            <w:tcBorders>
-              <w:top w:val="single" w:color="C9C9C4" w:sz="4"/>
-              <w:left w:val="single" w:color="C9C9C4" w:sz="4"/>
-              <w:bottom w:val="single" w:color="C9C9C4" w:sz="4"/>
-              <w:right w:val="single" w:color="C9C9C4" w:sz="4"/>
-            </w:tcBorders>
-            <w:tcMar>
-              <w:top w:type="dxa" w:w="60"/>
-              <w:left w:type="dxa" w:w="100"/>
-              <w:bottom w:type="dxa" w:w="60"/>
-              <w:right w:type="dxa" w:w="100"/>
-            </w:tcMar>
-          </w:tcPr>
-          <w:p>
-            <w:r>
-              <w:rPr>
-                <w:color w:val="0A0A0A"/>
-                <w:sz w:val="18"/>
-                <w:szCs w:val="18"/>
-              </w:rPr>
-              <w:t xml:space="preserve">Street</w:t>
-            </w:r>
-          </w:p>
-        </w:tc>
-        <w:tc>
-          <w:tcPr>
-            <w:tcW w:type="dxa" w:w="8666"/>
-            <w:tcBorders>
-              <w:top w:val="single" w:color="C9C9C4" w:sz="4"/>
-              <w:left w:val="single" w:color="C9C9C4" w:sz="4"/>
-              <w:bottom w:val="single" w:color="C9C9C4" w:sz="4"/>
-              <w:right w:val="single" w:color="C9C9C4" w:sz="4"/>
-            </w:tcBorders>
-            <w:tcMar>
-              <w:top w:type="dxa" w:w="60"/>
-              <w:left w:type="dxa" w:w="100"/>
-              <w:bottom w:type="dxa" w:w="60"/>
-              <w:right w:type="dxa" w:w="100"/>
-            </w:tcMar>
-          </w:tcPr>
-          <w:p>
-            <w:r>
-              <w:rPr>
-                <w:color w:val="0A0A0A"/>
-                <w:sz w:val="18"/>
-                <w:szCs w:val="18"/>
-              </w:rPr>
-              <w:t xml:space="preserve">Riders in rain, phone mounts, helmets. Faces only with consent</w:t>
-            </w:r>
-          </w:p>
-        </w:tc>
-        <w:tc>
-          <w:tcPr>
-            <w:tcW w:type="dxa" w:w="1314"/>
+            <w:tcW w:type="dxa" w:w="4547"/>
+            <w:tcBorders>
+              <w:top w:val="single" w:color="C9C9C4" w:sz="4"/>
+              <w:left w:val="single" w:color="C9C9C4" w:sz="4"/>
+              <w:bottom w:val="single" w:color="C9C9C4" w:sz="4"/>
+              <w:right w:val="single" w:color="C9C9C4" w:sz="4"/>
+            </w:tcBorders>
+            <w:tcMar>
+              <w:top w:type="dxa" w:w="60"/>
+              <w:left w:type="dxa" w:w="100"/>
+              <w:bottom w:type="dxa" w:w="60"/>
+              <w:right w:type="dxa" w:w="100"/>
+            </w:tcMar>
+          </w:tcPr>
+          <w:p>
+            <w:r>
+              <w:rPr>
+                <w:color w:val="0A0A0A"/>
+                <w:sz w:val="18"/>
+                <w:szCs w:val="18"/>
+              </w:rPr>
+              <w:t xml:space="preserve">Street or Creative Commons stock</w:t>
+            </w:r>
+          </w:p>
+        </w:tc>
+        <w:tc>
+          <w:tcPr>
+            <w:tcW w:type="dxa" w:w="7898"/>
+            <w:tcBorders>
+              <w:top w:val="single" w:color="C9C9C4" w:sz="4"/>
+              <w:left w:val="single" w:color="C9C9C4" w:sz="4"/>
+              <w:bottom w:val="single" w:color="C9C9C4" w:sz="4"/>
+              <w:right w:val="single" w:color="C9C9C4" w:sz="4"/>
+            </w:tcBorders>
+            <w:tcMar>
+              <w:top w:type="dxa" w:w="60"/>
+              <w:left w:type="dxa" w:w="100"/>
+              <w:bottom w:type="dxa" w:w="60"/>
+              <w:right w:type="dxa" w:w="100"/>
+            </w:tcMar>
+          </w:tcPr>
+          <w:p>
+            <w:r>
+              <w:rPr>
+                <w:color w:val="0A0A0A"/>
+                <w:sz w:val="18"/>
+                <w:szCs w:val="18"/>
+              </w:rPr>
+              <w:t xml:space="preserve">Riders in rain, phone mounts, helmets, hospital corridor, government buildings. Faces only with consent</w:t>
+            </w:r>
+          </w:p>
+        </w:tc>
+        <w:tc>
+          <w:tcPr>
+            <w:tcW w:type="dxa" w:w="1197"/>
             <w:tcBorders>
               <w:top w:val="single" w:color="C9C9C4" w:sz="4"/>
               <w:left w:val="single" w:color="C9C9C4" w:sz="4"/>
@@ -8401,7 +8944,7 @@
         </w:trPr>
         <w:tc>
           <w:tcPr>
-            <w:tcW w:type="dxa" w:w="1313"/>
+            <w:tcW w:type="dxa" w:w="1196"/>
             <w:tcBorders>
               <w:top w:val="single" w:color="C9C9C4" w:sz="4"/>
               <w:left w:val="single" w:color="C9C9C4" w:sz="4"/>
@@ -8428,61 +8971,61 @@
         </w:tc>
         <w:tc>
           <w:tcPr>
-            <w:tcW w:type="dxa" w:w="3545"/>
-            <w:tcBorders>
-              <w:top w:val="single" w:color="C9C9C4" w:sz="4"/>
-              <w:left w:val="single" w:color="C9C9C4" w:sz="4"/>
-              <w:bottom w:val="single" w:color="C9C9C4" w:sz="4"/>
-              <w:right w:val="single" w:color="C9C9C4" w:sz="4"/>
-            </w:tcBorders>
-            <w:tcMar>
-              <w:top w:type="dxa" w:w="60"/>
-              <w:left w:type="dxa" w:w="100"/>
-              <w:bottom w:type="dxa" w:w="60"/>
-              <w:right w:type="dxa" w:w="100"/>
-            </w:tcMar>
-          </w:tcPr>
-          <w:p>
-            <w:r>
-              <w:rPr>
-                <w:color w:val="0A0A0A"/>
-                <w:sz w:val="18"/>
-                <w:szCs w:val="18"/>
-              </w:rPr>
-              <w:t xml:space="preserve">Phone, /rider</w:t>
-            </w:r>
-          </w:p>
-        </w:tc>
-        <w:tc>
-          <w:tcPr>
-            <w:tcW w:type="dxa" w:w="8666"/>
-            <w:tcBorders>
-              <w:top w:val="single" w:color="C9C9C4" w:sz="4"/>
-              <w:left w:val="single" w:color="C9C9C4" w:sz="4"/>
-              <w:bottom w:val="single" w:color="C9C9C4" w:sz="4"/>
-              <w:right w:val="single" w:color="C9C9C4" w:sz="4"/>
-            </w:tcBorders>
-            <w:tcMar>
-              <w:top w:type="dxa" w:w="60"/>
-              <w:left w:type="dxa" w:w="100"/>
-              <w:bottom w:type="dxa" w:w="60"/>
-              <w:right w:type="dxa" w:w="100"/>
-            </w:tcMar>
-          </w:tcPr>
-          <w:p>
-            <w:r>
-              <w:rPr>
-                <w:color w:val="0A0A0A"/>
-                <w:sz w:val="18"/>
-                <w:szCs w:val="18"/>
-              </w:rPr>
-              <w:t xml:space="preserve">Consent, language switch, Allow motion, On shift, drop onto a cushion, countdown</w:t>
-            </w:r>
-          </w:p>
-        </w:tc>
-        <w:tc>
-          <w:tcPr>
-            <w:tcW w:type="dxa" w:w="1314"/>
+            <w:tcW w:type="dxa" w:w="4547"/>
+            <w:tcBorders>
+              <w:top w:val="single" w:color="C9C9C4" w:sz="4"/>
+              <w:left w:val="single" w:color="C9C9C4" w:sz="4"/>
+              <w:bottom w:val="single" w:color="C9C9C4" w:sz="4"/>
+              <w:right w:val="single" w:color="C9C9C4" w:sz="4"/>
+            </w:tcBorders>
+            <w:tcMar>
+              <w:top w:type="dxa" w:w="60"/>
+              <w:left w:type="dxa" w:w="100"/>
+              <w:bottom w:type="dxa" w:w="60"/>
+              <w:right w:type="dxa" w:w="100"/>
+            </w:tcMar>
+          </w:tcPr>
+          <w:p>
+            <w:r>
+              <w:rPr>
+                <w:color w:val="0A0A0A"/>
+                <w:sz w:val="18"/>
+                <w:szCs w:val="18"/>
+              </w:rPr>
+              <w:t xml:space="preserve">Karina's phone, /rider</w:t>
+            </w:r>
+          </w:p>
+        </w:tc>
+        <w:tc>
+          <w:tcPr>
+            <w:tcW w:type="dxa" w:w="7898"/>
+            <w:tcBorders>
+              <w:top w:val="single" w:color="C9C9C4" w:sz="4"/>
+              <w:left w:val="single" w:color="C9C9C4" w:sz="4"/>
+              <w:bottom w:val="single" w:color="C9C9C4" w:sz="4"/>
+              <w:right w:val="single" w:color="C9C9C4" w:sz="4"/>
+            </w:tcBorders>
+            <w:tcMar>
+              <w:top w:type="dxa" w:w="60"/>
+              <w:left w:type="dxa" w:w="100"/>
+              <w:bottom w:type="dxa" w:w="60"/>
+              <w:right w:type="dxa" w:w="100"/>
+            </w:tcMar>
+          </w:tcPr>
+          <w:p>
+            <w:r>
+              <w:rPr>
+                <w:color w:val="0A0A0A"/>
+                <w:sz w:val="18"/>
+                <w:szCs w:val="18"/>
+              </w:rPr>
+              <w:t xml:space="preserve">Consent, On shift, drop onto a cushion, countdown</w:t>
+            </w:r>
+          </w:p>
+        </w:tc>
+        <w:tc>
+          <w:tcPr>
+            <w:tcW w:type="dxa" w:w="1197"/>
             <w:tcBorders>
               <w:top w:val="single" w:color="C9C9C4" w:sz="4"/>
               <w:left w:val="single" w:color="C9C9C4" w:sz="4"/>
@@ -8515,7 +9058,7 @@
         </w:trPr>
         <w:tc>
           <w:tcPr>
-            <w:tcW w:type="dxa" w:w="1313"/>
+            <w:tcW w:type="dxa" w:w="1196"/>
             <w:tcBorders>
               <w:top w:val="single" w:color="C9C9C4" w:sz="4"/>
               <w:left w:val="single" w:color="C9C9C4" w:sz="4"/>
@@ -8542,61 +9085,61 @@
         </w:tc>
         <w:tc>
           <w:tcPr>
-            <w:tcW w:type="dxa" w:w="3545"/>
-            <w:tcBorders>
-              <w:top w:val="single" w:color="C9C9C4" w:sz="4"/>
-              <w:left w:val="single" w:color="C9C9C4" w:sz="4"/>
-              <w:bottom w:val="single" w:color="C9C9C4" w:sz="4"/>
-              <w:right w:val="single" w:color="C9C9C4" w:sz="4"/>
-            </w:tcBorders>
-            <w:tcMar>
-              <w:top w:type="dxa" w:w="60"/>
-              <w:left w:type="dxa" w:w="100"/>
-              <w:bottom w:type="dxa" w:w="60"/>
-              <w:right w:type="dxa" w:w="100"/>
-            </w:tcMar>
-          </w:tcPr>
-          <w:p>
-            <w:r>
-              <w:rPr>
-                <w:color w:val="0A0A0A"/>
-                <w:sz w:val="18"/>
-                <w:szCs w:val="18"/>
-              </w:rPr>
-              <w:t xml:space="preserve">Laptop, /demo?key=...</w:t>
-            </w:r>
-          </w:p>
-        </w:tc>
-        <w:tc>
-          <w:tcPr>
-            <w:tcW w:type="dxa" w:w="8666"/>
-            <w:tcBorders>
-              <w:top w:val="single" w:color="C9C9C4" w:sz="4"/>
-              <w:left w:val="single" w:color="C9C9C4" w:sz="4"/>
-              <w:bottom w:val="single" w:color="C9C9C4" w:sz="4"/>
-              <w:right w:val="single" w:color="C9C9C4" w:sz="4"/>
-            </w:tcBorders>
-            <w:tcMar>
-              <w:top w:type="dxa" w:w="60"/>
-              <w:left w:type="dxa" w:w="100"/>
-              <w:bottom w:type="dxa" w:w="60"/>
-              <w:right w:type="dxa" w:w="100"/>
-            </w:tcMar>
-          </w:tcPr>
-          <w:p>
-            <w:r>
-              <w:rPr>
-                <w:color w:val="0A0A0A"/>
-                <w:sz w:val="18"/>
-                <w:szCs w:val="18"/>
-              </w:rPr>
-              <w:t xml:space="preserve">Reset, start shift, Second app on, Crash, dispatcher card, wait 30 s for Paid</w:t>
-            </w:r>
-          </w:p>
-        </w:tc>
-        <w:tc>
-          <w:tcPr>
-            <w:tcW w:type="dxa" w:w="1314"/>
+            <w:tcW w:type="dxa" w:w="4547"/>
+            <w:tcBorders>
+              <w:top w:val="single" w:color="C9C9C4" w:sz="4"/>
+              <w:left w:val="single" w:color="C9C9C4" w:sz="4"/>
+              <w:bottom w:val="single" w:color="C9C9C4" w:sz="4"/>
+              <w:right w:val="single" w:color="C9C9C4" w:sz="4"/>
+            </w:tcBorders>
+            <w:tcMar>
+              <w:top w:type="dxa" w:w="60"/>
+              <w:left w:type="dxa" w:w="100"/>
+              <w:bottom w:type="dxa" w:w="60"/>
+              <w:right w:type="dxa" w:w="100"/>
+            </w:tcMar>
+          </w:tcPr>
+          <w:p>
+            <w:r>
+              <w:rPr>
+                <w:color w:val="0A0A0A"/>
+                <w:sz w:val="18"/>
+                <w:szCs w:val="18"/>
+              </w:rPr>
+              <w:t xml:space="preserve">Laptop screen</w:t>
+            </w:r>
+          </w:p>
+        </w:tc>
+        <w:tc>
+          <w:tcPr>
+            <w:tcW w:type="dxa" w:w="7898"/>
+            <w:tcBorders>
+              <w:top w:val="single" w:color="C9C9C4" w:sz="4"/>
+              <w:left w:val="single" w:color="C9C9C4" w:sz="4"/>
+              <w:bottom w:val="single" w:color="C9C9C4" w:sz="4"/>
+              <w:right w:val="single" w:color="C9C9C4" w:sz="4"/>
+            </w:tcBorders>
+            <w:tcMar>
+              <w:top w:type="dxa" w:w="60"/>
+              <w:left w:type="dxa" w:w="100"/>
+              <w:bottom w:type="dxa" w:w="60"/>
+              <w:right w:type="dxa" w:w="100"/>
+            </w:tcMar>
+          </w:tcPr>
+          <w:p>
+            <w:r>
+              <w:rPr>
+                <w:color w:val="0A0A0A"/>
+                <w:sz w:val="18"/>
+                <w:szCs w:val="18"/>
+              </w:rPr>
+              <w:t xml:space="preserve">/demo, the terminal verify shot, /labour, the README results section, recorded with the face camera running</w:t>
+            </w:r>
+          </w:p>
+        </w:tc>
+        <w:tc>
+          <w:tcPr>
+            <w:tcW w:type="dxa" w:w="1197"/>
             <w:tcBorders>
               <w:top w:val="single" w:color="C9C9C4" w:sz="4"/>
               <w:left w:val="single" w:color="C9C9C4" w:sz="4"/>
@@ -8629,7 +9172,7 @@
         </w:trPr>
         <w:tc>
           <w:tcPr>
-            <w:tcW w:type="dxa" w:w="1313"/>
+            <w:tcW w:type="dxa" w:w="1196"/>
             <w:tcBorders>
               <w:top w:val="single" w:color="C9C9C4" w:sz="4"/>
               <w:left w:val="single" w:color="C9C9C4" w:sz="4"/>
@@ -8656,61 +9199,61 @@
         </w:tc>
         <w:tc>
           <w:tcPr>
-            <w:tcW w:type="dxa" w:w="3545"/>
-            <w:tcBorders>
-              <w:top w:val="single" w:color="C9C9C4" w:sz="4"/>
-              <w:left w:val="single" w:color="C9C9C4" w:sz="4"/>
-              <w:bottom w:val="single" w:color="C9C9C4" w:sz="4"/>
-              <w:right w:val="single" w:color="C9C9C4" w:sz="4"/>
-            </w:tcBorders>
-            <w:tcMar>
-              <w:top w:type="dxa" w:w="60"/>
-              <w:left w:type="dxa" w:w="100"/>
-              <w:bottom w:type="dxa" w:w="60"/>
-              <w:right w:type="dxa" w:w="100"/>
-            </w:tcMar>
-          </w:tcPr>
-          <w:p>
-            <w:r>
-              <w:rPr>
-                <w:color w:val="0A0A0A"/>
-                <w:sz w:val="18"/>
-                <w:szCs w:val="18"/>
-              </w:rPr>
-              <w:t xml:space="preserve">Laptop, /r/EVT-...</w:t>
-            </w:r>
-          </w:p>
-        </w:tc>
-        <w:tc>
-          <w:tcPr>
-            <w:tcW w:type="dxa" w:w="8666"/>
-            <w:tcBorders>
-              <w:top w:val="single" w:color="C9C9C4" w:sz="4"/>
-              <w:left w:val="single" w:color="C9C9C4" w:sz="4"/>
-              <w:bottom w:val="single" w:color="C9C9C4" w:sz="4"/>
-              <w:right w:val="single" w:color="C9C9C4" w:sz="4"/>
-            </w:tcBorders>
-            <w:tcMar>
-              <w:top w:type="dxa" w:w="60"/>
-              <w:left w:type="dxa" w:w="100"/>
-              <w:bottom w:type="dxa" w:w="60"/>
-              <w:right w:type="dxa" w:w="100"/>
-            </w:tcMar>
-          </w:tcPr>
-          <w:p>
-            <w:r>
-              <w:rPr>
-                <w:color w:val="0A0A0A"/>
-                <w:sz w:val="18"/>
-                <w:szCs w:val="18"/>
-              </w:rPr>
-              <w:t xml:space="preserve">Open the signed copy from the paid card</w:t>
-            </w:r>
-          </w:p>
-        </w:tc>
-        <w:tc>
-          <w:tcPr>
-            <w:tcW w:type="dxa" w:w="1314"/>
+            <w:tcW w:type="dxa" w:w="4547"/>
+            <w:tcBorders>
+              <w:top w:val="single" w:color="C9C9C4" w:sz="4"/>
+              <w:left w:val="single" w:color="C9C9C4" w:sz="4"/>
+              <w:bottom w:val="single" w:color="C9C9C4" w:sz="4"/>
+              <w:right w:val="single" w:color="C9C9C4" w:sz="4"/>
+            </w:tcBorders>
+            <w:tcMar>
+              <w:top w:type="dxa" w:w="60"/>
+              <w:left w:type="dxa" w:w="100"/>
+              <w:bottom w:type="dxa" w:w="60"/>
+              <w:right w:type="dxa" w:w="100"/>
+            </w:tcMar>
+          </w:tcPr>
+          <w:p>
+            <w:r>
+              <w:rPr>
+                <w:color w:val="0A0A0A"/>
+                <w:sz w:val="18"/>
+                <w:szCs w:val="18"/>
+              </w:rPr>
+              <w:t xml:space="preserve">Face camera</w:t>
+            </w:r>
+          </w:p>
+        </w:tc>
+        <w:tc>
+          <w:tcPr>
+            <w:tcW w:type="dxa" w:w="7898"/>
+            <w:tcBorders>
+              <w:top w:val="single" w:color="C9C9C4" w:sz="4"/>
+              <w:left w:val="single" w:color="C9C9C4" w:sz="4"/>
+              <w:bottom w:val="single" w:color="C9C9C4" w:sz="4"/>
+              <w:right w:val="single" w:color="C9C9C4" w:sz="4"/>
+            </w:tcBorders>
+            <w:tcMar>
+              <w:top w:type="dxa" w:w="60"/>
+              <w:left w:type="dxa" w:w="100"/>
+              <w:bottom w:type="dxa" w:w="60"/>
+              <w:right w:type="dxa" w:w="100"/>
+            </w:tcMar>
+          </w:tcPr>
+          <w:p>
+            <w:r>
+              <w:rPr>
+                <w:color w:val="0A0A0A"/>
+                <w:sz w:val="18"/>
+                <w:szCs w:val="18"/>
+              </w:rPr>
+              <w:t xml:space="preserve">Karina narrating Part 4, recorded at the same time as C2 and C3</w:t>
+            </w:r>
+          </w:p>
+        </w:tc>
+        <w:tc>
+          <w:tcPr>
+            <w:tcW w:type="dxa" w:w="1197"/>
             <w:tcBorders>
               <w:top w:val="single" w:color="C9C9C4" w:sz="4"/>
               <w:left w:val="single" w:color="C9C9C4" w:sz="4"/>
@@ -8743,7 +9286,7 @@
         </w:trPr>
         <w:tc>
           <w:tcPr>
-            <w:tcW w:type="dxa" w:w="1313"/>
+            <w:tcW w:type="dxa" w:w="1196"/>
             <w:tcBorders>
               <w:top w:val="single" w:color="C9C9C4" w:sz="4"/>
               <w:left w:val="single" w:color="C9C9C4" w:sz="4"/>
@@ -8770,91 +9313,82 @@
         </w:tc>
         <w:tc>
           <w:tcPr>
-            <w:tcW w:type="dxa" w:w="3545"/>
-            <w:tcBorders>
-              <w:top w:val="single" w:color="C9C9C4" w:sz="4"/>
-              <w:left w:val="single" w:color="C9C9C4" w:sz="4"/>
-              <w:bottom w:val="single" w:color="C9C9C4" w:sz="4"/>
-              <w:right w:val="single" w:color="C9C9C4" w:sz="4"/>
-            </w:tcBorders>
-            <w:tcMar>
-              <w:top w:type="dxa" w:w="60"/>
-              <w:left w:type="dxa" w:w="100"/>
-              <w:bottom w:type="dxa" w:w="60"/>
-              <w:right w:type="dxa" w:w="100"/>
-            </w:tcMar>
-          </w:tcPr>
-          <w:p>
-            <w:r>
-              <w:rPr>
-                <w:color w:val="0A0A0A"/>
-                <w:sz w:val="18"/>
-                <w:szCs w:val="18"/>
-              </w:rPr>
-              <w:t xml:space="preserve">Terminal</w:t>
-            </w:r>
-          </w:p>
-        </w:tc>
-        <w:tc>
-          <w:tcPr>
-            <w:tcW w:type="dxa" w:w="8666"/>
-            <w:tcBorders>
-              <w:top w:val="single" w:color="C9C9C4" w:sz="4"/>
-              <w:left w:val="single" w:color="C9C9C4" w:sz="4"/>
-              <w:bottom w:val="single" w:color="C9C9C4" w:sz="4"/>
-              <w:right w:val="single" w:color="C9C9C4" w:sz="4"/>
-            </w:tcBorders>
-            <w:tcMar>
-              <w:top w:type="dxa" w:w="60"/>
-              <w:left w:type="dxa" w:w="100"/>
-              <w:bottom w:type="dxa" w:w="60"/>
-              <w:right w:type="dxa" w:w="100"/>
-            </w:tcMar>
-          </w:tcPr>
-          <w:p>
-            <w:r>
-              <w:rPr>
-                <w:rFonts w:ascii="Consolas" w:cs="Consolas" w:eastAsia="Consolas" w:hAnsi="Consolas"/>
-                <w:color w:val="0A0A0A"/>
-                <w:sz w:val="18"/>
-                <w:szCs w:val="18"/>
-              </w:rPr>
-              <w:t xml:space="preserve">curl -s -X POST https://metricsfile.vercel.app/api/verify -H 'content-type: application/json' -d @record.json</w:t>
-            </w:r>
-            <w:r>
-              <w:rPr>
-                <w:color w:val="0A0A0A"/>
-                <w:sz w:val="18"/>
-                <w:szCs w:val="18"/>
-              </w:rPr>
-              <w:t xml:space="preserve">, then again with payoutHkd edited</w:t>
-            </w:r>
-          </w:p>
-        </w:tc>
-        <w:tc>
-          <w:tcPr>
-            <w:tcW w:type="dxa" w:w="1314"/>
-            <w:tcBorders>
-              <w:top w:val="single" w:color="C9C9C4" w:sz="4"/>
-              <w:left w:val="single" w:color="C9C9C4" w:sz="4"/>
-              <w:bottom w:val="single" w:color="C9C9C4" w:sz="4"/>
-              <w:right w:val="single" w:color="C9C9C4" w:sz="4"/>
-            </w:tcBorders>
-            <w:tcMar>
-              <w:top w:type="dxa" w:w="60"/>
-              <w:left w:type="dxa" w:w="100"/>
-              <w:bottom w:type="dxa" w:w="60"/>
-              <w:right w:type="dxa" w:w="100"/>
-            </w:tcMar>
-          </w:tcPr>
-          <w:p>
-            <w:r>
-              <w:rPr>
-                <w:color w:val="0A0A0A"/>
-                <w:sz w:val="18"/>
-                <w:szCs w:val="18"/>
-              </w:rPr>
-              <w:t xml:space="preserve">4</w:t>
+            <w:tcW w:type="dxa" w:w="4547"/>
+            <w:tcBorders>
+              <w:top w:val="single" w:color="C9C9C4" w:sz="4"/>
+              <w:left w:val="single" w:color="C9C9C4" w:sz="4"/>
+              <w:bottom w:val="single" w:color="C9C9C4" w:sz="4"/>
+              <w:right w:val="single" w:color="C9C9C4" w:sz="4"/>
+            </w:tcBorders>
+            <w:tcMar>
+              <w:top w:type="dxa" w:w="60"/>
+              <w:left w:type="dxa" w:w="100"/>
+              <w:bottom w:type="dxa" w:w="60"/>
+              <w:right w:type="dxa" w:w="100"/>
+            </w:tcMar>
+          </w:tcPr>
+          <w:p>
+            <w:r>
+              <w:rPr>
+                <w:color w:val="0A0A0A"/>
+                <w:sz w:val="18"/>
+                <w:szCs w:val="18"/>
+              </w:rPr>
+              <w:t xml:space="preserve">Relay locations</w:t>
+            </w:r>
+          </w:p>
+        </w:tc>
+        <w:tc>
+          <w:tcPr>
+            <w:tcW w:type="dxa" w:w="7898"/>
+            <w:tcBorders>
+              <w:top w:val="single" w:color="C9C9C4" w:sz="4"/>
+              <w:left w:val="single" w:color="C9C9C4" w:sz="4"/>
+              <w:bottom w:val="single" w:color="C9C9C4" w:sz="4"/>
+              <w:right w:val="single" w:color="C9C9C4" w:sz="4"/>
+            </w:tcBorders>
+            <w:tcMar>
+              <w:top w:type="dxa" w:w="60"/>
+              <w:left w:type="dxa" w:w="100"/>
+              <w:bottom w:type="dxa" w:w="60"/>
+              <w:right w:type="dxa" w:w="100"/>
+            </w:tcMar>
+          </w:tcPr>
+          <w:p>
+            <w:r>
+              <w:rPr>
+                <w:color w:val="0A0A0A"/>
+                <w:sz w:val="18"/>
+                <w:szCs w:val="18"/>
+              </w:rPr>
+              <w:t xml:space="preserve">Lines 1 to 16, each shot twice</w:t>
+            </w:r>
+          </w:p>
+        </w:tc>
+        <w:tc>
+          <w:tcPr>
+            <w:tcW w:type="dxa" w:w="1197"/>
+            <w:tcBorders>
+              <w:top w:val="single" w:color="C9C9C4" w:sz="4"/>
+              <w:left w:val="single" w:color="C9C9C4" w:sz="4"/>
+              <w:bottom w:val="single" w:color="C9C9C4" w:sz="4"/>
+              <w:right w:val="single" w:color="C9C9C4" w:sz="4"/>
+            </w:tcBorders>
+            <w:tcMar>
+              <w:top w:type="dxa" w:w="60"/>
+              <w:left w:type="dxa" w:w="100"/>
+              <w:bottom w:type="dxa" w:w="60"/>
+              <w:right w:type="dxa" w:w="100"/>
+            </w:tcMar>
+          </w:tcPr>
+          <w:p>
+            <w:r>
+              <w:rPr>
+                <w:color w:val="0A0A0A"/>
+                <w:sz w:val="18"/>
+                <w:szCs w:val="18"/>
+              </w:rPr>
+              <w:t xml:space="preserve">2, 6</w:t>
             </w:r>
           </w:p>
         </w:tc>
@@ -8866,7 +9400,7 @@
         </w:trPr>
         <w:tc>
           <w:tcPr>
-            <w:tcW w:type="dxa" w:w="1313"/>
+            <w:tcW w:type="dxa" w:w="1196"/>
             <w:tcBorders>
               <w:top w:val="single" w:color="C9C9C4" w:sz="4"/>
               <w:left w:val="single" w:color="C9C9C4" w:sz="4"/>
@@ -8893,349 +9427,7 @@
         </w:tc>
         <w:tc>
           <w:tcPr>
-            <w:tcW w:type="dxa" w:w="3545"/>
-            <w:tcBorders>
-              <w:top w:val="single" w:color="C9C9C4" w:sz="4"/>
-              <w:left w:val="single" w:color="C9C9C4" w:sz="4"/>
-              <w:bottom w:val="single" w:color="C9C9C4" w:sz="4"/>
-              <w:right w:val="single" w:color="C9C9C4" w:sz="4"/>
-            </w:tcBorders>
-            <w:tcMar>
-              <w:top w:type="dxa" w:w="60"/>
-              <w:left w:type="dxa" w:w="100"/>
-              <w:bottom w:type="dxa" w:w="60"/>
-              <w:right w:type="dxa" w:w="100"/>
-            </w:tcMar>
-          </w:tcPr>
-          <w:p>
-            <w:r>
-              <w:rPr>
-                <w:color w:val="0A0A0A"/>
-                <w:sz w:val="18"/>
-                <w:szCs w:val="18"/>
-              </w:rPr>
-              <w:t xml:space="preserve">Laptop, /labour</w:t>
-            </w:r>
-          </w:p>
-        </w:tc>
-        <w:tc>
-          <w:tcPr>
-            <w:tcW w:type="dxa" w:w="8666"/>
-            <w:tcBorders>
-              <w:top w:val="single" w:color="C9C9C4" w:sz="4"/>
-              <w:left w:val="single" w:color="C9C9C4" w:sz="4"/>
-              <w:bottom w:val="single" w:color="C9C9C4" w:sz="4"/>
-              <w:right w:val="single" w:color="C9C9C4" w:sz="4"/>
-            </w:tcBorders>
-            <w:tcMar>
-              <w:top w:type="dxa" w:w="60"/>
-              <w:left w:type="dxa" w:w="100"/>
-              <w:bottom w:type="dxa" w:w="60"/>
-              <w:right w:type="dxa" w:w="100"/>
-            </w:tcMar>
-          </w:tcPr>
-          <w:p>
-            <w:r>
-              <w:rPr>
-                <w:color w:val="0A0A0A"/>
-                <w:sz w:val="18"/>
-                <w:szCs w:val="18"/>
-              </w:rPr>
-              <w:t xml:space="preserve">Slow scroll</w:t>
-            </w:r>
-          </w:p>
-        </w:tc>
-        <w:tc>
-          <w:tcPr>
-            <w:tcW w:type="dxa" w:w="1314"/>
-            <w:tcBorders>
-              <w:top w:val="single" w:color="C9C9C4" w:sz="4"/>
-              <w:left w:val="single" w:color="C9C9C4" w:sz="4"/>
-              <w:bottom w:val="single" w:color="C9C9C4" w:sz="4"/>
-              <w:right w:val="single" w:color="C9C9C4" w:sz="4"/>
-            </w:tcBorders>
-            <w:tcMar>
-              <w:top w:type="dxa" w:w="60"/>
-              <w:left w:type="dxa" w:w="100"/>
-              <w:bottom w:type="dxa" w:w="60"/>
-              <w:right w:type="dxa" w:w="100"/>
-            </w:tcMar>
-          </w:tcPr>
-          <w:p>
-            <w:r>
-              <w:rPr>
-                <w:color w:val="0A0A0A"/>
-                <w:sz w:val="18"/>
-                <w:szCs w:val="18"/>
-              </w:rPr>
-              <w:t xml:space="preserve">4</w:t>
-            </w:r>
-          </w:p>
-        </w:tc>
-      </w:tr>
-      <w:tr>
-        <w:trPr>
-          <w:cantSplit/>
-          <w:tblHeader w:val="off"/>
-        </w:trPr>
-        <w:tc>
-          <w:tcPr>
-            <w:tcW w:type="dxa" w:w="1313"/>
-            <w:tcBorders>
-              <w:top w:val="single" w:color="C9C9C4" w:sz="4"/>
-              <w:left w:val="single" w:color="C9C9C4" w:sz="4"/>
-              <w:bottom w:val="single" w:color="C9C9C4" w:sz="4"/>
-              <w:right w:val="single" w:color="C9C9C4" w:sz="4"/>
-            </w:tcBorders>
-            <w:tcMar>
-              <w:top w:type="dxa" w:w="60"/>
-              <w:left w:type="dxa" w:w="100"/>
-              <w:bottom w:type="dxa" w:w="60"/>
-              <w:right w:type="dxa" w:w="100"/>
-            </w:tcMar>
-          </w:tcPr>
-          <w:p>
-            <w:r>
-              <w:rPr>
-                <w:color w:val="0A0A0A"/>
-                <w:sz w:val="18"/>
-                <w:szCs w:val="18"/>
-              </w:rPr>
-              <w:t xml:space="preserve">C7</w:t>
-            </w:r>
-          </w:p>
-        </w:tc>
-        <w:tc>
-          <w:tcPr>
-            <w:tcW w:type="dxa" w:w="3545"/>
-            <w:tcBorders>
-              <w:top w:val="single" w:color="C9C9C4" w:sz="4"/>
-              <w:left w:val="single" w:color="C9C9C4" w:sz="4"/>
-              <w:bottom w:val="single" w:color="C9C9C4" w:sz="4"/>
-              <w:right w:val="single" w:color="C9C9C4" w:sz="4"/>
-            </w:tcBorders>
-            <w:tcMar>
-              <w:top w:type="dxa" w:w="60"/>
-              <w:left w:type="dxa" w:w="100"/>
-              <w:bottom w:type="dxa" w:w="60"/>
-              <w:right w:type="dxa" w:w="100"/>
-            </w:tcMar>
-          </w:tcPr>
-          <w:p>
-            <w:r>
-              <w:rPr>
-                <w:color w:val="0A0A0A"/>
-                <w:sz w:val="18"/>
-                <w:szCs w:val="18"/>
-              </w:rPr>
-              <w:t xml:space="preserve">Landing page</w:t>
-            </w:r>
-          </w:p>
-        </w:tc>
-        <w:tc>
-          <w:tcPr>
-            <w:tcW w:type="dxa" w:w="8666"/>
-            <w:tcBorders>
-              <w:top w:val="single" w:color="C9C9C4" w:sz="4"/>
-              <w:left w:val="single" w:color="C9C9C4" w:sz="4"/>
-              <w:bottom w:val="single" w:color="C9C9C4" w:sz="4"/>
-              <w:right w:val="single" w:color="C9C9C4" w:sz="4"/>
-            </w:tcBorders>
-            <w:tcMar>
-              <w:top w:type="dxa" w:w="60"/>
-              <w:left w:type="dxa" w:w="100"/>
-              <w:bottom w:type="dxa" w:w="60"/>
-              <w:right w:type="dxa" w:w="100"/>
-            </w:tcMar>
-          </w:tcPr>
-          <w:p>
-            <w:r>
-              <w:rPr>
-                <w:color w:val="0A0A0A"/>
-                <w:sz w:val="18"/>
-                <w:szCs w:val="18"/>
-              </w:rPr>
-              <w:t xml:space="preserve">Model section bars animating in</w:t>
-            </w:r>
-          </w:p>
-        </w:tc>
-        <w:tc>
-          <w:tcPr>
-            <w:tcW w:type="dxa" w:w="1314"/>
-            <w:tcBorders>
-              <w:top w:val="single" w:color="C9C9C4" w:sz="4"/>
-              <w:left w:val="single" w:color="C9C9C4" w:sz="4"/>
-              <w:bottom w:val="single" w:color="C9C9C4" w:sz="4"/>
-              <w:right w:val="single" w:color="C9C9C4" w:sz="4"/>
-            </w:tcBorders>
-            <w:tcMar>
-              <w:top w:type="dxa" w:w="60"/>
-              <w:left w:type="dxa" w:w="100"/>
-              <w:bottom w:type="dxa" w:w="60"/>
-              <w:right w:type="dxa" w:w="100"/>
-            </w:tcMar>
-          </w:tcPr>
-          <w:p>
-            <w:r>
-              <w:rPr>
-                <w:color w:val="0A0A0A"/>
-                <w:sz w:val="18"/>
-                <w:szCs w:val="18"/>
-              </w:rPr>
-              <w:t xml:space="preserve">4</w:t>
-            </w:r>
-          </w:p>
-        </w:tc>
-      </w:tr>
-      <w:tr>
-        <w:trPr>
-          <w:cantSplit/>
-          <w:tblHeader w:val="off"/>
-        </w:trPr>
-        <w:tc>
-          <w:tcPr>
-            <w:tcW w:type="dxa" w:w="1313"/>
-            <w:tcBorders>
-              <w:top w:val="single" w:color="C9C9C4" w:sz="4"/>
-              <w:left w:val="single" w:color="C9C9C4" w:sz="4"/>
-              <w:bottom w:val="single" w:color="C9C9C4" w:sz="4"/>
-              <w:right w:val="single" w:color="C9C9C4" w:sz="4"/>
-            </w:tcBorders>
-            <w:tcMar>
-              <w:top w:type="dxa" w:w="60"/>
-              <w:left w:type="dxa" w:w="100"/>
-              <w:bottom w:type="dxa" w:w="60"/>
-              <w:right w:type="dxa" w:w="100"/>
-            </w:tcMar>
-          </w:tcPr>
-          <w:p>
-            <w:r>
-              <w:rPr>
-                <w:color w:val="0A0A0A"/>
-                <w:sz w:val="18"/>
-                <w:szCs w:val="18"/>
-              </w:rPr>
-              <w:t xml:space="preserve">C8</w:t>
-            </w:r>
-          </w:p>
-        </w:tc>
-        <w:tc>
-          <w:tcPr>
-            <w:tcW w:type="dxa" w:w="3545"/>
-            <w:tcBorders>
-              <w:top w:val="single" w:color="C9C9C4" w:sz="4"/>
-              <w:left w:val="single" w:color="C9C9C4" w:sz="4"/>
-              <w:bottom w:val="single" w:color="C9C9C4" w:sz="4"/>
-              <w:right w:val="single" w:color="C9C9C4" w:sz="4"/>
-            </w:tcBorders>
-            <w:tcMar>
-              <w:top w:type="dxa" w:w="60"/>
-              <w:left w:type="dxa" w:w="100"/>
-              <w:bottom w:type="dxa" w:w="60"/>
-              <w:right w:type="dxa" w:w="100"/>
-            </w:tcMar>
-          </w:tcPr>
-          <w:p>
-            <w:r>
-              <w:rPr>
-                <w:color w:val="0A0A0A"/>
-                <w:sz w:val="18"/>
-                <w:szCs w:val="18"/>
-              </w:rPr>
-              <w:t xml:space="preserve">Relay locations</w:t>
-            </w:r>
-          </w:p>
-        </w:tc>
-        <w:tc>
-          <w:tcPr>
-            <w:tcW w:type="dxa" w:w="8666"/>
-            <w:tcBorders>
-              <w:top w:val="single" w:color="C9C9C4" w:sz="4"/>
-              <w:left w:val="single" w:color="C9C9C4" w:sz="4"/>
-              <w:bottom w:val="single" w:color="C9C9C4" w:sz="4"/>
-              <w:right w:val="single" w:color="C9C9C4" w:sz="4"/>
-            </w:tcBorders>
-            <w:tcMar>
-              <w:top w:type="dxa" w:w="60"/>
-              <w:left w:type="dxa" w:w="100"/>
-              <w:bottom w:type="dxa" w:w="60"/>
-              <w:right w:type="dxa" w:w="100"/>
-            </w:tcMar>
-          </w:tcPr>
-          <w:p>
-            <w:r>
-              <w:rPr>
-                <w:color w:val="0A0A0A"/>
-                <w:sz w:val="18"/>
-                <w:szCs w:val="18"/>
-              </w:rPr>
-              <w:t xml:space="preserve">Lines 1 to 15, each shot twice</w:t>
-            </w:r>
-          </w:p>
-        </w:tc>
-        <w:tc>
-          <w:tcPr>
-            <w:tcW w:type="dxa" w:w="1314"/>
-            <w:tcBorders>
-              <w:top w:val="single" w:color="C9C9C4" w:sz="4"/>
-              <w:left w:val="single" w:color="C9C9C4" w:sz="4"/>
-              <w:bottom w:val="single" w:color="C9C9C4" w:sz="4"/>
-              <w:right w:val="single" w:color="C9C9C4" w:sz="4"/>
-            </w:tcBorders>
-            <w:tcMar>
-              <w:top w:type="dxa" w:w="60"/>
-              <w:left w:type="dxa" w:w="100"/>
-              <w:bottom w:type="dxa" w:w="60"/>
-              <w:right w:type="dxa" w:w="100"/>
-            </w:tcMar>
-          </w:tcPr>
-          <w:p>
-            <w:r>
-              <w:rPr>
-                <w:color w:val="0A0A0A"/>
-                <w:sz w:val="18"/>
-                <w:szCs w:val="18"/>
-              </w:rPr>
-              <w:t xml:space="preserve">2, 6</w:t>
-            </w:r>
-          </w:p>
-        </w:tc>
-      </w:tr>
-      <w:tr>
-        <w:trPr>
-          <w:cantSplit/>
-          <w:tblHeader w:val="off"/>
-        </w:trPr>
-        <w:tc>
-          <w:tcPr>
-            <w:tcW w:type="dxa" w:w="1313"/>
-            <w:tcBorders>
-              <w:top w:val="single" w:color="C9C9C4" w:sz="4"/>
-              <w:left w:val="single" w:color="C9C9C4" w:sz="4"/>
-              <w:bottom w:val="single" w:color="C9C9C4" w:sz="4"/>
-              <w:right w:val="single" w:color="C9C9C4" w:sz="4"/>
-            </w:tcBorders>
-            <w:tcMar>
-              <w:top w:type="dxa" w:w="60"/>
-              <w:left w:type="dxa" w:w="100"/>
-              <w:bottom w:type="dxa" w:w="60"/>
-              <w:right w:type="dxa" w:w="100"/>
-            </w:tcMar>
-          </w:tcPr>
-          <w:p>
-            <w:r>
-              <w:rPr>
-                <w:color w:val="0A0A0A"/>
-                <w:sz w:val="18"/>
-                <w:szCs w:val="18"/>
-              </w:rPr>
-              <w:t xml:space="preserve">C9</w:t>
-            </w:r>
-          </w:p>
-        </w:tc>
-        <w:tc>
-          <w:tcPr>
-            <w:tcW w:type="dxa" w:w="3545"/>
+            <w:tcW w:type="dxa" w:w="4547"/>
             <w:tcBorders>
               <w:top w:val="single" w:color="C9C9C4" w:sz="4"/>
               <w:left w:val="single" w:color="C9C9C4" w:sz="4"/>
@@ -9262,7 +9454,7 @@
         </w:tc>
         <w:tc>
           <w:tcPr>
-            <w:tcW w:type="dxa" w:w="8666"/>
+            <w:tcW w:type="dxa" w:w="7898"/>
             <w:tcBorders>
               <w:top w:val="single" w:color="C9C9C4" w:sz="4"/>
               <w:left w:val="single" w:color="C9C9C4" w:sz="4"/>
@@ -9289,7 +9481,7 @@
         </w:tc>
         <w:tc>
           <w:tcPr>
-            <w:tcW w:type="dxa" w:w="1314"/>
+            <w:tcW w:type="dxa" w:w="1197"/>
             <w:tcBorders>
               <w:top w:val="single" w:color="C9C9C4" w:sz="4"/>
               <w:left w:val="single" w:color="C9C9C4" w:sz="4"/>
@@ -9326,7 +9518,7 @@
         <w:spacing w:after="120"/>
       </w:pPr>
       <w:r>
-        <w:t xml:space="preserve">For C5, open /api/events/EVT-... and save the "record" field as record.json.</w:t>
+        <w:t xml:space="preserve">Put files in footage/clips/part1 to part7, named in order. footage/ is never committed.</w:t>
       </w:r>
     </w:p>
     <w:p>
@@ -9346,7 +9538,7 @@
         </w:numPr>
       </w:pPr>
       <w:r>
-        <w:t xml:space="preserve">Total under 4:30</w:t>
+        <w:t xml:space="preserve">Total under 4:30 (target 3:58)</w:t>
       </w:r>
     </w:p>
     <w:p>
@@ -9370,7 +9562,7 @@
         </w:numPr>
       </w:pPr>
       <w:r>
-        <w:t xml:space="preserve">"Synthetic crash window" and "Placeholder amounts" captioned in Part 4</w:t>
+        <w:t xml:space="preserve">"Synthetic crash window" and "Placeholder amounts" captioned in Part 4; face circle never covers a number</w:t>
       </w:r>
     </w:p>
     <w:p>

</xml_diff>

<commit_message>
Video script: second by second screen recording with the phone held up to camera
</commit_message>
<xml_diff>
--- a/docs/submission/VIDEO_SCRIPT.docx
+++ b/docs/submission/VIDEO_SCRIPT.docx
@@ -3792,10 +3792,11 @@
         </w:tblBorders>
       </w:tblPr>
       <w:tblGrid>
-        <w:gridCol w:w="889"/>
-        <w:gridCol w:w="4769"/>
-        <w:gridCol w:w="4769"/>
-        <w:gridCol w:w="4411"/>
+        <w:gridCol w:w="911"/>
+        <w:gridCol w:w="1041"/>
+        <w:gridCol w:w="4295"/>
+        <w:gridCol w:w="4295"/>
+        <w:gridCol w:w="4296"/>
       </w:tblGrid>
       <w:tr>
         <w:trPr>
@@ -3804,7 +3805,7 @@
         </w:trPr>
         <w:tc>
           <w:tcPr>
-            <w:tcW w:type="dxa" w:w="889"/>
+            <w:tcW w:type="dxa" w:w="911"/>
             <w:tcBorders>
               <w:top w:val="single" w:color="C9C9C4" w:sz="4"/>
               <w:left w:val="single" w:color="C9C9C4" w:sz="4"/>
@@ -3828,13 +3829,13 @@
                 <w:sz w:val="18"/>
                 <w:szCs w:val="18"/>
               </w:rPr>
-              <w:t xml:space="preserve">Time</w:t>
-            </w:r>
-          </w:p>
-        </w:tc>
-        <w:tc>
-          <w:tcPr>
-            <w:tcW w:type="dxa" w:w="4769"/>
+              <w:t xml:space="preserve">Seconds</w:t>
+            </w:r>
+          </w:p>
+        </w:tc>
+        <w:tc>
+          <w:tcPr>
+            <w:tcW w:type="dxa" w:w="1041"/>
             <w:tcBorders>
               <w:top w:val="single" w:color="C9C9C4" w:sz="4"/>
               <w:left w:val="single" w:color="C9C9C4" w:sz="4"/>
@@ -3858,13 +3859,13 @@
                 <w:sz w:val="18"/>
                 <w:szCs w:val="18"/>
               </w:rPr>
-              <w:t xml:space="preserve">Screen</w:t>
-            </w:r>
-          </w:p>
-        </w:tc>
-        <w:tc>
-          <w:tcPr>
-            <w:tcW w:type="dxa" w:w="4769"/>
+              <w:t xml:space="preserve">Video time</w:t>
+            </w:r>
+          </w:p>
+        </w:tc>
+        <w:tc>
+          <w:tcPr>
+            <w:tcW w:type="dxa" w:w="4295"/>
             <w:tcBorders>
               <w:top w:val="single" w:color="C9C9C4" w:sz="4"/>
               <w:left w:val="single" w:color="C9C9C4" w:sz="4"/>
@@ -3888,13 +3889,13 @@
                 <w:sz w:val="18"/>
                 <w:szCs w:val="18"/>
               </w:rPr>
-              <w:t xml:space="preserve">Karina</w:t>
-            </w:r>
-          </w:p>
-        </w:tc>
-        <w:tc>
-          <w:tcPr>
-            <w:tcW w:type="dxa" w:w="4411"/>
+              <w:t xml:space="preserve">Screen</w:t>
+            </w:r>
+          </w:p>
+        </w:tc>
+        <w:tc>
+          <w:tcPr>
+            <w:tcW w:type="dxa" w:w="4295"/>
             <w:tcBorders>
               <w:top w:val="single" w:color="C9C9C4" w:sz="4"/>
               <w:left w:val="single" w:color="C9C9C4" w:sz="4"/>
@@ -3918,7 +3919,37 @@
                 <w:sz w:val="18"/>
                 <w:szCs w:val="18"/>
               </w:rPr>
-              <w:t xml:space="preserve">Source corner or caption</w:t>
+              <w:t xml:space="preserve">Karina says</w:t>
+            </w:r>
+          </w:p>
+        </w:tc>
+        <w:tc>
+          <w:tcPr>
+            <w:tcW w:type="dxa" w:w="4296"/>
+            <w:tcBorders>
+              <w:top w:val="single" w:color="C9C9C4" w:sz="4"/>
+              <w:left w:val="single" w:color="C9C9C4" w:sz="4"/>
+              <w:bottom w:val="single" w:color="C9C9C4" w:sz="4"/>
+              <w:right w:val="single" w:color="C9C9C4" w:sz="4"/>
+            </w:tcBorders>
+            <w:shd w:fill="EDE9FF" w:color="auto" w:val="clear"/>
+            <w:tcMar>
+              <w:top w:type="dxa" w:w="60"/>
+              <w:left w:type="dxa" w:w="100"/>
+              <w:bottom w:type="dxa" w:w="60"/>
+              <w:right w:type="dxa" w:w="100"/>
+            </w:tcMar>
+          </w:tcPr>
+          <w:p>
+            <w:r>
+              <w:rPr>
+                <w:b/>
+                <w:bCs/>
+                <w:color w:val="0A0A0A"/>
+                <w:sz w:val="18"/>
+                <w:szCs w:val="18"/>
+              </w:rPr>
+              <w:t xml:space="preserve">Caption or source corner</w:t>
             </w:r>
           </w:p>
         </w:tc>
@@ -3930,7 +3961,34 @@
         </w:trPr>
         <w:tc>
           <w:tcPr>
-            <w:tcW w:type="dxa" w:w="889"/>
+            <w:tcW w:type="dxa" w:w="911"/>
+            <w:tcBorders>
+              <w:top w:val="single" w:color="C9C9C4" w:sz="4"/>
+              <w:left w:val="single" w:color="C9C9C4" w:sz="4"/>
+              <w:bottom w:val="single" w:color="C9C9C4" w:sz="4"/>
+              <w:right w:val="single" w:color="C9C9C4" w:sz="4"/>
+            </w:tcBorders>
+            <w:tcMar>
+              <w:top w:type="dxa" w:w="60"/>
+              <w:left w:type="dxa" w:w="100"/>
+              <w:bottom w:type="dxa" w:w="60"/>
+              <w:right w:type="dxa" w:w="100"/>
+            </w:tcMar>
+          </w:tcPr>
+          <w:p>
+            <w:r>
+              <w:rPr>
+                <w:color w:val="0A0A0A"/>
+                <w:sz w:val="18"/>
+                <w:szCs w:val="18"/>
+              </w:rPr>
+              <w:t xml:space="preserve">0 to 3</w:t>
+            </w:r>
+          </w:p>
+        </w:tc>
+        <w:tc>
+          <w:tcPr>
+            <w:tcW w:type="dxa" w:w="1041"/>
             <w:tcBorders>
               <w:top w:val="single" w:color="C9C9C4" w:sz="4"/>
               <w:left w:val="single" w:color="C9C9C4" w:sz="4"/>
@@ -3957,61 +4015,61 @@
         </w:tc>
         <w:tc>
           <w:tcPr>
-            <w:tcW w:type="dxa" w:w="4769"/>
-            <w:tcBorders>
-              <w:top w:val="single" w:color="C9C9C4" w:sz="4"/>
-              <w:left w:val="single" w:color="C9C9C4" w:sz="4"/>
-              <w:bottom w:val="single" w:color="C9C9C4" w:sz="4"/>
-              <w:right w:val="single" w:color="C9C9C4" w:sz="4"/>
-            </w:tcBorders>
-            <w:tcMar>
-              <w:top w:type="dxa" w:w="60"/>
-              <w:left w:type="dxa" w:w="100"/>
-              <w:bottom w:type="dxa" w:w="60"/>
-              <w:right w:type="dxa" w:w="100"/>
-            </w:tcMar>
-          </w:tcPr>
-          <w:p>
-            <w:r>
-              <w:rPr>
-                <w:color w:val="0A0A0A"/>
-                <w:sz w:val="18"/>
-                <w:szCs w:val="18"/>
-              </w:rPr>
-              <w:t xml:space="preserve">Phone full screen, metricsfile.vercel.app/rider: consent, On shift, live sensor trace. Face circle appears</w:t>
-            </w:r>
-          </w:p>
-        </w:tc>
-        <w:tc>
-          <w:tcPr>
-            <w:tcW w:type="dxa" w:w="4769"/>
-            <w:tcBorders>
-              <w:top w:val="single" w:color="C9C9C4" w:sz="4"/>
-              <w:left w:val="single" w:color="C9C9C4" w:sz="4"/>
-              <w:bottom w:val="single" w:color="C9C9C4" w:sz="4"/>
-              <w:right w:val="single" w:color="C9C9C4" w:sz="4"/>
-            </w:tcBorders>
-            <w:tcMar>
-              <w:top w:type="dxa" w:w="60"/>
-              <w:left w:type="dxa" w:w="100"/>
-              <w:bottom w:type="dxa" w:w="60"/>
-              <w:right w:type="dxa" w:w="100"/>
-            </w:tcMar>
-          </w:tcPr>
-          <w:p>
-            <w:r>
-              <w:rPr>
-                <w:color w:val="0A0A0A"/>
-                <w:sz w:val="18"/>
-                <w:szCs w:val="18"/>
-              </w:rPr>
-              <w:t xml:space="preserve">"This is the live app. My phone is the sensor, streaming motion to our server while I'm on shift."</w:t>
-            </w:r>
-          </w:p>
-        </w:tc>
-        <w:tc>
-          <w:tcPr>
-            <w:tcW w:type="dxa" w:w="4411"/>
+            <w:tcW w:type="dxa" w:w="4295"/>
+            <w:tcBorders>
+              <w:top w:val="single" w:color="C9C9C4" w:sz="4"/>
+              <w:left w:val="single" w:color="C9C9C4" w:sz="4"/>
+              <w:bottom w:val="single" w:color="C9C9C4" w:sz="4"/>
+              <w:right w:val="single" w:color="C9C9C4" w:sz="4"/>
+            </w:tcBorders>
+            <w:tcMar>
+              <w:top w:type="dxa" w:w="60"/>
+              <w:left w:type="dxa" w:w="100"/>
+              <w:bottom w:type="dxa" w:w="60"/>
+              <w:right w:type="dxa" w:w="100"/>
+            </w:tcMar>
+          </w:tcPr>
+          <w:p>
+            <w:r>
+              <w:rPr>
+                <w:color w:val="0A0A0A"/>
+                <w:sz w:val="18"/>
+                <w:szCs w:val="18"/>
+              </w:rPr>
+              <w:t xml:space="preserve">Face camera grows to fill the centre. Karina lifts her phone to the lens, screen facing the camera, /rider on shift with the live trace moving</w:t>
+            </w:r>
+          </w:p>
+        </w:tc>
+        <w:tc>
+          <w:tcPr>
+            <w:tcW w:type="dxa" w:w="4295"/>
+            <w:tcBorders>
+              <w:top w:val="single" w:color="C9C9C4" w:sz="4"/>
+              <w:left w:val="single" w:color="C9C9C4" w:sz="4"/>
+              <w:bottom w:val="single" w:color="C9C9C4" w:sz="4"/>
+              <w:right w:val="single" w:color="C9C9C4" w:sz="4"/>
+            </w:tcBorders>
+            <w:tcMar>
+              <w:top w:type="dxa" w:w="60"/>
+              <w:left w:type="dxa" w:w="100"/>
+              <w:bottom w:type="dxa" w:w="60"/>
+              <w:right w:type="dxa" w:w="100"/>
+            </w:tcMar>
+          </w:tcPr>
+          <w:p>
+            <w:r>
+              <w:rPr>
+                <w:color w:val="0A0A0A"/>
+                <w:sz w:val="18"/>
+                <w:szCs w:val="18"/>
+              </w:rPr>
+              <w:t xml:space="preserve">"This is the live app, running on my phone."</w:t>
+            </w:r>
+          </w:p>
+        </w:tc>
+        <w:tc>
+          <w:tcPr>
+            <w:tcW w:type="dxa" w:w="4296"/>
             <w:tcBorders>
               <w:top w:val="single" w:color="C9C9C4" w:sz="4"/>
               <w:left w:val="single" w:color="C9C9C4" w:sz="4"/>
@@ -4044,109 +4102,136 @@
         </w:trPr>
         <w:tc>
           <w:tcPr>
-            <w:tcW w:type="dxa" w:w="889"/>
-            <w:tcBorders>
-              <w:top w:val="single" w:color="C9C9C4" w:sz="4"/>
-              <w:left w:val="single" w:color="C9C9C4" w:sz="4"/>
-              <w:bottom w:val="single" w:color="C9C9C4" w:sz="4"/>
-              <w:right w:val="single" w:color="C9C9C4" w:sz="4"/>
-            </w:tcBorders>
-            <w:tcMar>
-              <w:top w:type="dxa" w:w="60"/>
-              <w:left w:type="dxa" w:w="100"/>
-              <w:bottom w:type="dxa" w:w="60"/>
-              <w:right w:type="dxa" w:w="100"/>
-            </w:tcMar>
-          </w:tcPr>
-          <w:p>
-            <w:r>
-              <w:rPr>
-                <w:color w:val="0A0A0A"/>
-                <w:sz w:val="18"/>
-                <w:szCs w:val="18"/>
-              </w:rPr>
-              <w:t xml:space="preserve">1:57</w:t>
-            </w:r>
-          </w:p>
-        </w:tc>
-        <w:tc>
-          <w:tcPr>
-            <w:tcW w:type="dxa" w:w="4769"/>
-            <w:tcBorders>
-              <w:top w:val="single" w:color="C9C9C4" w:sz="4"/>
-              <w:left w:val="single" w:color="C9C9C4" w:sz="4"/>
-              <w:bottom w:val="single" w:color="C9C9C4" w:sz="4"/>
-              <w:right w:val="single" w:color="C9C9C4" w:sz="4"/>
-            </w:tcBorders>
-            <w:tcMar>
-              <w:top w:type="dxa" w:w="60"/>
-              <w:left w:type="dxa" w:w="100"/>
-              <w:bottom w:type="dxa" w:w="60"/>
-              <w:right w:type="dxa" w:w="100"/>
-            </w:tcMar>
-          </w:tcPr>
-          <w:p>
-            <w:r>
-              <w:rPr>
-                <w:color w:val="0A0A0A"/>
-                <w:sz w:val="18"/>
-                <w:szCs w:val="18"/>
-              </w:rPr>
-              <w:t xml:space="preserve">Phone dropped onto a cushion: 30 second countdown, large I'm OK button. Cut to the laptop</w:t>
-            </w:r>
-          </w:p>
-        </w:tc>
-        <w:tc>
-          <w:tcPr>
-            <w:tcW w:type="dxa" w:w="4769"/>
-            <w:tcBorders>
-              <w:top w:val="single" w:color="C9C9C4" w:sz="4"/>
-              <w:left w:val="single" w:color="C9C9C4" w:sz="4"/>
-              <w:bottom w:val="single" w:color="C9C9C4" w:sz="4"/>
-              <w:right w:val="single" w:color="C9C9C4" w:sz="4"/>
-            </w:tcBorders>
-            <w:tcMar>
-              <w:top w:type="dxa" w:w="60"/>
-              <w:left w:type="dxa" w:w="100"/>
-              <w:bottom w:type="dxa" w:w="60"/>
-              <w:right w:type="dxa" w:w="100"/>
-            </w:tcMar>
-          </w:tcPr>
-          <w:p>
-            <w:r>
-              <w:rPr>
-                <w:color w:val="0A0A0A"/>
-                <w:sz w:val="18"/>
-                <w:szCs w:val="18"/>
-              </w:rPr>
-              <w:t xml:space="preserve">"Our model catches 93 percent of falls on people it never saw, at 93 percent precision."</w:t>
-            </w:r>
-          </w:p>
-        </w:tc>
-        <w:tc>
-          <w:tcPr>
-            <w:tcW w:type="dxa" w:w="4411"/>
-            <w:tcBorders>
-              <w:top w:val="single" w:color="C9C9C4" w:sz="4"/>
-              <w:left w:val="single" w:color="C9C9C4" w:sz="4"/>
-              <w:bottom w:val="single" w:color="C9C9C4" w:sz="4"/>
-              <w:right w:val="single" w:color="C9C9C4" w:sz="4"/>
-            </w:tcBorders>
-            <w:tcMar>
-              <w:top w:type="dxa" w:w="60"/>
-              <w:left w:type="dxa" w:w="100"/>
-              <w:bottom w:type="dxa" w:w="60"/>
-              <w:right w:type="dxa" w:w="100"/>
-            </w:tcMar>
-          </w:tcPr>
-          <w:p>
-            <w:r>
-              <w:rPr>
-                <w:color w:val="0A0A0A"/>
-                <w:sz w:val="18"/>
-                <w:szCs w:val="18"/>
-              </w:rPr>
-              <w:t xml:space="preserve">UMAFall, leave-subjects-out, 95% CIs, ml/out/results.md</w:t>
+            <w:tcW w:type="dxa" w:w="911"/>
+            <w:tcBorders>
+              <w:top w:val="single" w:color="C9C9C4" w:sz="4"/>
+              <w:left w:val="single" w:color="C9C9C4" w:sz="4"/>
+              <w:bottom w:val="single" w:color="C9C9C4" w:sz="4"/>
+              <w:right w:val="single" w:color="C9C9C4" w:sz="4"/>
+            </w:tcBorders>
+            <w:tcMar>
+              <w:top w:type="dxa" w:w="60"/>
+              <w:left w:type="dxa" w:w="100"/>
+              <w:bottom w:type="dxa" w:w="60"/>
+              <w:right w:type="dxa" w:w="100"/>
+            </w:tcMar>
+          </w:tcPr>
+          <w:p>
+            <w:r>
+              <w:rPr>
+                <w:color w:val="0A0A0A"/>
+                <w:sz w:val="18"/>
+                <w:szCs w:val="18"/>
+              </w:rPr>
+              <w:t xml:space="preserve">3 to 7</w:t>
+            </w:r>
+          </w:p>
+        </w:tc>
+        <w:tc>
+          <w:tcPr>
+            <w:tcW w:type="dxa" w:w="1041"/>
+            <w:tcBorders>
+              <w:top w:val="single" w:color="C9C9C4" w:sz="4"/>
+              <w:left w:val="single" w:color="C9C9C4" w:sz="4"/>
+              <w:bottom w:val="single" w:color="C9C9C4" w:sz="4"/>
+              <w:right w:val="single" w:color="C9C9C4" w:sz="4"/>
+            </w:tcBorders>
+            <w:tcMar>
+              <w:top w:type="dxa" w:w="60"/>
+              <w:left w:type="dxa" w:w="100"/>
+              <w:bottom w:type="dxa" w:w="60"/>
+              <w:right w:type="dxa" w:w="100"/>
+            </w:tcMar>
+          </w:tcPr>
+          <w:p>
+            <w:r>
+              <w:rPr>
+                <w:color w:val="0A0A0A"/>
+                <w:sz w:val="18"/>
+                <w:szCs w:val="18"/>
+              </w:rPr>
+              <w:t xml:space="preserve">1:53</w:t>
+            </w:r>
+          </w:p>
+        </w:tc>
+        <w:tc>
+          <w:tcPr>
+            <w:tcW w:type="dxa" w:w="4295"/>
+            <w:tcBorders>
+              <w:top w:val="single" w:color="C9C9C4" w:sz="4"/>
+              <w:left w:val="single" w:color="C9C9C4" w:sz="4"/>
+              <w:bottom w:val="single" w:color="C9C9C4" w:sz="4"/>
+              <w:right w:val="single" w:color="C9C9C4" w:sz="4"/>
+            </w:tcBorders>
+            <w:tcMar>
+              <w:top w:type="dxa" w:w="60"/>
+              <w:left w:type="dxa" w:w="100"/>
+              <w:bottom w:type="dxa" w:w="60"/>
+              <w:right w:type="dxa" w:w="100"/>
+            </w:tcMar>
+          </w:tcPr>
+          <w:p>
+            <w:r>
+              <w:rPr>
+                <w:color w:val="0A0A0A"/>
+                <w:sz w:val="18"/>
+                <w:szCs w:val="18"/>
+              </w:rPr>
+              <w:t xml:space="preserve">Cut to the phone screen recording, full screen: On shift, trace moving. Face shrinks to the circle bottom right</w:t>
+            </w:r>
+          </w:p>
+        </w:tc>
+        <w:tc>
+          <w:tcPr>
+            <w:tcW w:type="dxa" w:w="4295"/>
+            <w:tcBorders>
+              <w:top w:val="single" w:color="C9C9C4" w:sz="4"/>
+              <w:left w:val="single" w:color="C9C9C4" w:sz="4"/>
+              <w:bottom w:val="single" w:color="C9C9C4" w:sz="4"/>
+              <w:right w:val="single" w:color="C9C9C4" w:sz="4"/>
+            </w:tcBorders>
+            <w:tcMar>
+              <w:top w:type="dxa" w:w="60"/>
+              <w:left w:type="dxa" w:w="100"/>
+              <w:bottom w:type="dxa" w:w="60"/>
+              <w:right w:type="dxa" w:w="100"/>
+            </w:tcMar>
+          </w:tcPr>
+          <w:p>
+            <w:r>
+              <w:rPr>
+                <w:color w:val="0A0A0A"/>
+                <w:sz w:val="18"/>
+                <w:szCs w:val="18"/>
+              </w:rPr>
+              <w:t xml:space="preserve">"My phone is the sensor. It streams motion to our server, only while I'm on shift."</w:t>
+            </w:r>
+          </w:p>
+        </w:tc>
+        <w:tc>
+          <w:tcPr>
+            <w:tcW w:type="dxa" w:w="4296"/>
+            <w:tcBorders>
+              <w:top w:val="single" w:color="C9C9C4" w:sz="4"/>
+              <w:left w:val="single" w:color="C9C9C4" w:sz="4"/>
+              <w:bottom w:val="single" w:color="C9C9C4" w:sz="4"/>
+              <w:right w:val="single" w:color="C9C9C4" w:sz="4"/>
+            </w:tcBorders>
+            <w:tcMar>
+              <w:top w:type="dxa" w:w="60"/>
+              <w:left w:type="dxa" w:w="100"/>
+              <w:bottom w:type="dxa" w:w="60"/>
+              <w:right w:type="dxa" w:w="100"/>
+            </w:tcMar>
+          </w:tcPr>
+          <w:p>
+            <w:r>
+              <w:rPr>
+                <w:color w:val="0A0A0A"/>
+                <w:sz w:val="18"/>
+                <w:szCs w:val="18"/>
+              </w:rPr>
+              <w:t xml:space="preserve"/>
             </w:r>
           </w:p>
         </w:tc>
@@ -4158,109 +4243,136 @@
         </w:trPr>
         <w:tc>
           <w:tcPr>
-            <w:tcW w:type="dxa" w:w="889"/>
-            <w:tcBorders>
-              <w:top w:val="single" w:color="C9C9C4" w:sz="4"/>
-              <w:left w:val="single" w:color="C9C9C4" w:sz="4"/>
-              <w:bottom w:val="single" w:color="C9C9C4" w:sz="4"/>
-              <w:right w:val="single" w:color="C9C9C4" w:sz="4"/>
-            </w:tcBorders>
-            <w:tcMar>
-              <w:top w:type="dxa" w:w="60"/>
-              <w:left w:type="dxa" w:w="100"/>
-              <w:bottom w:type="dxa" w:w="60"/>
-              <w:right w:type="dxa" w:w="100"/>
-            </w:tcMar>
-          </w:tcPr>
-          <w:p>
-            <w:r>
-              <w:rPr>
-                <w:color w:val="0A0A0A"/>
-                <w:sz w:val="18"/>
-                <w:szCs w:val="18"/>
-              </w:rPr>
-              <w:t xml:space="preserve">2:03</w:t>
-            </w:r>
-          </w:p>
-        </w:tc>
-        <w:tc>
-          <w:tcPr>
-            <w:tcW w:type="dxa" w:w="4769"/>
-            <w:tcBorders>
-              <w:top w:val="single" w:color="C9C9C4" w:sz="4"/>
-              <w:left w:val="single" w:color="C9C9C4" w:sz="4"/>
-              <w:bottom w:val="single" w:color="C9C9C4" w:sz="4"/>
-              <w:right w:val="single" w:color="C9C9C4" w:sz="4"/>
-            </w:tcBorders>
-            <w:tcMar>
-              <w:top w:type="dxa" w:w="60"/>
-              <w:left w:type="dxa" w:w="100"/>
-              <w:bottom w:type="dxa" w:w="60"/>
-              <w:right w:type="dxa" w:w="100"/>
-            </w:tcMar>
-          </w:tcPr>
-          <w:p>
-            <w:r>
-              <w:rPr>
-                <w:color w:val="0A0A0A"/>
-                <w:sz w:val="18"/>
-                <w:szCs w:val="18"/>
-              </w:rPr>
-              <w:t xml:space="preserve">Laptop /demo: Second app on, Crash, dispatcher card slides in</w:t>
-            </w:r>
-          </w:p>
-        </w:tc>
-        <w:tc>
-          <w:tcPr>
-            <w:tcW w:type="dxa" w:w="4769"/>
-            <w:tcBorders>
-              <w:top w:val="single" w:color="C9C9C4" w:sz="4"/>
-              <w:left w:val="single" w:color="C9C9C4" w:sz="4"/>
-              <w:bottom w:val="single" w:color="C9C9C4" w:sz="4"/>
-              <w:right w:val="single" w:color="C9C9C4" w:sz="4"/>
-            </w:tcBorders>
-            <w:tcMar>
-              <w:top w:type="dxa" w:w="60"/>
-              <w:left w:type="dxa" w:w="100"/>
-              <w:bottom w:type="dxa" w:w="60"/>
-              <w:right w:type="dxa" w:w="100"/>
-            </w:tcMar>
-          </w:tcPr>
-          <w:p>
-            <w:r>
-              <w:rPr>
-                <w:color w:val="0A0A0A"/>
-                <w:sz w:val="18"/>
-                <w:szCs w:val="18"/>
-              </w:rPr>
-              <w:t xml:space="preserve">"Thirty seconds without a tap, and dispatch gets the location and likely injury. The record names both apps."</w:t>
-            </w:r>
-          </w:p>
-        </w:tc>
-        <w:tc>
-          <w:tcPr>
-            <w:tcW w:type="dxa" w:w="4411"/>
-            <w:tcBorders>
-              <w:top w:val="single" w:color="C9C9C4" w:sz="4"/>
-              <w:left w:val="single" w:color="C9C9C4" w:sz="4"/>
-              <w:bottom w:val="single" w:color="C9C9C4" w:sz="4"/>
-              <w:right w:val="single" w:color="C9C9C4" w:sz="4"/>
-            </w:tcBorders>
-            <w:tcMar>
-              <w:top w:type="dxa" w:w="60"/>
-              <w:left w:type="dxa" w:w="100"/>
-              <w:bottom w:type="dxa" w:w="60"/>
-              <w:right w:type="dxa" w:w="100"/>
-            </w:tcMar>
-          </w:tcPr>
-          <w:p>
-            <w:r>
-              <w:rPr>
-                <w:color w:val="0A0A0A"/>
-                <w:sz w:val="18"/>
-                <w:szCs w:val="18"/>
-              </w:rPr>
-              <w:t xml:space="preserve">Demo rider, synthetic crash window</w:t>
+            <w:tcW w:type="dxa" w:w="911"/>
+            <w:tcBorders>
+              <w:top w:val="single" w:color="C9C9C4" w:sz="4"/>
+              <w:left w:val="single" w:color="C9C9C4" w:sz="4"/>
+              <w:bottom w:val="single" w:color="C9C9C4" w:sz="4"/>
+              <w:right w:val="single" w:color="C9C9C4" w:sz="4"/>
+            </w:tcBorders>
+            <w:tcMar>
+              <w:top w:type="dxa" w:w="60"/>
+              <w:left w:type="dxa" w:w="100"/>
+              <w:bottom w:type="dxa" w:w="60"/>
+              <w:right w:type="dxa" w:w="100"/>
+            </w:tcMar>
+          </w:tcPr>
+          <w:p>
+            <w:r>
+              <w:rPr>
+                <w:color w:val="0A0A0A"/>
+                <w:sz w:val="18"/>
+                <w:szCs w:val="18"/>
+              </w:rPr>
+              <w:t xml:space="preserve">7 to 10</w:t>
+            </w:r>
+          </w:p>
+        </w:tc>
+        <w:tc>
+          <w:tcPr>
+            <w:tcW w:type="dxa" w:w="1041"/>
+            <w:tcBorders>
+              <w:top w:val="single" w:color="C9C9C4" w:sz="4"/>
+              <w:left w:val="single" w:color="C9C9C4" w:sz="4"/>
+              <w:bottom w:val="single" w:color="C9C9C4" w:sz="4"/>
+              <w:right w:val="single" w:color="C9C9C4" w:sz="4"/>
+            </w:tcBorders>
+            <w:tcMar>
+              <w:top w:type="dxa" w:w="60"/>
+              <w:left w:type="dxa" w:w="100"/>
+              <w:bottom w:type="dxa" w:w="60"/>
+              <w:right w:type="dxa" w:w="100"/>
+            </w:tcMar>
+          </w:tcPr>
+          <w:p>
+            <w:r>
+              <w:rPr>
+                <w:color w:val="0A0A0A"/>
+                <w:sz w:val="18"/>
+                <w:szCs w:val="18"/>
+              </w:rPr>
+              <w:t xml:space="preserve">1:57</w:t>
+            </w:r>
+          </w:p>
+        </w:tc>
+        <w:tc>
+          <w:tcPr>
+            <w:tcW w:type="dxa" w:w="4295"/>
+            <w:tcBorders>
+              <w:top w:val="single" w:color="C9C9C4" w:sz="4"/>
+              <w:left w:val="single" w:color="C9C9C4" w:sz="4"/>
+              <w:bottom w:val="single" w:color="C9C9C4" w:sz="4"/>
+              <w:right w:val="single" w:color="C9C9C4" w:sz="4"/>
+            </w:tcBorders>
+            <w:tcMar>
+              <w:top w:type="dxa" w:w="60"/>
+              <w:left w:type="dxa" w:w="100"/>
+              <w:bottom w:type="dxa" w:w="60"/>
+              <w:right w:type="dxa" w:w="100"/>
+            </w:tcMar>
+          </w:tcPr>
+          <w:p>
+            <w:r>
+              <w:rPr>
+                <w:color w:val="0A0A0A"/>
+                <w:sz w:val="18"/>
+                <w:szCs w:val="18"/>
+              </w:rPr>
+              <w:t xml:space="preserve">Face camera: she drops the phone onto a cushion in frame. No words, keep the thud</w:t>
+            </w:r>
+          </w:p>
+        </w:tc>
+        <w:tc>
+          <w:tcPr>
+            <w:tcW w:type="dxa" w:w="4295"/>
+            <w:tcBorders>
+              <w:top w:val="single" w:color="C9C9C4" w:sz="4"/>
+              <w:left w:val="single" w:color="C9C9C4" w:sz="4"/>
+              <w:bottom w:val="single" w:color="C9C9C4" w:sz="4"/>
+              <w:right w:val="single" w:color="C9C9C4" w:sz="4"/>
+            </w:tcBorders>
+            <w:tcMar>
+              <w:top w:type="dxa" w:w="60"/>
+              <w:left w:type="dxa" w:w="100"/>
+              <w:bottom w:type="dxa" w:w="60"/>
+              <w:right w:type="dxa" w:w="100"/>
+            </w:tcMar>
+          </w:tcPr>
+          <w:p>
+            <w:r>
+              <w:rPr>
+                <w:color w:val="0A0A0A"/>
+                <w:sz w:val="18"/>
+                <w:szCs w:val="18"/>
+              </w:rPr>
+              <w:t xml:space="preserve">(silent)</w:t>
+            </w:r>
+          </w:p>
+        </w:tc>
+        <w:tc>
+          <w:tcPr>
+            <w:tcW w:type="dxa" w:w="4296"/>
+            <w:tcBorders>
+              <w:top w:val="single" w:color="C9C9C4" w:sz="4"/>
+              <w:left w:val="single" w:color="C9C9C4" w:sz="4"/>
+              <w:bottom w:val="single" w:color="C9C9C4" w:sz="4"/>
+              <w:right w:val="single" w:color="C9C9C4" w:sz="4"/>
+            </w:tcBorders>
+            <w:tcMar>
+              <w:top w:type="dxa" w:w="60"/>
+              <w:left w:type="dxa" w:w="100"/>
+              <w:bottom w:type="dxa" w:w="60"/>
+              <w:right w:type="dxa" w:w="100"/>
+            </w:tcMar>
+          </w:tcPr>
+          <w:p>
+            <w:r>
+              <w:rPr>
+                <w:color w:val="0A0A0A"/>
+                <w:sz w:val="18"/>
+                <w:szCs w:val="18"/>
+              </w:rPr>
+              <w:t xml:space="preserve"/>
             </w:r>
           </w:p>
         </w:tc>
@@ -4272,109 +4384,136 @@
         </w:trPr>
         <w:tc>
           <w:tcPr>
-            <w:tcW w:type="dxa" w:w="889"/>
-            <w:tcBorders>
-              <w:top w:val="single" w:color="C9C9C4" w:sz="4"/>
-              <w:left w:val="single" w:color="C9C9C4" w:sz="4"/>
-              <w:bottom w:val="single" w:color="C9C9C4" w:sz="4"/>
-              <w:right w:val="single" w:color="C9C9C4" w:sz="4"/>
-            </w:tcBorders>
-            <w:tcMar>
-              <w:top w:type="dxa" w:w="60"/>
-              <w:left w:type="dxa" w:w="100"/>
-              <w:bottom w:type="dxa" w:w="60"/>
-              <w:right w:type="dxa" w:w="100"/>
-            </w:tcMar>
-          </w:tcPr>
-          <w:p>
-            <w:r>
-              <w:rPr>
-                <w:color w:val="0A0A0A"/>
-                <w:sz w:val="18"/>
-                <w:szCs w:val="18"/>
-              </w:rPr>
-              <w:t xml:space="preserve">2:11</w:t>
-            </w:r>
-          </w:p>
-        </w:tc>
-        <w:tc>
-          <w:tcPr>
-            <w:tcW w:type="dxa" w:w="4769"/>
-            <w:tcBorders>
-              <w:top w:val="single" w:color="C9C9C4" w:sz="4"/>
-              <w:left w:val="single" w:color="C9C9C4" w:sz="4"/>
-              <w:bottom w:val="single" w:color="C9C9C4" w:sz="4"/>
-              <w:right w:val="single" w:color="C9C9C4" w:sz="4"/>
-            </w:tcBorders>
-            <w:tcMar>
-              <w:top w:type="dxa" w:w="60"/>
-              <w:left w:type="dxa" w:w="100"/>
-              <w:bottom w:type="dxa" w:w="60"/>
-              <w:right w:type="dxa" w:w="100"/>
-            </w:tcMar>
-          </w:tcPr>
-          <w:p>
-            <w:r>
-              <w:rPr>
-                <w:color w:val="0A0A0A"/>
-                <w:sz w:val="18"/>
-                <w:szCs w:val="18"/>
-              </w:rPr>
-              <w:t xml:space="preserve">Underwriter panel: Paid, split 50 and 50 between Platform A and B, "Settlement verified"</w:t>
-            </w:r>
-          </w:p>
-        </w:tc>
-        <w:tc>
-          <w:tcPr>
-            <w:tcW w:type="dxa" w:w="4769"/>
-            <w:tcBorders>
-              <w:top w:val="single" w:color="C9C9C4" w:sz="4"/>
-              <w:left w:val="single" w:color="C9C9C4" w:sz="4"/>
-              <w:bottom w:val="single" w:color="C9C9C4" w:sz="4"/>
-              <w:right w:val="single" w:color="C9C9C4" w:sz="4"/>
-            </w:tcBorders>
-            <w:tcMar>
-              <w:top w:type="dxa" w:w="60"/>
-              <w:left w:type="dxa" w:w="100"/>
-              <w:bottom w:type="dxa" w:w="60"/>
-              <w:right w:type="dxa" w:w="100"/>
-            </w:tcMar>
-          </w:tcPr>
-          <w:p>
-            <w:r>
-              <w:rPr>
-                <w:color w:val="0A0A0A"/>
-                <w:sz w:val="18"/>
-                <w:szCs w:val="18"/>
-              </w:rPr>
-              <w:t xml:space="preserve">"Tier one pays and splits between platforms. Every record and payout is signed and hash-chained."</w:t>
-            </w:r>
-          </w:p>
-        </w:tc>
-        <w:tc>
-          <w:tcPr>
-            <w:tcW w:type="dxa" w:w="4411"/>
-            <w:tcBorders>
-              <w:top w:val="single" w:color="C9C9C4" w:sz="4"/>
-              <w:left w:val="single" w:color="C9C9C4" w:sz="4"/>
-              <w:bottom w:val="single" w:color="C9C9C4" w:sz="4"/>
-              <w:right w:val="single" w:color="C9C9C4" w:sz="4"/>
-            </w:tcBorders>
-            <w:tcMar>
-              <w:top w:type="dxa" w:w="60"/>
-              <w:left w:type="dxa" w:w="100"/>
-              <w:bottom w:type="dxa" w:w="60"/>
-              <w:right w:type="dxa" w:w="100"/>
-            </w:tcMar>
-          </w:tcPr>
-          <w:p>
-            <w:r>
-              <w:rPr>
-                <w:color w:val="0A0A0A"/>
-                <w:sz w:val="18"/>
-                <w:szCs w:val="18"/>
-              </w:rPr>
-              <w:t xml:space="preserve">Placeholder amounts</w:t>
+            <w:tcW w:type="dxa" w:w="911"/>
+            <w:tcBorders>
+              <w:top w:val="single" w:color="C9C9C4" w:sz="4"/>
+              <w:left w:val="single" w:color="C9C9C4" w:sz="4"/>
+              <w:bottom w:val="single" w:color="C9C9C4" w:sz="4"/>
+              <w:right w:val="single" w:color="C9C9C4" w:sz="4"/>
+            </w:tcBorders>
+            <w:tcMar>
+              <w:top w:type="dxa" w:w="60"/>
+              <w:left w:type="dxa" w:w="100"/>
+              <w:bottom w:type="dxa" w:w="60"/>
+              <w:right w:type="dxa" w:w="100"/>
+            </w:tcMar>
+          </w:tcPr>
+          <w:p>
+            <w:r>
+              <w:rPr>
+                <w:color w:val="0A0A0A"/>
+                <w:sz w:val="18"/>
+                <w:szCs w:val="18"/>
+              </w:rPr>
+              <w:t xml:space="preserve">10 to 14</w:t>
+            </w:r>
+          </w:p>
+        </w:tc>
+        <w:tc>
+          <w:tcPr>
+            <w:tcW w:type="dxa" w:w="1041"/>
+            <w:tcBorders>
+              <w:top w:val="single" w:color="C9C9C4" w:sz="4"/>
+              <w:left w:val="single" w:color="C9C9C4" w:sz="4"/>
+              <w:bottom w:val="single" w:color="C9C9C4" w:sz="4"/>
+              <w:right w:val="single" w:color="C9C9C4" w:sz="4"/>
+            </w:tcBorders>
+            <w:tcMar>
+              <w:top w:type="dxa" w:w="60"/>
+              <w:left w:type="dxa" w:w="100"/>
+              <w:bottom w:type="dxa" w:w="60"/>
+              <w:right w:type="dxa" w:w="100"/>
+            </w:tcMar>
+          </w:tcPr>
+          <w:p>
+            <w:r>
+              <w:rPr>
+                <w:color w:val="0A0A0A"/>
+                <w:sz w:val="18"/>
+                <w:szCs w:val="18"/>
+              </w:rPr>
+              <w:t xml:space="preserve">2:00</w:t>
+            </w:r>
+          </w:p>
+        </w:tc>
+        <w:tc>
+          <w:tcPr>
+            <w:tcW w:type="dxa" w:w="4295"/>
+            <w:tcBorders>
+              <w:top w:val="single" w:color="C9C9C4" w:sz="4"/>
+              <w:left w:val="single" w:color="C9C9C4" w:sz="4"/>
+              <w:bottom w:val="single" w:color="C9C9C4" w:sz="4"/>
+              <w:right w:val="single" w:color="C9C9C4" w:sz="4"/>
+            </w:tcBorders>
+            <w:tcMar>
+              <w:top w:type="dxa" w:w="60"/>
+              <w:left w:type="dxa" w:w="100"/>
+              <w:bottom w:type="dxa" w:w="60"/>
+              <w:right w:type="dxa" w:w="100"/>
+            </w:tcMar>
+          </w:tcPr>
+          <w:p>
+            <w:r>
+              <w:rPr>
+                <w:color w:val="0A0A0A"/>
+                <w:sz w:val="18"/>
+                <w:szCs w:val="18"/>
+              </w:rPr>
+              <w:t xml:space="preserve">Phone screen recording: the 30 second countdown and the big I'm OK button</w:t>
+            </w:r>
+          </w:p>
+        </w:tc>
+        <w:tc>
+          <w:tcPr>
+            <w:tcW w:type="dxa" w:w="4295"/>
+            <w:tcBorders>
+              <w:top w:val="single" w:color="C9C9C4" w:sz="4"/>
+              <w:left w:val="single" w:color="C9C9C4" w:sz="4"/>
+              <w:bottom w:val="single" w:color="C9C9C4" w:sz="4"/>
+              <w:right w:val="single" w:color="C9C9C4" w:sz="4"/>
+            </w:tcBorders>
+            <w:tcMar>
+              <w:top w:type="dxa" w:w="60"/>
+              <w:left w:type="dxa" w:w="100"/>
+              <w:bottom w:type="dxa" w:w="60"/>
+              <w:right w:type="dxa" w:w="100"/>
+            </w:tcMar>
+          </w:tcPr>
+          <w:p>
+            <w:r>
+              <w:rPr>
+                <w:color w:val="0A0A0A"/>
+                <w:sz w:val="18"/>
+                <w:szCs w:val="18"/>
+              </w:rPr>
+              <w:t xml:space="preserve">"A fall. Thirty seconds to cancel."</w:t>
+            </w:r>
+          </w:p>
+        </w:tc>
+        <w:tc>
+          <w:tcPr>
+            <w:tcW w:type="dxa" w:w="4296"/>
+            <w:tcBorders>
+              <w:top w:val="single" w:color="C9C9C4" w:sz="4"/>
+              <w:left w:val="single" w:color="C9C9C4" w:sz="4"/>
+              <w:bottom w:val="single" w:color="C9C9C4" w:sz="4"/>
+              <w:right w:val="single" w:color="C9C9C4" w:sz="4"/>
+            </w:tcBorders>
+            <w:tcMar>
+              <w:top w:type="dxa" w:w="60"/>
+              <w:left w:type="dxa" w:w="100"/>
+              <w:bottom w:type="dxa" w:w="60"/>
+              <w:right w:type="dxa" w:w="100"/>
+            </w:tcMar>
+          </w:tcPr>
+          <w:p>
+            <w:r>
+              <w:rPr>
+                <w:color w:val="0A0A0A"/>
+                <w:sz w:val="18"/>
+                <w:szCs w:val="18"/>
+              </w:rPr>
+              <w:t xml:space="preserve"/>
             </w:r>
           </w:p>
         </w:tc>
@@ -4386,109 +4525,136 @@
         </w:trPr>
         <w:tc>
           <w:tcPr>
-            <w:tcW w:type="dxa" w:w="889"/>
-            <w:tcBorders>
-              <w:top w:val="single" w:color="C9C9C4" w:sz="4"/>
-              <w:left w:val="single" w:color="C9C9C4" w:sz="4"/>
-              <w:bottom w:val="single" w:color="C9C9C4" w:sz="4"/>
-              <w:right w:val="single" w:color="C9C9C4" w:sz="4"/>
-            </w:tcBorders>
-            <w:tcMar>
-              <w:top w:type="dxa" w:w="60"/>
-              <w:left w:type="dxa" w:w="100"/>
-              <w:bottom w:type="dxa" w:w="60"/>
-              <w:right w:type="dxa" w:w="100"/>
-            </w:tcMar>
-          </w:tcPr>
-          <w:p>
-            <w:r>
-              <w:rPr>
-                <w:color w:val="0A0A0A"/>
-                <w:sz w:val="18"/>
-                <w:szCs w:val="18"/>
-              </w:rPr>
-              <w:t xml:space="preserve">2:18</w:t>
-            </w:r>
-          </w:p>
-        </w:tc>
-        <w:tc>
-          <w:tcPr>
-            <w:tcW w:type="dxa" w:w="4769"/>
-            <w:tcBorders>
-              <w:top w:val="single" w:color="C9C9C4" w:sz="4"/>
-              <w:left w:val="single" w:color="C9C9C4" w:sz="4"/>
-              <w:bottom w:val="single" w:color="C9C9C4" w:sz="4"/>
-              <w:right w:val="single" w:color="C9C9C4" w:sz="4"/>
-            </w:tcBorders>
-            <w:tcMar>
-              <w:top w:type="dxa" w:w="60"/>
-              <w:left w:type="dxa" w:w="100"/>
-              <w:bottom w:type="dxa" w:w="60"/>
-              <w:right w:type="dxa" w:w="100"/>
-            </w:tcMar>
-          </w:tcPr>
-          <w:p>
-            <w:r>
-              <w:rPr>
-                <w:color w:val="0A0A0A"/>
-                <w:sz w:val="18"/>
-                <w:szCs w:val="18"/>
-              </w:rPr>
-              <w:t xml:space="preserve">Terminal beside the browser: /api/verify returns valid; payoutHkd edited to 80000, returns invalid</w:t>
-            </w:r>
-          </w:p>
-        </w:tc>
-        <w:tc>
-          <w:tcPr>
-            <w:tcW w:type="dxa" w:w="4769"/>
-            <w:tcBorders>
-              <w:top w:val="single" w:color="C9C9C4" w:sz="4"/>
-              <w:left w:val="single" w:color="C9C9C4" w:sz="4"/>
-              <w:bottom w:val="single" w:color="C9C9C4" w:sz="4"/>
-              <w:right w:val="single" w:color="C9C9C4" w:sz="4"/>
-            </w:tcBorders>
-            <w:tcMar>
-              <w:top w:type="dxa" w:w="60"/>
-              <w:left w:type="dxa" w:w="100"/>
-              <w:bottom w:type="dxa" w:w="60"/>
-              <w:right w:type="dxa" w:w="100"/>
-            </w:tcMar>
-          </w:tcPr>
-          <w:p>
-            <w:r>
-              <w:rPr>
-                <w:color w:val="0A0A0A"/>
-                <w:sz w:val="18"/>
-                <w:szCs w:val="18"/>
-              </w:rPr>
-              <w:t xml:space="preserve">"Edit one number and verification fails. Nobody can quietly change a claim."</w:t>
-            </w:r>
-          </w:p>
-        </w:tc>
-        <w:tc>
-          <w:tcPr>
-            <w:tcW w:type="dxa" w:w="4411"/>
-            <w:tcBorders>
-              <w:top w:val="single" w:color="C9C9C4" w:sz="4"/>
-              <w:left w:val="single" w:color="C9C9C4" w:sz="4"/>
-              <w:bottom w:val="single" w:color="C9C9C4" w:sz="4"/>
-              <w:right w:val="single" w:color="C9C9C4" w:sz="4"/>
-            </w:tcBorders>
-            <w:tcMar>
-              <w:top w:type="dxa" w:w="60"/>
-              <w:left w:type="dxa" w:w="100"/>
-              <w:bottom w:type="dxa" w:w="60"/>
-              <w:right w:type="dxa" w:w="100"/>
-            </w:tcMar>
-          </w:tcPr>
-          <w:p>
-            <w:r>
-              <w:rPr>
-                <w:color w:val="0A0A0A"/>
-                <w:sz w:val="18"/>
-                <w:szCs w:val="18"/>
-              </w:rPr>
-              <w:t xml:space="preserve"/>
+            <w:tcW w:type="dxa" w:w="911"/>
+            <w:tcBorders>
+              <w:top w:val="single" w:color="C9C9C4" w:sz="4"/>
+              <w:left w:val="single" w:color="C9C9C4" w:sz="4"/>
+              <w:bottom w:val="single" w:color="C9C9C4" w:sz="4"/>
+              <w:right w:val="single" w:color="C9C9C4" w:sz="4"/>
+            </w:tcBorders>
+            <w:tcMar>
+              <w:top w:type="dxa" w:w="60"/>
+              <w:left w:type="dxa" w:w="100"/>
+              <w:bottom w:type="dxa" w:w="60"/>
+              <w:right w:type="dxa" w:w="100"/>
+            </w:tcMar>
+          </w:tcPr>
+          <w:p>
+            <w:r>
+              <w:rPr>
+                <w:color w:val="0A0A0A"/>
+                <w:sz w:val="18"/>
+                <w:szCs w:val="18"/>
+              </w:rPr>
+              <w:t xml:space="preserve">14 to 19</w:t>
+            </w:r>
+          </w:p>
+        </w:tc>
+        <w:tc>
+          <w:tcPr>
+            <w:tcW w:type="dxa" w:w="1041"/>
+            <w:tcBorders>
+              <w:top w:val="single" w:color="C9C9C4" w:sz="4"/>
+              <w:left w:val="single" w:color="C9C9C4" w:sz="4"/>
+              <w:bottom w:val="single" w:color="C9C9C4" w:sz="4"/>
+              <w:right w:val="single" w:color="C9C9C4" w:sz="4"/>
+            </w:tcBorders>
+            <w:tcMar>
+              <w:top w:type="dxa" w:w="60"/>
+              <w:left w:type="dxa" w:w="100"/>
+              <w:bottom w:type="dxa" w:w="60"/>
+              <w:right w:type="dxa" w:w="100"/>
+            </w:tcMar>
+          </w:tcPr>
+          <w:p>
+            <w:r>
+              <w:rPr>
+                <w:color w:val="0A0A0A"/>
+                <w:sz w:val="18"/>
+                <w:szCs w:val="18"/>
+              </w:rPr>
+              <w:t xml:space="preserve">2:04</w:t>
+            </w:r>
+          </w:p>
+        </w:tc>
+        <w:tc>
+          <w:tcPr>
+            <w:tcW w:type="dxa" w:w="4295"/>
+            <w:tcBorders>
+              <w:top w:val="single" w:color="C9C9C4" w:sz="4"/>
+              <w:left w:val="single" w:color="C9C9C4" w:sz="4"/>
+              <w:bottom w:val="single" w:color="C9C9C4" w:sz="4"/>
+              <w:right w:val="single" w:color="C9C9C4" w:sz="4"/>
+            </w:tcBorders>
+            <w:tcMar>
+              <w:top w:type="dxa" w:w="60"/>
+              <w:left w:type="dxa" w:w="100"/>
+              <w:bottom w:type="dxa" w:w="60"/>
+              <w:right w:type="dxa" w:w="100"/>
+            </w:tcMar>
+          </w:tcPr>
+          <w:p>
+            <w:r>
+              <w:rPr>
+                <w:color w:val="0A0A0A"/>
+                <w:sz w:val="18"/>
+                <w:szCs w:val="18"/>
+              </w:rPr>
+              <w:t xml:space="preserve">Laptop /demo, Second app already on: press Crash, the sensor panel spikes, the probability reads high</w:t>
+            </w:r>
+          </w:p>
+        </w:tc>
+        <w:tc>
+          <w:tcPr>
+            <w:tcW w:type="dxa" w:w="4295"/>
+            <w:tcBorders>
+              <w:top w:val="single" w:color="C9C9C4" w:sz="4"/>
+              <w:left w:val="single" w:color="C9C9C4" w:sz="4"/>
+              <w:bottom w:val="single" w:color="C9C9C4" w:sz="4"/>
+              <w:right w:val="single" w:color="C9C9C4" w:sz="4"/>
+            </w:tcBorders>
+            <w:tcMar>
+              <w:top w:type="dxa" w:w="60"/>
+              <w:left w:type="dxa" w:w="100"/>
+              <w:bottom w:type="dxa" w:w="60"/>
+              <w:right w:type="dxa" w:w="100"/>
+            </w:tcMar>
+          </w:tcPr>
+          <w:p>
+            <w:r>
+              <w:rPr>
+                <w:color w:val="0A0A0A"/>
+                <w:sz w:val="18"/>
+                <w:szCs w:val="18"/>
+              </w:rPr>
+              <w:t xml:space="preserve">"Our model catches 93 percent of falls on people it never saw, at 93 percent precision."</w:t>
+            </w:r>
+          </w:p>
+        </w:tc>
+        <w:tc>
+          <w:tcPr>
+            <w:tcW w:type="dxa" w:w="4296"/>
+            <w:tcBorders>
+              <w:top w:val="single" w:color="C9C9C4" w:sz="4"/>
+              <w:left w:val="single" w:color="C9C9C4" w:sz="4"/>
+              <w:bottom w:val="single" w:color="C9C9C4" w:sz="4"/>
+              <w:right w:val="single" w:color="C9C9C4" w:sz="4"/>
+            </w:tcBorders>
+            <w:tcMar>
+              <w:top w:type="dxa" w:w="60"/>
+              <w:left w:type="dxa" w:w="100"/>
+              <w:bottom w:type="dxa" w:w="60"/>
+              <w:right w:type="dxa" w:w="100"/>
+            </w:tcMar>
+          </w:tcPr>
+          <w:p>
+            <w:r>
+              <w:rPr>
+                <w:color w:val="0A0A0A"/>
+                <w:sz w:val="18"/>
+                <w:szCs w:val="18"/>
+              </w:rPr>
+              <w:t xml:space="preserve">UMAFall, leave-subjects-out, 95% CIs. Demo rider, synthetic crash window</w:t>
             </w:r>
           </w:p>
         </w:tc>
@@ -4500,88 +4666,115 @@
         </w:trPr>
         <w:tc>
           <w:tcPr>
-            <w:tcW w:type="dxa" w:w="889"/>
-            <w:tcBorders>
-              <w:top w:val="single" w:color="C9C9C4" w:sz="4"/>
-              <w:left w:val="single" w:color="C9C9C4" w:sz="4"/>
-              <w:bottom w:val="single" w:color="C9C9C4" w:sz="4"/>
-              <w:right w:val="single" w:color="C9C9C4" w:sz="4"/>
-            </w:tcBorders>
-            <w:tcMar>
-              <w:top w:type="dxa" w:w="60"/>
-              <w:left w:type="dxa" w:w="100"/>
-              <w:bottom w:type="dxa" w:w="60"/>
-              <w:right w:type="dxa" w:w="100"/>
-            </w:tcMar>
-          </w:tcPr>
-          <w:p>
-            <w:r>
-              <w:rPr>
-                <w:color w:val="0A0A0A"/>
-                <w:sz w:val="18"/>
-                <w:szCs w:val="18"/>
-              </w:rPr>
-              <w:t xml:space="preserve">2:24</w:t>
-            </w:r>
-          </w:p>
-        </w:tc>
-        <w:tc>
-          <w:tcPr>
-            <w:tcW w:type="dxa" w:w="4769"/>
-            <w:tcBorders>
-              <w:top w:val="single" w:color="C9C9C4" w:sz="4"/>
-              <w:left w:val="single" w:color="C9C9C4" w:sz="4"/>
-              <w:bottom w:val="single" w:color="C9C9C4" w:sz="4"/>
-              <w:right w:val="single" w:color="C9C9C4" w:sz="4"/>
-            </w:tcBorders>
-            <w:tcMar>
-              <w:top w:type="dxa" w:w="60"/>
-              <w:left w:type="dxa" w:w="100"/>
-              <w:bottom w:type="dxa" w:w="60"/>
-              <w:right w:type="dxa" w:w="100"/>
-            </w:tcMar>
-          </w:tcPr>
-          <w:p>
-            <w:r>
-              <w:rPr>
-                <w:color w:val="0A0A0A"/>
-                <w:sz w:val="18"/>
-                <w:szCs w:val="18"/>
-              </w:rPr>
-              <w:t xml:space="preserve">/labour: injuries by time left on the delivery clock, hazard cells ranked by rate</w:t>
-            </w:r>
-          </w:p>
-        </w:tc>
-        <w:tc>
-          <w:tcPr>
-            <w:tcW w:type="dxa" w:w="4769"/>
-            <w:tcBorders>
-              <w:top w:val="single" w:color="C9C9C4" w:sz="4"/>
-              <w:left w:val="single" w:color="C9C9C4" w:sz="4"/>
-              <w:bottom w:val="single" w:color="C9C9C4" w:sz="4"/>
-              <w:right w:val="single" w:color="C9C9C4" w:sz="4"/>
-            </w:tcBorders>
-            <w:tcMar>
-              <w:top w:type="dxa" w:w="60"/>
-              <w:left w:type="dxa" w:w="100"/>
-              <w:bottom w:type="dxa" w:w="60"/>
-              <w:right w:type="dxa" w:w="100"/>
-            </w:tcMar>
-          </w:tcPr>
-          <w:p>
-            <w:r>
-              <w:rPr>
-                <w:color w:val="0A0A0A"/>
-                <w:sz w:val="18"/>
-                <w:szCs w:val="18"/>
-              </w:rPr>
-              <w:t xml:space="preserve">"The Labour Department sees aggregates only: no rider ids, no routes."</w:t>
-            </w:r>
-          </w:p>
-        </w:tc>
-        <w:tc>
-          <w:tcPr>
-            <w:tcW w:type="dxa" w:w="4411"/>
+            <w:tcW w:type="dxa" w:w="911"/>
+            <w:tcBorders>
+              <w:top w:val="single" w:color="C9C9C4" w:sz="4"/>
+              <w:left w:val="single" w:color="C9C9C4" w:sz="4"/>
+              <w:bottom w:val="single" w:color="C9C9C4" w:sz="4"/>
+              <w:right w:val="single" w:color="C9C9C4" w:sz="4"/>
+            </w:tcBorders>
+            <w:tcMar>
+              <w:top w:type="dxa" w:w="60"/>
+              <w:left w:type="dxa" w:w="100"/>
+              <w:bottom w:type="dxa" w:w="60"/>
+              <w:right w:type="dxa" w:w="100"/>
+            </w:tcMar>
+          </w:tcPr>
+          <w:p>
+            <w:r>
+              <w:rPr>
+                <w:color w:val="0A0A0A"/>
+                <w:sz w:val="18"/>
+                <w:szCs w:val="18"/>
+              </w:rPr>
+              <w:t xml:space="preserve">19 to 25</w:t>
+            </w:r>
+          </w:p>
+        </w:tc>
+        <w:tc>
+          <w:tcPr>
+            <w:tcW w:type="dxa" w:w="1041"/>
+            <w:tcBorders>
+              <w:top w:val="single" w:color="C9C9C4" w:sz="4"/>
+              <w:left w:val="single" w:color="C9C9C4" w:sz="4"/>
+              <w:bottom w:val="single" w:color="C9C9C4" w:sz="4"/>
+              <w:right w:val="single" w:color="C9C9C4" w:sz="4"/>
+            </w:tcBorders>
+            <w:tcMar>
+              <w:top w:type="dxa" w:w="60"/>
+              <w:left w:type="dxa" w:w="100"/>
+              <w:bottom w:type="dxa" w:w="60"/>
+              <w:right w:type="dxa" w:w="100"/>
+            </w:tcMar>
+          </w:tcPr>
+          <w:p>
+            <w:r>
+              <w:rPr>
+                <w:color w:val="0A0A0A"/>
+                <w:sz w:val="18"/>
+                <w:szCs w:val="18"/>
+              </w:rPr>
+              <w:t xml:space="preserve">2:09</w:t>
+            </w:r>
+          </w:p>
+        </w:tc>
+        <w:tc>
+          <w:tcPr>
+            <w:tcW w:type="dxa" w:w="4295"/>
+            <w:tcBorders>
+              <w:top w:val="single" w:color="C9C9C4" w:sz="4"/>
+              <w:left w:val="single" w:color="C9C9C4" w:sz="4"/>
+              <w:bottom w:val="single" w:color="C9C9C4" w:sz="4"/>
+              <w:right w:val="single" w:color="C9C9C4" w:sz="4"/>
+            </w:tcBorders>
+            <w:tcMar>
+              <w:top w:type="dxa" w:w="60"/>
+              <w:left w:type="dxa" w:w="100"/>
+              <w:bottom w:type="dxa" w:w="60"/>
+              <w:right w:type="dxa" w:w="100"/>
+            </w:tcMar>
+          </w:tcPr>
+          <w:p>
+            <w:r>
+              <w:rPr>
+                <w:color w:val="0A0A0A"/>
+                <w:sz w:val="18"/>
+                <w:szCs w:val="18"/>
+              </w:rPr>
+              <w:t xml:space="preserve">Dispatcher card slides in. Hover Copy for 999</w:t>
+            </w:r>
+          </w:p>
+        </w:tc>
+        <w:tc>
+          <w:tcPr>
+            <w:tcW w:type="dxa" w:w="4295"/>
+            <w:tcBorders>
+              <w:top w:val="single" w:color="C9C9C4" w:sz="4"/>
+              <w:left w:val="single" w:color="C9C9C4" w:sz="4"/>
+              <w:bottom w:val="single" w:color="C9C9C4" w:sz="4"/>
+              <w:right w:val="single" w:color="C9C9C4" w:sz="4"/>
+            </w:tcBorders>
+            <w:tcMar>
+              <w:top w:type="dxa" w:w="60"/>
+              <w:left w:type="dxa" w:w="100"/>
+              <w:bottom w:type="dxa" w:w="60"/>
+              <w:right w:type="dxa" w:w="100"/>
+            </w:tcMar>
+          </w:tcPr>
+          <w:p>
+            <w:r>
+              <w:rPr>
+                <w:color w:val="0A0A0A"/>
+                <w:sz w:val="18"/>
+                <w:szCs w:val="18"/>
+              </w:rPr>
+              <w:t xml:space="preserve">"No tap, and dispatch gets the location and the likely injury."</w:t>
+            </w:r>
+          </w:p>
+        </w:tc>
+        <w:tc>
+          <w:tcPr>
+            <w:tcW w:type="dxa" w:w="4296"/>
             <w:tcBorders>
               <w:top w:val="single" w:color="C9C9C4" w:sz="4"/>
               <w:left w:val="single" w:color="C9C9C4" w:sz="4"/>
@@ -4614,109 +4807,700 @@
         </w:trPr>
         <w:tc>
           <w:tcPr>
-            <w:tcW w:type="dxa" w:w="889"/>
-            <w:tcBorders>
-              <w:top w:val="single" w:color="C9C9C4" w:sz="4"/>
-              <w:left w:val="single" w:color="C9C9C4" w:sz="4"/>
-              <w:bottom w:val="single" w:color="C9C9C4" w:sz="4"/>
-              <w:right w:val="single" w:color="C9C9C4" w:sz="4"/>
-            </w:tcBorders>
-            <w:tcMar>
-              <w:top w:type="dxa" w:w="60"/>
-              <w:left w:type="dxa" w:w="100"/>
-              <w:bottom w:type="dxa" w:w="60"/>
-              <w:right w:type="dxa" w:w="100"/>
-            </w:tcMar>
-          </w:tcPr>
-          <w:p>
-            <w:r>
-              <w:rPr>
-                <w:color w:val="0A0A0A"/>
-                <w:sz w:val="18"/>
-                <w:szCs w:val="18"/>
-              </w:rPr>
-              <w:t xml:space="preserve">2:30</w:t>
-            </w:r>
-          </w:p>
-        </w:tc>
-        <w:tc>
-          <w:tcPr>
-            <w:tcW w:type="dxa" w:w="4769"/>
-            <w:tcBorders>
-              <w:top w:val="single" w:color="C9C9C4" w:sz="4"/>
-              <w:left w:val="single" w:color="C9C9C4" w:sz="4"/>
-              <w:bottom w:val="single" w:color="C9C9C4" w:sz="4"/>
-              <w:right w:val="single" w:color="C9C9C4" w:sz="4"/>
-            </w:tcBorders>
-            <w:tcMar>
-              <w:top w:type="dxa" w:w="60"/>
-              <w:left w:type="dxa" w:w="100"/>
-              <w:bottom w:type="dxa" w:w="60"/>
-              <w:right w:type="dxa" w:w="100"/>
-            </w:tcMar>
-          </w:tcPr>
-          <w:p>
-            <w:r>
-              <w:rPr>
-                <w:color w:val="0A0A0A"/>
-                <w:sz w:val="18"/>
-                <w:szCs w:val="18"/>
-              </w:rPr>
-              <w:t xml:space="preserve">README section "Are the numbers real?": results table with intervals, the real riding rows</w:t>
-            </w:r>
-          </w:p>
-        </w:tc>
-        <w:tc>
-          <w:tcPr>
-            <w:tcW w:type="dxa" w:w="4769"/>
-            <w:tcBorders>
-              <w:top w:val="single" w:color="C9C9C4" w:sz="4"/>
-              <w:left w:val="single" w:color="C9C9C4" w:sz="4"/>
-              <w:bottom w:val="single" w:color="C9C9C4" w:sz="4"/>
-              <w:right w:val="single" w:color="C9C9C4" w:sz="4"/>
-            </w:tcBorders>
-            <w:tcMar>
-              <w:top w:type="dxa" w:w="60"/>
-              <w:left w:type="dxa" w:w="100"/>
-              <w:bottom w:type="dxa" w:w="60"/>
-              <w:right w:type="dxa" w:w="100"/>
-            </w:tcMar>
-          </w:tcPr>
-          <w:p>
-            <w:r>
-              <w:rPr>
-                <w:color w:val="0A0A0A"/>
-                <w:sz w:val="18"/>
-                <w:szCs w:val="18"/>
-              </w:rPr>
-              <w:t xml:space="preserve">"Every number is published with confidence intervals. On fifteen hours of real motorbike riding, one false alarm every five hours."</w:t>
-            </w:r>
-          </w:p>
-        </w:tc>
-        <w:tc>
-          <w:tcPr>
-            <w:tcW w:type="dxa" w:w="4411"/>
-            <w:tcBorders>
-              <w:top w:val="single" w:color="C9C9C4" w:sz="4"/>
-              <w:left w:val="single" w:color="C9C9C4" w:sz="4"/>
-              <w:bottom w:val="single" w:color="C9C9C4" w:sz="4"/>
-              <w:right w:val="single" w:color="C9C9C4" w:sz="4"/>
-            </w:tcBorders>
-            <w:tcMar>
-              <w:top w:type="dxa" w:w="60"/>
-              <w:left w:type="dxa" w:w="100"/>
-              <w:bottom w:type="dxa" w:w="60"/>
-              <w:right w:type="dxa" w:w="100"/>
-            </w:tcMar>
-          </w:tcPr>
-          <w:p>
-            <w:r>
-              <w:rPr>
-                <w:color w:val="0A0A0A"/>
-                <w:sz w:val="18"/>
-                <w:szCs w:val="18"/>
-              </w:rPr>
-              <w:t xml:space="preserve">TU Wien motorcyclist IMU dataset, ml/PUBLIC_RIDES.md</w:t>
+            <w:tcW w:type="dxa" w:w="911"/>
+            <w:tcBorders>
+              <w:top w:val="single" w:color="C9C9C4" w:sz="4"/>
+              <w:left w:val="single" w:color="C9C9C4" w:sz="4"/>
+              <w:bottom w:val="single" w:color="C9C9C4" w:sz="4"/>
+              <w:right w:val="single" w:color="C9C9C4" w:sz="4"/>
+            </w:tcBorders>
+            <w:tcMar>
+              <w:top w:type="dxa" w:w="60"/>
+              <w:left w:type="dxa" w:w="100"/>
+              <w:bottom w:type="dxa" w:w="60"/>
+              <w:right w:type="dxa" w:w="100"/>
+            </w:tcMar>
+          </w:tcPr>
+          <w:p>
+            <w:r>
+              <w:rPr>
+                <w:color w:val="0A0A0A"/>
+                <w:sz w:val="18"/>
+                <w:szCs w:val="18"/>
+              </w:rPr>
+              <w:t xml:space="preserve">25 to 31</w:t>
+            </w:r>
+          </w:p>
+        </w:tc>
+        <w:tc>
+          <w:tcPr>
+            <w:tcW w:type="dxa" w:w="1041"/>
+            <w:tcBorders>
+              <w:top w:val="single" w:color="C9C9C4" w:sz="4"/>
+              <w:left w:val="single" w:color="C9C9C4" w:sz="4"/>
+              <w:bottom w:val="single" w:color="C9C9C4" w:sz="4"/>
+              <w:right w:val="single" w:color="C9C9C4" w:sz="4"/>
+            </w:tcBorders>
+            <w:tcMar>
+              <w:top w:type="dxa" w:w="60"/>
+              <w:left w:type="dxa" w:w="100"/>
+              <w:bottom w:type="dxa" w:w="60"/>
+              <w:right w:type="dxa" w:w="100"/>
+            </w:tcMar>
+          </w:tcPr>
+          <w:p>
+            <w:r>
+              <w:rPr>
+                <w:color w:val="0A0A0A"/>
+                <w:sz w:val="18"/>
+                <w:szCs w:val="18"/>
+              </w:rPr>
+              <w:t xml:space="preserve">2:15</w:t>
+            </w:r>
+          </w:p>
+        </w:tc>
+        <w:tc>
+          <w:tcPr>
+            <w:tcW w:type="dxa" w:w="4295"/>
+            <w:tcBorders>
+              <w:top w:val="single" w:color="C9C9C4" w:sz="4"/>
+              <w:left w:val="single" w:color="C9C9C4" w:sz="4"/>
+              <w:bottom w:val="single" w:color="C9C9C4" w:sz="4"/>
+              <w:right w:val="single" w:color="C9C9C4" w:sz="4"/>
+            </w:tcBorders>
+            <w:tcMar>
+              <w:top w:type="dxa" w:w="60"/>
+              <w:left w:type="dxa" w:w="100"/>
+              <w:bottom w:type="dxa" w:w="60"/>
+              <w:right w:type="dxa" w:w="100"/>
+            </w:tcMar>
+          </w:tcPr>
+          <w:p>
+            <w:r>
+              <w:rPr>
+                <w:color w:val="0A0A0A"/>
+                <w:sz w:val="18"/>
+                <w:szCs w:val="18"/>
+              </w:rPr>
+              <w:t xml:space="preserve">Underwriter panel: Paid, split 50 and 50 between Platform A and B, Settlement verified</w:t>
+            </w:r>
+          </w:p>
+        </w:tc>
+        <w:tc>
+          <w:tcPr>
+            <w:tcW w:type="dxa" w:w="4295"/>
+            <w:tcBorders>
+              <w:top w:val="single" w:color="C9C9C4" w:sz="4"/>
+              <w:left w:val="single" w:color="C9C9C4" w:sz="4"/>
+              <w:bottom w:val="single" w:color="C9C9C4" w:sz="4"/>
+              <w:right w:val="single" w:color="C9C9C4" w:sz="4"/>
+            </w:tcBorders>
+            <w:tcMar>
+              <w:top w:type="dxa" w:w="60"/>
+              <w:left w:type="dxa" w:w="100"/>
+              <w:bottom w:type="dxa" w:w="60"/>
+              <w:right w:type="dxa" w:w="100"/>
+            </w:tcMar>
+          </w:tcPr>
+          <w:p>
+            <w:r>
+              <w:rPr>
+                <w:color w:val="0A0A0A"/>
+                <w:sz w:val="18"/>
+                <w:szCs w:val="18"/>
+              </w:rPr>
+              <w:t xml:space="preserve">"The record names both apps, so tier one pays and splits between them."</w:t>
+            </w:r>
+          </w:p>
+        </w:tc>
+        <w:tc>
+          <w:tcPr>
+            <w:tcW w:type="dxa" w:w="4296"/>
+            <w:tcBorders>
+              <w:top w:val="single" w:color="C9C9C4" w:sz="4"/>
+              <w:left w:val="single" w:color="C9C9C4" w:sz="4"/>
+              <w:bottom w:val="single" w:color="C9C9C4" w:sz="4"/>
+              <w:right w:val="single" w:color="C9C9C4" w:sz="4"/>
+            </w:tcBorders>
+            <w:tcMar>
+              <w:top w:type="dxa" w:w="60"/>
+              <w:left w:type="dxa" w:w="100"/>
+              <w:bottom w:type="dxa" w:w="60"/>
+              <w:right w:type="dxa" w:w="100"/>
+            </w:tcMar>
+          </w:tcPr>
+          <w:p>
+            <w:r>
+              <w:rPr>
+                <w:color w:val="0A0A0A"/>
+                <w:sz w:val="18"/>
+                <w:szCs w:val="18"/>
+              </w:rPr>
+              <w:t xml:space="preserve">Placeholder amounts</w:t>
+            </w:r>
+          </w:p>
+        </w:tc>
+      </w:tr>
+      <w:tr>
+        <w:trPr>
+          <w:cantSplit/>
+          <w:tblHeader w:val="off"/>
+        </w:trPr>
+        <w:tc>
+          <w:tcPr>
+            <w:tcW w:type="dxa" w:w="911"/>
+            <w:tcBorders>
+              <w:top w:val="single" w:color="C9C9C4" w:sz="4"/>
+              <w:left w:val="single" w:color="C9C9C4" w:sz="4"/>
+              <w:bottom w:val="single" w:color="C9C9C4" w:sz="4"/>
+              <w:right w:val="single" w:color="C9C9C4" w:sz="4"/>
+            </w:tcBorders>
+            <w:tcMar>
+              <w:top w:type="dxa" w:w="60"/>
+              <w:left w:type="dxa" w:w="100"/>
+              <w:bottom w:type="dxa" w:w="60"/>
+              <w:right w:type="dxa" w:w="100"/>
+            </w:tcMar>
+          </w:tcPr>
+          <w:p>
+            <w:r>
+              <w:rPr>
+                <w:color w:val="0A0A0A"/>
+                <w:sz w:val="18"/>
+                <w:szCs w:val="18"/>
+              </w:rPr>
+              <w:t xml:space="preserve">31 to 37</w:t>
+            </w:r>
+          </w:p>
+        </w:tc>
+        <w:tc>
+          <w:tcPr>
+            <w:tcW w:type="dxa" w:w="1041"/>
+            <w:tcBorders>
+              <w:top w:val="single" w:color="C9C9C4" w:sz="4"/>
+              <w:left w:val="single" w:color="C9C9C4" w:sz="4"/>
+              <w:bottom w:val="single" w:color="C9C9C4" w:sz="4"/>
+              <w:right w:val="single" w:color="C9C9C4" w:sz="4"/>
+            </w:tcBorders>
+            <w:tcMar>
+              <w:top w:type="dxa" w:w="60"/>
+              <w:left w:type="dxa" w:w="100"/>
+              <w:bottom w:type="dxa" w:w="60"/>
+              <w:right w:type="dxa" w:w="100"/>
+            </w:tcMar>
+          </w:tcPr>
+          <w:p>
+            <w:r>
+              <w:rPr>
+                <w:color w:val="0A0A0A"/>
+                <w:sz w:val="18"/>
+                <w:szCs w:val="18"/>
+              </w:rPr>
+              <w:t xml:space="preserve">2:21</w:t>
+            </w:r>
+          </w:p>
+        </w:tc>
+        <w:tc>
+          <w:tcPr>
+            <w:tcW w:type="dxa" w:w="4295"/>
+            <w:tcBorders>
+              <w:top w:val="single" w:color="C9C9C4" w:sz="4"/>
+              <w:left w:val="single" w:color="C9C9C4" w:sz="4"/>
+              <w:bottom w:val="single" w:color="C9C9C4" w:sz="4"/>
+              <w:right w:val="single" w:color="C9C9C4" w:sz="4"/>
+            </w:tcBorders>
+            <w:tcMar>
+              <w:top w:type="dxa" w:w="60"/>
+              <w:left w:type="dxa" w:w="100"/>
+              <w:bottom w:type="dxa" w:w="60"/>
+              <w:right w:type="dxa" w:w="100"/>
+            </w:tcMar>
+          </w:tcPr>
+          <w:p>
+            <w:r>
+              <w:rPr>
+                <w:color w:val="0A0A0A"/>
+                <w:sz w:val="18"/>
+                <w:szCs w:val="18"/>
+              </w:rPr>
+              <w:t xml:space="preserve">Terminal beside the browser: verify returns valid. Change payoutHkd to 80000, run again, returns invalid</w:t>
+            </w:r>
+          </w:p>
+        </w:tc>
+        <w:tc>
+          <w:tcPr>
+            <w:tcW w:type="dxa" w:w="4295"/>
+            <w:tcBorders>
+              <w:top w:val="single" w:color="C9C9C4" w:sz="4"/>
+              <w:left w:val="single" w:color="C9C9C4" w:sz="4"/>
+              <w:bottom w:val="single" w:color="C9C9C4" w:sz="4"/>
+              <w:right w:val="single" w:color="C9C9C4" w:sz="4"/>
+            </w:tcBorders>
+            <w:tcMar>
+              <w:top w:type="dxa" w:w="60"/>
+              <w:left w:type="dxa" w:w="100"/>
+              <w:bottom w:type="dxa" w:w="60"/>
+              <w:right w:type="dxa" w:w="100"/>
+            </w:tcMar>
+          </w:tcPr>
+          <w:p>
+            <w:r>
+              <w:rPr>
+                <w:color w:val="0A0A0A"/>
+                <w:sz w:val="18"/>
+                <w:szCs w:val="18"/>
+              </w:rPr>
+              <w:t xml:space="preserve">"Every record is signed and hash-chained. Edit one number and verification fails."</w:t>
+            </w:r>
+          </w:p>
+        </w:tc>
+        <w:tc>
+          <w:tcPr>
+            <w:tcW w:type="dxa" w:w="4296"/>
+            <w:tcBorders>
+              <w:top w:val="single" w:color="C9C9C4" w:sz="4"/>
+              <w:left w:val="single" w:color="C9C9C4" w:sz="4"/>
+              <w:bottom w:val="single" w:color="C9C9C4" w:sz="4"/>
+              <w:right w:val="single" w:color="C9C9C4" w:sz="4"/>
+            </w:tcBorders>
+            <w:tcMar>
+              <w:top w:type="dxa" w:w="60"/>
+              <w:left w:type="dxa" w:w="100"/>
+              <w:bottom w:type="dxa" w:w="60"/>
+              <w:right w:type="dxa" w:w="100"/>
+            </w:tcMar>
+          </w:tcPr>
+          <w:p>
+            <w:r>
+              <w:rPr>
+                <w:color w:val="0A0A0A"/>
+                <w:sz w:val="18"/>
+                <w:szCs w:val="18"/>
+              </w:rPr>
+              <w:t xml:space="preserve"/>
+            </w:r>
+          </w:p>
+        </w:tc>
+      </w:tr>
+      <w:tr>
+        <w:trPr>
+          <w:cantSplit/>
+          <w:tblHeader w:val="off"/>
+        </w:trPr>
+        <w:tc>
+          <w:tcPr>
+            <w:tcW w:type="dxa" w:w="911"/>
+            <w:tcBorders>
+              <w:top w:val="single" w:color="C9C9C4" w:sz="4"/>
+              <w:left w:val="single" w:color="C9C9C4" w:sz="4"/>
+              <w:bottom w:val="single" w:color="C9C9C4" w:sz="4"/>
+              <w:right w:val="single" w:color="C9C9C4" w:sz="4"/>
+            </w:tcBorders>
+            <w:tcMar>
+              <w:top w:type="dxa" w:w="60"/>
+              <w:left w:type="dxa" w:w="100"/>
+              <w:bottom w:type="dxa" w:w="60"/>
+              <w:right w:type="dxa" w:w="100"/>
+            </w:tcMar>
+          </w:tcPr>
+          <w:p>
+            <w:r>
+              <w:rPr>
+                <w:color w:val="0A0A0A"/>
+                <w:sz w:val="18"/>
+                <w:szCs w:val="18"/>
+              </w:rPr>
+              <w:t xml:space="preserve">37 to 42</w:t>
+            </w:r>
+          </w:p>
+        </w:tc>
+        <w:tc>
+          <w:tcPr>
+            <w:tcW w:type="dxa" w:w="1041"/>
+            <w:tcBorders>
+              <w:top w:val="single" w:color="C9C9C4" w:sz="4"/>
+              <w:left w:val="single" w:color="C9C9C4" w:sz="4"/>
+              <w:bottom w:val="single" w:color="C9C9C4" w:sz="4"/>
+              <w:right w:val="single" w:color="C9C9C4" w:sz="4"/>
+            </w:tcBorders>
+            <w:tcMar>
+              <w:top w:type="dxa" w:w="60"/>
+              <w:left w:type="dxa" w:w="100"/>
+              <w:bottom w:type="dxa" w:w="60"/>
+              <w:right w:type="dxa" w:w="100"/>
+            </w:tcMar>
+          </w:tcPr>
+          <w:p>
+            <w:r>
+              <w:rPr>
+                <w:color w:val="0A0A0A"/>
+                <w:sz w:val="18"/>
+                <w:szCs w:val="18"/>
+              </w:rPr>
+              <w:t xml:space="preserve">2:27</w:t>
+            </w:r>
+          </w:p>
+        </w:tc>
+        <w:tc>
+          <w:tcPr>
+            <w:tcW w:type="dxa" w:w="4295"/>
+            <w:tcBorders>
+              <w:top w:val="single" w:color="C9C9C4" w:sz="4"/>
+              <w:left w:val="single" w:color="C9C9C4" w:sz="4"/>
+              <w:bottom w:val="single" w:color="C9C9C4" w:sz="4"/>
+              <w:right w:val="single" w:color="C9C9C4" w:sz="4"/>
+            </w:tcBorders>
+            <w:tcMar>
+              <w:top w:type="dxa" w:w="60"/>
+              <w:left w:type="dxa" w:w="100"/>
+              <w:bottom w:type="dxa" w:w="60"/>
+              <w:right w:type="dxa" w:w="100"/>
+            </w:tcMar>
+          </w:tcPr>
+          <w:p>
+            <w:r>
+              <w:rPr>
+                <w:color w:val="0A0A0A"/>
+                <w:sz w:val="18"/>
+                <w:szCs w:val="18"/>
+              </w:rPr>
+              <w:t xml:space="preserve">/labour: injuries by time left on the delivery clock, hazard cells ranked by rate</w:t>
+            </w:r>
+          </w:p>
+        </w:tc>
+        <w:tc>
+          <w:tcPr>
+            <w:tcW w:type="dxa" w:w="4295"/>
+            <w:tcBorders>
+              <w:top w:val="single" w:color="C9C9C4" w:sz="4"/>
+              <w:left w:val="single" w:color="C9C9C4" w:sz="4"/>
+              <w:bottom w:val="single" w:color="C9C9C4" w:sz="4"/>
+              <w:right w:val="single" w:color="C9C9C4" w:sz="4"/>
+            </w:tcBorders>
+            <w:tcMar>
+              <w:top w:type="dxa" w:w="60"/>
+              <w:left w:type="dxa" w:w="100"/>
+              <w:bottom w:type="dxa" w:w="60"/>
+              <w:right w:type="dxa" w:w="100"/>
+            </w:tcMar>
+          </w:tcPr>
+          <w:p>
+            <w:r>
+              <w:rPr>
+                <w:color w:val="0A0A0A"/>
+                <w:sz w:val="18"/>
+                <w:szCs w:val="18"/>
+              </w:rPr>
+              <w:t xml:space="preserve">"The Labour Department sees totals only. No rider ids, no routes."</w:t>
+            </w:r>
+          </w:p>
+        </w:tc>
+        <w:tc>
+          <w:tcPr>
+            <w:tcW w:type="dxa" w:w="4296"/>
+            <w:tcBorders>
+              <w:top w:val="single" w:color="C9C9C4" w:sz="4"/>
+              <w:left w:val="single" w:color="C9C9C4" w:sz="4"/>
+              <w:bottom w:val="single" w:color="C9C9C4" w:sz="4"/>
+              <w:right w:val="single" w:color="C9C9C4" w:sz="4"/>
+            </w:tcBorders>
+            <w:tcMar>
+              <w:top w:type="dxa" w:w="60"/>
+              <w:left w:type="dxa" w:w="100"/>
+              <w:bottom w:type="dxa" w:w="60"/>
+              <w:right w:type="dxa" w:w="100"/>
+            </w:tcMar>
+          </w:tcPr>
+          <w:p>
+            <w:r>
+              <w:rPr>
+                <w:color w:val="0A0A0A"/>
+                <w:sz w:val="18"/>
+                <w:szCs w:val="18"/>
+              </w:rPr>
+              <w:t xml:space="preserve"/>
+            </w:r>
+          </w:p>
+        </w:tc>
+      </w:tr>
+      <w:tr>
+        <w:trPr>
+          <w:cantSplit/>
+          <w:tblHeader w:val="off"/>
+        </w:trPr>
+        <w:tc>
+          <w:tcPr>
+            <w:tcW w:type="dxa" w:w="911"/>
+            <w:tcBorders>
+              <w:top w:val="single" w:color="C9C9C4" w:sz="4"/>
+              <w:left w:val="single" w:color="C9C9C4" w:sz="4"/>
+              <w:bottom w:val="single" w:color="C9C9C4" w:sz="4"/>
+              <w:right w:val="single" w:color="C9C9C4" w:sz="4"/>
+            </w:tcBorders>
+            <w:tcMar>
+              <w:top w:type="dxa" w:w="60"/>
+              <w:left w:type="dxa" w:w="100"/>
+              <w:bottom w:type="dxa" w:w="60"/>
+              <w:right w:type="dxa" w:w="100"/>
+            </w:tcMar>
+          </w:tcPr>
+          <w:p>
+            <w:r>
+              <w:rPr>
+                <w:color w:val="0A0A0A"/>
+                <w:sz w:val="18"/>
+                <w:szCs w:val="18"/>
+              </w:rPr>
+              <w:t xml:space="preserve">42 to 48</w:t>
+            </w:r>
+          </w:p>
+        </w:tc>
+        <w:tc>
+          <w:tcPr>
+            <w:tcW w:type="dxa" w:w="1041"/>
+            <w:tcBorders>
+              <w:top w:val="single" w:color="C9C9C4" w:sz="4"/>
+              <w:left w:val="single" w:color="C9C9C4" w:sz="4"/>
+              <w:bottom w:val="single" w:color="C9C9C4" w:sz="4"/>
+              <w:right w:val="single" w:color="C9C9C4" w:sz="4"/>
+            </w:tcBorders>
+            <w:tcMar>
+              <w:top w:type="dxa" w:w="60"/>
+              <w:left w:type="dxa" w:w="100"/>
+              <w:bottom w:type="dxa" w:w="60"/>
+              <w:right w:type="dxa" w:w="100"/>
+            </w:tcMar>
+          </w:tcPr>
+          <w:p>
+            <w:r>
+              <w:rPr>
+                <w:color w:val="0A0A0A"/>
+                <w:sz w:val="18"/>
+                <w:szCs w:val="18"/>
+              </w:rPr>
+              <w:t xml:space="preserve">2:32</w:t>
+            </w:r>
+          </w:p>
+        </w:tc>
+        <w:tc>
+          <w:tcPr>
+            <w:tcW w:type="dxa" w:w="4295"/>
+            <w:tcBorders>
+              <w:top w:val="single" w:color="C9C9C4" w:sz="4"/>
+              <w:left w:val="single" w:color="C9C9C4" w:sz="4"/>
+              <w:bottom w:val="single" w:color="C9C9C4" w:sz="4"/>
+              <w:right w:val="single" w:color="C9C9C4" w:sz="4"/>
+            </w:tcBorders>
+            <w:tcMar>
+              <w:top w:type="dxa" w:w="60"/>
+              <w:left w:type="dxa" w:w="100"/>
+              <w:bottom w:type="dxa" w:w="60"/>
+              <w:right w:type="dxa" w:w="100"/>
+            </w:tcMar>
+          </w:tcPr>
+          <w:p>
+            <w:r>
+              <w:rPr>
+                <w:color w:val="0A0A0A"/>
+                <w:sz w:val="18"/>
+                <w:szCs w:val="18"/>
+              </w:rPr>
+              <w:t xml:space="preserve">README, "Are the numbers real?": the results table, then the real riding rows</w:t>
+            </w:r>
+          </w:p>
+        </w:tc>
+        <w:tc>
+          <w:tcPr>
+            <w:tcW w:type="dxa" w:w="4295"/>
+            <w:tcBorders>
+              <w:top w:val="single" w:color="C9C9C4" w:sz="4"/>
+              <w:left w:val="single" w:color="C9C9C4" w:sz="4"/>
+              <w:bottom w:val="single" w:color="C9C9C4" w:sz="4"/>
+              <w:right w:val="single" w:color="C9C9C4" w:sz="4"/>
+            </w:tcBorders>
+            <w:tcMar>
+              <w:top w:type="dxa" w:w="60"/>
+              <w:left w:type="dxa" w:w="100"/>
+              <w:bottom w:type="dxa" w:w="60"/>
+              <w:right w:type="dxa" w:w="100"/>
+            </w:tcMar>
+          </w:tcPr>
+          <w:p>
+            <w:r>
+              <w:rPr>
+                <w:color w:val="0A0A0A"/>
+                <w:sz w:val="18"/>
+                <w:szCs w:val="18"/>
+              </w:rPr>
+              <w:t xml:space="preserve">"On fifteen hours of real motorbike riding, one false alarm every five hours."</w:t>
+            </w:r>
+          </w:p>
+        </w:tc>
+        <w:tc>
+          <w:tcPr>
+            <w:tcW w:type="dxa" w:w="4296"/>
+            <w:tcBorders>
+              <w:top w:val="single" w:color="C9C9C4" w:sz="4"/>
+              <w:left w:val="single" w:color="C9C9C4" w:sz="4"/>
+              <w:bottom w:val="single" w:color="C9C9C4" w:sz="4"/>
+              <w:right w:val="single" w:color="C9C9C4" w:sz="4"/>
+            </w:tcBorders>
+            <w:tcMar>
+              <w:top w:type="dxa" w:w="60"/>
+              <w:left w:type="dxa" w:w="100"/>
+              <w:bottom w:type="dxa" w:w="60"/>
+              <w:right w:type="dxa" w:w="100"/>
+            </w:tcMar>
+          </w:tcPr>
+          <w:p>
+            <w:r>
+              <w:rPr>
+                <w:color w:val="0A0A0A"/>
+                <w:sz w:val="18"/>
+                <w:szCs w:val="18"/>
+              </w:rPr>
+              <w:t xml:space="preserve">TU Wien motorcyclist IMU dataset</w:t>
+            </w:r>
+          </w:p>
+        </w:tc>
+      </w:tr>
+      <w:tr>
+        <w:trPr>
+          <w:cantSplit/>
+          <w:tblHeader w:val="off"/>
+        </w:trPr>
+        <w:tc>
+          <w:tcPr>
+            <w:tcW w:type="dxa" w:w="911"/>
+            <w:tcBorders>
+              <w:top w:val="single" w:color="C9C9C4" w:sz="4"/>
+              <w:left w:val="single" w:color="C9C9C4" w:sz="4"/>
+              <w:bottom w:val="single" w:color="C9C9C4" w:sz="4"/>
+              <w:right w:val="single" w:color="C9C9C4" w:sz="4"/>
+            </w:tcBorders>
+            <w:tcMar>
+              <w:top w:type="dxa" w:w="60"/>
+              <w:left w:type="dxa" w:w="100"/>
+              <w:bottom w:type="dxa" w:w="60"/>
+              <w:right w:type="dxa" w:w="100"/>
+            </w:tcMar>
+          </w:tcPr>
+          <w:p>
+            <w:r>
+              <w:rPr>
+                <w:color w:val="0A0A0A"/>
+                <w:sz w:val="18"/>
+                <w:szCs w:val="18"/>
+              </w:rPr>
+              <w:t xml:space="preserve">48 to 50</w:t>
+            </w:r>
+          </w:p>
+        </w:tc>
+        <w:tc>
+          <w:tcPr>
+            <w:tcW w:type="dxa" w:w="1041"/>
+            <w:tcBorders>
+              <w:top w:val="single" w:color="C9C9C4" w:sz="4"/>
+              <w:left w:val="single" w:color="C9C9C4" w:sz="4"/>
+              <w:bottom w:val="single" w:color="C9C9C4" w:sz="4"/>
+              <w:right w:val="single" w:color="C9C9C4" w:sz="4"/>
+            </w:tcBorders>
+            <w:tcMar>
+              <w:top w:type="dxa" w:w="60"/>
+              <w:left w:type="dxa" w:w="100"/>
+              <w:bottom w:type="dxa" w:w="60"/>
+              <w:right w:type="dxa" w:w="100"/>
+            </w:tcMar>
+          </w:tcPr>
+          <w:p>
+            <w:r>
+              <w:rPr>
+                <w:color w:val="0A0A0A"/>
+                <w:sz w:val="18"/>
+                <w:szCs w:val="18"/>
+              </w:rPr>
+              <w:t xml:space="preserve">2:38</w:t>
+            </w:r>
+          </w:p>
+        </w:tc>
+        <w:tc>
+          <w:tcPr>
+            <w:tcW w:type="dxa" w:w="4295"/>
+            <w:tcBorders>
+              <w:top w:val="single" w:color="C9C9C4" w:sz="4"/>
+              <w:left w:val="single" w:color="C9C9C4" w:sz="4"/>
+              <w:bottom w:val="single" w:color="C9C9C4" w:sz="4"/>
+              <w:right w:val="single" w:color="C9C9C4" w:sz="4"/>
+            </w:tcBorders>
+            <w:tcMar>
+              <w:top w:type="dxa" w:w="60"/>
+              <w:left w:type="dxa" w:w="100"/>
+              <w:bottom w:type="dxa" w:w="60"/>
+              <w:right w:type="dxa" w:w="100"/>
+            </w:tcMar>
+          </w:tcPr>
+          <w:p>
+            <w:r>
+              <w:rPr>
+                <w:color w:val="0A0A0A"/>
+                <w:sz w:val="18"/>
+                <w:szCs w:val="18"/>
+              </w:rPr>
+              <w:t xml:space="preserve">Face circle grows back. Karina holds the phone up again, showing the Paid card</w:t>
+            </w:r>
+          </w:p>
+        </w:tc>
+        <w:tc>
+          <w:tcPr>
+            <w:tcW w:type="dxa" w:w="4295"/>
+            <w:tcBorders>
+              <w:top w:val="single" w:color="C9C9C4" w:sz="4"/>
+              <w:left w:val="single" w:color="C9C9C4" w:sz="4"/>
+              <w:bottom w:val="single" w:color="C9C9C4" w:sz="4"/>
+              <w:right w:val="single" w:color="C9C9C4" w:sz="4"/>
+            </w:tcBorders>
+            <w:tcMar>
+              <w:top w:type="dxa" w:w="60"/>
+              <w:left w:type="dxa" w:w="100"/>
+              <w:bottom w:type="dxa" w:w="60"/>
+              <w:right w:type="dxa" w:w="100"/>
+            </w:tcMar>
+          </w:tcPr>
+          <w:p>
+            <w:r>
+              <w:rPr>
+                <w:color w:val="0A0A0A"/>
+                <w:sz w:val="18"/>
+                <w:szCs w:val="18"/>
+              </w:rPr>
+              <w:t xml:space="preserve">"Try it yourself: metricsfile dot vercel dot app."</w:t>
+            </w:r>
+          </w:p>
+        </w:tc>
+        <w:tc>
+          <w:tcPr>
+            <w:tcW w:type="dxa" w:w="4296"/>
+            <w:tcBorders>
+              <w:top w:val="single" w:color="C9C9C4" w:sz="4"/>
+              <w:left w:val="single" w:color="C9C9C4" w:sz="4"/>
+              <w:bottom w:val="single" w:color="C9C9C4" w:sz="4"/>
+              <w:right w:val="single" w:color="C9C9C4" w:sz="4"/>
+            </w:tcBorders>
+            <w:tcMar>
+              <w:top w:type="dxa" w:w="60"/>
+              <w:left w:type="dxa" w:w="100"/>
+              <w:bottom w:type="dxa" w:w="60"/>
+              <w:right w:type="dxa" w:w="100"/>
+            </w:tcMar>
+          </w:tcPr>
+          <w:p>
+            <w:r>
+              <w:rPr>
+                <w:color w:val="0A0A0A"/>
+                <w:sz w:val="18"/>
+                <w:szCs w:val="18"/>
+              </w:rPr>
+              <w:t xml:space="preserve">metricsfile.vercel.app</w:t>
             </w:r>
           </w:p>
         </w:tc>
@@ -4732,7 +5516,7 @@
         <w:spacing w:after="120"/>
       </w:pPr>
       <w:r>
-        <w:t xml:space="preserve">About 115 words, 47 seconds at a natural pace.</w:t>
+        <w:t xml:space="preserve">About 105 words, about 45 seconds spoken plus a 3 second silent drop.</w:t>
       </w:r>
     </w:p>
     <w:p>
@@ -4756,8 +5540,8 @@
         </w:tblBorders>
       </w:tblPr>
       <w:tblGrid>
-        <w:gridCol w:w="6171"/>
-        <w:gridCol w:w="8667"/>
+        <w:gridCol w:w="7003"/>
+        <w:gridCol w:w="7835"/>
       </w:tblGrid>
       <w:tr>
         <w:trPr>
@@ -4766,7 +5550,7 @@
         </w:trPr>
         <w:tc>
           <w:tcPr>
-            <w:tcW w:type="dxa" w:w="6171"/>
+            <w:tcW w:type="dxa" w:w="7003"/>
             <w:tcBorders>
               <w:top w:val="single" w:color="C9C9C4" w:sz="4"/>
               <w:left w:val="single" w:color="C9C9C4" w:sz="4"/>
@@ -4796,7 +5580,7 @@
         </w:tc>
         <w:tc>
           <w:tcPr>
-            <w:tcW w:type="dxa" w:w="8667"/>
+            <w:tcW w:type="dxa" w:w="7835"/>
             <w:tcBorders>
               <w:top w:val="single" w:color="C9C9C4" w:sz="4"/>
               <w:left w:val="single" w:color="C9C9C4" w:sz="4"/>
@@ -4832,55 +5616,55 @@
         </w:trPr>
         <w:tc>
           <w:tcPr>
-            <w:tcW w:type="dxa" w:w="6171"/>
-            <w:tcBorders>
-              <w:top w:val="single" w:color="C9C9C4" w:sz="4"/>
-              <w:left w:val="single" w:color="C9C9C4" w:sz="4"/>
-              <w:bottom w:val="single" w:color="C9C9C4" w:sz="4"/>
-              <w:right w:val="single" w:color="C9C9C4" w:sz="4"/>
-            </w:tcBorders>
-            <w:tcMar>
-              <w:top w:type="dxa" w:w="60"/>
-              <w:left w:type="dxa" w:w="100"/>
-              <w:bottom w:type="dxa" w:w="60"/>
-              <w:right w:type="dxa" w:w="100"/>
-            </w:tcMar>
-          </w:tcPr>
-          <w:p>
-            <w:r>
-              <w:rPr>
-                <w:color w:val="0A0A0A"/>
-                <w:sz w:val="18"/>
-                <w:szCs w:val="18"/>
-              </w:rPr>
-              <w:t xml:space="preserve">Live app, phone as sensor</w:t>
-            </w:r>
-          </w:p>
-        </w:tc>
-        <w:tc>
-          <w:tcPr>
-            <w:tcW w:type="dxa" w:w="8667"/>
-            <w:tcBorders>
-              <w:top w:val="single" w:color="C9C9C4" w:sz="4"/>
-              <w:left w:val="single" w:color="C9C9C4" w:sz="4"/>
-              <w:bottom w:val="single" w:color="C9C9C4" w:sz="4"/>
-              <w:right w:val="single" w:color="C9C9C4" w:sz="4"/>
-            </w:tcBorders>
-            <w:tcMar>
-              <w:top w:type="dxa" w:w="60"/>
-              <w:left w:type="dxa" w:w="100"/>
-              <w:bottom w:type="dxa" w:w="60"/>
-              <w:right w:type="dxa" w:w="100"/>
-            </w:tcMar>
-          </w:tcPr>
-          <w:p>
-            <w:r>
-              <w:rPr>
-                <w:color w:val="0A0A0A"/>
-                <w:sz w:val="18"/>
-                <w:szCs w:val="18"/>
-              </w:rPr>
-              <w:t xml:space="preserve">Design and build: a working prototype, not a mock-up</w:t>
+            <w:tcW w:type="dxa" w:w="7003"/>
+            <w:tcBorders>
+              <w:top w:val="single" w:color="C9C9C4" w:sz="4"/>
+              <w:left w:val="single" w:color="C9C9C4" w:sz="4"/>
+              <w:bottom w:val="single" w:color="C9C9C4" w:sz="4"/>
+              <w:right w:val="single" w:color="C9C9C4" w:sz="4"/>
+            </w:tcBorders>
+            <w:tcMar>
+              <w:top w:type="dxa" w:w="60"/>
+              <w:left w:type="dxa" w:w="100"/>
+              <w:bottom w:type="dxa" w:w="60"/>
+              <w:right w:type="dxa" w:w="100"/>
+            </w:tcMar>
+          </w:tcPr>
+          <w:p>
+            <w:r>
+              <w:rPr>
+                <w:color w:val="0A0A0A"/>
+                <w:sz w:val="18"/>
+                <w:szCs w:val="18"/>
+              </w:rPr>
+              <w:t xml:space="preserve">Phone held up to the camera, then the phone as sensor</w:t>
+            </w:r>
+          </w:p>
+        </w:tc>
+        <w:tc>
+          <w:tcPr>
+            <w:tcW w:type="dxa" w:w="7835"/>
+            <w:tcBorders>
+              <w:top w:val="single" w:color="C9C9C4" w:sz="4"/>
+              <w:left w:val="single" w:color="C9C9C4" w:sz="4"/>
+              <w:bottom w:val="single" w:color="C9C9C4" w:sz="4"/>
+              <w:right w:val="single" w:color="C9C9C4" w:sz="4"/>
+            </w:tcBorders>
+            <w:tcMar>
+              <w:top w:type="dxa" w:w="60"/>
+              <w:left w:type="dxa" w:w="100"/>
+              <w:bottom w:type="dxa" w:w="60"/>
+              <w:right w:type="dxa" w:w="100"/>
+            </w:tcMar>
+          </w:tcPr>
+          <w:p>
+            <w:r>
+              <w:rPr>
+                <w:color w:val="0A0A0A"/>
+                <w:sz w:val="18"/>
+                <w:szCs w:val="18"/>
+              </w:rPr>
+              <w:t xml:space="preserve">Design and build: a working prototype on a real phone, not a mock-up</w:t>
             </w:r>
           </w:p>
         </w:tc>
@@ -4892,7 +5676,7 @@
         </w:trPr>
         <w:tc>
           <w:tcPr>
-            <w:tcW w:type="dxa" w:w="6171"/>
+            <w:tcW w:type="dxa" w:w="7003"/>
             <w:tcBorders>
               <w:top w:val="single" w:color="C9C9C4" w:sz="4"/>
               <w:left w:val="single" w:color="C9C9C4" w:sz="4"/>
@@ -4919,7 +5703,7 @@
         </w:tc>
         <w:tc>
           <w:tcPr>
-            <w:tcW w:type="dxa" w:w="8667"/>
+            <w:tcW w:type="dxa" w:w="7835"/>
             <w:tcBorders>
               <w:top w:val="single" w:color="C9C9C4" w:sz="4"/>
               <w:left w:val="single" w:color="C9C9C4" w:sz="4"/>
@@ -4952,7 +5736,7 @@
         </w:trPr>
         <w:tc>
           <w:tcPr>
-            <w:tcW w:type="dxa" w:w="6171"/>
+            <w:tcW w:type="dxa" w:w="7003"/>
             <w:tcBorders>
               <w:top w:val="single" w:color="C9C9C4" w:sz="4"/>
               <w:left w:val="single" w:color="C9C9C4" w:sz="4"/>
@@ -4979,7 +5763,7 @@
         </w:tc>
         <w:tc>
           <w:tcPr>
-            <w:tcW w:type="dxa" w:w="8667"/>
+            <w:tcW w:type="dxa" w:w="7835"/>
             <w:tcBorders>
               <w:top w:val="single" w:color="C9C9C4" w:sz="4"/>
               <w:left w:val="single" w:color="C9C9C4" w:sz="4"/>
@@ -5012,7 +5796,7 @@
         </w:trPr>
         <w:tc>
           <w:tcPr>
-            <w:tcW w:type="dxa" w:w="6171"/>
+            <w:tcW w:type="dxa" w:w="7003"/>
             <w:tcBorders>
               <w:top w:val="single" w:color="C9C9C4" w:sz="4"/>
               <w:left w:val="single" w:color="C9C9C4" w:sz="4"/>
@@ -5039,7 +5823,7 @@
         </w:tc>
         <w:tc>
           <w:tcPr>
-            <w:tcW w:type="dxa" w:w="8667"/>
+            <w:tcW w:type="dxa" w:w="7835"/>
             <w:tcBorders>
               <w:top w:val="single" w:color="C9C9C4" w:sz="4"/>
               <w:left w:val="single" w:color="C9C9C4" w:sz="4"/>
@@ -5072,7 +5856,7 @@
         </w:trPr>
         <w:tc>
           <w:tcPr>
-            <w:tcW w:type="dxa" w:w="6171"/>
+            <w:tcW w:type="dxa" w:w="7003"/>
             <w:tcBorders>
               <w:top w:val="single" w:color="C9C9C4" w:sz="4"/>
               <w:left w:val="single" w:color="C9C9C4" w:sz="4"/>
@@ -5099,7 +5883,7 @@
         </w:tc>
         <w:tc>
           <w:tcPr>
-            <w:tcW w:type="dxa" w:w="8667"/>
+            <w:tcW w:type="dxa" w:w="7835"/>
             <w:tcBorders>
               <w:top w:val="single" w:color="C9C9C4" w:sz="4"/>
               <w:left w:val="single" w:color="C9C9C4" w:sz="4"/>
@@ -5132,7 +5916,7 @@
         </w:trPr>
         <w:tc>
           <w:tcPr>
-            <w:tcW w:type="dxa" w:w="6171"/>
+            <w:tcW w:type="dxa" w:w="7003"/>
             <w:tcBorders>
               <w:top w:val="single" w:color="C9C9C4" w:sz="4"/>
               <w:left w:val="single" w:color="C9C9C4" w:sz="4"/>
@@ -5159,7 +5943,7 @@
         </w:tc>
         <w:tc>
           <w:tcPr>
-            <w:tcW w:type="dxa" w:w="8667"/>
+            <w:tcW w:type="dxa" w:w="7835"/>
             <w:tcBorders>
               <w:top w:val="single" w:color="C9C9C4" w:sz="4"/>
               <w:left w:val="single" w:color="C9C9C4" w:sz="4"/>
@@ -5192,7 +5976,7 @@
         </w:trPr>
         <w:tc>
           <w:tcPr>
-            <w:tcW w:type="dxa" w:w="6171"/>
+            <w:tcW w:type="dxa" w:w="7003"/>
             <w:tcBorders>
               <w:top w:val="single" w:color="C9C9C4" w:sz="4"/>
               <w:left w:val="single" w:color="C9C9C4" w:sz="4"/>
@@ -5219,7 +6003,7 @@
         </w:tc>
         <w:tc>
           <w:tcPr>
-            <w:tcW w:type="dxa" w:w="8667"/>
+            <w:tcW w:type="dxa" w:w="7835"/>
             <w:tcBorders>
               <w:top w:val="single" w:color="C9C9C4" w:sz="4"/>
               <w:left w:val="single" w:color="C9C9C4" w:sz="4"/>

</xml_diff>

<commit_message>
Video script: 7 second how it works over the architecture diagram
</commit_message>
<xml_diff>
--- a/docs/submission/VIDEO_SCRIPT.docx
+++ b/docs/submission/VIDEO_SCRIPT.docx
@@ -4123,7 +4123,7 @@
                 <w:sz w:val="18"/>
                 <w:szCs w:val="18"/>
               </w:rPr>
-              <w:t xml:space="preserve">3 to 7</w:t>
+              <w:t xml:space="preserve">3 to 6</w:t>
             </w:r>
           </w:p>
         </w:tc>
@@ -4204,7 +4204,7 @@
                 <w:sz w:val="18"/>
                 <w:szCs w:val="18"/>
               </w:rPr>
-              <w:t xml:space="preserve">"My phone is the sensor. It streams motion to our server, only while I'm on shift."</w:t>
+              <w:t xml:space="preserve">"My phone is the sensor, only while I'm on shift."</w:t>
             </w:r>
           </w:p>
         </w:tc>
@@ -4264,7 +4264,7 @@
                 <w:sz w:val="18"/>
                 <w:szCs w:val="18"/>
               </w:rPr>
-              <w:t xml:space="preserve">7 to 10</w:t>
+              <w:t xml:space="preserve">6 to 9</w:t>
             </w:r>
           </w:p>
         </w:tc>
@@ -4291,7 +4291,7 @@
                 <w:sz w:val="18"/>
                 <w:szCs w:val="18"/>
               </w:rPr>
-              <w:t xml:space="preserve">1:57</w:t>
+              <w:t xml:space="preserve">1:56</w:t>
             </w:r>
           </w:p>
         </w:tc>
@@ -4405,7 +4405,7 @@
                 <w:sz w:val="18"/>
                 <w:szCs w:val="18"/>
               </w:rPr>
-              <w:t xml:space="preserve">10 to 14</w:t>
+              <w:t xml:space="preserve">9 to 12</w:t>
             </w:r>
           </w:p>
         </w:tc>
@@ -4432,7 +4432,7 @@
                 <w:sz w:val="18"/>
                 <w:szCs w:val="18"/>
               </w:rPr>
-              <w:t xml:space="preserve">2:00</w:t>
+              <w:t xml:space="preserve">1:59</w:t>
             </w:r>
           </w:p>
         </w:tc>
@@ -4546,7 +4546,7 @@
                 <w:sz w:val="18"/>
                 <w:szCs w:val="18"/>
               </w:rPr>
-              <w:t xml:space="preserve">14 to 19</w:t>
+              <w:t xml:space="preserve">12 to 19</w:t>
             </w:r>
           </w:p>
         </w:tc>
@@ -4573,7 +4573,7 @@
                 <w:sz w:val="18"/>
                 <w:szCs w:val="18"/>
               </w:rPr>
-              <w:t xml:space="preserve">2:04</w:t>
+              <w:t xml:space="preserve">2:02</w:t>
             </w:r>
           </w:p>
         </w:tc>
@@ -4600,7 +4600,7 @@
                 <w:sz w:val="18"/>
                 <w:szCs w:val="18"/>
               </w:rPr>
-              <w:t xml:space="preserve">Laptop /demo, Second app already on: press Crash, the sensor panel spikes, the probability reads high</w:t>
+              <w:t xml:space="preserve">README, How it works: the system architecture diagram. Slow pan left to right: rider device, Metrics API, who reads the record</w:t>
             </w:r>
           </w:p>
         </w:tc>
@@ -4627,7 +4627,7 @@
                 <w:sz w:val="18"/>
                 <w:szCs w:val="18"/>
               </w:rPr>
-              <w:t xml:space="preserve">"Our model catches 93 percent of falls on people it never saw, at 93 percent precision."</w:t>
+              <w:t xml:space="preserve">"Under the hood: phone or helmet, our model, a thirty second cancel, then one signed record everyone reads."</w:t>
             </w:r>
           </w:p>
         </w:tc>
@@ -4654,7 +4654,7 @@
                 <w:sz w:val="18"/>
                 <w:szCs w:val="18"/>
               </w:rPr>
-              <w:t xml:space="preserve">UMAFall, leave-subjects-out, 95% CIs. Demo rider, synthetic crash window</w:t>
+              <w:t xml:space="preserve">README, How it works</w:t>
             </w:r>
           </w:p>
         </w:tc>
@@ -4687,7 +4687,7 @@
                 <w:sz w:val="18"/>
                 <w:szCs w:val="18"/>
               </w:rPr>
-              <w:t xml:space="preserve">19 to 25</w:t>
+              <w:t xml:space="preserve">19 to 24</w:t>
             </w:r>
           </w:p>
         </w:tc>
@@ -4741,7 +4741,7 @@
                 <w:sz w:val="18"/>
                 <w:szCs w:val="18"/>
               </w:rPr>
-              <w:t xml:space="preserve">Dispatcher card slides in. Hover Copy for 999</w:t>
+              <w:t xml:space="preserve">Laptop /demo, Second app already on: press Crash, the sensor panel spikes, the probability reads high</w:t>
             </w:r>
           </w:p>
         </w:tc>
@@ -4768,7 +4768,7 @@
                 <w:sz w:val="18"/>
                 <w:szCs w:val="18"/>
               </w:rPr>
-              <w:t xml:space="preserve">"No tap, and dispatch gets the location and the likely injury."</w:t>
+              <w:t xml:space="preserve">"Our model catches 93 percent of falls on people it never saw, at 93 percent precision."</w:t>
             </w:r>
           </w:p>
         </w:tc>
@@ -4795,7 +4795,7 @@
                 <w:sz w:val="18"/>
                 <w:szCs w:val="18"/>
               </w:rPr>
-              <w:t xml:space="preserve"/>
+              <w:t xml:space="preserve">UMAFall, leave-subjects-out, 95% CIs. Demo rider, synthetic crash window</w:t>
             </w:r>
           </w:p>
         </w:tc>
@@ -4828,7 +4828,7 @@
                 <w:sz w:val="18"/>
                 <w:szCs w:val="18"/>
               </w:rPr>
-              <w:t xml:space="preserve">25 to 31</w:t>
+              <w:t xml:space="preserve">24 to 28</w:t>
             </w:r>
           </w:p>
         </w:tc>
@@ -4855,7 +4855,7 @@
                 <w:sz w:val="18"/>
                 <w:szCs w:val="18"/>
               </w:rPr>
-              <w:t xml:space="preserve">2:15</w:t>
+              <w:t xml:space="preserve">2:14</w:t>
             </w:r>
           </w:p>
         </w:tc>
@@ -4882,7 +4882,7 @@
                 <w:sz w:val="18"/>
                 <w:szCs w:val="18"/>
               </w:rPr>
-              <w:t xml:space="preserve">Underwriter panel: Paid, split 50 and 50 between Platform A and B, Settlement verified</w:t>
+              <w:t xml:space="preserve">Dispatcher card slides in. Hover Copy for 999</w:t>
             </w:r>
           </w:p>
         </w:tc>
@@ -4909,7 +4909,7 @@
                 <w:sz w:val="18"/>
                 <w:szCs w:val="18"/>
               </w:rPr>
-              <w:t xml:space="preserve">"The record names both apps, so tier one pays and splits between them."</w:t>
+              <w:t xml:space="preserve">"No tap, and dispatch gets the location and likely injury."</w:t>
             </w:r>
           </w:p>
         </w:tc>
@@ -4936,7 +4936,7 @@
                 <w:sz w:val="18"/>
                 <w:szCs w:val="18"/>
               </w:rPr>
-              <w:t xml:space="preserve">Placeholder amounts</w:t>
+              <w:t xml:space="preserve"/>
             </w:r>
           </w:p>
         </w:tc>
@@ -4969,7 +4969,7 @@
                 <w:sz w:val="18"/>
                 <w:szCs w:val="18"/>
               </w:rPr>
-              <w:t xml:space="preserve">31 to 37</w:t>
+              <w:t xml:space="preserve">28 to 33</w:t>
             </w:r>
           </w:p>
         </w:tc>
@@ -4996,7 +4996,7 @@
                 <w:sz w:val="18"/>
                 <w:szCs w:val="18"/>
               </w:rPr>
-              <w:t xml:space="preserve">2:21</w:t>
+              <w:t xml:space="preserve">2:18</w:t>
             </w:r>
           </w:p>
         </w:tc>
@@ -5023,7 +5023,7 @@
                 <w:sz w:val="18"/>
                 <w:szCs w:val="18"/>
               </w:rPr>
-              <w:t xml:space="preserve">Terminal beside the browser: verify returns valid. Change payoutHkd to 80000, run again, returns invalid</w:t>
+              <w:t xml:space="preserve">Underwriter panel: Paid, split 50 and 50 between Platform A and B, Settlement verified</w:t>
             </w:r>
           </w:p>
         </w:tc>
@@ -5050,7 +5050,7 @@
                 <w:sz w:val="18"/>
                 <w:szCs w:val="18"/>
               </w:rPr>
-              <w:t xml:space="preserve">"Every record is signed and hash-chained. Edit one number and verification fails."</w:t>
+              <w:t xml:space="preserve">"The record names both apps, so tier one pays and splits between them."</w:t>
             </w:r>
           </w:p>
         </w:tc>
@@ -5077,7 +5077,7 @@
                 <w:sz w:val="18"/>
                 <w:szCs w:val="18"/>
               </w:rPr>
-              <w:t xml:space="preserve"/>
+              <w:t xml:space="preserve">Placeholder amounts</w:t>
             </w:r>
           </w:p>
         </w:tc>
@@ -5110,7 +5110,7 @@
                 <w:sz w:val="18"/>
                 <w:szCs w:val="18"/>
               </w:rPr>
-              <w:t xml:space="preserve">37 to 42</w:t>
+              <w:t xml:space="preserve">33 to 37</w:t>
             </w:r>
           </w:p>
         </w:tc>
@@ -5137,7 +5137,7 @@
                 <w:sz w:val="18"/>
                 <w:szCs w:val="18"/>
               </w:rPr>
-              <w:t xml:space="preserve">2:27</w:t>
+              <w:t xml:space="preserve">2:23</w:t>
             </w:r>
           </w:p>
         </w:tc>
@@ -5164,7 +5164,7 @@
                 <w:sz w:val="18"/>
                 <w:szCs w:val="18"/>
               </w:rPr>
-              <w:t xml:space="preserve">/labour: injuries by time left on the delivery clock, hazard cells ranked by rate</w:t>
+              <w:t xml:space="preserve">Terminal beside the browser: verify returns valid. Change payoutHkd to 80000, run again, returns invalid</w:t>
             </w:r>
           </w:p>
         </w:tc>
@@ -5191,7 +5191,7 @@
                 <w:sz w:val="18"/>
                 <w:szCs w:val="18"/>
               </w:rPr>
-              <w:t xml:space="preserve">"The Labour Department sees totals only. No rider ids, no routes."</w:t>
+              <w:t xml:space="preserve">"Every record is signed. Edit one number and verification fails."</w:t>
             </w:r>
           </w:p>
         </w:tc>
@@ -5251,7 +5251,7 @@
                 <w:sz w:val="18"/>
                 <w:szCs w:val="18"/>
               </w:rPr>
-              <w:t xml:space="preserve">42 to 48</w:t>
+              <w:t xml:space="preserve">37 to 41</w:t>
             </w:r>
           </w:p>
         </w:tc>
@@ -5278,7 +5278,7 @@
                 <w:sz w:val="18"/>
                 <w:szCs w:val="18"/>
               </w:rPr>
-              <w:t xml:space="preserve">2:32</w:t>
+              <w:t xml:space="preserve">2:27</w:t>
             </w:r>
           </w:p>
         </w:tc>
@@ -5305,7 +5305,7 @@
                 <w:sz w:val="18"/>
                 <w:szCs w:val="18"/>
               </w:rPr>
-              <w:t xml:space="preserve">README, "Are the numbers real?": the results table, then the real riding rows</w:t>
+              <w:t xml:space="preserve">/labour: injuries by time left on the delivery clock, hazard cells ranked by rate</w:t>
             </w:r>
           </w:p>
         </w:tc>
@@ -5332,7 +5332,7 @@
                 <w:sz w:val="18"/>
                 <w:szCs w:val="18"/>
               </w:rPr>
-              <w:t xml:space="preserve">"On fifteen hours of real motorbike riding, one false alarm every five hours."</w:t>
+              <w:t xml:space="preserve">"The Labour Department sees totals only. No names, no routes."</w:t>
             </w:r>
           </w:p>
         </w:tc>
@@ -5359,7 +5359,7 @@
                 <w:sz w:val="18"/>
                 <w:szCs w:val="18"/>
               </w:rPr>
-              <w:t xml:space="preserve">TU Wien motorcyclist IMU dataset</w:t>
+              <w:t xml:space="preserve"/>
             </w:r>
           </w:p>
         </w:tc>
@@ -5392,7 +5392,7 @@
                 <w:sz w:val="18"/>
                 <w:szCs w:val="18"/>
               </w:rPr>
-              <w:t xml:space="preserve">48 to 50</w:t>
+              <w:t xml:space="preserve">41 to 46</w:t>
             </w:r>
           </w:p>
         </w:tc>
@@ -5419,7 +5419,148 @@
                 <w:sz w:val="18"/>
                 <w:szCs w:val="18"/>
               </w:rPr>
-              <w:t xml:space="preserve">2:38</w:t>
+              <w:t xml:space="preserve">2:31</w:t>
+            </w:r>
+          </w:p>
+        </w:tc>
+        <w:tc>
+          <w:tcPr>
+            <w:tcW w:type="dxa" w:w="4295"/>
+            <w:tcBorders>
+              <w:top w:val="single" w:color="C9C9C4" w:sz="4"/>
+              <w:left w:val="single" w:color="C9C9C4" w:sz="4"/>
+              <w:bottom w:val="single" w:color="C9C9C4" w:sz="4"/>
+              <w:right w:val="single" w:color="C9C9C4" w:sz="4"/>
+            </w:tcBorders>
+            <w:tcMar>
+              <w:top w:type="dxa" w:w="60"/>
+              <w:left w:type="dxa" w:w="100"/>
+              <w:bottom w:type="dxa" w:w="60"/>
+              <w:right w:type="dxa" w:w="100"/>
+            </w:tcMar>
+          </w:tcPr>
+          <w:p>
+            <w:r>
+              <w:rPr>
+                <w:color w:val="0A0A0A"/>
+                <w:sz w:val="18"/>
+                <w:szCs w:val="18"/>
+              </w:rPr>
+              <w:t xml:space="preserve">README, "Are the numbers real?": the real riding rows</w:t>
+            </w:r>
+          </w:p>
+        </w:tc>
+        <w:tc>
+          <w:tcPr>
+            <w:tcW w:type="dxa" w:w="4295"/>
+            <w:tcBorders>
+              <w:top w:val="single" w:color="C9C9C4" w:sz="4"/>
+              <w:left w:val="single" w:color="C9C9C4" w:sz="4"/>
+              <w:bottom w:val="single" w:color="C9C9C4" w:sz="4"/>
+              <w:right w:val="single" w:color="C9C9C4" w:sz="4"/>
+            </w:tcBorders>
+            <w:tcMar>
+              <w:top w:type="dxa" w:w="60"/>
+              <w:left w:type="dxa" w:w="100"/>
+              <w:bottom w:type="dxa" w:w="60"/>
+              <w:right w:type="dxa" w:w="100"/>
+            </w:tcMar>
+          </w:tcPr>
+          <w:p>
+            <w:r>
+              <w:rPr>
+                <w:color w:val="0A0A0A"/>
+                <w:sz w:val="18"/>
+                <w:szCs w:val="18"/>
+              </w:rPr>
+              <w:t xml:space="preserve">"On fifteen hours of real motorbike riding, one false alarm every five hours."</w:t>
+            </w:r>
+          </w:p>
+        </w:tc>
+        <w:tc>
+          <w:tcPr>
+            <w:tcW w:type="dxa" w:w="4296"/>
+            <w:tcBorders>
+              <w:top w:val="single" w:color="C9C9C4" w:sz="4"/>
+              <w:left w:val="single" w:color="C9C9C4" w:sz="4"/>
+              <w:bottom w:val="single" w:color="C9C9C4" w:sz="4"/>
+              <w:right w:val="single" w:color="C9C9C4" w:sz="4"/>
+            </w:tcBorders>
+            <w:tcMar>
+              <w:top w:type="dxa" w:w="60"/>
+              <w:left w:type="dxa" w:w="100"/>
+              <w:bottom w:type="dxa" w:w="60"/>
+              <w:right w:type="dxa" w:w="100"/>
+            </w:tcMar>
+          </w:tcPr>
+          <w:p>
+            <w:r>
+              <w:rPr>
+                <w:color w:val="0A0A0A"/>
+                <w:sz w:val="18"/>
+                <w:szCs w:val="18"/>
+              </w:rPr>
+              <w:t xml:space="preserve">TU Wien motorcyclist IMU dataset</w:t>
+            </w:r>
+          </w:p>
+        </w:tc>
+      </w:tr>
+      <w:tr>
+        <w:trPr>
+          <w:cantSplit/>
+          <w:tblHeader w:val="off"/>
+        </w:trPr>
+        <w:tc>
+          <w:tcPr>
+            <w:tcW w:type="dxa" w:w="911"/>
+            <w:tcBorders>
+              <w:top w:val="single" w:color="C9C9C4" w:sz="4"/>
+              <w:left w:val="single" w:color="C9C9C4" w:sz="4"/>
+              <w:bottom w:val="single" w:color="C9C9C4" w:sz="4"/>
+              <w:right w:val="single" w:color="C9C9C4" w:sz="4"/>
+            </w:tcBorders>
+            <w:tcMar>
+              <w:top w:type="dxa" w:w="60"/>
+              <w:left w:type="dxa" w:w="100"/>
+              <w:bottom w:type="dxa" w:w="60"/>
+              <w:right w:type="dxa" w:w="100"/>
+            </w:tcMar>
+          </w:tcPr>
+          <w:p>
+            <w:r>
+              <w:rPr>
+                <w:color w:val="0A0A0A"/>
+                <w:sz w:val="18"/>
+                <w:szCs w:val="18"/>
+              </w:rPr>
+              <w:t xml:space="preserve">46 to 50</w:t>
+            </w:r>
+          </w:p>
+        </w:tc>
+        <w:tc>
+          <w:tcPr>
+            <w:tcW w:type="dxa" w:w="1041"/>
+            <w:tcBorders>
+              <w:top w:val="single" w:color="C9C9C4" w:sz="4"/>
+              <w:left w:val="single" w:color="C9C9C4" w:sz="4"/>
+              <w:bottom w:val="single" w:color="C9C9C4" w:sz="4"/>
+              <w:right w:val="single" w:color="C9C9C4" w:sz="4"/>
+            </w:tcBorders>
+            <w:tcMar>
+              <w:top w:type="dxa" w:w="60"/>
+              <w:left w:type="dxa" w:w="100"/>
+              <w:bottom w:type="dxa" w:w="60"/>
+              <w:right w:type="dxa" w:w="100"/>
+            </w:tcMar>
+          </w:tcPr>
+          <w:p>
+            <w:r>
+              <w:rPr>
+                <w:color w:val="0A0A0A"/>
+                <w:sz w:val="18"/>
+                <w:szCs w:val="18"/>
+              </w:rPr>
+              <w:t xml:space="preserve">2:36</w:t>
             </w:r>
           </w:p>
         </w:tc>
@@ -5516,7 +5657,7 @@
         <w:spacing w:after="120"/>
       </w:pPr>
       <w:r>
-        <w:t xml:space="preserve">About 105 words, about 45 seconds spoken plus a 3 second silent drop.</w:t>
+        <w:t xml:space="preserve">About 120 words at a brisk pace, about 46 seconds, plus a 3 second silent drop.</w:t>
       </w:r>
     </w:p>
     <w:p>
@@ -5725,6 +5866,66 @@
                 <w:szCs w:val="18"/>
               </w:rPr>
               <w:t xml:space="preserve">Validation: held-out people, confidence intervals</w:t>
+            </w:r>
+          </w:p>
+        </w:tc>
+      </w:tr>
+      <w:tr>
+        <w:trPr>
+          <w:cantSplit/>
+          <w:tblHeader w:val="off"/>
+        </w:trPr>
+        <w:tc>
+          <w:tcPr>
+            <w:tcW w:type="dxa" w:w="7003"/>
+            <w:tcBorders>
+              <w:top w:val="single" w:color="C9C9C4" w:sz="4"/>
+              <w:left w:val="single" w:color="C9C9C4" w:sz="4"/>
+              <w:bottom w:val="single" w:color="C9C9C4" w:sz="4"/>
+              <w:right w:val="single" w:color="C9C9C4" w:sz="4"/>
+            </w:tcBorders>
+            <w:tcMar>
+              <w:top w:type="dxa" w:w="60"/>
+              <w:left w:type="dxa" w:w="100"/>
+              <w:bottom w:type="dxa" w:w="60"/>
+              <w:right w:type="dxa" w:w="100"/>
+            </w:tcMar>
+          </w:tcPr>
+          <w:p>
+            <w:r>
+              <w:rPr>
+                <w:color w:val="0A0A0A"/>
+                <w:sz w:val="18"/>
+                <w:szCs w:val="18"/>
+              </w:rPr>
+              <w:t xml:space="preserve">How it works over the architecture diagram</w:t>
+            </w:r>
+          </w:p>
+        </w:tc>
+        <w:tc>
+          <w:tcPr>
+            <w:tcW w:type="dxa" w:w="7835"/>
+            <w:tcBorders>
+              <w:top w:val="single" w:color="C9C9C4" w:sz="4"/>
+              <w:left w:val="single" w:color="C9C9C4" w:sz="4"/>
+              <w:bottom w:val="single" w:color="C9C9C4" w:sz="4"/>
+              <w:right w:val="single" w:color="C9C9C4" w:sz="4"/>
+            </w:tcBorders>
+            <w:tcMar>
+              <w:top w:type="dxa" w:w="60"/>
+              <w:left w:type="dxa" w:w="100"/>
+              <w:bottom w:type="dxa" w:w="60"/>
+              <w:right w:type="dxa" w:w="100"/>
+            </w:tcMar>
+          </w:tcPr>
+          <w:p>
+            <w:r>
+              <w:rPr>
+                <w:color w:val="0A0A0A"/>
+                <w:sz w:val="18"/>
+                <w:szCs w:val="18"/>
+              </w:rPr>
+              <w:t xml:space="preserve">Replicable design: the whole system in one picture</w:t>
             </w:r>
           </w:p>
         </w:tc>

</xml_diff>

<commit_message>
Video script: final Part 6 on limits, risks, insurer pathway and Imperial feedback, plus Q&A notes
</commit_message>
<xml_diff>
--- a/docs/submission/VIDEO_SCRIPT.docx
+++ b/docs/submission/VIDEO_SCRIPT.docx
@@ -23,7 +23,7 @@
         <w:spacing w:after="120"/>
       </w:pPr>
       <w:r>
-        <w:t xml:space="preserve">Hard limit 4:30. Target 3:58. English. Burned-in subtitles on every spoken line. Every member speaks at least twice.</w:t>
+        <w:t xml:space="preserve">Hard limit 4:30. Target 4:20. English. Burned-in subtitles on every spoken line. Every member speaks at least twice.</w:t>
       </w:r>
     </w:p>
     <w:p>
@@ -47,10 +47,10 @@
         </w:tblBorders>
       </w:tblPr>
       <w:tblGrid>
-        <w:gridCol w:w="2473"/>
-        <w:gridCol w:w="1534"/>
-        <w:gridCol w:w="5628"/>
-        <w:gridCol w:w="5203"/>
+        <w:gridCol w:w="2935"/>
+        <w:gridCol w:w="1428"/>
+        <w:gridCol w:w="5237"/>
+        <w:gridCol w:w="5238"/>
       </w:tblGrid>
       <w:tr>
         <w:trPr>
@@ -59,7 +59,7 @@
         </w:trPr>
         <w:tc>
           <w:tcPr>
-            <w:tcW w:type="dxa" w:w="2473"/>
+            <w:tcW w:type="dxa" w:w="2935"/>
             <w:tcBorders>
               <w:top w:val="single" w:color="C9C9C4" w:sz="4"/>
               <w:left w:val="single" w:color="C9C9C4" w:sz="4"/>
@@ -89,7 +89,7 @@
         </w:tc>
         <w:tc>
           <w:tcPr>
-            <w:tcW w:type="dxa" w:w="1534"/>
+            <w:tcW w:type="dxa" w:w="1428"/>
             <w:tcBorders>
               <w:top w:val="single" w:color="C9C9C4" w:sz="4"/>
               <w:left w:val="single" w:color="C9C9C4" w:sz="4"/>
@@ -119,7 +119,7 @@
         </w:tc>
         <w:tc>
           <w:tcPr>
-            <w:tcW w:type="dxa" w:w="5628"/>
+            <w:tcW w:type="dxa" w:w="5237"/>
             <w:tcBorders>
               <w:top w:val="single" w:color="C9C9C4" w:sz="4"/>
               <w:left w:val="single" w:color="C9C9C4" w:sz="4"/>
@@ -149,7 +149,7 @@
         </w:tc>
         <w:tc>
           <w:tcPr>
-            <w:tcW w:type="dxa" w:w="5203"/>
+            <w:tcW w:type="dxa" w:w="5238"/>
             <w:tcBorders>
               <w:top w:val="single" w:color="C9C9C4" w:sz="4"/>
               <w:left w:val="single" w:color="C9C9C4" w:sz="4"/>
@@ -185,7 +185,7 @@
         </w:trPr>
         <w:tc>
           <w:tcPr>
-            <w:tcW w:type="dxa" w:w="2473"/>
+            <w:tcW w:type="dxa" w:w="2935"/>
             <w:tcBorders>
               <w:top w:val="single" w:color="C9C9C4" w:sz="4"/>
               <w:left w:val="single" w:color="C9C9C4" w:sz="4"/>
@@ -212,7 +212,7 @@
         </w:tc>
         <w:tc>
           <w:tcPr>
-            <w:tcW w:type="dxa" w:w="1534"/>
+            <w:tcW w:type="dxa" w:w="1428"/>
             <w:tcBorders>
               <w:top w:val="single" w:color="C9C9C4" w:sz="4"/>
               <w:left w:val="single" w:color="C9C9C4" w:sz="4"/>
@@ -239,7 +239,7 @@
         </w:tc>
         <w:tc>
           <w:tcPr>
-            <w:tcW w:type="dxa" w:w="5628"/>
+            <w:tcW w:type="dxa" w:w="5237"/>
             <w:tcBorders>
               <w:top w:val="single" w:color="C9C9C4" w:sz="4"/>
               <w:left w:val="single" w:color="C9C9C4" w:sz="4"/>
@@ -266,7 +266,7 @@
         </w:tc>
         <w:tc>
           <w:tcPr>
-            <w:tcW w:type="dxa" w:w="5203"/>
+            <w:tcW w:type="dxa" w:w="5238"/>
             <w:tcBorders>
               <w:top w:val="single" w:color="C9C9C4" w:sz="4"/>
               <w:left w:val="single" w:color="C9C9C4" w:sz="4"/>
@@ -299,7 +299,7 @@
         </w:trPr>
         <w:tc>
           <w:tcPr>
-            <w:tcW w:type="dxa" w:w="2473"/>
+            <w:tcW w:type="dxa" w:w="2935"/>
             <w:tcBorders>
               <w:top w:val="single" w:color="C9C9C4" w:sz="4"/>
               <w:left w:val="single" w:color="C9C9C4" w:sz="4"/>
@@ -326,7 +326,7 @@
         </w:tc>
         <w:tc>
           <w:tcPr>
-            <w:tcW w:type="dxa" w:w="1534"/>
+            <w:tcW w:type="dxa" w:w="1428"/>
             <w:tcBorders>
               <w:top w:val="single" w:color="C9C9C4" w:sz="4"/>
               <w:left w:val="single" w:color="C9C9C4" w:sz="4"/>
@@ -353,7 +353,7 @@
         </w:tc>
         <w:tc>
           <w:tcPr>
-            <w:tcW w:type="dxa" w:w="5628"/>
+            <w:tcW w:type="dxa" w:w="5237"/>
             <w:tcBorders>
               <w:top w:val="single" w:color="C9C9C4" w:sz="4"/>
               <w:left w:val="single" w:color="C9C9C4" w:sz="4"/>
@@ -380,7 +380,7 @@
         </w:tc>
         <w:tc>
           <w:tcPr>
-            <w:tcW w:type="dxa" w:w="5203"/>
+            <w:tcW w:type="dxa" w:w="5238"/>
             <w:tcBorders>
               <w:top w:val="single" w:color="C9C9C4" w:sz="4"/>
               <w:left w:val="single" w:color="C9C9C4" w:sz="4"/>
@@ -413,7 +413,7 @@
         </w:trPr>
         <w:tc>
           <w:tcPr>
-            <w:tcW w:type="dxa" w:w="2473"/>
+            <w:tcW w:type="dxa" w:w="2935"/>
             <w:tcBorders>
               <w:top w:val="single" w:color="C9C9C4" w:sz="4"/>
               <w:left w:val="single" w:color="C9C9C4" w:sz="4"/>
@@ -440,7 +440,7 @@
         </w:tc>
         <w:tc>
           <w:tcPr>
-            <w:tcW w:type="dxa" w:w="1534"/>
+            <w:tcW w:type="dxa" w:w="1428"/>
             <w:tcBorders>
               <w:top w:val="single" w:color="C9C9C4" w:sz="4"/>
               <w:left w:val="single" w:color="C9C9C4" w:sz="4"/>
@@ -467,7 +467,7 @@
         </w:tc>
         <w:tc>
           <w:tcPr>
-            <w:tcW w:type="dxa" w:w="5628"/>
+            <w:tcW w:type="dxa" w:w="5237"/>
             <w:tcBorders>
               <w:top w:val="single" w:color="C9C9C4" w:sz="4"/>
               <w:left w:val="single" w:color="C9C9C4" w:sz="4"/>
@@ -494,7 +494,7 @@
         </w:tc>
         <w:tc>
           <w:tcPr>
-            <w:tcW w:type="dxa" w:w="5203"/>
+            <w:tcW w:type="dxa" w:w="5238"/>
             <w:tcBorders>
               <w:top w:val="single" w:color="C9C9C4" w:sz="4"/>
               <w:left w:val="single" w:color="C9C9C4" w:sz="4"/>
@@ -527,7 +527,7 @@
         </w:trPr>
         <w:tc>
           <w:tcPr>
-            <w:tcW w:type="dxa" w:w="2473"/>
+            <w:tcW w:type="dxa" w:w="2935"/>
             <w:tcBorders>
               <w:top w:val="single" w:color="C9C9C4" w:sz="4"/>
               <w:left w:val="single" w:color="C9C9C4" w:sz="4"/>
@@ -554,7 +554,7 @@
         </w:tc>
         <w:tc>
           <w:tcPr>
-            <w:tcW w:type="dxa" w:w="1534"/>
+            <w:tcW w:type="dxa" w:w="1428"/>
             <w:tcBorders>
               <w:top w:val="single" w:color="C9C9C4" w:sz="4"/>
               <w:left w:val="single" w:color="C9C9C4" w:sz="4"/>
@@ -581,7 +581,7 @@
         </w:tc>
         <w:tc>
           <w:tcPr>
-            <w:tcW w:type="dxa" w:w="5628"/>
+            <w:tcW w:type="dxa" w:w="5237"/>
             <w:tcBorders>
               <w:top w:val="single" w:color="C9C9C4" w:sz="4"/>
               <w:left w:val="single" w:color="C9C9C4" w:sz="4"/>
@@ -608,7 +608,7 @@
         </w:tc>
         <w:tc>
           <w:tcPr>
-            <w:tcW w:type="dxa" w:w="5203"/>
+            <w:tcW w:type="dxa" w:w="5238"/>
             <w:tcBorders>
               <w:top w:val="single" w:color="C9C9C4" w:sz="4"/>
               <w:left w:val="single" w:color="C9C9C4" w:sz="4"/>
@@ -641,7 +641,7 @@
         </w:trPr>
         <w:tc>
           <w:tcPr>
-            <w:tcW w:type="dxa" w:w="2473"/>
+            <w:tcW w:type="dxa" w:w="2935"/>
             <w:tcBorders>
               <w:top w:val="single" w:color="C9C9C4" w:sz="4"/>
               <w:left w:val="single" w:color="C9C9C4" w:sz="4"/>
@@ -668,7 +668,7 @@
         </w:tc>
         <w:tc>
           <w:tcPr>
-            <w:tcW w:type="dxa" w:w="1534"/>
+            <w:tcW w:type="dxa" w:w="1428"/>
             <w:tcBorders>
               <w:top w:val="single" w:color="C9C9C4" w:sz="4"/>
               <w:left w:val="single" w:color="C9C9C4" w:sz="4"/>
@@ -695,7 +695,7 @@
         </w:tc>
         <w:tc>
           <w:tcPr>
-            <w:tcW w:type="dxa" w:w="5628"/>
+            <w:tcW w:type="dxa" w:w="5237"/>
             <w:tcBorders>
               <w:top w:val="single" w:color="C9C9C4" w:sz="4"/>
               <w:left w:val="single" w:color="C9C9C4" w:sz="4"/>
@@ -722,7 +722,7 @@
         </w:tc>
         <w:tc>
           <w:tcPr>
-            <w:tcW w:type="dxa" w:w="5203"/>
+            <w:tcW w:type="dxa" w:w="5238"/>
             <w:tcBorders>
               <w:top w:val="single" w:color="C9C9C4" w:sz="4"/>
               <w:left w:val="single" w:color="C9C9C4" w:sz="4"/>
@@ -755,109 +755,109 @@
         </w:trPr>
         <w:tc>
           <w:tcPr>
-            <w:tcW w:type="dxa" w:w="2473"/>
-            <w:tcBorders>
-              <w:top w:val="single" w:color="C9C9C4" w:sz="4"/>
-              <w:left w:val="single" w:color="C9C9C4" w:sz="4"/>
-              <w:bottom w:val="single" w:color="C9C9C4" w:sz="4"/>
-              <w:right w:val="single" w:color="C9C9C4" w:sz="4"/>
-            </w:tcBorders>
-            <w:tcMar>
-              <w:top w:type="dxa" w:w="60"/>
-              <w:left w:type="dxa" w:w="100"/>
-              <w:bottom w:type="dxa" w:w="60"/>
-              <w:right w:type="dxa" w:w="100"/>
-            </w:tcMar>
-          </w:tcPr>
-          <w:p>
-            <w:r>
-              <w:rPr>
-                <w:color w:val="0A0A0A"/>
-                <w:sz w:val="18"/>
-                <w:szCs w:val="18"/>
-              </w:rPr>
-              <w:t xml:space="preserve">6. Risks and next steps</w:t>
-            </w:r>
-          </w:p>
-        </w:tc>
-        <w:tc>
-          <w:tcPr>
-            <w:tcW w:type="dxa" w:w="1534"/>
-            <w:tcBorders>
-              <w:top w:val="single" w:color="C9C9C4" w:sz="4"/>
-              <w:left w:val="single" w:color="C9C9C4" w:sz="4"/>
-              <w:bottom w:val="single" w:color="C9C9C4" w:sz="4"/>
-              <w:right w:val="single" w:color="C9C9C4" w:sz="4"/>
-            </w:tcBorders>
-            <w:tcMar>
-              <w:top w:type="dxa" w:w="60"/>
-              <w:left w:type="dxa" w:w="100"/>
-              <w:bottom w:type="dxa" w:w="60"/>
-              <w:right w:type="dxa" w:w="100"/>
-            </w:tcMar>
-          </w:tcPr>
-          <w:p>
-            <w:r>
-              <w:rPr>
-                <w:color w:val="0A0A0A"/>
-                <w:sz w:val="18"/>
-                <w:szCs w:val="18"/>
-              </w:rPr>
-              <w:t xml:space="preserve">3:05 to 3:50</w:t>
-            </w:r>
-          </w:p>
-        </w:tc>
-        <w:tc>
-          <w:tcPr>
-            <w:tcW w:type="dxa" w:w="5628"/>
-            <w:tcBorders>
-              <w:top w:val="single" w:color="C9C9C4" w:sz="4"/>
-              <w:left w:val="single" w:color="C9C9C4" w:sz="4"/>
-              <w:bottom w:val="single" w:color="C9C9C4" w:sz="4"/>
-              <w:right w:val="single" w:color="C9C9C4" w:sz="4"/>
-            </w:tcBorders>
-            <w:tcMar>
-              <w:top w:type="dxa" w:w="60"/>
-              <w:left w:type="dxa" w:w="100"/>
-              <w:bottom w:type="dxa" w:w="60"/>
-              <w:right w:type="dxa" w:w="100"/>
-            </w:tcMar>
-          </w:tcPr>
-          <w:p>
-            <w:r>
-              <w:rPr>
-                <w:color w:val="0A0A0A"/>
-                <w:sz w:val="18"/>
-                <w:szCs w:val="18"/>
-              </w:rPr>
-              <w:t xml:space="preserve">Team relay: limits, top three risks and fixes, ethics, what comes next</w:t>
-            </w:r>
-          </w:p>
-        </w:tc>
-        <w:tc>
-          <w:tcPr>
-            <w:tcW w:type="dxa" w:w="5203"/>
-            <w:tcBorders>
-              <w:top w:val="single" w:color="C9C9C4" w:sz="4"/>
-              <w:left w:val="single" w:color="C9C9C4" w:sz="4"/>
-              <w:bottom w:val="single" w:color="C9C9C4" w:sz="4"/>
-              <w:right w:val="single" w:color="C9C9C4" w:sz="4"/>
-            </w:tcBorders>
-            <w:tcMar>
-              <w:top w:type="dxa" w:w="60"/>
-              <w:left w:type="dxa" w:w="100"/>
-              <w:bottom w:type="dxa" w:w="60"/>
-              <w:right w:type="dxa" w:w="100"/>
-            </w:tcMar>
-          </w:tcPr>
-          <w:p>
-            <w:r>
-              <w:rPr>
-                <w:color w:val="0A0A0A"/>
-                <w:sz w:val="18"/>
-                <w:szCs w:val="18"/>
-              </w:rPr>
-              <w:t xml:space="preserve">Validation, risk register, ethics, research integrity</w:t>
+            <w:tcW w:type="dxa" w:w="2935"/>
+            <w:tcBorders>
+              <w:top w:val="single" w:color="C9C9C4" w:sz="4"/>
+              <w:left w:val="single" w:color="C9C9C4" w:sz="4"/>
+              <w:bottom w:val="single" w:color="C9C9C4" w:sz="4"/>
+              <w:right w:val="single" w:color="C9C9C4" w:sz="4"/>
+            </w:tcBorders>
+            <w:tcMar>
+              <w:top w:type="dxa" w:w="60"/>
+              <w:left w:type="dxa" w:w="100"/>
+              <w:bottom w:type="dxa" w:w="60"/>
+              <w:right w:type="dxa" w:w="100"/>
+            </w:tcMar>
+          </w:tcPr>
+          <w:p>
+            <w:r>
+              <w:rPr>
+                <w:color w:val="0A0A0A"/>
+                <w:sz w:val="18"/>
+                <w:szCs w:val="18"/>
+              </w:rPr>
+              <w:t xml:space="preserve">6. Limits, risks and next steps</w:t>
+            </w:r>
+          </w:p>
+        </w:tc>
+        <w:tc>
+          <w:tcPr>
+            <w:tcW w:type="dxa" w:w="1428"/>
+            <w:tcBorders>
+              <w:top w:val="single" w:color="C9C9C4" w:sz="4"/>
+              <w:left w:val="single" w:color="C9C9C4" w:sz="4"/>
+              <w:bottom w:val="single" w:color="C9C9C4" w:sz="4"/>
+              <w:right w:val="single" w:color="C9C9C4" w:sz="4"/>
+            </w:tcBorders>
+            <w:tcMar>
+              <w:top w:type="dxa" w:w="60"/>
+              <w:left w:type="dxa" w:w="100"/>
+              <w:bottom w:type="dxa" w:w="60"/>
+              <w:right w:type="dxa" w:w="100"/>
+            </w:tcMar>
+          </w:tcPr>
+          <w:p>
+            <w:r>
+              <w:rPr>
+                <w:color w:val="0A0A0A"/>
+                <w:sz w:val="18"/>
+                <w:szCs w:val="18"/>
+              </w:rPr>
+              <w:t xml:space="preserve">3:05 to 4:12</w:t>
+            </w:r>
+          </w:p>
+        </w:tc>
+        <w:tc>
+          <w:tcPr>
+            <w:tcW w:type="dxa" w:w="5237"/>
+            <w:tcBorders>
+              <w:top w:val="single" w:color="C9C9C4" w:sz="4"/>
+              <w:left w:val="single" w:color="C9C9C4" w:sz="4"/>
+              <w:bottom w:val="single" w:color="C9C9C4" w:sz="4"/>
+              <w:right w:val="single" w:color="C9C9C4" w:sz="4"/>
+            </w:tcBorders>
+            <w:tcMar>
+              <w:top w:type="dxa" w:w="60"/>
+              <w:left w:type="dxa" w:w="100"/>
+              <w:bottom w:type="dxa" w:w="60"/>
+              <w:right w:type="dxa" w:w="100"/>
+            </w:tcMar>
+          </w:tcPr>
+          <w:p>
+            <w:r>
+              <w:rPr>
+                <w:color w:val="0A0A0A"/>
+                <w:sz w:val="18"/>
+                <w:szCs w:val="18"/>
+              </w:rPr>
+              <w:t xml:space="preserve">Team relay: limits, top three barriers, ethics, insurer pathway, answers to Imperial feedback</w:t>
+            </w:r>
+          </w:p>
+        </w:tc>
+        <w:tc>
+          <w:tcPr>
+            <w:tcW w:type="dxa" w:w="5238"/>
+            <w:tcBorders>
+              <w:top w:val="single" w:color="C9C9C4" w:sz="4"/>
+              <w:left w:val="single" w:color="C9C9C4" w:sz="4"/>
+              <w:bottom w:val="single" w:color="C9C9C4" w:sz="4"/>
+              <w:right w:val="single" w:color="C9C9C4" w:sz="4"/>
+            </w:tcBorders>
+            <w:tcMar>
+              <w:top w:type="dxa" w:w="60"/>
+              <w:left w:type="dxa" w:w="100"/>
+              <w:bottom w:type="dxa" w:w="60"/>
+              <w:right w:type="dxa" w:w="100"/>
+            </w:tcMar>
+          </w:tcPr>
+          <w:p>
+            <w:r>
+              <w:rPr>
+                <w:color w:val="0A0A0A"/>
+                <w:sz w:val="18"/>
+                <w:szCs w:val="18"/>
+              </w:rPr>
+              <w:t xml:space="preserve">Validation, risk register, ethics, translation, research integrity</w:t>
             </w:r>
           </w:p>
         </w:tc>
@@ -869,7 +869,7 @@
         </w:trPr>
         <w:tc>
           <w:tcPr>
-            <w:tcW w:type="dxa" w:w="2473"/>
+            <w:tcW w:type="dxa" w:w="2935"/>
             <w:tcBorders>
               <w:top w:val="single" w:color="C9C9C4" w:sz="4"/>
               <w:left w:val="single" w:color="C9C9C4" w:sz="4"/>
@@ -896,34 +896,34 @@
         </w:tc>
         <w:tc>
           <w:tcPr>
-            <w:tcW w:type="dxa" w:w="1534"/>
-            <w:tcBorders>
-              <w:top w:val="single" w:color="C9C9C4" w:sz="4"/>
-              <w:left w:val="single" w:color="C9C9C4" w:sz="4"/>
-              <w:bottom w:val="single" w:color="C9C9C4" w:sz="4"/>
-              <w:right w:val="single" w:color="C9C9C4" w:sz="4"/>
-            </w:tcBorders>
-            <w:tcMar>
-              <w:top w:type="dxa" w:w="60"/>
-              <w:left w:type="dxa" w:w="100"/>
-              <w:bottom w:type="dxa" w:w="60"/>
-              <w:right w:type="dxa" w:w="100"/>
-            </w:tcMar>
-          </w:tcPr>
-          <w:p>
-            <w:r>
-              <w:rPr>
-                <w:color w:val="0A0A0A"/>
-                <w:sz w:val="18"/>
-                <w:szCs w:val="18"/>
-              </w:rPr>
-              <w:t xml:space="preserve">3:50 to 3:58</w:t>
-            </w:r>
-          </w:p>
-        </w:tc>
-        <w:tc>
-          <w:tcPr>
-            <w:tcW w:type="dxa" w:w="5628"/>
+            <w:tcW w:type="dxa" w:w="1428"/>
+            <w:tcBorders>
+              <w:top w:val="single" w:color="C9C9C4" w:sz="4"/>
+              <w:left w:val="single" w:color="C9C9C4" w:sz="4"/>
+              <w:bottom w:val="single" w:color="C9C9C4" w:sz="4"/>
+              <w:right w:val="single" w:color="C9C9C4" w:sz="4"/>
+            </w:tcBorders>
+            <w:tcMar>
+              <w:top w:type="dxa" w:w="60"/>
+              <w:left w:type="dxa" w:w="100"/>
+              <w:bottom w:type="dxa" w:w="60"/>
+              <w:right w:type="dxa" w:w="100"/>
+            </w:tcMar>
+          </w:tcPr>
+          <w:p>
+            <w:r>
+              <w:rPr>
+                <w:color w:val="0A0A0A"/>
+                <w:sz w:val="18"/>
+                <w:szCs w:val="18"/>
+              </w:rPr>
+              <w:t xml:space="preserve">4:12 to 4:20</w:t>
+            </w:r>
+          </w:p>
+        </w:tc>
+        <w:tc>
+          <w:tcPr>
+            <w:tcW w:type="dxa" w:w="5237"/>
             <w:tcBorders>
               <w:top w:val="single" w:color="C9C9C4" w:sz="4"/>
               <w:left w:val="single" w:color="C9C9C4" w:sz="4"/>
@@ -950,7 +950,7 @@
         </w:tc>
         <w:tc>
           <w:tcPr>
-            <w:tcW w:type="dxa" w:w="5203"/>
+            <w:tcW w:type="dxa" w:w="5238"/>
             <w:tcBorders>
               <w:top w:val="single" w:color="C9C9C4" w:sz="4"/>
               <w:left w:val="single" w:color="C9C9C4" w:sz="4"/>
@@ -1023,7 +1023,7 @@
         </w:numPr>
       </w:pPr>
       <w:r>
-        <w:t xml:space="preserve">No line longer than nine seconds in the relays. Cut on every line.</w:t>
+        <w:t xml:space="preserve">No line longer than nine seconds in the relays, except lines 14 and 15 in Part 6. Cut on every line.</w:t>
       </w:r>
     </w:p>
     <w:p>
@@ -6939,7 +6939,7 @@
         <w:pStyle w:val="Heading1"/>
       </w:pPr>
       <w:r>
-        <w:t xml:space="preserve">Part 6. Risks and next steps (3:05 to 3:50)</w:t>
+        <w:t xml:space="preserve">Part 6. Limits, risks and what comes next (3:05 to 4:12)</w:t>
       </w:r>
     </w:p>
     <w:p>
@@ -6947,7 +6947,7 @@
         <w:spacing w:after="120"/>
       </w:pPr>
       <w:r>
-        <w:t xml:space="preserve">Relay again, one line each, a single card behind each line. This is where we answer the hardest questions before anyone asks.</w:t>
+        <w:t xml:space="preserve">Relay, one line each, each person on their own field. A single card behind each line. This part answers, before anyone asks: what the evidence does not prove, the top three barriers (accuracy, rider trust, insurer and regulator), the dual use risk, and each point in Imperial's feedback on our problem statement.</w:t>
       </w:r>
     </w:p>
     <w:tbl>
@@ -6963,10 +6963,11 @@
         </w:tblBorders>
       </w:tblPr>
       <w:tblGrid>
-        <w:gridCol w:w="892"/>
-        <w:gridCol w:w="1249"/>
-        <w:gridCol w:w="6347"/>
-        <w:gridCol w:w="6350"/>
+        <w:gridCol w:w="877"/>
+        <w:gridCol w:w="877"/>
+        <w:gridCol w:w="4360"/>
+        <w:gridCol w:w="4360"/>
+        <w:gridCol w:w="4364"/>
       </w:tblGrid>
       <w:tr>
         <w:trPr>
@@ -6975,7 +6976,7 @@
         </w:trPr>
         <w:tc>
           <w:tcPr>
-            <w:tcW w:type="dxa" w:w="892"/>
+            <w:tcW w:type="dxa" w:w="877"/>
             <w:tcBorders>
               <w:top w:val="single" w:color="C9C9C4" w:sz="4"/>
               <w:left w:val="single" w:color="C9C9C4" w:sz="4"/>
@@ -7005,7 +7006,7 @@
         </w:tc>
         <w:tc>
           <w:tcPr>
-            <w:tcW w:type="dxa" w:w="1249"/>
+            <w:tcW w:type="dxa" w:w="877"/>
             <w:tcBorders>
               <w:top w:val="single" w:color="C9C9C4" w:sz="4"/>
               <w:left w:val="single" w:color="C9C9C4" w:sz="4"/>
@@ -7035,7 +7036,7 @@
         </w:tc>
         <w:tc>
           <w:tcPr>
-            <w:tcW w:type="dxa" w:w="6347"/>
+            <w:tcW w:type="dxa" w:w="4360"/>
             <w:tcBorders>
               <w:top w:val="single" w:color="C9C9C4" w:sz="4"/>
               <w:left w:val="single" w:color="C9C9C4" w:sz="4"/>
@@ -7065,7 +7066,7 @@
         </w:tc>
         <w:tc>
           <w:tcPr>
-            <w:tcW w:type="dxa" w:w="6350"/>
+            <w:tcW w:type="dxa" w:w="4360"/>
             <w:tcBorders>
               <w:top w:val="single" w:color="C9C9C4" w:sz="4"/>
               <w:left w:val="single" w:color="C9C9C4" w:sz="4"/>
@@ -7090,6 +7091,36 @@
                 <w:szCs w:val="18"/>
               </w:rPr>
               <w:t xml:space="preserve">Card behind</w:t>
+            </w:r>
+          </w:p>
+        </w:tc>
+        <w:tc>
+          <w:tcPr>
+            <w:tcW w:type="dxa" w:w="4364"/>
+            <w:tcBorders>
+              <w:top w:val="single" w:color="C9C9C4" w:sz="4"/>
+              <w:left w:val="single" w:color="C9C9C4" w:sz="4"/>
+              <w:bottom w:val="single" w:color="C9C9C4" w:sz="4"/>
+              <w:right w:val="single" w:color="C9C9C4" w:sz="4"/>
+            </w:tcBorders>
+            <w:shd w:fill="EDE9FF" w:color="auto" w:val="clear"/>
+            <w:tcMar>
+              <w:top w:type="dxa" w:w="60"/>
+              <w:left w:type="dxa" w:w="100"/>
+              <w:bottom w:type="dxa" w:w="60"/>
+              <w:right w:type="dxa" w:w="100"/>
+            </w:tcMar>
+          </w:tcPr>
+          <w:p>
+            <w:r>
+              <w:rPr>
+                <w:b/>
+                <w:bCs/>
+                <w:color w:val="0A0A0A"/>
+                <w:sz w:val="18"/>
+                <w:szCs w:val="18"/>
+              </w:rPr>
+              <w:t xml:space="preserve">Answers</w:t>
             </w:r>
           </w:p>
         </w:tc>
@@ -7101,7 +7132,7 @@
         </w:trPr>
         <w:tc>
           <w:tcPr>
-            <w:tcW w:type="dxa" w:w="892"/>
+            <w:tcW w:type="dxa" w:w="877"/>
             <w:tcBorders>
               <w:top w:val="single" w:color="C9C9C4" w:sz="4"/>
               <w:left w:val="single" w:color="C9C9C4" w:sz="4"/>
@@ -7128,7 +7159,7 @@
         </w:tc>
         <w:tc>
           <w:tcPr>
-            <w:tcW w:type="dxa" w:w="1249"/>
+            <w:tcW w:type="dxa" w:w="877"/>
             <w:tcBorders>
               <w:top w:val="single" w:color="C9C9C4" w:sz="4"/>
               <w:left w:val="single" w:color="C9C9C4" w:sz="4"/>
@@ -7155,55 +7186,82 @@
         </w:tc>
         <w:tc>
           <w:tcPr>
-            <w:tcW w:type="dxa" w:w="6347"/>
-            <w:tcBorders>
-              <w:top w:val="single" w:color="C9C9C4" w:sz="4"/>
-              <w:left w:val="single" w:color="C9C9C4" w:sz="4"/>
-              <w:bottom w:val="single" w:color="C9C9C4" w:sz="4"/>
-              <w:right w:val="single" w:color="C9C9C4" w:sz="4"/>
-            </w:tcBorders>
-            <w:tcMar>
-              <w:top w:type="dxa" w:w="60"/>
-              <w:left w:type="dxa" w:w="100"/>
-              <w:bottom w:type="dxa" w:w="60"/>
-              <w:right w:type="dxa" w:w="100"/>
-            </w:tcMar>
-          </w:tcPr>
-          <w:p>
-            <w:r>
-              <w:rPr>
-                <w:color w:val="0A0A0A"/>
-                <w:sz w:val="18"/>
-                <w:szCs w:val="18"/>
-              </w:rPr>
-              <w:t xml:space="preserve">Our limit: we trained on volunteers falling onto mats, not road crashes. We say so everywhere.</w:t>
-            </w:r>
-          </w:p>
-        </w:tc>
-        <w:tc>
-          <w:tcPr>
-            <w:tcW w:type="dxa" w:w="6350"/>
-            <w:tcBorders>
-              <w:top w:val="single" w:color="C9C9C4" w:sz="4"/>
-              <w:left w:val="single" w:color="C9C9C4" w:sz="4"/>
-              <w:bottom w:val="single" w:color="C9C9C4" w:sz="4"/>
-              <w:right w:val="single" w:color="C9C9C4" w:sz="4"/>
-            </w:tcBorders>
-            <w:tcMar>
-              <w:top w:type="dxa" w:w="60"/>
-              <w:left w:type="dxa" w:w="100"/>
-              <w:bottom w:type="dxa" w:w="60"/>
-              <w:right w:type="dxa" w:w="100"/>
-            </w:tcMar>
-          </w:tcPr>
-          <w:p>
-            <w:r>
-              <w:rPr>
-                <w:color w:val="0A0A0A"/>
-                <w:sz w:val="18"/>
-                <w:szCs w:val="18"/>
-              </w:rPr>
-              <w:t xml:space="preserve">"Simulated falls. Limits listed on the site and in the repo."</w:t>
+            <w:tcW w:type="dxa" w:w="4360"/>
+            <w:tcBorders>
+              <w:top w:val="single" w:color="C9C9C4" w:sz="4"/>
+              <w:left w:val="single" w:color="C9C9C4" w:sz="4"/>
+              <w:bottom w:val="single" w:color="C9C9C4" w:sz="4"/>
+              <w:right w:val="single" w:color="C9C9C4" w:sz="4"/>
+            </w:tcBorders>
+            <w:tcMar>
+              <w:top w:type="dxa" w:w="60"/>
+              <w:left w:type="dxa" w:w="100"/>
+              <w:bottom w:type="dxa" w:w="60"/>
+              <w:right w:type="dxa" w:w="100"/>
+            </w:tcMar>
+          </w:tcPr>
+          <w:p>
+            <w:r>
+              <w:rPr>
+                <w:color w:val="0A0A0A"/>
+                <w:sz w:val="18"/>
+                <w:szCs w:val="18"/>
+              </w:rPr>
+              <w:t xml:space="preserve">Our biggest limit: we trained on volunteers falling onto mats, not road crashes. So riders who opt in can now donate real rides for us to retrain on.</w:t>
+            </w:r>
+          </w:p>
+        </w:tc>
+        <w:tc>
+          <w:tcPr>
+            <w:tcW w:type="dxa" w:w="4360"/>
+            <w:tcBorders>
+              <w:top w:val="single" w:color="C9C9C4" w:sz="4"/>
+              <w:left w:val="single" w:color="C9C9C4" w:sz="4"/>
+              <w:bottom w:val="single" w:color="C9C9C4" w:sz="4"/>
+              <w:right w:val="single" w:color="C9C9C4" w:sz="4"/>
+            </w:tcBorders>
+            <w:tcMar>
+              <w:top w:type="dxa" w:w="60"/>
+              <w:left w:type="dxa" w:w="100"/>
+              <w:bottom w:type="dxa" w:w="60"/>
+              <w:right w:type="dxa" w:w="100"/>
+            </w:tcMar>
+          </w:tcPr>
+          <w:p>
+            <w:r>
+              <w:rPr>
+                <w:color w:val="0A0A0A"/>
+                <w:sz w:val="18"/>
+                <w:szCs w:val="18"/>
+              </w:rPr>
+              <w:t xml:space="preserve">"Simulated falls. Real rides next." Research mode toggle on /rider</w:t>
+            </w:r>
+          </w:p>
+        </w:tc>
+        <w:tc>
+          <w:tcPr>
+            <w:tcW w:type="dxa" w:w="4364"/>
+            <w:tcBorders>
+              <w:top w:val="single" w:color="C9C9C4" w:sz="4"/>
+              <w:left w:val="single" w:color="C9C9C4" w:sz="4"/>
+              <w:bottom w:val="single" w:color="C9C9C4" w:sz="4"/>
+              <w:right w:val="single" w:color="C9C9C4" w:sz="4"/>
+            </w:tcBorders>
+            <w:tcMar>
+              <w:top w:type="dxa" w:w="60"/>
+              <w:left w:type="dxa" w:w="100"/>
+              <w:bottom w:type="dxa" w:w="60"/>
+              <w:right w:type="dxa" w:w="100"/>
+            </w:tcMar>
+          </w:tcPr>
+          <w:p>
+            <w:r>
+              <w:rPr>
+                <w:color w:val="0A0A0A"/>
+                <w:sz w:val="18"/>
+                <w:szCs w:val="18"/>
+              </w:rPr>
+              <w:t xml:space="preserve">Limits of the evidence, further research</w:t>
             </w:r>
           </w:p>
         </w:tc>
@@ -7215,7 +7273,7 @@
         </w:trPr>
         <w:tc>
           <w:tcPr>
-            <w:tcW w:type="dxa" w:w="892"/>
+            <w:tcW w:type="dxa" w:w="877"/>
             <w:tcBorders>
               <w:top w:val="single" w:color="C9C9C4" w:sz="4"/>
               <w:left w:val="single" w:color="C9C9C4" w:sz="4"/>
@@ -7242,7 +7300,7 @@
         </w:tc>
         <w:tc>
           <w:tcPr>
-            <w:tcW w:type="dxa" w:w="1249"/>
+            <w:tcW w:type="dxa" w:w="877"/>
             <w:tcBorders>
               <w:top w:val="single" w:color="C9C9C4" w:sz="4"/>
               <w:left w:val="single" w:color="C9C9C4" w:sz="4"/>
@@ -7269,34 +7327,34 @@
         </w:tc>
         <w:tc>
           <w:tcPr>
-            <w:tcW w:type="dxa" w:w="6347"/>
-            <w:tcBorders>
-              <w:top w:val="single" w:color="C9C9C4" w:sz="4"/>
-              <w:left w:val="single" w:color="C9C9C4" w:sz="4"/>
-              <w:bottom w:val="single" w:color="C9C9C4" w:sz="4"/>
-              <w:right w:val="single" w:color="C9C9C4" w:sz="4"/>
-            </w:tcBorders>
-            <w:tcMar>
-              <w:top w:type="dxa" w:w="60"/>
-              <w:left w:type="dxa" w:w="100"/>
-              <w:bottom w:type="dxa" w:w="60"/>
-              <w:right w:type="dxa" w:w="100"/>
-            </w:tcMar>
-          </w:tcPr>
-          <w:p>
-            <w:r>
-              <w:rPr>
-                <w:color w:val="0A0A0A"/>
-                <w:sz w:val="18"/>
-                <w:szCs w:val="18"/>
-              </w:rPr>
-              <w:t xml:space="preserve">Risk one, false alarms. About ten an hour of phone handling, one every five hours on real motorbike rides. All can be cancelled.</w:t>
-            </w:r>
-          </w:p>
-        </w:tc>
-        <w:tc>
-          <w:tcPr>
-            <w:tcW w:type="dxa" w:w="6350"/>
+            <w:tcW w:type="dxa" w:w="4360"/>
+            <w:tcBorders>
+              <w:top w:val="single" w:color="C9C9C4" w:sz="4"/>
+              <w:left w:val="single" w:color="C9C9C4" w:sz="4"/>
+              <w:bottom w:val="single" w:color="C9C9C4" w:sz="4"/>
+              <w:right w:val="single" w:color="C9C9C4" w:sz="4"/>
+            </w:tcBorders>
+            <w:tcMar>
+              <w:top w:type="dxa" w:w="60"/>
+              <w:left w:type="dxa" w:w="100"/>
+              <w:bottom w:type="dxa" w:w="60"/>
+              <w:right w:type="dxa" w:w="100"/>
+            </w:tcMar>
+          </w:tcPr>
+          <w:p>
+            <w:r>
+              <w:rPr>
+                <w:color w:val="0A0A0A"/>
+                <w:sz w:val="18"/>
+                <w:szCs w:val="18"/>
+              </w:rPr>
+              <w:t xml:space="preserve">Will it cry wolf? About ten false alarms an hour of phone handling, one every five hours of real riding. Every alarm cancels in thirty seconds.</w:t>
+            </w:r>
+          </w:p>
+        </w:tc>
+        <w:tc>
+          <w:tcPr>
+            <w:tcW w:type="dxa" w:w="4360"/>
             <w:tcBorders>
               <w:top w:val="single" w:color="C9C9C4" w:sz="4"/>
               <w:left w:val="single" w:color="C9C9C4" w:sz="4"/>
@@ -7318,6 +7376,33 @@
                 <w:szCs w:val="18"/>
               </w:rPr>
               <w:t xml:space="preserve">"10.5 per hour handling. 0.2 per hour real riding." Sources: ml/STREAMING.md; TU Wien dataset</w:t>
+            </w:r>
+          </w:p>
+        </w:tc>
+        <w:tc>
+          <w:tcPr>
+            <w:tcW w:type="dxa" w:w="4364"/>
+            <w:tcBorders>
+              <w:top w:val="single" w:color="C9C9C4" w:sz="4"/>
+              <w:left w:val="single" w:color="C9C9C4" w:sz="4"/>
+              <w:bottom w:val="single" w:color="C9C9C4" w:sz="4"/>
+              <w:right w:val="single" w:color="C9C9C4" w:sz="4"/>
+            </w:tcBorders>
+            <w:tcMar>
+              <w:top w:type="dxa" w:w="60"/>
+              <w:left w:type="dxa" w:w="100"/>
+              <w:bottom w:type="dxa" w:w="60"/>
+              <w:right w:type="dxa" w:w="100"/>
+            </w:tcMar>
+          </w:tcPr>
+          <w:p>
+            <w:r>
+              <w:rPr>
+                <w:color w:val="0A0A0A"/>
+                <w:sz w:val="18"/>
+                <w:szCs w:val="18"/>
+              </w:rPr>
+              <w:t xml:space="preserve">Barrier one: accuracy</w:t>
             </w:r>
           </w:p>
         </w:tc>
@@ -7329,7 +7414,7 @@
         </w:trPr>
         <w:tc>
           <w:tcPr>
-            <w:tcW w:type="dxa" w:w="892"/>
+            <w:tcW w:type="dxa" w:w="877"/>
             <w:tcBorders>
               <w:top w:val="single" w:color="C9C9C4" w:sz="4"/>
               <w:left w:val="single" w:color="C9C9C4" w:sz="4"/>
@@ -7356,82 +7441,109 @@
         </w:tc>
         <w:tc>
           <w:tcPr>
-            <w:tcW w:type="dxa" w:w="1249"/>
-            <w:tcBorders>
-              <w:top w:val="single" w:color="C9C9C4" w:sz="4"/>
-              <w:left w:val="single" w:color="C9C9C4" w:sz="4"/>
-              <w:bottom w:val="single" w:color="C9C9C4" w:sz="4"/>
-              <w:right w:val="single" w:color="C9C9C4" w:sz="4"/>
-            </w:tcBorders>
-            <w:tcMar>
-              <w:top w:type="dxa" w:w="60"/>
-              <w:left w:type="dxa" w:w="100"/>
-              <w:bottom w:type="dxa" w:w="60"/>
-              <w:right w:type="dxa" w:w="100"/>
-            </w:tcMar>
-          </w:tcPr>
-          <w:p>
-            <w:r>
-              <w:rPr>
-                <w:color w:val="0A0A0A"/>
-                <w:sz w:val="18"/>
-                <w:szCs w:val="18"/>
-              </w:rPr>
-              <w:t xml:space="preserve">Alysa</w:t>
-            </w:r>
-          </w:p>
-        </w:tc>
-        <w:tc>
-          <w:tcPr>
-            <w:tcW w:type="dxa" w:w="6347"/>
-            <w:tcBorders>
-              <w:top w:val="single" w:color="C9C9C4" w:sz="4"/>
-              <w:left w:val="single" w:color="C9C9C4" w:sz="4"/>
-              <w:bottom w:val="single" w:color="C9C9C4" w:sz="4"/>
-              <w:right w:val="single" w:color="C9C9C4" w:sz="4"/>
-            </w:tcBorders>
-            <w:tcMar>
-              <w:top w:type="dxa" w:w="60"/>
-              <w:left w:type="dxa" w:w="100"/>
-              <w:bottom w:type="dxa" w:w="60"/>
-              <w:right w:type="dxa" w:w="100"/>
-            </w:tcMar>
-          </w:tcPr>
-          <w:p>
-            <w:r>
-              <w:rPr>
-                <w:color w:val="0A0A0A"/>
-                <w:sz w:val="18"/>
-                <w:szCs w:val="18"/>
-              </w:rPr>
-              <w:t xml:space="preserve">Risk two, platforms resisting. They are liable either way, and the record settles who pays.</w:t>
-            </w:r>
-          </w:p>
-        </w:tc>
-        <w:tc>
-          <w:tcPr>
-            <w:tcW w:type="dxa" w:w="6350"/>
-            <w:tcBorders>
-              <w:top w:val="single" w:color="C9C9C4" w:sz="4"/>
-              <w:left w:val="single" w:color="C9C9C4" w:sz="4"/>
-              <w:bottom w:val="single" w:color="C9C9C4" w:sz="4"/>
-              <w:right w:val="single" w:color="C9C9C4" w:sz="4"/>
-            </w:tcBorders>
-            <w:tcMar>
-              <w:top w:type="dxa" w:w="60"/>
-              <w:left w:type="dxa" w:w="100"/>
-              <w:bottom w:type="dxa" w:w="60"/>
-              <w:right w:type="dxa" w:w="100"/>
-            </w:tcMar>
-          </w:tcPr>
-          <w:p>
-            <w:r>
-              <w:rPr>
-                <w:color w:val="0A0A0A"/>
-                <w:sz w:val="18"/>
-                <w:szCs w:val="18"/>
-              </w:rPr>
-              <w:t xml:space="preserve">"Liable either way. Apportionment by lookup."</w:t>
+            <w:tcW w:type="dxa" w:w="877"/>
+            <w:tcBorders>
+              <w:top w:val="single" w:color="C9C9C4" w:sz="4"/>
+              <w:left w:val="single" w:color="C9C9C4" w:sz="4"/>
+              <w:bottom w:val="single" w:color="C9C9C4" w:sz="4"/>
+              <w:right w:val="single" w:color="C9C9C4" w:sz="4"/>
+            </w:tcBorders>
+            <w:tcMar>
+              <w:top w:type="dxa" w:w="60"/>
+              <w:left w:type="dxa" w:w="100"/>
+              <w:bottom w:type="dxa" w:w="60"/>
+              <w:right w:type="dxa" w:w="100"/>
+            </w:tcMar>
+          </w:tcPr>
+          <w:p>
+            <w:r>
+              <w:rPr>
+                <w:color w:val="0A0A0A"/>
+                <w:sz w:val="18"/>
+                <w:szCs w:val="18"/>
+              </w:rPr>
+              <w:t xml:space="preserve">Hannes</w:t>
+            </w:r>
+          </w:p>
+        </w:tc>
+        <w:tc>
+          <w:tcPr>
+            <w:tcW w:type="dxa" w:w="4360"/>
+            <w:tcBorders>
+              <w:top w:val="single" w:color="C9C9C4" w:sz="4"/>
+              <w:left w:val="single" w:color="C9C9C4" w:sz="4"/>
+              <w:bottom w:val="single" w:color="C9C9C4" w:sz="4"/>
+              <w:right w:val="single" w:color="C9C9C4" w:sz="4"/>
+            </w:tcBorders>
+            <w:tcMar>
+              <w:top w:type="dxa" w:w="60"/>
+              <w:left w:type="dxa" w:w="100"/>
+              <w:bottom w:type="dxa" w:w="60"/>
+              <w:right w:type="dxa" w:w="100"/>
+            </w:tcMar>
+          </w:tcPr>
+          <w:p>
+            <w:r>
+              <w:rPr>
+                <w:color w:val="0A0A0A"/>
+                <w:sz w:val="18"/>
+                <w:szCs w:val="18"/>
+              </w:rPr>
+              <w:t xml:space="preserve">Imperial asked us for drop test evidence. The protocol is written; we run it before the final and demo it live.</w:t>
+            </w:r>
+          </w:p>
+        </w:tc>
+        <w:tc>
+          <w:tcPr>
+            <w:tcW w:type="dxa" w:w="4360"/>
+            <w:tcBorders>
+              <w:top w:val="single" w:color="C9C9C4" w:sz="4"/>
+              <w:left w:val="single" w:color="C9C9C4" w:sz="4"/>
+              <w:bottom w:val="single" w:color="C9C9C4" w:sz="4"/>
+              <w:right w:val="single" w:color="C9C9C4" w:sz="4"/>
+            </w:tcBorders>
+            <w:tcMar>
+              <w:top w:type="dxa" w:w="60"/>
+              <w:left w:type="dxa" w:w="100"/>
+              <w:bottom w:type="dxa" w:w="60"/>
+              <w:right w:type="dxa" w:w="100"/>
+            </w:tcMar>
+          </w:tcPr>
+          <w:p>
+            <w:r>
+              <w:rPr>
+                <w:color w:val="0A0A0A"/>
+                <w:sz w:val="18"/>
+                <w:szCs w:val="18"/>
+              </w:rPr>
+              <w:t xml:space="preserve">Drop test protocol page; helmet on the bench</w:t>
+            </w:r>
+          </w:p>
+        </w:tc>
+        <w:tc>
+          <w:tcPr>
+            <w:tcW w:type="dxa" w:w="4364"/>
+            <w:tcBorders>
+              <w:top w:val="single" w:color="C9C9C4" w:sz="4"/>
+              <w:left w:val="single" w:color="C9C9C4" w:sz="4"/>
+              <w:bottom w:val="single" w:color="C9C9C4" w:sz="4"/>
+              <w:right w:val="single" w:color="C9C9C4" w:sz="4"/>
+            </w:tcBorders>
+            <w:tcMar>
+              <w:top w:type="dxa" w:w="60"/>
+              <w:left w:type="dxa" w:w="100"/>
+              <w:bottom w:type="dxa" w:w="60"/>
+              <w:right w:type="dxa" w:w="100"/>
+            </w:tcMar>
+          </w:tcPr>
+          <w:p>
+            <w:r>
+              <w:rPr>
+                <w:color w:val="0A0A0A"/>
+                <w:sz w:val="18"/>
+                <w:szCs w:val="18"/>
+              </w:rPr>
+              <w:t xml:space="preserve">Feedback: prototype and validation</w:t>
             </w:r>
           </w:p>
         </w:tc>
@@ -7443,7 +7555,7 @@
         </w:trPr>
         <w:tc>
           <w:tcPr>
-            <w:tcW w:type="dxa" w:w="892"/>
+            <w:tcW w:type="dxa" w:w="877"/>
             <w:tcBorders>
               <w:top w:val="single" w:color="C9C9C4" w:sz="4"/>
               <w:left w:val="single" w:color="C9C9C4" w:sz="4"/>
@@ -7470,7 +7582,7 @@
         </w:tc>
         <w:tc>
           <w:tcPr>
-            <w:tcW w:type="dxa" w:w="1249"/>
+            <w:tcW w:type="dxa" w:w="877"/>
             <w:tcBorders>
               <w:top w:val="single" w:color="C9C9C4" w:sz="4"/>
               <w:left w:val="single" w:color="C9C9C4" w:sz="4"/>
@@ -7497,34 +7609,34 @@
         </w:tc>
         <w:tc>
           <w:tcPr>
-            <w:tcW w:type="dxa" w:w="6347"/>
-            <w:tcBorders>
-              <w:top w:val="single" w:color="C9C9C4" w:sz="4"/>
-              <w:left w:val="single" w:color="C9C9C4" w:sz="4"/>
-              <w:bottom w:val="single" w:color="C9C9C4" w:sz="4"/>
-              <w:right w:val="single" w:color="C9C9C4" w:sz="4"/>
-            </w:tcBorders>
-            <w:tcMar>
-              <w:top w:type="dxa" w:w="60"/>
-              <w:left w:type="dxa" w:w="100"/>
-              <w:bottom w:type="dxa" w:w="60"/>
-              <w:right w:type="dxa" w:w="100"/>
-            </w:tcMar>
-          </w:tcPr>
-          <w:p>
-            <w:r>
-              <w:rPr>
-                <w:color w:val="0A0A0A"/>
-                <w:sz w:val="18"/>
-                <w:szCs w:val="18"/>
-              </w:rPr>
-              <w:t xml:space="preserve">Risk three, surveillance. No route history, no risk score, and research data deleted on request.</w:t>
-            </w:r>
-          </w:p>
-        </w:tc>
-        <w:tc>
-          <w:tcPr>
-            <w:tcW w:type="dxa" w:w="6350"/>
+            <w:tcW w:type="dxa" w:w="4360"/>
+            <w:tcBorders>
+              <w:top w:val="single" w:color="C9C9C4" w:sz="4"/>
+              <w:left w:val="single" w:color="C9C9C4" w:sz="4"/>
+              <w:bottom w:val="single" w:color="C9C9C4" w:sz="4"/>
+              <w:right w:val="single" w:color="C9C9C4" w:sz="4"/>
+            </w:tcBorders>
+            <w:tcMar>
+              <w:top w:type="dxa" w:w="60"/>
+              <w:left w:type="dxa" w:w="100"/>
+              <w:bottom w:type="dxa" w:w="60"/>
+              <w:right w:type="dxa" w:w="100"/>
+            </w:tcMar>
+          </w:tcPr>
+          <w:p>
+            <w:r>
+              <w:rPr>
+                <w:color w:val="0A0A0A"/>
+                <w:sz w:val="18"/>
+                <w:szCs w:val="18"/>
+              </w:rPr>
+              <w:t xml:space="preserve">It never diagnoses, and it can't be turned against riders: they opt in each shift and own their record. No routes, no risk score.</w:t>
+            </w:r>
+          </w:p>
+        </w:tc>
+        <w:tc>
+          <w:tcPr>
+            <w:tcW w:type="dxa" w:w="4360"/>
             <w:tcBorders>
               <w:top w:val="single" w:color="C9C9C4" w:sz="4"/>
               <w:left w:val="single" w:color="C9C9C4" w:sz="4"/>
@@ -7546,6 +7658,33 @@
                 <w:szCs w:val="18"/>
               </w:rPr>
               <w:t xml:space="preserve">Consent screen, then the who-sees-what matrix</w:t>
+            </w:r>
+          </w:p>
+        </w:tc>
+        <w:tc>
+          <w:tcPr>
+            <w:tcW w:type="dxa" w:w="4364"/>
+            <w:tcBorders>
+              <w:top w:val="single" w:color="C9C9C4" w:sz="4"/>
+              <w:left w:val="single" w:color="C9C9C4" w:sz="4"/>
+              <w:bottom w:val="single" w:color="C9C9C4" w:sz="4"/>
+              <w:right w:val="single" w:color="C9C9C4" w:sz="4"/>
+            </w:tcBorders>
+            <w:tcMar>
+              <w:top w:type="dxa" w:w="60"/>
+              <w:left w:type="dxa" w:w="100"/>
+              <w:bottom w:type="dxa" w:w="60"/>
+              <w:right w:type="dxa" w:w="100"/>
+            </w:tcMar>
+          </w:tcPr>
+          <w:p>
+            <w:r>
+              <w:rPr>
+                <w:color w:val="0A0A0A"/>
+                <w:sz w:val="18"/>
+                <w:szCs w:val="18"/>
+              </w:rPr>
+              <w:t xml:space="preserve">Barrier two: rider trust. Feedback: consent, ownership, dual use</w:t>
             </w:r>
           </w:p>
         </w:tc>
@@ -7557,7 +7696,7 @@
         </w:trPr>
         <w:tc>
           <w:tcPr>
-            <w:tcW w:type="dxa" w:w="892"/>
+            <w:tcW w:type="dxa" w:w="877"/>
             <w:tcBorders>
               <w:top w:val="single" w:color="C9C9C4" w:sz="4"/>
               <w:left w:val="single" w:color="C9C9C4" w:sz="4"/>
@@ -7584,82 +7723,109 @@
         </w:tc>
         <w:tc>
           <w:tcPr>
-            <w:tcW w:type="dxa" w:w="1249"/>
-            <w:tcBorders>
-              <w:top w:val="single" w:color="C9C9C4" w:sz="4"/>
-              <w:left w:val="single" w:color="C9C9C4" w:sz="4"/>
-              <w:bottom w:val="single" w:color="C9C9C4" w:sz="4"/>
-              <w:right w:val="single" w:color="C9C9C4" w:sz="4"/>
-            </w:tcBorders>
-            <w:tcMar>
-              <w:top w:type="dxa" w:w="60"/>
-              <w:left w:type="dxa" w:w="100"/>
-              <w:bottom w:type="dxa" w:w="60"/>
-              <w:right w:type="dxa" w:w="100"/>
-            </w:tcMar>
-          </w:tcPr>
-          <w:p>
-            <w:r>
-              <w:rPr>
-                <w:color w:val="0A0A0A"/>
-                <w:sz w:val="18"/>
-                <w:szCs w:val="18"/>
-              </w:rPr>
-              <w:t xml:space="preserve">Hannes</w:t>
-            </w:r>
-          </w:p>
-        </w:tc>
-        <w:tc>
-          <w:tcPr>
-            <w:tcW w:type="dxa" w:w="6347"/>
-            <w:tcBorders>
-              <w:top w:val="single" w:color="C9C9C4" w:sz="4"/>
-              <w:left w:val="single" w:color="C9C9C4" w:sz="4"/>
-              <w:bottom w:val="single" w:color="C9C9C4" w:sz="4"/>
-              <w:right w:val="single" w:color="C9C9C4" w:sz="4"/>
-            </w:tcBorders>
-            <w:tcMar>
-              <w:top w:type="dxa" w:w="60"/>
-              <w:left w:type="dxa" w:w="100"/>
-              <w:bottom w:type="dxa" w:w="60"/>
-              <w:right w:type="dxa" w:w="100"/>
-            </w:tcMar>
-          </w:tcPr>
-          <w:p>
-            <w:r>
-              <w:rPr>
-                <w:color w:val="0A0A0A"/>
-                <w:sz w:val="18"/>
-                <w:szCs w:val="18"/>
-              </w:rPr>
-              <w:t xml:space="preserve">Next on the hardware: helmet drop tests on a rig, and a stronger sensor so hard impacts do not clip.</w:t>
-            </w:r>
-          </w:p>
-        </w:tc>
-        <w:tc>
-          <w:tcPr>
-            <w:tcW w:type="dxa" w:w="6350"/>
-            <w:tcBorders>
-              <w:top w:val="single" w:color="C9C9C4" w:sz="4"/>
-              <w:left w:val="single" w:color="C9C9C4" w:sz="4"/>
-              <w:bottom w:val="single" w:color="C9C9C4" w:sz="4"/>
-              <w:right w:val="single" w:color="C9C9C4" w:sz="4"/>
-            </w:tcBorders>
-            <w:tcMar>
-              <w:top w:type="dxa" w:w="60"/>
-              <w:left w:type="dxa" w:w="100"/>
-              <w:bottom w:type="dxa" w:w="60"/>
-              <w:right w:type="dxa" w:w="100"/>
-            </w:tcMar>
-          </w:tcPr>
-          <w:p>
-            <w:r>
-              <w:rPr>
-                <w:color w:val="0A0A0A"/>
-                <w:sz w:val="18"/>
-                <w:szCs w:val="18"/>
-              </w:rPr>
-              <w:t xml:space="preserve">Drop test protocol page; helmet on the bench</w:t>
+            <w:tcW w:type="dxa" w:w="877"/>
+            <w:tcBorders>
+              <w:top w:val="single" w:color="C9C9C4" w:sz="4"/>
+              <w:left w:val="single" w:color="C9C9C4" w:sz="4"/>
+              <w:bottom w:val="single" w:color="C9C9C4" w:sz="4"/>
+              <w:right w:val="single" w:color="C9C9C4" w:sz="4"/>
+            </w:tcBorders>
+            <w:tcMar>
+              <w:top w:type="dxa" w:w="60"/>
+              <w:left w:type="dxa" w:w="100"/>
+              <w:bottom w:type="dxa" w:w="60"/>
+              <w:right w:type="dxa" w:w="100"/>
+            </w:tcMar>
+          </w:tcPr>
+          <w:p>
+            <w:r>
+              <w:rPr>
+                <w:color w:val="0A0A0A"/>
+                <w:sz w:val="18"/>
+                <w:szCs w:val="18"/>
+              </w:rPr>
+              <w:t xml:space="preserve">Alysa</w:t>
+            </w:r>
+          </w:p>
+        </w:tc>
+        <w:tc>
+          <w:tcPr>
+            <w:tcW w:type="dxa" w:w="4360"/>
+            <w:tcBorders>
+              <w:top w:val="single" w:color="C9C9C4" w:sz="4"/>
+              <w:left w:val="single" w:color="C9C9C4" w:sz="4"/>
+              <w:bottom w:val="single" w:color="C9C9C4" w:sz="4"/>
+              <w:right w:val="single" w:color="C9C9C4" w:sz="4"/>
+            </w:tcBorders>
+            <w:tcMar>
+              <w:top w:type="dxa" w:w="60"/>
+              <w:left w:type="dxa" w:w="100"/>
+              <w:bottom w:type="dxa" w:w="60"/>
+              <w:right w:type="dxa" w:w="100"/>
+            </w:tcMar>
+          </w:tcPr>
+          <w:p>
+            <w:r>
+              <w:rPr>
+                <w:color w:val="0A0A0A"/>
+                <w:sz w:val="18"/>
+                <w:szCs w:val="18"/>
+              </w:rPr>
+              <w:t xml:space="preserve">We are not an insurer, and no insurer has signed with us yet. A licensed insurer writes the cover; we supply the trigger: a verified crash that nobody cancelled.</w:t>
+            </w:r>
+          </w:p>
+        </w:tc>
+        <w:tc>
+          <w:tcPr>
+            <w:tcW w:type="dxa" w:w="4360"/>
+            <w:tcBorders>
+              <w:top w:val="single" w:color="C9C9C4" w:sz="4"/>
+              <w:left w:val="single" w:color="C9C9C4" w:sz="4"/>
+              <w:bottom w:val="single" w:color="C9C9C4" w:sz="4"/>
+              <w:right w:val="single" w:color="C9C9C4" w:sz="4"/>
+            </w:tcBorders>
+            <w:tcMar>
+              <w:top w:type="dxa" w:w="60"/>
+              <w:left w:type="dxa" w:w="100"/>
+              <w:bottom w:type="dxa" w:w="60"/>
+              <w:right w:type="dxa" w:w="100"/>
+            </w:tcMar>
+          </w:tcPr>
+          <w:p>
+            <w:r>
+              <w:rPr>
+                <w:color w:val="0A0A0A"/>
+                <w:sz w:val="18"/>
+                <w:szCs w:val="18"/>
+              </w:rPr>
+              <w:t xml:space="preserve">Diagram: rider, Metrics trigger, licensed insurer, platform</w:t>
+            </w:r>
+          </w:p>
+        </w:tc>
+        <w:tc>
+          <w:tcPr>
+            <w:tcW w:type="dxa" w:w="4364"/>
+            <w:tcBorders>
+              <w:top w:val="single" w:color="C9C9C4" w:sz="4"/>
+              <w:left w:val="single" w:color="C9C9C4" w:sz="4"/>
+              <w:bottom w:val="single" w:color="C9C9C4" w:sz="4"/>
+              <w:right w:val="single" w:color="C9C9C4" w:sz="4"/>
+            </w:tcBorders>
+            <w:tcMar>
+              <w:top w:type="dxa" w:w="60"/>
+              <w:left w:type="dxa" w:w="100"/>
+              <w:bottom w:type="dxa" w:w="60"/>
+              <w:right w:type="dxa" w:w="100"/>
+            </w:tcMar>
+          </w:tcPr>
+          <w:p>
+            <w:r>
+              <w:rPr>
+                <w:color w:val="0A0A0A"/>
+                <w:sz w:val="18"/>
+                <w:szCs w:val="18"/>
+              </w:rPr>
+              <w:t xml:space="preserve">Barrier three: insurer and regulator. Feedback: insurance mechanism</w:t>
             </w:r>
           </w:p>
         </w:tc>
@@ -7671,7 +7837,7 @@
         </w:trPr>
         <w:tc>
           <w:tcPr>
-            <w:tcW w:type="dxa" w:w="892"/>
+            <w:tcW w:type="dxa" w:w="877"/>
             <w:tcBorders>
               <w:top w:val="single" w:color="C9C9C4" w:sz="4"/>
               <w:left w:val="single" w:color="C9C9C4" w:sz="4"/>
@@ -7698,82 +7864,109 @@
         </w:tc>
         <w:tc>
           <w:tcPr>
-            <w:tcW w:type="dxa" w:w="1249"/>
-            <w:tcBorders>
-              <w:top w:val="single" w:color="C9C9C4" w:sz="4"/>
-              <w:left w:val="single" w:color="C9C9C4" w:sz="4"/>
-              <w:bottom w:val="single" w:color="C9C9C4" w:sz="4"/>
-              <w:right w:val="single" w:color="C9C9C4" w:sz="4"/>
-            </w:tcBorders>
-            <w:tcMar>
-              <w:top w:type="dxa" w:w="60"/>
-              <w:left w:type="dxa" w:w="100"/>
-              <w:bottom w:type="dxa" w:w="60"/>
-              <w:right w:type="dxa" w:w="100"/>
-            </w:tcMar>
-          </w:tcPr>
-          <w:p>
-            <w:r>
-              <w:rPr>
-                <w:color w:val="0A0A0A"/>
-                <w:sz w:val="18"/>
-                <w:szCs w:val="18"/>
-              </w:rPr>
-              <w:t xml:space="preserve">Karina</w:t>
-            </w:r>
-          </w:p>
-        </w:tc>
-        <w:tc>
-          <w:tcPr>
-            <w:tcW w:type="dxa" w:w="6347"/>
-            <w:tcBorders>
-              <w:top w:val="single" w:color="C9C9C4" w:sz="4"/>
-              <w:left w:val="single" w:color="C9C9C4" w:sz="4"/>
-              <w:bottom w:val="single" w:color="C9C9C4" w:sz="4"/>
-              <w:right w:val="single" w:color="C9C9C4" w:sz="4"/>
-            </w:tcBorders>
-            <w:tcMar>
-              <w:top w:type="dxa" w:w="60"/>
-              <w:left w:type="dxa" w:w="100"/>
-              <w:bottom w:type="dxa" w:w="60"/>
-              <w:right w:type="dxa" w:w="100"/>
-            </w:tcMar>
-          </w:tcPr>
-          <w:p>
-            <w:r>
-              <w:rPr>
-                <w:color w:val="0A0A0A"/>
-                <w:sz w:val="18"/>
-                <w:szCs w:val="18"/>
-              </w:rPr>
-              <w:t xml:space="preserve">Next on the model: real rides from riders who opt in, and retraining on their own labels.</w:t>
-            </w:r>
-          </w:p>
-        </w:tc>
-        <w:tc>
-          <w:tcPr>
-            <w:tcW w:type="dxa" w:w="6350"/>
-            <w:tcBorders>
-              <w:top w:val="single" w:color="C9C9C4" w:sz="4"/>
-              <w:left w:val="single" w:color="C9C9C4" w:sz="4"/>
-              <w:bottom w:val="single" w:color="C9C9C4" w:sz="4"/>
-              <w:right w:val="single" w:color="C9C9C4" w:sz="4"/>
-            </w:tcBorders>
-            <w:tcMar>
-              <w:top w:type="dxa" w:w="60"/>
-              <w:left w:type="dxa" w:w="100"/>
-              <w:bottom w:type="dxa" w:w="60"/>
-              <w:right w:type="dxa" w:w="100"/>
-            </w:tcMar>
-          </w:tcPr>
-          <w:p>
-            <w:r>
-              <w:rPr>
-                <w:color w:val="0A0A0A"/>
-                <w:sz w:val="18"/>
-                <w:szCs w:val="18"/>
-              </w:rPr>
-              <w:t xml:space="preserve">Research mode toggle on /rider</w:t>
+            <w:tcW w:type="dxa" w:w="877"/>
+            <w:tcBorders>
+              <w:top w:val="single" w:color="C9C9C4" w:sz="4"/>
+              <w:left w:val="single" w:color="C9C9C4" w:sz="4"/>
+              <w:bottom w:val="single" w:color="C9C9C4" w:sz="4"/>
+              <w:right w:val="single" w:color="C9C9C4" w:sz="4"/>
+            </w:tcBorders>
+            <w:tcMar>
+              <w:top w:type="dxa" w:w="60"/>
+              <w:left w:type="dxa" w:w="100"/>
+              <w:bottom w:type="dxa" w:w="60"/>
+              <w:right w:type="dxa" w:w="100"/>
+            </w:tcMar>
+          </w:tcPr>
+          <w:p>
+            <w:r>
+              <w:rPr>
+                <w:color w:val="0A0A0A"/>
+                <w:sz w:val="18"/>
+                <w:szCs w:val="18"/>
+              </w:rPr>
+              <w:t xml:space="preserve">Alysa</w:t>
+            </w:r>
+          </w:p>
+        </w:tc>
+        <w:tc>
+          <w:tcPr>
+            <w:tcW w:type="dxa" w:w="4360"/>
+            <w:tcBorders>
+              <w:top w:val="single" w:color="C9C9C4" w:sz="4"/>
+              <w:left w:val="single" w:color="C9C9C4" w:sz="4"/>
+              <w:bottom w:val="single" w:color="C9C9C4" w:sz="4"/>
+              <w:right w:val="single" w:color="C9C9C4" w:sz="4"/>
+            </w:tcBorders>
+            <w:tcMar>
+              <w:top w:type="dxa" w:w="60"/>
+              <w:left w:type="dxa" w:w="100"/>
+              <w:bottom w:type="dxa" w:w="60"/>
+              <w:right w:type="dxa" w:w="100"/>
+            </w:tcMar>
+          </w:tcPr>
+          <w:p>
+            <w:r>
+              <w:rPr>
+                <w:color w:val="0A0A0A"/>
+                <w:sz w:val="18"/>
+                <w:szCs w:val="18"/>
+              </w:rPr>
+              <w:t xml:space="preserve">It adds to statutory compensation, never replaces it. Next, a licensed insurer takes us into the Insurance Authority's sandbox as its technology partner.</w:t>
+            </w:r>
+          </w:p>
+        </w:tc>
+        <w:tc>
+          <w:tcPr>
+            <w:tcW w:type="dxa" w:w="4360"/>
+            <w:tcBorders>
+              <w:top w:val="single" w:color="C9C9C4" w:sz="4"/>
+              <w:left w:val="single" w:color="C9C9C4" w:sz="4"/>
+              <w:bottom w:val="single" w:color="C9C9C4" w:sz="4"/>
+              <w:right w:val="single" w:color="C9C9C4" w:sz="4"/>
+            </w:tcBorders>
+            <w:tcMar>
+              <w:top w:type="dxa" w:w="60"/>
+              <w:left w:type="dxa" w:w="100"/>
+              <w:bottom w:type="dxa" w:w="60"/>
+              <w:right w:type="dxa" w:w="100"/>
+            </w:tcMar>
+          </w:tcPr>
+          <w:p>
+            <w:r>
+              <w:rPr>
+                <w:color w:val="0A0A0A"/>
+                <w:sz w:val="18"/>
+                <w:szCs w:val="18"/>
+              </w:rPr>
+              <w:t xml:space="preserve">"Tier one on top of statutory rights. Next: Insurtech Sandbox pilot."</w:t>
+            </w:r>
+          </w:p>
+        </w:tc>
+        <w:tc>
+          <w:tcPr>
+            <w:tcW w:type="dxa" w:w="4364"/>
+            <w:tcBorders>
+              <w:top w:val="single" w:color="C9C9C4" w:sz="4"/>
+              <w:left w:val="single" w:color="C9C9C4" w:sz="4"/>
+              <w:bottom w:val="single" w:color="C9C9C4" w:sz="4"/>
+              <w:right w:val="single" w:color="C9C9C4" w:sz="4"/>
+            </w:tcBorders>
+            <w:tcMar>
+              <w:top w:type="dxa" w:w="60"/>
+              <w:left w:type="dxa" w:w="100"/>
+              <w:bottom w:type="dxa" w:w="60"/>
+              <w:right w:type="dxa" w:w="100"/>
+            </w:tcMar>
+          </w:tcPr>
+          <w:p>
+            <w:r>
+              <w:rPr>
+                <w:color w:val="0A0A0A"/>
+                <w:sz w:val="18"/>
+                <w:szCs w:val="18"/>
+              </w:rPr>
+              <w:t xml:space="preserve">Feedback: Hong Kong regulatory framework</w:t>
             </w:r>
           </w:p>
         </w:tc>
@@ -7785,7 +7978,7 @@
         </w:trPr>
         <w:tc>
           <w:tcPr>
-            <w:tcW w:type="dxa" w:w="892"/>
+            <w:tcW w:type="dxa" w:w="877"/>
             <w:tcBorders>
               <w:top w:val="single" w:color="C9C9C4" w:sz="4"/>
               <w:left w:val="single" w:color="C9C9C4" w:sz="4"/>
@@ -7812,34 +8005,34 @@
         </w:tc>
         <w:tc>
           <w:tcPr>
-            <w:tcW w:type="dxa" w:w="1249"/>
-            <w:tcBorders>
-              <w:top w:val="single" w:color="C9C9C4" w:sz="4"/>
-              <w:left w:val="single" w:color="C9C9C4" w:sz="4"/>
-              <w:bottom w:val="single" w:color="C9C9C4" w:sz="4"/>
-              <w:right w:val="single" w:color="C9C9C4" w:sz="4"/>
-            </w:tcBorders>
-            <w:tcMar>
-              <w:top w:type="dxa" w:w="60"/>
-              <w:left w:type="dxa" w:w="100"/>
-              <w:bottom w:type="dxa" w:w="60"/>
-              <w:right w:type="dxa" w:w="100"/>
-            </w:tcMar>
-          </w:tcPr>
-          <w:p>
-            <w:r>
-              <w:rPr>
-                <w:color w:val="0A0A0A"/>
-                <w:sz w:val="18"/>
-                <w:szCs w:val="18"/>
-              </w:rPr>
-              <w:t xml:space="preserve">Alysa</w:t>
-            </w:r>
-          </w:p>
-        </w:tc>
-        <w:tc>
-          <w:tcPr>
-            <w:tcW w:type="dxa" w:w="6347"/>
+            <w:tcW w:type="dxa" w:w="877"/>
+            <w:tcBorders>
+              <w:top w:val="single" w:color="C9C9C4" w:sz="4"/>
+              <w:left w:val="single" w:color="C9C9C4" w:sz="4"/>
+              <w:bottom w:val="single" w:color="C9C9C4" w:sz="4"/>
+              <w:right w:val="single" w:color="C9C9C4" w:sz="4"/>
+            </w:tcBorders>
+            <w:tcMar>
+              <w:top w:type="dxa" w:w="60"/>
+              <w:left w:type="dxa" w:w="100"/>
+              <w:bottom w:type="dxa" w:w="60"/>
+              <w:right w:type="dxa" w:w="100"/>
+            </w:tcMar>
+          </w:tcPr>
+          <w:p>
+            <w:r>
+              <w:rPr>
+                <w:color w:val="0A0A0A"/>
+                <w:sz w:val="18"/>
+                <w:szCs w:val="18"/>
+              </w:rPr>
+              <w:t xml:space="preserve">Maalon</w:t>
+            </w:r>
+          </w:p>
+        </w:tc>
+        <w:tc>
+          <w:tcPr>
+            <w:tcW w:type="dxa" w:w="4360"/>
             <w:tcBorders>
               <w:top w:val="single" w:color="C9C9C4" w:sz="4"/>
               <w:left w:val="single" w:color="C9C9C4" w:sz="4"/>
@@ -7866,7 +8059,7 @@
         </w:tc>
         <w:tc>
           <w:tcPr>
-            <w:tcW w:type="dxa" w:w="6350"/>
+            <w:tcW w:type="dxa" w:w="4360"/>
             <w:tcBorders>
               <w:top w:val="single" w:color="C9C9C4" w:sz="4"/>
               <w:left w:val="single" w:color="C9C9C4" w:sz="4"/>
@@ -7888,6 +8081,33 @@
                 <w:szCs w:val="18"/>
               </w:rPr>
               <w:t xml:space="preserve">Map card: Hong Kong, Shenzhen, Singapore</w:t>
+            </w:r>
+          </w:p>
+        </w:tc>
+        <w:tc>
+          <w:tcPr>
+            <w:tcW w:type="dxa" w:w="4364"/>
+            <w:tcBorders>
+              <w:top w:val="single" w:color="C9C9C4" w:sz="4"/>
+              <w:left w:val="single" w:color="C9C9C4" w:sz="4"/>
+              <w:bottom w:val="single" w:color="C9C9C4" w:sz="4"/>
+              <w:right w:val="single" w:color="C9C9C4" w:sz="4"/>
+            </w:tcBorders>
+            <w:tcMar>
+              <w:top w:type="dxa" w:w="60"/>
+              <w:left w:type="dxa" w:w="100"/>
+              <w:bottom w:type="dxa" w:w="60"/>
+              <w:right w:type="dxa" w:w="100"/>
+            </w:tcMar>
+          </w:tcPr>
+          <w:p>
+            <w:r>
+              <w:rPr>
+                <w:color w:val="0A0A0A"/>
+                <w:sz w:val="18"/>
+                <w:szCs w:val="18"/>
+              </w:rPr>
+              <w:t xml:space="preserve">Vision and scale</w:t>
             </w:r>
           </w:p>
         </w:tc>
@@ -7903,7 +8123,7 @@
         <w:spacing w:after="120"/>
       </w:pPr>
       <w:r>
-        <w:t xml:space="preserve">About 115 words, 45 seconds.</w:t>
+        <w:t xml:space="preserve">About 170 words, 67 seconds. Lines 14 and 15 run about 10 seconds each; that is fine here.</w:t>
       </w:r>
     </w:p>
     <w:p>
@@ -7911,7 +8131,7 @@
         <w:pStyle w:val="Heading1"/>
       </w:pPr>
       <w:r>
-        <w:t xml:space="preserve">Part 7. End card (3:50 to 3:58)</w:t>
+        <w:t xml:space="preserve">Part 7. End card (4:12 to 4:20)</w:t>
       </w:r>
     </w:p>
     <w:p>
@@ -7991,8 +8211,8 @@
         </w:tblBorders>
       </w:tblPr>
       <w:tblGrid>
-        <w:gridCol w:w="6744"/>
-        <w:gridCol w:w="8094"/>
+        <w:gridCol w:w="7419"/>
+        <w:gridCol w:w="7419"/>
       </w:tblGrid>
       <w:tr>
         <w:trPr>
@@ -8001,7 +8221,7 @@
         </w:trPr>
         <w:tc>
           <w:tcPr>
-            <w:tcW w:type="dxa" w:w="6744"/>
+            <w:tcW w:type="dxa" w:w="7419"/>
             <w:tcBorders>
               <w:top w:val="single" w:color="C9C9C4" w:sz="4"/>
               <w:left w:val="single" w:color="C9C9C4" w:sz="4"/>
@@ -8031,7 +8251,7 @@
         </w:tc>
         <w:tc>
           <w:tcPr>
-            <w:tcW w:type="dxa" w:w="8094"/>
+            <w:tcW w:type="dxa" w:w="7419"/>
             <w:tcBorders>
               <w:top w:val="single" w:color="C9C9C4" w:sz="4"/>
               <w:left w:val="single" w:color="C9C9C4" w:sz="4"/>
@@ -8067,7 +8287,7 @@
         </w:trPr>
         <w:tc>
           <w:tcPr>
-            <w:tcW w:type="dxa" w:w="6744"/>
+            <w:tcW w:type="dxa" w:w="7419"/>
             <w:tcBorders>
               <w:top w:val="single" w:color="C9C9C4" w:sz="4"/>
               <w:left w:val="single" w:color="C9C9C4" w:sz="4"/>
@@ -8094,7 +8314,7 @@
         </w:tc>
         <w:tc>
           <w:tcPr>
-            <w:tcW w:type="dxa" w:w="8094"/>
+            <w:tcW w:type="dxa" w:w="7419"/>
             <w:tcBorders>
               <w:top w:val="single" w:color="C9C9C4" w:sz="4"/>
               <w:left w:val="single" w:color="C9C9C4" w:sz="4"/>
@@ -8127,7 +8347,7 @@
         </w:trPr>
         <w:tc>
           <w:tcPr>
-            <w:tcW w:type="dxa" w:w="6744"/>
+            <w:tcW w:type="dxa" w:w="7419"/>
             <w:tcBorders>
               <w:top w:val="single" w:color="C9C9C4" w:sz="4"/>
               <w:left w:val="single" w:color="C9C9C4" w:sz="4"/>
@@ -8154,7 +8374,7 @@
         </w:tc>
         <w:tc>
           <w:tcPr>
-            <w:tcW w:type="dxa" w:w="8094"/>
+            <w:tcW w:type="dxa" w:w="7419"/>
             <w:tcBorders>
               <w:top w:val="single" w:color="C9C9C4" w:sz="4"/>
               <w:left w:val="single" w:color="C9C9C4" w:sz="4"/>
@@ -8187,7 +8407,7 @@
         </w:trPr>
         <w:tc>
           <w:tcPr>
-            <w:tcW w:type="dxa" w:w="6744"/>
+            <w:tcW w:type="dxa" w:w="7419"/>
             <w:tcBorders>
               <w:top w:val="single" w:color="C9C9C4" w:sz="4"/>
               <w:left w:val="single" w:color="C9C9C4" w:sz="4"/>
@@ -8214,7 +8434,7 @@
         </w:tc>
         <w:tc>
           <w:tcPr>
-            <w:tcW w:type="dxa" w:w="8094"/>
+            <w:tcW w:type="dxa" w:w="7419"/>
             <w:tcBorders>
               <w:top w:val="single" w:color="C9C9C4" w:sz="4"/>
               <w:left w:val="single" w:color="C9C9C4" w:sz="4"/>
@@ -8247,7 +8467,7 @@
         </w:trPr>
         <w:tc>
           <w:tcPr>
-            <w:tcW w:type="dxa" w:w="6744"/>
+            <w:tcW w:type="dxa" w:w="7419"/>
             <w:tcBorders>
               <w:top w:val="single" w:color="C9C9C4" w:sz="4"/>
               <w:left w:val="single" w:color="C9C9C4" w:sz="4"/>
@@ -8274,7 +8494,7 @@
         </w:tc>
         <w:tc>
           <w:tcPr>
-            <w:tcW w:type="dxa" w:w="8094"/>
+            <w:tcW w:type="dxa" w:w="7419"/>
             <w:tcBorders>
               <w:top w:val="single" w:color="C9C9C4" w:sz="4"/>
               <w:left w:val="single" w:color="C9C9C4" w:sz="4"/>
@@ -8307,7 +8527,7 @@
         </w:trPr>
         <w:tc>
           <w:tcPr>
-            <w:tcW w:type="dxa" w:w="6744"/>
+            <w:tcW w:type="dxa" w:w="7419"/>
             <w:tcBorders>
               <w:top w:val="single" w:color="C9C9C4" w:sz="4"/>
               <w:left w:val="single" w:color="C9C9C4" w:sz="4"/>
@@ -8334,7 +8554,7 @@
         </w:tc>
         <w:tc>
           <w:tcPr>
-            <w:tcW w:type="dxa" w:w="8094"/>
+            <w:tcW w:type="dxa" w:w="7419"/>
             <w:tcBorders>
               <w:top w:val="single" w:color="C9C9C4" w:sz="4"/>
               <w:left w:val="single" w:color="C9C9C4" w:sz="4"/>
@@ -8367,7 +8587,7 @@
         </w:trPr>
         <w:tc>
           <w:tcPr>
-            <w:tcW w:type="dxa" w:w="6744"/>
+            <w:tcW w:type="dxa" w:w="7419"/>
             <w:tcBorders>
               <w:top w:val="single" w:color="C9C9C4" w:sz="4"/>
               <w:left w:val="single" w:color="C9C9C4" w:sz="4"/>
@@ -8394,7 +8614,7 @@
         </w:tc>
         <w:tc>
           <w:tcPr>
-            <w:tcW w:type="dxa" w:w="8094"/>
+            <w:tcW w:type="dxa" w:w="7419"/>
             <w:tcBorders>
               <w:top w:val="single" w:color="C9C9C4" w:sz="4"/>
               <w:left w:val="single" w:color="C9C9C4" w:sz="4"/>
@@ -8427,7 +8647,7 @@
         </w:trPr>
         <w:tc>
           <w:tcPr>
-            <w:tcW w:type="dxa" w:w="6744"/>
+            <w:tcW w:type="dxa" w:w="7419"/>
             <w:tcBorders>
               <w:top w:val="single" w:color="C9C9C4" w:sz="4"/>
               <w:left w:val="single" w:color="C9C9C4" w:sz="4"/>
@@ -8454,7 +8674,7 @@
         </w:tc>
         <w:tc>
           <w:tcPr>
-            <w:tcW w:type="dxa" w:w="8094"/>
+            <w:tcW w:type="dxa" w:w="7419"/>
             <w:tcBorders>
               <w:top w:val="single" w:color="C9C9C4" w:sz="4"/>
               <w:left w:val="single" w:color="C9C9C4" w:sz="4"/>
@@ -8487,7 +8707,7 @@
         </w:trPr>
         <w:tc>
           <w:tcPr>
-            <w:tcW w:type="dxa" w:w="6744"/>
+            <w:tcW w:type="dxa" w:w="7419"/>
             <w:tcBorders>
               <w:top w:val="single" w:color="C9C9C4" w:sz="4"/>
               <w:left w:val="single" w:color="C9C9C4" w:sz="4"/>
@@ -8514,7 +8734,7 @@
         </w:tc>
         <w:tc>
           <w:tcPr>
-            <w:tcW w:type="dxa" w:w="8094"/>
+            <w:tcW w:type="dxa" w:w="7419"/>
             <w:tcBorders>
               <w:top w:val="single" w:color="C9C9C4" w:sz="4"/>
               <w:left w:val="single" w:color="C9C9C4" w:sz="4"/>
@@ -8547,55 +8767,55 @@
         </w:trPr>
         <w:tc>
           <w:tcPr>
-            <w:tcW w:type="dxa" w:w="6744"/>
-            <w:tcBorders>
-              <w:top w:val="single" w:color="C9C9C4" w:sz="4"/>
-              <w:left w:val="single" w:color="C9C9C4" w:sz="4"/>
-              <w:bottom w:val="single" w:color="C9C9C4" w:sz="4"/>
-              <w:right w:val="single" w:color="C9C9C4" w:sz="4"/>
-            </w:tcBorders>
-            <w:tcMar>
-              <w:top w:type="dxa" w:w="60"/>
-              <w:left w:type="dxa" w:w="100"/>
-              <w:bottom w:type="dxa" w:w="60"/>
-              <w:right w:type="dxa" w:w="100"/>
-            </w:tcMar>
-          </w:tcPr>
-          <w:p>
-            <w:r>
-              <w:rPr>
-                <w:color w:val="0A0A0A"/>
-                <w:sz w:val="18"/>
-                <w:szCs w:val="18"/>
-              </w:rPr>
-              <w:t xml:space="preserve">Validation with uncertainty</w:t>
-            </w:r>
-          </w:p>
-        </w:tc>
-        <w:tc>
-          <w:tcPr>
-            <w:tcW w:type="dxa" w:w="8094"/>
-            <w:tcBorders>
-              <w:top w:val="single" w:color="C9C9C4" w:sz="4"/>
-              <w:left w:val="single" w:color="C9C9C4" w:sz="4"/>
-              <w:bottom w:val="single" w:color="C9C9C4" w:sz="4"/>
-              <w:right w:val="single" w:color="C9C9C4" w:sz="4"/>
-            </w:tcBorders>
-            <w:tcMar>
-              <w:top w:type="dxa" w:w="60"/>
-              <w:left w:type="dxa" w:w="100"/>
-              <w:bottom w:type="dxa" w:w="60"/>
-              <w:right w:type="dxa" w:w="100"/>
-            </w:tcMar>
-          </w:tcPr>
-          <w:p>
-            <w:r>
-              <w:rPr>
-                <w:color w:val="0A0A0A"/>
-                <w:sz w:val="18"/>
-                <w:szCs w:val="18"/>
-              </w:rPr>
-              <w:t xml:space="preserve">Part 4 (held-out people, 95% CIs, real riding hours); line 11</w:t>
+            <w:tcW w:type="dxa" w:w="7419"/>
+            <w:tcBorders>
+              <w:top w:val="single" w:color="C9C9C4" w:sz="4"/>
+              <w:left w:val="single" w:color="C9C9C4" w:sz="4"/>
+              <w:bottom w:val="single" w:color="C9C9C4" w:sz="4"/>
+              <w:right w:val="single" w:color="C9C9C4" w:sz="4"/>
+            </w:tcBorders>
+            <w:tcMar>
+              <w:top w:type="dxa" w:w="60"/>
+              <w:left w:type="dxa" w:w="100"/>
+              <w:bottom w:type="dxa" w:w="60"/>
+              <w:right w:type="dxa" w:w="100"/>
+            </w:tcMar>
+          </w:tcPr>
+          <w:p>
+            <w:r>
+              <w:rPr>
+                <w:color w:val="0A0A0A"/>
+                <w:sz w:val="18"/>
+                <w:szCs w:val="18"/>
+              </w:rPr>
+              <w:t xml:space="preserve">Imperial feedback: STEMB composition</w:t>
+            </w:r>
+          </w:p>
+        </w:tc>
+        <w:tc>
+          <w:tcPr>
+            <w:tcW w:type="dxa" w:w="7419"/>
+            <w:tcBorders>
+              <w:top w:val="single" w:color="C9C9C4" w:sz="4"/>
+              <w:left w:val="single" w:color="C9C9C4" w:sz="4"/>
+              <w:bottom w:val="single" w:color="C9C9C4" w:sz="4"/>
+              <w:right w:val="single" w:color="C9C9C4" w:sz="4"/>
+            </w:tcBorders>
+            <w:tcMar>
+              <w:top w:type="dxa" w:w="60"/>
+              <w:left w:type="dxa" w:w="100"/>
+              <w:bottom w:type="dxa" w:w="60"/>
+              <w:right w:type="dxa" w:w="100"/>
+            </w:tcMar>
+          </w:tcPr>
+          <w:p>
+            <w:r>
+              <w:rPr>
+                <w:color w:val="0A0A0A"/>
+                <w:sz w:val="18"/>
+                <w:szCs w:val="18"/>
+              </w:rPr>
+              <w:t xml:space="preserve">Line 9, end card with each name and pillar</w:t>
             </w:r>
           </w:p>
         </w:tc>
@@ -8607,55 +8827,55 @@
         </w:trPr>
         <w:tc>
           <w:tcPr>
-            <w:tcW w:type="dxa" w:w="6744"/>
-            <w:tcBorders>
-              <w:top w:val="single" w:color="C9C9C4" w:sz="4"/>
-              <w:left w:val="single" w:color="C9C9C4" w:sz="4"/>
-              <w:bottom w:val="single" w:color="C9C9C4" w:sz="4"/>
-              <w:right w:val="single" w:color="C9C9C4" w:sz="4"/>
-            </w:tcBorders>
-            <w:tcMar>
-              <w:top w:type="dxa" w:w="60"/>
-              <w:left w:type="dxa" w:w="100"/>
-              <w:bottom w:type="dxa" w:w="60"/>
-              <w:right w:type="dxa" w:w="100"/>
-            </w:tcMar>
-          </w:tcPr>
-          <w:p>
-            <w:r>
-              <w:rPr>
-                <w:color w:val="0A0A0A"/>
-                <w:sz w:val="18"/>
-                <w:szCs w:val="18"/>
-              </w:rPr>
-              <w:t xml:space="preserve">Regulatory pathway</w:t>
-            </w:r>
-          </w:p>
-        </w:tc>
-        <w:tc>
-          <w:tcPr>
-            <w:tcW w:type="dxa" w:w="8094"/>
-            <w:tcBorders>
-              <w:top w:val="single" w:color="C9C9C4" w:sz="4"/>
-              <w:left w:val="single" w:color="C9C9C4" w:sz="4"/>
-              <w:bottom w:val="single" w:color="C9C9C4" w:sz="4"/>
-              <w:right w:val="single" w:color="C9C9C4" w:sz="4"/>
-            </w:tcBorders>
-            <w:tcMar>
-              <w:top w:type="dxa" w:w="60"/>
-              <w:left w:type="dxa" w:w="100"/>
-              <w:bottom w:type="dxa" w:w="60"/>
-              <w:right w:type="dxa" w:w="100"/>
-            </w:tcMar>
-          </w:tcPr>
-          <w:p>
-            <w:r>
-              <w:rPr>
-                <w:color w:val="0A0A0A"/>
-                <w:sz w:val="18"/>
-                <w:szCs w:val="18"/>
-              </w:rPr>
-              <w:t xml:space="preserve">Part 3 (Labour and Welfare Bureau regime) and line 12; Insurance Authority sandbox and PDPO mapping in the Q&amp;A notes</w:t>
+            <w:tcW w:type="dxa" w:w="7419"/>
+            <w:tcBorders>
+              <w:top w:val="single" w:color="C9C9C4" w:sz="4"/>
+              <w:left w:val="single" w:color="C9C9C4" w:sz="4"/>
+              <w:bottom w:val="single" w:color="C9C9C4" w:sz="4"/>
+              <w:right w:val="single" w:color="C9C9C4" w:sz="4"/>
+            </w:tcBorders>
+            <w:tcMar>
+              <w:top w:type="dxa" w:w="60"/>
+              <w:left w:type="dxa" w:w="100"/>
+              <w:bottom w:type="dxa" w:w="60"/>
+              <w:right w:type="dxa" w:w="100"/>
+            </w:tcMar>
+          </w:tcPr>
+          <w:p>
+            <w:r>
+              <w:rPr>
+                <w:color w:val="0A0A0A"/>
+                <w:sz w:val="18"/>
+                <w:szCs w:val="18"/>
+              </w:rPr>
+              <w:t xml:space="preserve">Imperial feedback: prototype and drop test validation</w:t>
+            </w:r>
+          </w:p>
+        </w:tc>
+        <w:tc>
+          <w:tcPr>
+            <w:tcW w:type="dxa" w:w="7419"/>
+            <w:tcBorders>
+              <w:top w:val="single" w:color="C9C9C4" w:sz="4"/>
+              <w:left w:val="single" w:color="C9C9C4" w:sz="4"/>
+              <w:bottom w:val="single" w:color="C9C9C4" w:sz="4"/>
+              <w:right w:val="single" w:color="C9C9C4" w:sz="4"/>
+            </w:tcBorders>
+            <w:tcMar>
+              <w:top w:type="dxa" w:w="60"/>
+              <w:left w:type="dxa" w:w="100"/>
+              <w:bottom w:type="dxa" w:w="60"/>
+              <w:right w:type="dxa" w:w="100"/>
+            </w:tcMar>
+          </w:tcPr>
+          <w:p>
+            <w:r>
+              <w:rPr>
+                <w:color w:val="0A0A0A"/>
+                <w:sz w:val="18"/>
+                <w:szCs w:val="18"/>
+              </w:rPr>
+              <w:t xml:space="preserve">Part 4 live app; line 12 (drop tests before the final, live demo)</w:t>
             </w:r>
           </w:p>
         </w:tc>
@@ -8667,55 +8887,55 @@
         </w:trPr>
         <w:tc>
           <w:tcPr>
-            <w:tcW w:type="dxa" w:w="6744"/>
-            <w:tcBorders>
-              <w:top w:val="single" w:color="C9C9C4" w:sz="4"/>
-              <w:left w:val="single" w:color="C9C9C4" w:sz="4"/>
-              <w:bottom w:val="single" w:color="C9C9C4" w:sz="4"/>
-              <w:right w:val="single" w:color="C9C9C4" w:sz="4"/>
-            </w:tcBorders>
-            <w:tcMar>
-              <w:top w:type="dxa" w:w="60"/>
-              <w:left w:type="dxa" w:w="100"/>
-              <w:bottom w:type="dxa" w:w="60"/>
-              <w:right w:type="dxa" w:w="100"/>
-            </w:tcMar>
-          </w:tcPr>
-          <w:p>
-            <w:r>
-              <w:rPr>
-                <w:color w:val="0A0A0A"/>
-                <w:sz w:val="18"/>
-                <w:szCs w:val="18"/>
-              </w:rPr>
-              <w:t xml:space="preserve">Financial model</w:t>
-            </w:r>
-          </w:p>
-        </w:tc>
-        <w:tc>
-          <w:tcPr>
-            <w:tcW w:type="dxa" w:w="8094"/>
-            <w:tcBorders>
-              <w:top w:val="single" w:color="C9C9C4" w:sz="4"/>
-              <w:left w:val="single" w:color="C9C9C4" w:sz="4"/>
-              <w:bottom w:val="single" w:color="C9C9C4" w:sz="4"/>
-              <w:right w:val="single" w:color="C9C9C4" w:sz="4"/>
-            </w:tcBorders>
-            <w:tcMar>
-              <w:top w:type="dxa" w:w="60"/>
-              <w:left w:type="dxa" w:w="100"/>
-              <w:bottom w:type="dxa" w:w="60"/>
-              <w:right w:type="dxa" w:w="100"/>
-            </w:tcMar>
-          </w:tcPr>
-          <w:p>
-            <w:r>
-              <w:rPr>
-                <w:color w:val="0A0A0A"/>
-                <w:sz w:val="18"/>
-                <w:szCs w:val="18"/>
-              </w:rPr>
-              <w:t xml:space="preserve">Part 3 revenue card, labelled modelled</w:t>
+            <w:tcW w:type="dxa" w:w="7419"/>
+            <w:tcBorders>
+              <w:top w:val="single" w:color="C9C9C4" w:sz="4"/>
+              <w:left w:val="single" w:color="C9C9C4" w:sz="4"/>
+              <w:bottom w:val="single" w:color="C9C9C4" w:sz="4"/>
+              <w:right w:val="single" w:color="C9C9C4" w:sz="4"/>
+            </w:tcBorders>
+            <w:tcMar>
+              <w:top w:type="dxa" w:w="60"/>
+              <w:left w:type="dxa" w:w="100"/>
+              <w:bottom w:type="dxa" w:w="60"/>
+              <w:right w:type="dxa" w:w="100"/>
+            </w:tcMar>
+          </w:tcPr>
+          <w:p>
+            <w:r>
+              <w:rPr>
+                <w:color w:val="0A0A0A"/>
+                <w:sz w:val="18"/>
+                <w:szCs w:val="18"/>
+              </w:rPr>
+              <w:t xml:space="preserve">Imperial feedback: insurance mechanism and regulation</w:t>
+            </w:r>
+          </w:p>
+        </w:tc>
+        <w:tc>
+          <w:tcPr>
+            <w:tcW w:type="dxa" w:w="7419"/>
+            <w:tcBorders>
+              <w:top w:val="single" w:color="C9C9C4" w:sz="4"/>
+              <w:left w:val="single" w:color="C9C9C4" w:sz="4"/>
+              <w:bottom w:val="single" w:color="C9C9C4" w:sz="4"/>
+              <w:right w:val="single" w:color="C9C9C4" w:sz="4"/>
+            </w:tcBorders>
+            <w:tcMar>
+              <w:top w:type="dxa" w:w="60"/>
+              <w:left w:type="dxa" w:w="100"/>
+              <w:bottom w:type="dxa" w:w="60"/>
+              <w:right w:type="dxa" w:w="100"/>
+            </w:tcMar>
+          </w:tcPr>
+          <w:p>
+            <w:r>
+              <w:rPr>
+                <w:color w:val="0A0A0A"/>
+                <w:sz w:val="18"/>
+                <w:szCs w:val="18"/>
+              </w:rPr>
+              <w:t xml:space="preserve">Part 3; lines 14 and 15 (trigger, licensed insurer, on top of statutory rights, sandbox pilot)</w:t>
             </w:r>
           </w:p>
         </w:tc>
@@ -8727,55 +8947,55 @@
         </w:trPr>
         <w:tc>
           <w:tcPr>
-            <w:tcW w:type="dxa" w:w="6744"/>
-            <w:tcBorders>
-              <w:top w:val="single" w:color="C9C9C4" w:sz="4"/>
-              <w:left w:val="single" w:color="C9C9C4" w:sz="4"/>
-              <w:bottom w:val="single" w:color="C9C9C4" w:sz="4"/>
-              <w:right w:val="single" w:color="C9C9C4" w:sz="4"/>
-            </w:tcBorders>
-            <w:tcMar>
-              <w:top w:type="dxa" w:w="60"/>
-              <w:left w:type="dxa" w:w="100"/>
-              <w:bottom w:type="dxa" w:w="60"/>
-              <w:right w:type="dxa" w:w="100"/>
-            </w:tcMar>
-          </w:tcPr>
-          <w:p>
-            <w:r>
-              <w:rPr>
-                <w:color w:val="0A0A0A"/>
-                <w:sz w:val="18"/>
-                <w:szCs w:val="18"/>
-              </w:rPr>
-              <w:t xml:space="preserve">Stakeholders: government, industry, civil society</w:t>
-            </w:r>
-          </w:p>
-        </w:tc>
-        <w:tc>
-          <w:tcPr>
-            <w:tcW w:type="dxa" w:w="8094"/>
-            <w:tcBorders>
-              <w:top w:val="single" w:color="C9C9C4" w:sz="4"/>
-              <w:left w:val="single" w:color="C9C9C4" w:sz="4"/>
-              <w:bottom w:val="single" w:color="C9C9C4" w:sz="4"/>
-              <w:right w:val="single" w:color="C9C9C4" w:sz="4"/>
-            </w:tcBorders>
-            <w:tcMar>
-              <w:top w:type="dxa" w:w="60"/>
-              <w:left w:type="dxa" w:w="100"/>
-              <w:bottom w:type="dxa" w:w="60"/>
-              <w:right w:type="dxa" w:w="100"/>
-            </w:tcMar>
-          </w:tcPr>
-          <w:p>
-            <w:r>
-              <w:rPr>
-                <w:color w:val="0A0A0A"/>
-                <w:sz w:val="18"/>
-                <w:szCs w:val="18"/>
-              </w:rPr>
-              <w:t xml:space="preserve">Parts 3 and 4: platforms, insurers, dispatch, Labour Department; riders and unions in lines 1 and 13</w:t>
+            <w:tcW w:type="dxa" w:w="7419"/>
+            <w:tcBorders>
+              <w:top w:val="single" w:color="C9C9C4" w:sz="4"/>
+              <w:left w:val="single" w:color="C9C9C4" w:sz="4"/>
+              <w:bottom w:val="single" w:color="C9C9C4" w:sz="4"/>
+              <w:right w:val="single" w:color="C9C9C4" w:sz="4"/>
+            </w:tcBorders>
+            <w:tcMar>
+              <w:top w:type="dxa" w:w="60"/>
+              <w:left w:type="dxa" w:w="100"/>
+              <w:bottom w:type="dxa" w:w="60"/>
+              <w:right w:type="dxa" w:w="100"/>
+            </w:tcMar>
+          </w:tcPr>
+          <w:p>
+            <w:r>
+              <w:rPr>
+                <w:color w:val="0A0A0A"/>
+                <w:sz w:val="18"/>
+                <w:szCs w:val="18"/>
+              </w:rPr>
+              <w:t xml:space="preserve">Imperial feedback: consent, ownership, not used against workers</w:t>
+            </w:r>
+          </w:p>
+        </w:tc>
+        <w:tc>
+          <w:tcPr>
+            <w:tcW w:type="dxa" w:w="7419"/>
+            <w:tcBorders>
+              <w:top w:val="single" w:color="C9C9C4" w:sz="4"/>
+              <w:left w:val="single" w:color="C9C9C4" w:sz="4"/>
+              <w:bottom w:val="single" w:color="C9C9C4" w:sz="4"/>
+              <w:right w:val="single" w:color="C9C9C4" w:sz="4"/>
+            </w:tcBorders>
+            <w:tcMar>
+              <w:top w:type="dxa" w:w="60"/>
+              <w:left w:type="dxa" w:w="100"/>
+              <w:bottom w:type="dxa" w:w="60"/>
+              <w:right w:type="dxa" w:w="100"/>
+            </w:tcMar>
+          </w:tcPr>
+          <w:p>
+            <w:r>
+              <w:rPr>
+                <w:color w:val="0A0A0A"/>
+                <w:sz w:val="18"/>
+                <w:szCs w:val="18"/>
+              </w:rPr>
+              <w:t xml:space="preserve">Part 4 consent screen and labour view; line 13</w:t>
             </w:r>
           </w:p>
         </w:tc>
@@ -8787,55 +9007,55 @@
         </w:trPr>
         <w:tc>
           <w:tcPr>
-            <w:tcW w:type="dxa" w:w="6744"/>
-            <w:tcBorders>
-              <w:top w:val="single" w:color="C9C9C4" w:sz="4"/>
-              <w:left w:val="single" w:color="C9C9C4" w:sz="4"/>
-              <w:bottom w:val="single" w:color="C9C9C4" w:sz="4"/>
-              <w:right w:val="single" w:color="C9C9C4" w:sz="4"/>
-            </w:tcBorders>
-            <w:tcMar>
-              <w:top w:type="dxa" w:w="60"/>
-              <w:left w:type="dxa" w:w="100"/>
-              <w:bottom w:type="dxa" w:w="60"/>
-              <w:right w:type="dxa" w:w="100"/>
-            </w:tcMar>
-          </w:tcPr>
-          <w:p>
-            <w:r>
-              <w:rPr>
-                <w:color w:val="0A0A0A"/>
-                <w:sz w:val="18"/>
-                <w:szCs w:val="18"/>
-              </w:rPr>
-              <w:t xml:space="preserve">Risk register, top three barriers</w:t>
-            </w:r>
-          </w:p>
-        </w:tc>
-        <w:tc>
-          <w:tcPr>
-            <w:tcW w:type="dxa" w:w="8094"/>
-            <w:tcBorders>
-              <w:top w:val="single" w:color="C9C9C4" w:sz="4"/>
-              <w:left w:val="single" w:color="C9C9C4" w:sz="4"/>
-              <w:bottom w:val="single" w:color="C9C9C4" w:sz="4"/>
-              <w:right w:val="single" w:color="C9C9C4" w:sz="4"/>
-            </w:tcBorders>
-            <w:tcMar>
-              <w:top w:type="dxa" w:w="60"/>
-              <w:left w:type="dxa" w:w="100"/>
-              <w:bottom w:type="dxa" w:w="60"/>
-              <w:right w:type="dxa" w:w="100"/>
-            </w:tcMar>
-          </w:tcPr>
-          <w:p>
-            <w:r>
-              <w:rPr>
-                <w:color w:val="0A0A0A"/>
-                <w:sz w:val="18"/>
-                <w:szCs w:val="18"/>
-              </w:rPr>
-              <w:t xml:space="preserve">Lines 11, 12, 13</w:t>
+            <w:tcW w:type="dxa" w:w="7419"/>
+            <w:tcBorders>
+              <w:top w:val="single" w:color="C9C9C4" w:sz="4"/>
+              <w:left w:val="single" w:color="C9C9C4" w:sz="4"/>
+              <w:bottom w:val="single" w:color="C9C9C4" w:sz="4"/>
+              <w:right w:val="single" w:color="C9C9C4" w:sz="4"/>
+            </w:tcBorders>
+            <w:tcMar>
+              <w:top w:type="dxa" w:w="60"/>
+              <w:left w:type="dxa" w:w="100"/>
+              <w:bottom w:type="dxa" w:w="60"/>
+              <w:right w:type="dxa" w:w="100"/>
+            </w:tcMar>
+          </w:tcPr>
+          <w:p>
+            <w:r>
+              <w:rPr>
+                <w:color w:val="0A0A0A"/>
+                <w:sz w:val="18"/>
+                <w:szCs w:val="18"/>
+              </w:rPr>
+              <w:t xml:space="preserve">Validation with uncertainty</w:t>
+            </w:r>
+          </w:p>
+        </w:tc>
+        <w:tc>
+          <w:tcPr>
+            <w:tcW w:type="dxa" w:w="7419"/>
+            <w:tcBorders>
+              <w:top w:val="single" w:color="C9C9C4" w:sz="4"/>
+              <w:left w:val="single" w:color="C9C9C4" w:sz="4"/>
+              <w:bottom w:val="single" w:color="C9C9C4" w:sz="4"/>
+              <w:right w:val="single" w:color="C9C9C4" w:sz="4"/>
+            </w:tcBorders>
+            <w:tcMar>
+              <w:top w:type="dxa" w:w="60"/>
+              <w:left w:type="dxa" w:w="100"/>
+              <w:bottom w:type="dxa" w:w="60"/>
+              <w:right w:type="dxa" w:w="100"/>
+            </w:tcMar>
+          </w:tcPr>
+          <w:p>
+            <w:r>
+              <w:rPr>
+                <w:color w:val="0A0A0A"/>
+                <w:sz w:val="18"/>
+                <w:szCs w:val="18"/>
+              </w:rPr>
+              <w:t xml:space="preserve">Part 4 (held-out people, 95% CIs, real riding hours); line 11</w:t>
             </w:r>
           </w:p>
         </w:tc>
@@ -8847,55 +9067,55 @@
         </w:trPr>
         <w:tc>
           <w:tcPr>
-            <w:tcW w:type="dxa" w:w="6744"/>
-            <w:tcBorders>
-              <w:top w:val="single" w:color="C9C9C4" w:sz="4"/>
-              <w:left w:val="single" w:color="C9C9C4" w:sz="4"/>
-              <w:bottom w:val="single" w:color="C9C9C4" w:sz="4"/>
-              <w:right w:val="single" w:color="C9C9C4" w:sz="4"/>
-            </w:tcBorders>
-            <w:tcMar>
-              <w:top w:type="dxa" w:w="60"/>
-              <w:left w:type="dxa" w:w="100"/>
-              <w:bottom w:type="dxa" w:w="60"/>
-              <w:right w:type="dxa" w:w="100"/>
-            </w:tcMar>
-          </w:tcPr>
-          <w:p>
-            <w:r>
-              <w:rPr>
-                <w:color w:val="0A0A0A"/>
-                <w:sz w:val="18"/>
-                <w:szCs w:val="18"/>
-              </w:rPr>
-              <w:t xml:space="preserve">Ethics and dual use</w:t>
-            </w:r>
-          </w:p>
-        </w:tc>
-        <w:tc>
-          <w:tcPr>
-            <w:tcW w:type="dxa" w:w="8094"/>
-            <w:tcBorders>
-              <w:top w:val="single" w:color="C9C9C4" w:sz="4"/>
-              <w:left w:val="single" w:color="C9C9C4" w:sz="4"/>
-              <w:bottom w:val="single" w:color="C9C9C4" w:sz="4"/>
-              <w:right w:val="single" w:color="C9C9C4" w:sz="4"/>
-            </w:tcBorders>
-            <w:tcMar>
-              <w:top w:type="dxa" w:w="60"/>
-              <w:left w:type="dxa" w:w="100"/>
-              <w:bottom w:type="dxa" w:w="60"/>
-              <w:right w:type="dxa" w:w="100"/>
-            </w:tcMar>
-          </w:tcPr>
-          <w:p>
-            <w:r>
-              <w:rPr>
-                <w:color w:val="0A0A0A"/>
-                <w:sz w:val="18"/>
-                <w:szCs w:val="18"/>
-              </w:rPr>
-              <w:t xml:space="preserve">Line 13 and Part 4 labour view: no route history, no risk score, no platform surveillance</w:t>
+            <w:tcW w:type="dxa" w:w="7419"/>
+            <w:tcBorders>
+              <w:top w:val="single" w:color="C9C9C4" w:sz="4"/>
+              <w:left w:val="single" w:color="C9C9C4" w:sz="4"/>
+              <w:bottom w:val="single" w:color="C9C9C4" w:sz="4"/>
+              <w:right w:val="single" w:color="C9C9C4" w:sz="4"/>
+            </w:tcBorders>
+            <w:tcMar>
+              <w:top w:type="dxa" w:w="60"/>
+              <w:left w:type="dxa" w:w="100"/>
+              <w:bottom w:type="dxa" w:w="60"/>
+              <w:right w:type="dxa" w:w="100"/>
+            </w:tcMar>
+          </w:tcPr>
+          <w:p>
+            <w:r>
+              <w:rPr>
+                <w:color w:val="0A0A0A"/>
+                <w:sz w:val="18"/>
+                <w:szCs w:val="18"/>
+              </w:rPr>
+              <w:t xml:space="preserve">Regulatory pathway</w:t>
+            </w:r>
+          </w:p>
+        </w:tc>
+        <w:tc>
+          <w:tcPr>
+            <w:tcW w:type="dxa" w:w="7419"/>
+            <w:tcBorders>
+              <w:top w:val="single" w:color="C9C9C4" w:sz="4"/>
+              <w:left w:val="single" w:color="C9C9C4" w:sz="4"/>
+              <w:bottom w:val="single" w:color="C9C9C4" w:sz="4"/>
+              <w:right w:val="single" w:color="C9C9C4" w:sz="4"/>
+            </w:tcBorders>
+            <w:tcMar>
+              <w:top w:type="dxa" w:w="60"/>
+              <w:left w:type="dxa" w:w="100"/>
+              <w:bottom w:type="dxa" w:w="60"/>
+              <w:right w:type="dxa" w:w="100"/>
+            </w:tcMar>
+          </w:tcPr>
+          <w:p>
+            <w:r>
+              <w:rPr>
+                <w:color w:val="0A0A0A"/>
+                <w:sz w:val="18"/>
+                <w:szCs w:val="18"/>
+              </w:rPr>
+              <w:t xml:space="preserve">Part 3 (Labour and Welfare Bureau regime); lines 14 and 15 (licensed insurer, statutory rights kept, Insurance Authority sandbox)</w:t>
             </w:r>
           </w:p>
         </w:tc>
@@ -8907,55 +9127,55 @@
         </w:trPr>
         <w:tc>
           <w:tcPr>
-            <w:tcW w:type="dxa" w:w="6744"/>
-            <w:tcBorders>
-              <w:top w:val="single" w:color="C9C9C4" w:sz="4"/>
-              <w:left w:val="single" w:color="C9C9C4" w:sz="4"/>
-              <w:bottom w:val="single" w:color="C9C9C4" w:sz="4"/>
-              <w:right w:val="single" w:color="C9C9C4" w:sz="4"/>
-            </w:tcBorders>
-            <w:tcMar>
-              <w:top w:type="dxa" w:w="60"/>
-              <w:left w:type="dxa" w:w="100"/>
-              <w:bottom w:type="dxa" w:w="60"/>
-              <w:right w:type="dxa" w:w="100"/>
-            </w:tcMar>
-          </w:tcPr>
-          <w:p>
-            <w:r>
-              <w:rPr>
-                <w:color w:val="0A0A0A"/>
-                <w:sz w:val="18"/>
-                <w:szCs w:val="18"/>
-              </w:rPr>
-              <w:t xml:space="preserve">Conflicts of interest</w:t>
-            </w:r>
-          </w:p>
-        </w:tc>
-        <w:tc>
-          <w:tcPr>
-            <w:tcW w:type="dxa" w:w="8094"/>
-            <w:tcBorders>
-              <w:top w:val="single" w:color="C9C9C4" w:sz="4"/>
-              <w:left w:val="single" w:color="C9C9C4" w:sz="4"/>
-              <w:bottom w:val="single" w:color="C9C9C4" w:sz="4"/>
-              <w:right w:val="single" w:color="C9C9C4" w:sz="4"/>
-            </w:tcBorders>
-            <w:tcMar>
-              <w:top w:type="dxa" w:w="60"/>
-              <w:left w:type="dxa" w:w="100"/>
-              <w:bottom w:type="dxa" w:w="60"/>
-              <w:right w:type="dxa" w:w="100"/>
-            </w:tcMar>
-          </w:tcPr>
-          <w:p>
-            <w:r>
-              <w:rPr>
-                <w:color w:val="0A0A0A"/>
-                <w:sz w:val="18"/>
-                <w:szCs w:val="18"/>
-              </w:rPr>
-              <w:t xml:space="preserve">Part 3: "We are not the insurer"</w:t>
+            <w:tcW w:type="dxa" w:w="7419"/>
+            <w:tcBorders>
+              <w:top w:val="single" w:color="C9C9C4" w:sz="4"/>
+              <w:left w:val="single" w:color="C9C9C4" w:sz="4"/>
+              <w:bottom w:val="single" w:color="C9C9C4" w:sz="4"/>
+              <w:right w:val="single" w:color="C9C9C4" w:sz="4"/>
+            </w:tcBorders>
+            <w:tcMar>
+              <w:top w:type="dxa" w:w="60"/>
+              <w:left w:type="dxa" w:w="100"/>
+              <w:bottom w:type="dxa" w:w="60"/>
+              <w:right w:type="dxa" w:w="100"/>
+            </w:tcMar>
+          </w:tcPr>
+          <w:p>
+            <w:r>
+              <w:rPr>
+                <w:color w:val="0A0A0A"/>
+                <w:sz w:val="18"/>
+                <w:szCs w:val="18"/>
+              </w:rPr>
+              <w:t xml:space="preserve">Financial model</w:t>
+            </w:r>
+          </w:p>
+        </w:tc>
+        <w:tc>
+          <w:tcPr>
+            <w:tcW w:type="dxa" w:w="7419"/>
+            <w:tcBorders>
+              <w:top w:val="single" w:color="C9C9C4" w:sz="4"/>
+              <w:left w:val="single" w:color="C9C9C4" w:sz="4"/>
+              <w:bottom w:val="single" w:color="C9C9C4" w:sz="4"/>
+              <w:right w:val="single" w:color="C9C9C4" w:sz="4"/>
+            </w:tcBorders>
+            <w:tcMar>
+              <w:top w:type="dxa" w:w="60"/>
+              <w:left w:type="dxa" w:w="100"/>
+              <w:bottom w:type="dxa" w:w="60"/>
+              <w:right w:type="dxa" w:w="100"/>
+            </w:tcMar>
+          </w:tcPr>
+          <w:p>
+            <w:r>
+              <w:rPr>
+                <w:color w:val="0A0A0A"/>
+                <w:sz w:val="18"/>
+                <w:szCs w:val="18"/>
+              </w:rPr>
+              <w:t xml:space="preserve">Part 3 revenue card, labelled modelled</w:t>
             </w:r>
           </w:p>
         </w:tc>
@@ -8967,55 +9187,55 @@
         </w:trPr>
         <w:tc>
           <w:tcPr>
-            <w:tcW w:type="dxa" w:w="6744"/>
-            <w:tcBorders>
-              <w:top w:val="single" w:color="C9C9C4" w:sz="4"/>
-              <w:left w:val="single" w:color="C9C9C4" w:sz="4"/>
-              <w:bottom w:val="single" w:color="C9C9C4" w:sz="4"/>
-              <w:right w:val="single" w:color="C9C9C4" w:sz="4"/>
-            </w:tcBorders>
-            <w:tcMar>
-              <w:top w:type="dxa" w:w="60"/>
-              <w:left w:type="dxa" w:w="100"/>
-              <w:bottom w:type="dxa" w:w="60"/>
-              <w:right w:type="dxa" w:w="100"/>
-            </w:tcMar>
-          </w:tcPr>
-          <w:p>
-            <w:r>
-              <w:rPr>
-                <w:color w:val="0A0A0A"/>
-                <w:sz w:val="18"/>
-                <w:szCs w:val="18"/>
-              </w:rPr>
-              <w:t xml:space="preserve">STEMB integration and teamwork</w:t>
-            </w:r>
-          </w:p>
-        </w:tc>
-        <w:tc>
-          <w:tcPr>
-            <w:tcW w:type="dxa" w:w="8094"/>
-            <w:tcBorders>
-              <w:top w:val="single" w:color="C9C9C4" w:sz="4"/>
-              <w:left w:val="single" w:color="C9C9C4" w:sz="4"/>
-              <w:bottom w:val="single" w:color="C9C9C4" w:sz="4"/>
-              <w:right w:val="single" w:color="C9C9C4" w:sz="4"/>
-            </w:tcBorders>
-            <w:tcMar>
-              <w:top w:type="dxa" w:w="60"/>
-              <w:left w:type="dxa" w:w="100"/>
-              <w:bottom w:type="dxa" w:w="60"/>
-              <w:right w:type="dxa" w:w="100"/>
-            </w:tcMar>
-          </w:tcPr>
-          <w:p>
-            <w:r>
-              <w:rPr>
-                <w:color w:val="0A0A0A"/>
-                <w:sz w:val="18"/>
-                <w:szCs w:val="18"/>
-              </w:rPr>
-              <w:t xml:space="preserve">Line 9; every member speaks at least twice; end card</w:t>
+            <w:tcW w:type="dxa" w:w="7419"/>
+            <w:tcBorders>
+              <w:top w:val="single" w:color="C9C9C4" w:sz="4"/>
+              <w:left w:val="single" w:color="C9C9C4" w:sz="4"/>
+              <w:bottom w:val="single" w:color="C9C9C4" w:sz="4"/>
+              <w:right w:val="single" w:color="C9C9C4" w:sz="4"/>
+            </w:tcBorders>
+            <w:tcMar>
+              <w:top w:type="dxa" w:w="60"/>
+              <w:left w:type="dxa" w:w="100"/>
+              <w:bottom w:type="dxa" w:w="60"/>
+              <w:right w:type="dxa" w:w="100"/>
+            </w:tcMar>
+          </w:tcPr>
+          <w:p>
+            <w:r>
+              <w:rPr>
+                <w:color w:val="0A0A0A"/>
+                <w:sz w:val="18"/>
+                <w:szCs w:val="18"/>
+              </w:rPr>
+              <w:t xml:space="preserve">Stakeholders: government, industry, civil society</w:t>
+            </w:r>
+          </w:p>
+        </w:tc>
+        <w:tc>
+          <w:tcPr>
+            <w:tcW w:type="dxa" w:w="7419"/>
+            <w:tcBorders>
+              <w:top w:val="single" w:color="C9C9C4" w:sz="4"/>
+              <w:left w:val="single" w:color="C9C9C4" w:sz="4"/>
+              <w:bottom w:val="single" w:color="C9C9C4" w:sz="4"/>
+              <w:right w:val="single" w:color="C9C9C4" w:sz="4"/>
+            </w:tcBorders>
+            <w:tcMar>
+              <w:top w:type="dxa" w:w="60"/>
+              <w:left w:type="dxa" w:w="100"/>
+              <w:bottom w:type="dxa" w:w="60"/>
+              <w:right w:type="dxa" w:w="100"/>
+            </w:tcMar>
+          </w:tcPr>
+          <w:p>
+            <w:r>
+              <w:rPr>
+                <w:color w:val="0A0A0A"/>
+                <w:sz w:val="18"/>
+                <w:szCs w:val="18"/>
+              </w:rPr>
+              <w:t xml:space="preserve">Parts 3 and 4: platforms, insurers, dispatch, Labour Department; riders and unions in lines 1 and 13</w:t>
             </w:r>
           </w:p>
         </w:tc>
@@ -9027,7 +9247,247 @@
         </w:trPr>
         <w:tc>
           <w:tcPr>
-            <w:tcW w:type="dxa" w:w="6744"/>
+            <w:tcW w:type="dxa" w:w="7419"/>
+            <w:tcBorders>
+              <w:top w:val="single" w:color="C9C9C4" w:sz="4"/>
+              <w:left w:val="single" w:color="C9C9C4" w:sz="4"/>
+              <w:bottom w:val="single" w:color="C9C9C4" w:sz="4"/>
+              <w:right w:val="single" w:color="C9C9C4" w:sz="4"/>
+            </w:tcBorders>
+            <w:tcMar>
+              <w:top w:type="dxa" w:w="60"/>
+              <w:left w:type="dxa" w:w="100"/>
+              <w:bottom w:type="dxa" w:w="60"/>
+              <w:right w:type="dxa" w:w="100"/>
+            </w:tcMar>
+          </w:tcPr>
+          <w:p>
+            <w:r>
+              <w:rPr>
+                <w:color w:val="0A0A0A"/>
+                <w:sz w:val="18"/>
+                <w:szCs w:val="18"/>
+              </w:rPr>
+              <w:t xml:space="preserve">Risk register, top three barriers</w:t>
+            </w:r>
+          </w:p>
+        </w:tc>
+        <w:tc>
+          <w:tcPr>
+            <w:tcW w:type="dxa" w:w="7419"/>
+            <w:tcBorders>
+              <w:top w:val="single" w:color="C9C9C4" w:sz="4"/>
+              <w:left w:val="single" w:color="C9C9C4" w:sz="4"/>
+              <w:bottom w:val="single" w:color="C9C9C4" w:sz="4"/>
+              <w:right w:val="single" w:color="C9C9C4" w:sz="4"/>
+            </w:tcBorders>
+            <w:tcMar>
+              <w:top w:type="dxa" w:w="60"/>
+              <w:left w:type="dxa" w:w="100"/>
+              <w:bottom w:type="dxa" w:w="60"/>
+              <w:right w:type="dxa" w:w="100"/>
+            </w:tcMar>
+          </w:tcPr>
+          <w:p>
+            <w:r>
+              <w:rPr>
+                <w:color w:val="0A0A0A"/>
+                <w:sz w:val="18"/>
+                <w:szCs w:val="18"/>
+              </w:rPr>
+              <w:t xml:space="preserve">Line 11 (accuracy), line 13 (rider trust), lines 14 and 15 (insurer and regulator)</w:t>
+            </w:r>
+          </w:p>
+        </w:tc>
+      </w:tr>
+      <w:tr>
+        <w:trPr>
+          <w:cantSplit/>
+          <w:tblHeader w:val="off"/>
+        </w:trPr>
+        <w:tc>
+          <w:tcPr>
+            <w:tcW w:type="dxa" w:w="7419"/>
+            <w:tcBorders>
+              <w:top w:val="single" w:color="C9C9C4" w:sz="4"/>
+              <w:left w:val="single" w:color="C9C9C4" w:sz="4"/>
+              <w:bottom w:val="single" w:color="C9C9C4" w:sz="4"/>
+              <w:right w:val="single" w:color="C9C9C4" w:sz="4"/>
+            </w:tcBorders>
+            <w:tcMar>
+              <w:top w:type="dxa" w:w="60"/>
+              <w:left w:type="dxa" w:w="100"/>
+              <w:bottom w:type="dxa" w:w="60"/>
+              <w:right w:type="dxa" w:w="100"/>
+            </w:tcMar>
+          </w:tcPr>
+          <w:p>
+            <w:r>
+              <w:rPr>
+                <w:color w:val="0A0A0A"/>
+                <w:sz w:val="18"/>
+                <w:szCs w:val="18"/>
+              </w:rPr>
+              <w:t xml:space="preserve">Ethics and dual use</w:t>
+            </w:r>
+          </w:p>
+        </w:tc>
+        <w:tc>
+          <w:tcPr>
+            <w:tcW w:type="dxa" w:w="7419"/>
+            <w:tcBorders>
+              <w:top w:val="single" w:color="C9C9C4" w:sz="4"/>
+              <w:left w:val="single" w:color="C9C9C4" w:sz="4"/>
+              <w:bottom w:val="single" w:color="C9C9C4" w:sz="4"/>
+              <w:right w:val="single" w:color="C9C9C4" w:sz="4"/>
+            </w:tcBorders>
+            <w:tcMar>
+              <w:top w:type="dxa" w:w="60"/>
+              <w:left w:type="dxa" w:w="100"/>
+              <w:bottom w:type="dxa" w:w="60"/>
+              <w:right w:type="dxa" w:w="100"/>
+            </w:tcMar>
+          </w:tcPr>
+          <w:p>
+            <w:r>
+              <w:rPr>
+                <w:color w:val="0A0A0A"/>
+                <w:sz w:val="18"/>
+                <w:szCs w:val="18"/>
+              </w:rPr>
+              <w:t xml:space="preserve">Line 13 and Part 4 labour view: no route history, no risk score, no platform surveillance</w:t>
+            </w:r>
+          </w:p>
+        </w:tc>
+      </w:tr>
+      <w:tr>
+        <w:trPr>
+          <w:cantSplit/>
+          <w:tblHeader w:val="off"/>
+        </w:trPr>
+        <w:tc>
+          <w:tcPr>
+            <w:tcW w:type="dxa" w:w="7419"/>
+            <w:tcBorders>
+              <w:top w:val="single" w:color="C9C9C4" w:sz="4"/>
+              <w:left w:val="single" w:color="C9C9C4" w:sz="4"/>
+              <w:bottom w:val="single" w:color="C9C9C4" w:sz="4"/>
+              <w:right w:val="single" w:color="C9C9C4" w:sz="4"/>
+            </w:tcBorders>
+            <w:tcMar>
+              <w:top w:type="dxa" w:w="60"/>
+              <w:left w:type="dxa" w:w="100"/>
+              <w:bottom w:type="dxa" w:w="60"/>
+              <w:right w:type="dxa" w:w="100"/>
+            </w:tcMar>
+          </w:tcPr>
+          <w:p>
+            <w:r>
+              <w:rPr>
+                <w:color w:val="0A0A0A"/>
+                <w:sz w:val="18"/>
+                <w:szCs w:val="18"/>
+              </w:rPr>
+              <w:t xml:space="preserve">Conflicts of interest</w:t>
+            </w:r>
+          </w:p>
+        </w:tc>
+        <w:tc>
+          <w:tcPr>
+            <w:tcW w:type="dxa" w:w="7419"/>
+            <w:tcBorders>
+              <w:top w:val="single" w:color="C9C9C4" w:sz="4"/>
+              <w:left w:val="single" w:color="C9C9C4" w:sz="4"/>
+              <w:bottom w:val="single" w:color="C9C9C4" w:sz="4"/>
+              <w:right w:val="single" w:color="C9C9C4" w:sz="4"/>
+            </w:tcBorders>
+            <w:tcMar>
+              <w:top w:type="dxa" w:w="60"/>
+              <w:left w:type="dxa" w:w="100"/>
+              <w:bottom w:type="dxa" w:w="60"/>
+              <w:right w:type="dxa" w:w="100"/>
+            </w:tcMar>
+          </w:tcPr>
+          <w:p>
+            <w:r>
+              <w:rPr>
+                <w:color w:val="0A0A0A"/>
+                <w:sz w:val="18"/>
+                <w:szCs w:val="18"/>
+              </w:rPr>
+              <w:t xml:space="preserve">Part 3: "We are not the insurer"</w:t>
+            </w:r>
+          </w:p>
+        </w:tc>
+      </w:tr>
+      <w:tr>
+        <w:trPr>
+          <w:cantSplit/>
+          <w:tblHeader w:val="off"/>
+        </w:trPr>
+        <w:tc>
+          <w:tcPr>
+            <w:tcW w:type="dxa" w:w="7419"/>
+            <w:tcBorders>
+              <w:top w:val="single" w:color="C9C9C4" w:sz="4"/>
+              <w:left w:val="single" w:color="C9C9C4" w:sz="4"/>
+              <w:bottom w:val="single" w:color="C9C9C4" w:sz="4"/>
+              <w:right w:val="single" w:color="C9C9C4" w:sz="4"/>
+            </w:tcBorders>
+            <w:tcMar>
+              <w:top w:type="dxa" w:w="60"/>
+              <w:left w:type="dxa" w:w="100"/>
+              <w:bottom w:type="dxa" w:w="60"/>
+              <w:right w:type="dxa" w:w="100"/>
+            </w:tcMar>
+          </w:tcPr>
+          <w:p>
+            <w:r>
+              <w:rPr>
+                <w:color w:val="0A0A0A"/>
+                <w:sz w:val="18"/>
+                <w:szCs w:val="18"/>
+              </w:rPr>
+              <w:t xml:space="preserve">STEMB integration and teamwork</w:t>
+            </w:r>
+          </w:p>
+        </w:tc>
+        <w:tc>
+          <w:tcPr>
+            <w:tcW w:type="dxa" w:w="7419"/>
+            <w:tcBorders>
+              <w:top w:val="single" w:color="C9C9C4" w:sz="4"/>
+              <w:left w:val="single" w:color="C9C9C4" w:sz="4"/>
+              <w:bottom w:val="single" w:color="C9C9C4" w:sz="4"/>
+              <w:right w:val="single" w:color="C9C9C4" w:sz="4"/>
+            </w:tcBorders>
+            <w:tcMar>
+              <w:top w:type="dxa" w:w="60"/>
+              <w:left w:type="dxa" w:w="100"/>
+              <w:bottom w:type="dxa" w:w="60"/>
+              <w:right w:type="dxa" w:w="100"/>
+            </w:tcMar>
+          </w:tcPr>
+          <w:p>
+            <w:r>
+              <w:rPr>
+                <w:color w:val="0A0A0A"/>
+                <w:sz w:val="18"/>
+                <w:szCs w:val="18"/>
+              </w:rPr>
+              <w:t xml:space="preserve">Line 9; every member speaks at least twice; end card</w:t>
+            </w:r>
+          </w:p>
+        </w:tc>
+      </w:tr>
+      <w:tr>
+        <w:trPr>
+          <w:cantSplit/>
+          <w:tblHeader w:val="off"/>
+        </w:trPr>
+        <w:tc>
+          <w:tcPr>
+            <w:tcW w:type="dxa" w:w="7419"/>
             <w:tcBorders>
               <w:top w:val="single" w:color="C9C9C4" w:sz="4"/>
               <w:left w:val="single" w:color="C9C9C4" w:sz="4"/>
@@ -9054,28 +9514,28 @@
         </w:tc>
         <w:tc>
           <w:tcPr>
-            <w:tcW w:type="dxa" w:w="8094"/>
-            <w:tcBorders>
-              <w:top w:val="single" w:color="C9C9C4" w:sz="4"/>
-              <w:left w:val="single" w:color="C9C9C4" w:sz="4"/>
-              <w:bottom w:val="single" w:color="C9C9C4" w:sz="4"/>
-              <w:right w:val="single" w:color="C9C9C4" w:sz="4"/>
-            </w:tcBorders>
-            <w:tcMar>
-              <w:top w:type="dxa" w:w="60"/>
-              <w:left w:type="dxa" w:w="100"/>
-              <w:bottom w:type="dxa" w:w="60"/>
-              <w:right w:type="dxa" w:w="100"/>
-            </w:tcMar>
-          </w:tcPr>
-          <w:p>
-            <w:r>
-              <w:rPr>
-                <w:color w:val="0A0A0A"/>
-                <w:sz w:val="18"/>
-                <w:szCs w:val="18"/>
-              </w:rPr>
-              <w:t xml:space="preserve">Lines 14 to 16</w:t>
+            <w:tcW w:type="dxa" w:w="7419"/>
+            <w:tcBorders>
+              <w:top w:val="single" w:color="C9C9C4" w:sz="4"/>
+              <w:left w:val="single" w:color="C9C9C4" w:sz="4"/>
+              <w:bottom w:val="single" w:color="C9C9C4" w:sz="4"/>
+              <w:right w:val="single" w:color="C9C9C4" w:sz="4"/>
+            </w:tcBorders>
+            <w:tcMar>
+              <w:top w:type="dxa" w:w="60"/>
+              <w:left w:type="dxa" w:w="100"/>
+              <w:bottom w:type="dxa" w:w="60"/>
+              <w:right w:type="dxa" w:w="100"/>
+            </w:tcMar>
+          </w:tcPr>
+          <w:p>
+            <w:r>
+              <w:rPr>
+                <w:color w:val="0A0A0A"/>
+                <w:sz w:val="18"/>
+                <w:szCs w:val="18"/>
+              </w:rPr>
+              <w:t xml:space="preserve">Line 16</w:t>
             </w:r>
           </w:p>
         </w:tc>
@@ -9115,9 +9575,9 @@
         </w:tblBorders>
       </w:tblPr>
       <w:tblGrid>
-        <w:gridCol w:w="1483"/>
-        <w:gridCol w:w="5821"/>
-        <w:gridCol w:w="7534"/>
+        <w:gridCol w:w="1506"/>
+        <w:gridCol w:w="5912"/>
+        <w:gridCol w:w="7420"/>
       </w:tblGrid>
       <w:tr>
         <w:trPr>
@@ -9126,7 +9586,7 @@
         </w:trPr>
         <w:tc>
           <w:tcPr>
-            <w:tcW w:type="dxa" w:w="1483"/>
+            <w:tcW w:type="dxa" w:w="1506"/>
             <w:tcBorders>
               <w:top w:val="single" w:color="C9C9C4" w:sz="4"/>
               <w:left w:val="single" w:color="C9C9C4" w:sz="4"/>
@@ -9156,7 +9616,7 @@
         </w:tc>
         <w:tc>
           <w:tcPr>
-            <w:tcW w:type="dxa" w:w="5821"/>
+            <w:tcW w:type="dxa" w:w="5912"/>
             <w:tcBorders>
               <w:top w:val="single" w:color="C9C9C4" w:sz="4"/>
               <w:left w:val="single" w:color="C9C9C4" w:sz="4"/>
@@ -9186,7 +9646,7 @@
         </w:tc>
         <w:tc>
           <w:tcPr>
-            <w:tcW w:type="dxa" w:w="7534"/>
+            <w:tcW w:type="dxa" w:w="7420"/>
             <w:tcBorders>
               <w:top w:val="single" w:color="C9C9C4" w:sz="4"/>
               <w:left w:val="single" w:color="C9C9C4" w:sz="4"/>
@@ -9222,7 +9682,7 @@
         </w:trPr>
         <w:tc>
           <w:tcPr>
-            <w:tcW w:type="dxa" w:w="1483"/>
+            <w:tcW w:type="dxa" w:w="1506"/>
             <w:tcBorders>
               <w:top w:val="single" w:color="C9C9C4" w:sz="4"/>
               <w:left w:val="single" w:color="C9C9C4" w:sz="4"/>
@@ -9249,55 +9709,55 @@
         </w:tc>
         <w:tc>
           <w:tcPr>
-            <w:tcW w:type="dxa" w:w="5821"/>
-            <w:tcBorders>
-              <w:top w:val="single" w:color="C9C9C4" w:sz="4"/>
-              <w:left w:val="single" w:color="C9C9C4" w:sz="4"/>
-              <w:bottom w:val="single" w:color="C9C9C4" w:sz="4"/>
-              <w:right w:val="single" w:color="C9C9C4" w:sz="4"/>
-            </w:tcBorders>
-            <w:tcMar>
-              <w:top w:type="dxa" w:w="60"/>
-              <w:left w:type="dxa" w:w="100"/>
-              <w:bottom w:type="dxa" w:w="60"/>
-              <w:right w:type="dxa" w:w="100"/>
-            </w:tcMar>
-          </w:tcPr>
-          <w:p>
-            <w:r>
-              <w:rPr>
-                <w:color w:val="0A0A0A"/>
-                <w:sz w:val="18"/>
-                <w:szCs w:val="18"/>
-              </w:rPr>
-              <w:t xml:space="preserve">Business: law, market, money</w:t>
-            </w:r>
-          </w:p>
-        </w:tc>
-        <w:tc>
-          <w:tcPr>
-            <w:tcW w:type="dxa" w:w="7534"/>
-            <w:tcBorders>
-              <w:top w:val="single" w:color="C9C9C4" w:sz="4"/>
-              <w:left w:val="single" w:color="C9C9C4" w:sz="4"/>
-              <w:bottom w:val="single" w:color="C9C9C4" w:sz="4"/>
-              <w:right w:val="single" w:color="C9C9C4" w:sz="4"/>
-            </w:tcBorders>
-            <w:tcMar>
-              <w:top w:type="dxa" w:w="60"/>
-              <w:left w:type="dxa" w:w="100"/>
-              <w:bottom w:type="dxa" w:w="60"/>
-              <w:right w:type="dxa" w:w="100"/>
-            </w:tcMar>
-          </w:tcPr>
-          <w:p>
-            <w:r>
-              <w:rPr>
-                <w:color w:val="0A0A0A"/>
-                <w:sz w:val="18"/>
-                <w:szCs w:val="18"/>
-              </w:rPr>
-              <w:t xml:space="preserve">2, 8, Part 3, Part 5 (twice), 12, 16</w:t>
+            <w:tcW w:type="dxa" w:w="5912"/>
+            <w:tcBorders>
+              <w:top w:val="single" w:color="C9C9C4" w:sz="4"/>
+              <w:left w:val="single" w:color="C9C9C4" w:sz="4"/>
+              <w:bottom w:val="single" w:color="C9C9C4" w:sz="4"/>
+              <w:right w:val="single" w:color="C9C9C4" w:sz="4"/>
+            </w:tcBorders>
+            <w:tcMar>
+              <w:top w:type="dxa" w:w="60"/>
+              <w:left w:type="dxa" w:w="100"/>
+              <w:bottom w:type="dxa" w:w="60"/>
+              <w:right w:type="dxa" w:w="100"/>
+            </w:tcMar>
+          </w:tcPr>
+          <w:p>
+            <w:r>
+              <w:rPr>
+                <w:color w:val="0A0A0A"/>
+                <w:sz w:val="18"/>
+                <w:szCs w:val="18"/>
+              </w:rPr>
+              <w:t xml:space="preserve">Business: law, market, money, insurance</w:t>
+            </w:r>
+          </w:p>
+        </w:tc>
+        <w:tc>
+          <w:tcPr>
+            <w:tcW w:type="dxa" w:w="7420"/>
+            <w:tcBorders>
+              <w:top w:val="single" w:color="C9C9C4" w:sz="4"/>
+              <w:left w:val="single" w:color="C9C9C4" w:sz="4"/>
+              <w:bottom w:val="single" w:color="C9C9C4" w:sz="4"/>
+              <w:right w:val="single" w:color="C9C9C4" w:sz="4"/>
+            </w:tcBorders>
+            <w:tcMar>
+              <w:top w:type="dxa" w:w="60"/>
+              <w:left w:type="dxa" w:w="100"/>
+              <w:bottom w:type="dxa" w:w="60"/>
+              <w:right w:type="dxa" w:w="100"/>
+            </w:tcMar>
+          </w:tcPr>
+          <w:p>
+            <w:r>
+              <w:rPr>
+                <w:color w:val="0A0A0A"/>
+                <w:sz w:val="18"/>
+                <w:szCs w:val="18"/>
+              </w:rPr>
+              <w:t xml:space="preserve">2, 8, Part 3, Part 5 (twice), 14, 15</w:t>
             </w:r>
           </w:p>
         </w:tc>
@@ -9309,7 +9769,7 @@
         </w:trPr>
         <w:tc>
           <w:tcPr>
-            <w:tcW w:type="dxa" w:w="1483"/>
+            <w:tcW w:type="dxa" w:w="1506"/>
             <w:tcBorders>
               <w:top w:val="single" w:color="C9C9C4" w:sz="4"/>
               <w:left w:val="single" w:color="C9C9C4" w:sz="4"/>
@@ -9336,7 +9796,7 @@
         </w:tc>
         <w:tc>
           <w:tcPr>
-            <w:tcW w:type="dxa" w:w="5821"/>
+            <w:tcW w:type="dxa" w:w="5912"/>
             <w:tcBorders>
               <w:top w:val="single" w:color="C9C9C4" w:sz="4"/>
               <w:left w:val="single" w:color="C9C9C4" w:sz="4"/>
@@ -9363,28 +9823,28 @@
         </w:tc>
         <w:tc>
           <w:tcPr>
-            <w:tcW w:type="dxa" w:w="7534"/>
-            <w:tcBorders>
-              <w:top w:val="single" w:color="C9C9C4" w:sz="4"/>
-              <w:left w:val="single" w:color="C9C9C4" w:sz="4"/>
-              <w:bottom w:val="single" w:color="C9C9C4" w:sz="4"/>
-              <w:right w:val="single" w:color="C9C9C4" w:sz="4"/>
-            </w:tcBorders>
-            <w:tcMar>
-              <w:top w:type="dxa" w:w="60"/>
-              <w:left w:type="dxa" w:w="100"/>
-              <w:bottom w:type="dxa" w:w="60"/>
-              <w:right w:type="dxa" w:w="100"/>
-            </w:tcMar>
-          </w:tcPr>
-          <w:p>
-            <w:r>
-              <w:rPr>
-                <w:color w:val="0A0A0A"/>
-                <w:sz w:val="18"/>
-                <w:szCs w:val="18"/>
-              </w:rPr>
-              <w:t xml:space="preserve">1, 3, 7, Part 5, 13</w:t>
+            <w:tcW w:type="dxa" w:w="7420"/>
+            <w:tcBorders>
+              <w:top w:val="single" w:color="C9C9C4" w:sz="4"/>
+              <w:left w:val="single" w:color="C9C9C4" w:sz="4"/>
+              <w:bottom w:val="single" w:color="C9C9C4" w:sz="4"/>
+              <w:right w:val="single" w:color="C9C9C4" w:sz="4"/>
+            </w:tcBorders>
+            <w:tcMar>
+              <w:top w:type="dxa" w:w="60"/>
+              <w:left w:type="dxa" w:w="100"/>
+              <w:bottom w:type="dxa" w:w="60"/>
+              <w:right w:type="dxa" w:w="100"/>
+            </w:tcMar>
+          </w:tcPr>
+          <w:p>
+            <w:r>
+              <w:rPr>
+                <w:color w:val="0A0A0A"/>
+                <w:sz w:val="18"/>
+                <w:szCs w:val="18"/>
+              </w:rPr>
+              <w:t xml:space="preserve">1, 3, 7, Part 5, 13, 16</w:t>
             </w:r>
           </w:p>
         </w:tc>
@@ -9396,7 +9856,7 @@
         </w:trPr>
         <w:tc>
           <w:tcPr>
-            <w:tcW w:type="dxa" w:w="1483"/>
+            <w:tcW w:type="dxa" w:w="1506"/>
             <w:tcBorders>
               <w:top w:val="single" w:color="C9C9C4" w:sz="4"/>
               <w:left w:val="single" w:color="C9C9C4" w:sz="4"/>
@@ -9423,7 +9883,7 @@
         </w:tc>
         <w:tc>
           <w:tcPr>
-            <w:tcW w:type="dxa" w:w="5821"/>
+            <w:tcW w:type="dxa" w:w="5912"/>
             <w:tcBorders>
               <w:top w:val="single" w:color="C9C9C4" w:sz="4"/>
               <w:left w:val="single" w:color="C9C9C4" w:sz="4"/>
@@ -9450,28 +9910,28 @@
         </w:tc>
         <w:tc>
           <w:tcPr>
-            <w:tcW w:type="dxa" w:w="7534"/>
-            <w:tcBorders>
-              <w:top w:val="single" w:color="C9C9C4" w:sz="4"/>
-              <w:left w:val="single" w:color="C9C9C4" w:sz="4"/>
-              <w:bottom w:val="single" w:color="C9C9C4" w:sz="4"/>
-              <w:right w:val="single" w:color="C9C9C4" w:sz="4"/>
-            </w:tcBorders>
-            <w:tcMar>
-              <w:top w:type="dxa" w:w="60"/>
-              <w:left w:type="dxa" w:w="100"/>
-              <w:bottom w:type="dxa" w:w="60"/>
-              <w:right w:type="dxa" w:w="100"/>
-            </w:tcMar>
-          </w:tcPr>
-          <w:p>
-            <w:r>
-              <w:rPr>
-                <w:color w:val="0A0A0A"/>
-                <w:sz w:val="18"/>
-                <w:szCs w:val="18"/>
-              </w:rPr>
-              <w:t xml:space="preserve">5, 9, 14</w:t>
+            <w:tcW w:type="dxa" w:w="7420"/>
+            <w:tcBorders>
+              <w:top w:val="single" w:color="C9C9C4" w:sz="4"/>
+              <w:left w:val="single" w:color="C9C9C4" w:sz="4"/>
+              <w:bottom w:val="single" w:color="C9C9C4" w:sz="4"/>
+              <w:right w:val="single" w:color="C9C9C4" w:sz="4"/>
+            </w:tcBorders>
+            <w:tcMar>
+              <w:top w:type="dxa" w:w="60"/>
+              <w:left w:type="dxa" w:w="100"/>
+              <w:bottom w:type="dxa" w:w="60"/>
+              <w:right w:type="dxa" w:w="100"/>
+            </w:tcMar>
+          </w:tcPr>
+          <w:p>
+            <w:r>
+              <w:rPr>
+                <w:color w:val="0A0A0A"/>
+                <w:sz w:val="18"/>
+                <w:szCs w:val="18"/>
+              </w:rPr>
+              <w:t xml:space="preserve">5, 9, 12</w:t>
             </w:r>
           </w:p>
         </w:tc>
@@ -9483,7 +9943,7 @@
         </w:trPr>
         <w:tc>
           <w:tcPr>
-            <w:tcW w:type="dxa" w:w="1483"/>
+            <w:tcW w:type="dxa" w:w="1506"/>
             <w:tcBorders>
               <w:top w:val="single" w:color="C9C9C4" w:sz="4"/>
               <w:left w:val="single" w:color="C9C9C4" w:sz="4"/>
@@ -9510,7 +9970,7 @@
         </w:tc>
         <w:tc>
           <w:tcPr>
-            <w:tcW w:type="dxa" w:w="5821"/>
+            <w:tcW w:type="dxa" w:w="5912"/>
             <w:tcBorders>
               <w:top w:val="single" w:color="C9C9C4" w:sz="4"/>
               <w:left w:val="single" w:color="C9C9C4" w:sz="4"/>
@@ -9537,28 +9997,28 @@
         </w:tc>
         <w:tc>
           <w:tcPr>
-            <w:tcW w:type="dxa" w:w="7534"/>
-            <w:tcBorders>
-              <w:top w:val="single" w:color="C9C9C4" w:sz="4"/>
-              <w:left w:val="single" w:color="C9C9C4" w:sz="4"/>
-              <w:bottom w:val="single" w:color="C9C9C4" w:sz="4"/>
-              <w:right w:val="single" w:color="C9C9C4" w:sz="4"/>
-            </w:tcBorders>
-            <w:tcMar>
-              <w:top w:type="dxa" w:w="60"/>
-              <w:left w:type="dxa" w:w="100"/>
-              <w:bottom w:type="dxa" w:w="60"/>
-              <w:right w:type="dxa" w:w="100"/>
-            </w:tcMar>
-          </w:tcPr>
-          <w:p>
-            <w:r>
-              <w:rPr>
-                <w:color w:val="0A0A0A"/>
-                <w:sz w:val="18"/>
-                <w:szCs w:val="18"/>
-              </w:rPr>
-              <w:t xml:space="preserve">6, Part 4 (all of it, on camera in the corner), Part 5, 10, 15</w:t>
+            <w:tcW w:type="dxa" w:w="7420"/>
+            <w:tcBorders>
+              <w:top w:val="single" w:color="C9C9C4" w:sz="4"/>
+              <w:left w:val="single" w:color="C9C9C4" w:sz="4"/>
+              <w:bottom w:val="single" w:color="C9C9C4" w:sz="4"/>
+              <w:right w:val="single" w:color="C9C9C4" w:sz="4"/>
+            </w:tcBorders>
+            <w:tcMar>
+              <w:top w:type="dxa" w:w="60"/>
+              <w:left w:type="dxa" w:w="100"/>
+              <w:bottom w:type="dxa" w:w="60"/>
+              <w:right w:type="dxa" w:w="100"/>
+            </w:tcMar>
+          </w:tcPr>
+          <w:p>
+            <w:r>
+              <w:rPr>
+                <w:color w:val="0A0A0A"/>
+                <w:sz w:val="18"/>
+                <w:szCs w:val="18"/>
+              </w:rPr>
+              <w:t xml:space="preserve">6, Part 4 (all of it, on camera in the corner), Part 5, 10</w:t>
             </w:r>
           </w:p>
         </w:tc>
@@ -9570,7 +10030,7 @@
         </w:trPr>
         <w:tc>
           <w:tcPr>
-            <w:tcW w:type="dxa" w:w="1483"/>
+            <w:tcW w:type="dxa" w:w="1506"/>
             <w:tcBorders>
               <w:top w:val="single" w:color="C9C9C4" w:sz="4"/>
               <w:left w:val="single" w:color="C9C9C4" w:sz="4"/>
@@ -9597,7 +10057,7 @@
         </w:tc>
         <w:tc>
           <w:tcPr>
-            <w:tcW w:type="dxa" w:w="5821"/>
+            <w:tcW w:type="dxa" w:w="5912"/>
             <w:tcBorders>
               <w:top w:val="single" w:color="C9C9C4" w:sz="4"/>
               <w:left w:val="single" w:color="C9C9C4" w:sz="4"/>
@@ -9624,7 +10084,7 @@
         </w:tc>
         <w:tc>
           <w:tcPr>
-            <w:tcW w:type="dxa" w:w="7534"/>
+            <w:tcW w:type="dxa" w:w="7420"/>
             <w:tcBorders>
               <w:top w:val="single" w:color="C9C9C4" w:sz="4"/>
               <w:left w:val="single" w:color="C9C9C4" w:sz="4"/>
@@ -10505,6 +10965,950 @@
       <w:r>
         <w:t xml:space="preserve">Put files in footage/clips/part1 to part7, named in order. footage/ is never committed.</w:t>
       </w:r>
+    </w:p>
+    <w:p>
+      <w:pPr>
+        <w:pStyle w:val="Heading1"/>
+      </w:pPr>
+      <w:r>
+        <w:t xml:space="preserve">Q&amp;A: what the judges are likely to poke at</w:t>
+      </w:r>
+    </w:p>
+    <w:p>
+      <w:pPr>
+        <w:spacing w:after="120"/>
+      </w:pPr>
+      <w:r>
+        <w:t xml:space="preserve">Not read in the video. One short answer each, owner in brackets.</w:t>
+      </w:r>
+    </w:p>
+    <w:tbl>
+      <w:tblPr>
+        <w:tblW w:type="dxa" w:w="14838"/>
+        <w:tblBorders>
+          <w:top w:val="single" w:color="auto" w:sz="4"/>
+          <w:left w:val="single" w:color="auto" w:sz="4"/>
+          <w:bottom w:val="single" w:color="auto" w:sz="4"/>
+          <w:right w:val="single" w:color="auto" w:sz="4"/>
+          <w:insideH w:val="single" w:color="auto" w:sz="4"/>
+          <w:insideV w:val="single" w:color="auto" w:sz="4"/>
+        </w:tblBorders>
+      </w:tblPr>
+      <w:tblGrid>
+        <w:gridCol w:w="7362"/>
+        <w:gridCol w:w="7476"/>
+      </w:tblGrid>
+      <w:tr>
+        <w:trPr>
+          <w:cantSplit/>
+          <w:tblHeader/>
+        </w:trPr>
+        <w:tc>
+          <w:tcPr>
+            <w:tcW w:type="dxa" w:w="7362"/>
+            <w:tcBorders>
+              <w:top w:val="single" w:color="C9C9C4" w:sz="4"/>
+              <w:left w:val="single" w:color="C9C9C4" w:sz="4"/>
+              <w:bottom w:val="single" w:color="C9C9C4" w:sz="4"/>
+              <w:right w:val="single" w:color="C9C9C4" w:sz="4"/>
+            </w:tcBorders>
+            <w:shd w:fill="EDE9FF" w:color="auto" w:val="clear"/>
+            <w:tcMar>
+              <w:top w:type="dxa" w:w="60"/>
+              <w:left w:type="dxa" w:w="100"/>
+              <w:bottom w:type="dxa" w:w="60"/>
+              <w:right w:type="dxa" w:w="100"/>
+            </w:tcMar>
+          </w:tcPr>
+          <w:p>
+            <w:r>
+              <w:rPr>
+                <w:b/>
+                <w:bCs/>
+                <w:color w:val="0A0A0A"/>
+                <w:sz w:val="18"/>
+                <w:szCs w:val="18"/>
+              </w:rPr>
+              <w:t xml:space="preserve">They ask</w:t>
+            </w:r>
+          </w:p>
+        </w:tc>
+        <w:tc>
+          <w:tcPr>
+            <w:tcW w:type="dxa" w:w="7476"/>
+            <w:tcBorders>
+              <w:top w:val="single" w:color="C9C9C4" w:sz="4"/>
+              <w:left w:val="single" w:color="C9C9C4" w:sz="4"/>
+              <w:bottom w:val="single" w:color="C9C9C4" w:sz="4"/>
+              <w:right w:val="single" w:color="C9C9C4" w:sz="4"/>
+            </w:tcBorders>
+            <w:shd w:fill="EDE9FF" w:color="auto" w:val="clear"/>
+            <w:tcMar>
+              <w:top w:type="dxa" w:w="60"/>
+              <w:left w:type="dxa" w:w="100"/>
+              <w:bottom w:type="dxa" w:w="60"/>
+              <w:right w:type="dxa" w:w="100"/>
+            </w:tcMar>
+          </w:tcPr>
+          <w:p>
+            <w:r>
+              <w:rPr>
+                <w:b/>
+                <w:bCs/>
+                <w:color w:val="0A0A0A"/>
+                <w:sz w:val="18"/>
+                <w:szCs w:val="18"/>
+              </w:rPr>
+              <w:t xml:space="preserve">We answer</w:t>
+            </w:r>
+          </w:p>
+        </w:tc>
+      </w:tr>
+      <w:tr>
+        <w:trPr>
+          <w:cantSplit/>
+          <w:tblHeader w:val="off"/>
+        </w:trPr>
+        <w:tc>
+          <w:tcPr>
+            <w:tcW w:type="dxa" w:w="7362"/>
+            <w:tcBorders>
+              <w:top w:val="single" w:color="C9C9C4" w:sz="4"/>
+              <w:left w:val="single" w:color="C9C9C4" w:sz="4"/>
+              <w:bottom w:val="single" w:color="C9C9C4" w:sz="4"/>
+              <w:right w:val="single" w:color="C9C9C4" w:sz="4"/>
+            </w:tcBorders>
+            <w:tcMar>
+              <w:top w:type="dxa" w:w="60"/>
+              <w:left w:type="dxa" w:w="100"/>
+              <w:bottom w:type="dxa" w:w="60"/>
+              <w:right w:type="dxa" w:w="100"/>
+            </w:tcMar>
+          </w:tcPr>
+          <w:p>
+            <w:r>
+              <w:rPr>
+                <w:color w:val="0A0A0A"/>
+                <w:sz w:val="18"/>
+                <w:szCs w:val="18"/>
+              </w:rPr>
+              <w:t xml:space="preserve">Do you work with an insurer? (Alysa)</w:t>
+            </w:r>
+          </w:p>
+        </w:tc>
+        <w:tc>
+          <w:tcPr>
+            <w:tcW w:type="dxa" w:w="7476"/>
+            <w:tcBorders>
+              <w:top w:val="single" w:color="C9C9C4" w:sz="4"/>
+              <w:left w:val="single" w:color="C9C9C4" w:sz="4"/>
+              <w:bottom w:val="single" w:color="C9C9C4" w:sz="4"/>
+              <w:right w:val="single" w:color="C9C9C4" w:sz="4"/>
+            </w:tcBorders>
+            <w:tcMar>
+              <w:top w:type="dxa" w:w="60"/>
+              <w:left w:type="dxa" w:w="100"/>
+              <w:bottom w:type="dxa" w:w="60"/>
+              <w:right w:type="dxa" w:w="100"/>
+            </w:tcMar>
+          </w:tcPr>
+          <w:p>
+            <w:r>
+              <w:rPr>
+                <w:color w:val="0A0A0A"/>
+                <w:sz w:val="18"/>
+                <w:szCs w:val="18"/>
+              </w:rPr>
+              <w:t xml:space="preserve">Not yet, and we say so. We are the trigger and the evidence, not the risk carrier. Next step: a licensed general insurer writing accident (Class 1) and liability (Class 13) cover enters the Insurance Authority's Insurtech Sandbox with us as its technology partner; the sandbox is open to authorised insurers working with technology companies. Precedents for no-claim-form parametric cover in Hong Kong exist, such as typhoon signal cover.</w:t>
+            </w:r>
+          </w:p>
+        </w:tc>
+      </w:tr>
+      <w:tr>
+        <w:trPr>
+          <w:cantSplit/>
+          <w:tblHeader w:val="off"/>
+        </w:trPr>
+        <w:tc>
+          <w:tcPr>
+            <w:tcW w:type="dxa" w:w="7362"/>
+            <w:tcBorders>
+              <w:top w:val="single" w:color="C9C9C4" w:sz="4"/>
+              <w:left w:val="single" w:color="C9C9C4" w:sz="4"/>
+              <w:bottom w:val="single" w:color="C9C9C4" w:sz="4"/>
+              <w:right w:val="single" w:color="C9C9C4" w:sz="4"/>
+            </w:tcBorders>
+            <w:tcMar>
+              <w:top w:type="dxa" w:w="60"/>
+              <w:left w:type="dxa" w:w="100"/>
+              <w:bottom w:type="dxa" w:w="60"/>
+              <w:right w:type="dxa" w:w="100"/>
+            </w:tcMar>
+          </w:tcPr>
+          <w:p>
+            <w:r>
+              <w:rPr>
+                <w:color w:val="0A0A0A"/>
+                <w:sz w:val="18"/>
+                <w:szCs w:val="18"/>
+              </w:rPr>
+              <w:t xml:space="preserve">Do you need an insurance licence? (Alysa)</w:t>
+            </w:r>
+          </w:p>
+        </w:tc>
+        <w:tc>
+          <w:tcPr>
+            <w:tcW w:type="dxa" w:w="7476"/>
+            <w:tcBorders>
+              <w:top w:val="single" w:color="C9C9C4" w:sz="4"/>
+              <w:left w:val="single" w:color="C9C9C4" w:sz="4"/>
+              <w:bottom w:val="single" w:color="C9C9C4" w:sz="4"/>
+              <w:right w:val="single" w:color="C9C9C4" w:sz="4"/>
+            </w:tcBorders>
+            <w:tcMar>
+              <w:top w:type="dxa" w:w="60"/>
+              <w:left w:type="dxa" w:w="100"/>
+              <w:bottom w:type="dxa" w:w="60"/>
+              <w:right w:type="dxa" w:w="100"/>
+            </w:tcMar>
+          </w:tcPr>
+          <w:p>
+            <w:r>
+              <w:rPr>
+                <w:color w:val="0A0A0A"/>
+                <w:sz w:val="18"/>
+                <w:szCs w:val="18"/>
+              </w:rPr>
+              <w:t xml:space="preserve">No, as long as we bear no risk, never call ourselves an insurer (Cap 41 s2(3)) and never invite riders to claim (s64G). We provide the verified record as clerical support for the insurer (s123(2)). We will get a legal opinion before the pilot.</w:t>
+            </w:r>
+          </w:p>
+        </w:tc>
+      </w:tr>
+      <w:tr>
+        <w:trPr>
+          <w:cantSplit/>
+          <w:tblHeader w:val="off"/>
+        </w:trPr>
+        <w:tc>
+          <w:tcPr>
+            <w:tcW w:type="dxa" w:w="7362"/>
+            <w:tcBorders>
+              <w:top w:val="single" w:color="C9C9C4" w:sz="4"/>
+              <w:left w:val="single" w:color="C9C9C4" w:sz="4"/>
+              <w:bottom w:val="single" w:color="C9C9C4" w:sz="4"/>
+              <w:right w:val="single" w:color="C9C9C4" w:sz="4"/>
+            </w:tcBorders>
+            <w:tcMar>
+              <w:top w:type="dxa" w:w="60"/>
+              <w:left w:type="dxa" w:w="100"/>
+              <w:bottom w:type="dxa" w:w="60"/>
+              <w:right w:type="dxa" w:w="100"/>
+            </w:tcMar>
+          </w:tcPr>
+          <w:p>
+            <w:r>
+              <w:rPr>
+                <w:color w:val="0A0A0A"/>
+                <w:sz w:val="18"/>
+                <w:szCs w:val="18"/>
+              </w:rPr>
+              <w:t xml:space="preserve">How does the data become a payout? (Alysa)</w:t>
+            </w:r>
+          </w:p>
+        </w:tc>
+        <w:tc>
+          <w:tcPr>
+            <w:tcW w:type="dxa" w:w="7476"/>
+            <w:tcBorders>
+              <w:top w:val="single" w:color="C9C9C4" w:sz="4"/>
+              <w:left w:val="single" w:color="C9C9C4" w:sz="4"/>
+              <w:bottom w:val="single" w:color="C9C9C4" w:sz="4"/>
+              <w:right w:val="single" w:color="C9C9C4" w:sz="4"/>
+            </w:tcBorders>
+            <w:tcMar>
+              <w:top w:type="dxa" w:w="60"/>
+              <w:left w:type="dxa" w:w="100"/>
+              <w:bottom w:type="dxa" w:w="60"/>
+              <w:right w:type="dxa" w:w="100"/>
+            </w:tcMar>
+          </w:tcPr>
+          <w:p>
+            <w:r>
+              <w:rPr>
+                <w:color w:val="0A0A0A"/>
+                <w:sz w:val="18"/>
+                <w:szCs w:val="18"/>
+              </w:rPr>
+              <w:t xml:space="preserve">Parametric conditions: rider on shift, model probability at or above 0.5, no cancel within 30 seconds, signed record. Tier one is a fixed amount paid at the deadline. Tier two follows a hospital record. Statutory compensation is untouched.</w:t>
+            </w:r>
+          </w:p>
+        </w:tc>
+      </w:tr>
+      <w:tr>
+        <w:trPr>
+          <w:cantSplit/>
+          <w:tblHeader w:val="off"/>
+        </w:trPr>
+        <w:tc>
+          <w:tcPr>
+            <w:tcW w:type="dxa" w:w="7362"/>
+            <w:tcBorders>
+              <w:top w:val="single" w:color="C9C9C4" w:sz="4"/>
+              <w:left w:val="single" w:color="C9C9C4" w:sz="4"/>
+              <w:bottom w:val="single" w:color="C9C9C4" w:sz="4"/>
+              <w:right w:val="single" w:color="C9C9C4" w:sz="4"/>
+            </w:tcBorders>
+            <w:tcMar>
+              <w:top w:type="dxa" w:w="60"/>
+              <w:left w:type="dxa" w:w="100"/>
+              <w:bottom w:type="dxa" w:w="60"/>
+              <w:right w:type="dxa" w:w="100"/>
+            </w:tcMar>
+          </w:tcPr>
+          <w:p>
+            <w:r>
+              <w:rPr>
+                <w:color w:val="0A0A0A"/>
+                <w:sz w:val="18"/>
+                <w:szCs w:val="18"/>
+              </w:rPr>
+              <w:t xml:space="preserve">Are the money figures real? (Alysa)</w:t>
+            </w:r>
+          </w:p>
+        </w:tc>
+        <w:tc>
+          <w:tcPr>
+            <w:tcW w:type="dxa" w:w="7476"/>
+            <w:tcBorders>
+              <w:top w:val="single" w:color="C9C9C4" w:sz="4"/>
+              <w:left w:val="single" w:color="C9C9C4" w:sz="4"/>
+              <w:bottom w:val="single" w:color="C9C9C4" w:sz="4"/>
+              <w:right w:val="single" w:color="C9C9C4" w:sz="4"/>
+            </w:tcBorders>
+            <w:tcMar>
+              <w:top w:type="dxa" w:w="60"/>
+              <w:left w:type="dxa" w:w="100"/>
+              <w:bottom w:type="dxa" w:w="60"/>
+              <w:right w:type="dxa" w:w="100"/>
+            </w:tcMar>
+          </w:tcPr>
+          <w:p>
+            <w:r>
+              <w:rPr>
+                <w:color w:val="0A0A0A"/>
+                <w:sz w:val="18"/>
+                <w:szCs w:val="18"/>
+              </w:rPr>
+              <w:t xml:space="preserve">Payout and premium are derived from sourced inputs (rider earnings, injury rates, statutory amounts) with a low, central and high range in docs/research/INSURANCE_MODEL.md. Our own fee is a pricing choice and labelled as such.</w:t>
+            </w:r>
+          </w:p>
+        </w:tc>
+      </w:tr>
+      <w:tr>
+        <w:trPr>
+          <w:cantSplit/>
+          <w:tblHeader w:val="off"/>
+        </w:trPr>
+        <w:tc>
+          <w:tcPr>
+            <w:tcW w:type="dxa" w:w="7362"/>
+            <w:tcBorders>
+              <w:top w:val="single" w:color="C9C9C4" w:sz="4"/>
+              <w:left w:val="single" w:color="C9C9C4" w:sz="4"/>
+              <w:bottom w:val="single" w:color="C9C9C4" w:sz="4"/>
+              <w:right w:val="single" w:color="C9C9C4" w:sz="4"/>
+            </w:tcBorders>
+            <w:tcMar>
+              <w:top w:type="dxa" w:w="60"/>
+              <w:left w:type="dxa" w:w="100"/>
+              <w:bottom w:type="dxa" w:w="60"/>
+              <w:right w:type="dxa" w:w="100"/>
+            </w:tcMar>
+          </w:tcPr>
+          <w:p>
+            <w:r>
+              <w:rPr>
+                <w:color w:val="0A0A0A"/>
+                <w:sz w:val="18"/>
+                <w:szCs w:val="18"/>
+              </w:rPr>
+              <w:t xml:space="preserve">Where are the drop tests? (Hannes)</w:t>
+            </w:r>
+          </w:p>
+        </w:tc>
+        <w:tc>
+          <w:tcPr>
+            <w:tcW w:type="dxa" w:w="7476"/>
+            <w:tcBorders>
+              <w:top w:val="single" w:color="C9C9C4" w:sz="4"/>
+              <w:left w:val="single" w:color="C9C9C4" w:sz="4"/>
+              <w:bottom w:val="single" w:color="C9C9C4" w:sz="4"/>
+              <w:right w:val="single" w:color="C9C9C4" w:sz="4"/>
+            </w:tcBorders>
+            <w:tcMar>
+              <w:top w:type="dxa" w:w="60"/>
+              <w:left w:type="dxa" w:w="100"/>
+              <w:bottom w:type="dxa" w:w="60"/>
+              <w:right w:type="dxa" w:w="100"/>
+            </w:tcMar>
+          </w:tcPr>
+          <w:p>
+            <w:r>
+              <w:rPr>
+                <w:color w:val="0A0A0A"/>
+                <w:sz w:val="18"/>
+                <w:szCs w:val="18"/>
+              </w:rPr>
+              <w:t xml:space="preserve">Protocol written, rig being built, results before the Grand Final. Meanwhile: held-out people, 1,865 hours of public real riding, and the live demo.</w:t>
+            </w:r>
+          </w:p>
+        </w:tc>
+      </w:tr>
+      <w:tr>
+        <w:trPr>
+          <w:cantSplit/>
+          <w:tblHeader w:val="off"/>
+        </w:trPr>
+        <w:tc>
+          <w:tcPr>
+            <w:tcW w:type="dxa" w:w="7362"/>
+            <w:tcBorders>
+              <w:top w:val="single" w:color="C9C9C4" w:sz="4"/>
+              <w:left w:val="single" w:color="C9C9C4" w:sz="4"/>
+              <w:bottom w:val="single" w:color="C9C9C4" w:sz="4"/>
+              <w:right w:val="single" w:color="C9C9C4" w:sz="4"/>
+            </w:tcBorders>
+            <w:tcMar>
+              <w:top w:type="dxa" w:w="60"/>
+              <w:left w:type="dxa" w:w="100"/>
+              <w:bottom w:type="dxa" w:w="60"/>
+              <w:right w:type="dxa" w:w="100"/>
+            </w:tcMar>
+          </w:tcPr>
+          <w:p>
+            <w:r>
+              <w:rPr>
+                <w:color w:val="0A0A0A"/>
+                <w:sz w:val="18"/>
+                <w:szCs w:val="18"/>
+              </w:rPr>
+              <w:t xml:space="preserve">Your data is simulated falls. Why believe it? (Karina)</w:t>
+            </w:r>
+          </w:p>
+        </w:tc>
+        <w:tc>
+          <w:tcPr>
+            <w:tcW w:type="dxa" w:w="7476"/>
+            <w:tcBorders>
+              <w:top w:val="single" w:color="C9C9C4" w:sz="4"/>
+              <w:left w:val="single" w:color="C9C9C4" w:sz="4"/>
+              <w:bottom w:val="single" w:color="C9C9C4" w:sz="4"/>
+              <w:right w:val="single" w:color="C9C9C4" w:sz="4"/>
+            </w:tcBorders>
+            <w:tcMar>
+              <w:top w:type="dxa" w:w="60"/>
+              <w:left w:type="dxa" w:w="100"/>
+              <w:bottom w:type="dxa" w:w="60"/>
+              <w:right w:type="dxa" w:w="100"/>
+            </w:tcMar>
+          </w:tcPr>
+          <w:p>
+            <w:r>
+              <w:rPr>
+                <w:color w:val="0A0A0A"/>
+                <w:sz w:val="18"/>
+                <w:szCs w:val="18"/>
+              </w:rPr>
+              <w:t xml:space="preserve">You should not believe it proves road performance, and we say so. It proves the method works on people it never saw. Real rides come from research mode.</w:t>
+            </w:r>
+          </w:p>
+        </w:tc>
+      </w:tr>
+      <w:tr>
+        <w:trPr>
+          <w:cantSplit/>
+          <w:tblHeader w:val="off"/>
+        </w:trPr>
+        <w:tc>
+          <w:tcPr>
+            <w:tcW w:type="dxa" w:w="7362"/>
+            <w:tcBorders>
+              <w:top w:val="single" w:color="C9C9C4" w:sz="4"/>
+              <w:left w:val="single" w:color="C9C9C4" w:sz="4"/>
+              <w:bottom w:val="single" w:color="C9C9C4" w:sz="4"/>
+              <w:right w:val="single" w:color="C9C9C4" w:sz="4"/>
+            </w:tcBorders>
+            <w:tcMar>
+              <w:top w:type="dxa" w:w="60"/>
+              <w:left w:type="dxa" w:w="100"/>
+              <w:bottom w:type="dxa" w:w="60"/>
+              <w:right w:type="dxa" w:w="100"/>
+            </w:tcMar>
+          </w:tcPr>
+          <w:p>
+            <w:r>
+              <w:rPr>
+                <w:color w:val="0A0A0A"/>
+                <w:sz w:val="18"/>
+                <w:szCs w:val="18"/>
+              </w:rPr>
+              <w:t xml:space="preserve">What about false alarms? (Simone)</w:t>
+            </w:r>
+          </w:p>
+        </w:tc>
+        <w:tc>
+          <w:tcPr>
+            <w:tcW w:type="dxa" w:w="7476"/>
+            <w:tcBorders>
+              <w:top w:val="single" w:color="C9C9C4" w:sz="4"/>
+              <w:left w:val="single" w:color="C9C9C4" w:sz="4"/>
+              <w:bottom w:val="single" w:color="C9C9C4" w:sz="4"/>
+              <w:right w:val="single" w:color="C9C9C4" w:sz="4"/>
+            </w:tcBorders>
+            <w:tcMar>
+              <w:top w:type="dxa" w:w="60"/>
+              <w:left w:type="dxa" w:w="100"/>
+              <w:bottom w:type="dxa" w:w="60"/>
+              <w:right w:type="dxa" w:w="100"/>
+            </w:tcMar>
+          </w:tcPr>
+          <w:p>
+            <w:r>
+              <w:rPr>
+                <w:color w:val="0A0A0A"/>
+                <w:sz w:val="18"/>
+                <w:szCs w:val="18"/>
+              </w:rPr>
+              <w:t xml:space="preserve">10.5 an hour of everyday phone handling, 0.2 an hour on real motorbike riding, 30 second cancel, helmet and phone must agree.</w:t>
+            </w:r>
+          </w:p>
+        </w:tc>
+      </w:tr>
+      <w:tr>
+        <w:trPr>
+          <w:cantSplit/>
+          <w:tblHeader w:val="off"/>
+        </w:trPr>
+        <w:tc>
+          <w:tcPr>
+            <w:tcW w:type="dxa" w:w="7362"/>
+            <w:tcBorders>
+              <w:top w:val="single" w:color="C9C9C4" w:sz="4"/>
+              <w:left w:val="single" w:color="C9C9C4" w:sz="4"/>
+              <w:bottom w:val="single" w:color="C9C9C4" w:sz="4"/>
+              <w:right w:val="single" w:color="C9C9C4" w:sz="4"/>
+            </w:tcBorders>
+            <w:tcMar>
+              <w:top w:type="dxa" w:w="60"/>
+              <w:left w:type="dxa" w:w="100"/>
+              <w:bottom w:type="dxa" w:w="60"/>
+              <w:right w:type="dxa" w:w="100"/>
+            </w:tcMar>
+          </w:tcPr>
+          <w:p>
+            <w:r>
+              <w:rPr>
+                <w:color w:val="0A0A0A"/>
+                <w:sz w:val="18"/>
+                <w:szCs w:val="18"/>
+              </w:rPr>
+              <w:t xml:space="preserve">Could a platform use this to watch riders? (Maalon)</w:t>
+            </w:r>
+          </w:p>
+        </w:tc>
+        <w:tc>
+          <w:tcPr>
+            <w:tcW w:type="dxa" w:w="7476"/>
+            <w:tcBorders>
+              <w:top w:val="single" w:color="C9C9C4" w:sz="4"/>
+              <w:left w:val="single" w:color="C9C9C4" w:sz="4"/>
+              <w:bottom w:val="single" w:color="C9C9C4" w:sz="4"/>
+              <w:right w:val="single" w:color="C9C9C4" w:sz="4"/>
+            </w:tcBorders>
+            <w:tcMar>
+              <w:top w:type="dxa" w:w="60"/>
+              <w:left w:type="dxa" w:w="100"/>
+              <w:bottom w:type="dxa" w:w="60"/>
+              <w:right w:type="dxa" w:w="100"/>
+            </w:tcMar>
+          </w:tcPr>
+          <w:p>
+            <w:r>
+              <w:rPr>
+                <w:color w:val="0A0A0A"/>
+                <w:sz w:val="18"/>
+                <w:szCs w:val="18"/>
+              </w:rPr>
+              <w:t xml:space="preserve">No route history, no risk score, opt-in per shift, platforms see events only, government sees totals only, event data never sets an individual premium.</w:t>
+            </w:r>
+          </w:p>
+        </w:tc>
+      </w:tr>
+      <w:tr>
+        <w:trPr>
+          <w:cantSplit/>
+          <w:tblHeader w:val="off"/>
+        </w:trPr>
+        <w:tc>
+          <w:tcPr>
+            <w:tcW w:type="dxa" w:w="7362"/>
+            <w:tcBorders>
+              <w:top w:val="single" w:color="C9C9C4" w:sz="4"/>
+              <w:left w:val="single" w:color="C9C9C4" w:sz="4"/>
+              <w:bottom w:val="single" w:color="C9C9C4" w:sz="4"/>
+              <w:right w:val="single" w:color="C9C9C4" w:sz="4"/>
+            </w:tcBorders>
+            <w:tcMar>
+              <w:top w:type="dxa" w:w="60"/>
+              <w:left w:type="dxa" w:w="100"/>
+              <w:bottom w:type="dxa" w:w="60"/>
+              <w:right w:type="dxa" w:w="100"/>
+            </w:tcMar>
+          </w:tcPr>
+          <w:p>
+            <w:r>
+              <w:rPr>
+                <w:color w:val="0A0A0A"/>
+                <w:sz w:val="18"/>
+                <w:szCs w:val="18"/>
+              </w:rPr>
+              <w:t xml:space="preserve">Could a platform use "no record" to deny a claim? (Alysa)</w:t>
+            </w:r>
+          </w:p>
+        </w:tc>
+        <w:tc>
+          <w:tcPr>
+            <w:tcW w:type="dxa" w:w="7476"/>
+            <w:tcBorders>
+              <w:top w:val="single" w:color="C9C9C4" w:sz="4"/>
+              <w:left w:val="single" w:color="C9C9C4" w:sz="4"/>
+              <w:bottom w:val="single" w:color="C9C9C4" w:sz="4"/>
+              <w:right w:val="single" w:color="C9C9C4" w:sz="4"/>
+            </w:tcBorders>
+            <w:tcMar>
+              <w:top w:type="dxa" w:w="60"/>
+              <w:left w:type="dxa" w:w="100"/>
+              <w:bottom w:type="dxa" w:w="60"/>
+              <w:right w:type="dxa" w:w="100"/>
+            </w:tcMar>
+          </w:tcPr>
+          <w:p>
+            <w:r>
+              <w:rPr>
+                <w:color w:val="0A0A0A"/>
+                <w:sz w:val="18"/>
+                <w:szCs w:val="18"/>
+              </w:rPr>
+              <w:t xml:space="preserve">No record never means no claim. The statutory route stays open; the record only adds proof.</w:t>
+            </w:r>
+          </w:p>
+        </w:tc>
+      </w:tr>
+      <w:tr>
+        <w:trPr>
+          <w:cantSplit/>
+          <w:tblHeader w:val="off"/>
+        </w:trPr>
+        <w:tc>
+          <w:tcPr>
+            <w:tcW w:type="dxa" w:w="7362"/>
+            <w:tcBorders>
+              <w:top w:val="single" w:color="C9C9C4" w:sz="4"/>
+              <w:left w:val="single" w:color="C9C9C4" w:sz="4"/>
+              <w:bottom w:val="single" w:color="C9C9C4" w:sz="4"/>
+              <w:right w:val="single" w:color="C9C9C4" w:sz="4"/>
+            </w:tcBorders>
+            <w:tcMar>
+              <w:top w:type="dxa" w:w="60"/>
+              <w:left w:type="dxa" w:w="100"/>
+              <w:bottom w:type="dxa" w:w="60"/>
+              <w:right w:type="dxa" w:w="100"/>
+            </w:tcMar>
+          </w:tcPr>
+          <w:p>
+            <w:r>
+              <w:rPr>
+                <w:color w:val="0A0A0A"/>
+                <w:sz w:val="18"/>
+                <w:szCs w:val="18"/>
+              </w:rPr>
+              <w:t xml:space="preserve">Is the triage note medical advice? (Maalon)</w:t>
+            </w:r>
+          </w:p>
+        </w:tc>
+        <w:tc>
+          <w:tcPr>
+            <w:tcW w:type="dxa" w:w="7476"/>
+            <w:tcBorders>
+              <w:top w:val="single" w:color="C9C9C4" w:sz="4"/>
+              <w:left w:val="single" w:color="C9C9C4" w:sz="4"/>
+              <w:bottom w:val="single" w:color="C9C9C4" w:sz="4"/>
+              <w:right w:val="single" w:color="C9C9C4" w:sz="4"/>
+            </w:tcBorders>
+            <w:tcMar>
+              <w:top w:type="dxa" w:w="60"/>
+              <w:left w:type="dxa" w:w="100"/>
+              <w:bottom w:type="dxa" w:w="60"/>
+              <w:right w:type="dxa" w:w="100"/>
+            </w:tcMar>
+          </w:tcPr>
+          <w:p>
+            <w:r>
+              <w:rPr>
+                <w:color w:val="0A0A0A"/>
+                <w:sz w:val="18"/>
+                <w:szCs w:val="18"/>
+              </w:rPr>
+              <w:t xml:space="preserve">No. It is a probable injury pattern from head impact research, worded as probable, and a person still calls 999.</w:t>
+            </w:r>
+          </w:p>
+        </w:tc>
+      </w:tr>
+      <w:tr>
+        <w:trPr>
+          <w:cantSplit/>
+          <w:tblHeader w:val="off"/>
+        </w:trPr>
+        <w:tc>
+          <w:tcPr>
+            <w:tcW w:type="dxa" w:w="7362"/>
+            <w:tcBorders>
+              <w:top w:val="single" w:color="C9C9C4" w:sz="4"/>
+              <w:left w:val="single" w:color="C9C9C4" w:sz="4"/>
+              <w:bottom w:val="single" w:color="C9C9C4" w:sz="4"/>
+              <w:right w:val="single" w:color="C9C9C4" w:sz="4"/>
+            </w:tcBorders>
+            <w:tcMar>
+              <w:top w:type="dxa" w:w="60"/>
+              <w:left w:type="dxa" w:w="100"/>
+              <w:bottom w:type="dxa" w:w="60"/>
+              <w:right w:type="dxa" w:w="100"/>
+            </w:tcMar>
+          </w:tcPr>
+          <w:p>
+            <w:r>
+              <w:rPr>
+                <w:color w:val="0A0A0A"/>
+                <w:sz w:val="18"/>
+                <w:szCs w:val="18"/>
+              </w:rPr>
+              <w:t xml:space="preserve">Fraud? (Simone)</w:t>
+            </w:r>
+          </w:p>
+        </w:tc>
+        <w:tc>
+          <w:tcPr>
+            <w:tcW w:type="dxa" w:w="7476"/>
+            <w:tcBorders>
+              <w:top w:val="single" w:color="C9C9C4" w:sz="4"/>
+              <w:left w:val="single" w:color="C9C9C4" w:sz="4"/>
+              <w:bottom w:val="single" w:color="C9C9C4" w:sz="4"/>
+              <w:right w:val="single" w:color="C9C9C4" w:sz="4"/>
+            </w:tcBorders>
+            <w:tcMar>
+              <w:top w:type="dxa" w:w="60"/>
+              <w:left w:type="dxa" w:w="100"/>
+              <w:bottom w:type="dxa" w:w="60"/>
+              <w:right w:type="dxa" w:w="100"/>
+            </w:tcMar>
+          </w:tcPr>
+          <w:p>
+            <w:r>
+              <w:rPr>
+                <w:color w:val="0A0A0A"/>
+                <w:sz w:val="18"/>
+                <w:szCs w:val="18"/>
+              </w:rPr>
+              <w:t xml:space="preserve">Device keys, one event per rider per minute, signed and chained records, small fixed tier one, tier two needs a hospital record.</w:t>
+            </w:r>
+          </w:p>
+        </w:tc>
+      </w:tr>
+      <w:tr>
+        <w:trPr>
+          <w:cantSplit/>
+          <w:tblHeader w:val="off"/>
+        </w:trPr>
+        <w:tc>
+          <w:tcPr>
+            <w:tcW w:type="dxa" w:w="7362"/>
+            <w:tcBorders>
+              <w:top w:val="single" w:color="C9C9C4" w:sz="4"/>
+              <w:left w:val="single" w:color="C9C9C4" w:sz="4"/>
+              <w:bottom w:val="single" w:color="C9C9C4" w:sz="4"/>
+              <w:right w:val="single" w:color="C9C9C4" w:sz="4"/>
+            </w:tcBorders>
+            <w:tcMar>
+              <w:top w:type="dxa" w:w="60"/>
+              <w:left w:type="dxa" w:w="100"/>
+              <w:bottom w:type="dxa" w:w="60"/>
+              <w:right w:type="dxa" w:w="100"/>
+            </w:tcMar>
+          </w:tcPr>
+          <w:p>
+            <w:r>
+              <w:rPr>
+                <w:color w:val="0A0A0A"/>
+                <w:sz w:val="18"/>
+                <w:szCs w:val="18"/>
+              </w:rPr>
+              <w:t xml:space="preserve">Why only phones and a HK$110 clip? (Hannes)</w:t>
+            </w:r>
+          </w:p>
+        </w:tc>
+        <w:tc>
+          <w:tcPr>
+            <w:tcW w:type="dxa" w:w="7476"/>
+            <w:tcBorders>
+              <w:top w:val="single" w:color="C9C9C4" w:sz="4"/>
+              <w:left w:val="single" w:color="C9C9C4" w:sz="4"/>
+              <w:bottom w:val="single" w:color="C9C9C4" w:sz="4"/>
+              <w:right w:val="single" w:color="C9C9C4" w:sz="4"/>
+            </w:tcBorders>
+            <w:tcMar>
+              <w:top w:type="dxa" w:w="60"/>
+              <w:left w:type="dxa" w:w="100"/>
+              <w:bottom w:type="dxa" w:w="60"/>
+              <w:right w:type="dxa" w:w="100"/>
+            </w:tcMar>
+          </w:tcPr>
+          <w:p>
+            <w:r>
+              <w:rPr>
+                <w:color w:val="0A0A0A"/>
+                <w:sz w:val="18"/>
+                <w:szCs w:val="18"/>
+              </w:rPr>
+              <w:t xml:space="preserve">Phone first so no rider pays for hardware; the clip adds crash-grade data for motorbike riders; a 200 g sensor is next.</w:t>
+            </w:r>
+          </w:p>
+        </w:tc>
+      </w:tr>
+      <w:tr>
+        <w:trPr>
+          <w:cantSplit/>
+          <w:tblHeader w:val="off"/>
+        </w:trPr>
+        <w:tc>
+          <w:tcPr>
+            <w:tcW w:type="dxa" w:w="7362"/>
+            <w:tcBorders>
+              <w:top w:val="single" w:color="C9C9C4" w:sz="4"/>
+              <w:left w:val="single" w:color="C9C9C4" w:sz="4"/>
+              <w:bottom w:val="single" w:color="C9C9C4" w:sz="4"/>
+              <w:right w:val="single" w:color="C9C9C4" w:sz="4"/>
+            </w:tcBorders>
+            <w:tcMar>
+              <w:top w:type="dxa" w:w="60"/>
+              <w:left w:type="dxa" w:w="100"/>
+              <w:bottom w:type="dxa" w:w="60"/>
+              <w:right w:type="dxa" w:w="100"/>
+            </w:tcMar>
+          </w:tcPr>
+          <w:p>
+            <w:r>
+              <w:rPr>
+                <w:color w:val="0A0A0A"/>
+                <w:sz w:val="18"/>
+                <w:szCs w:val="18"/>
+              </w:rPr>
+              <w:t xml:space="preserve">Hong Kong is small. Why here? (Alysa)</w:t>
+            </w:r>
+          </w:p>
+        </w:tc>
+        <w:tc>
+          <w:tcPr>
+            <w:tcW w:type="dxa" w:w="7476"/>
+            <w:tcBorders>
+              <w:top w:val="single" w:color="C9C9C4" w:sz="4"/>
+              <w:left w:val="single" w:color="C9C9C4" w:sz="4"/>
+              <w:bottom w:val="single" w:color="C9C9C4" w:sz="4"/>
+              <w:right w:val="single" w:color="C9C9C4" w:sz="4"/>
+            </w:tcBorders>
+            <w:tcMar>
+              <w:top w:type="dxa" w:w="60"/>
+              <w:left w:type="dxa" w:w="100"/>
+              <w:bottom w:type="dxa" w:w="60"/>
+              <w:right w:type="dxa" w:w="100"/>
+            </w:tcMar>
+          </w:tcPr>
+          <w:p>
+            <w:r>
+              <w:rPr>
+                <w:color w:val="0A0A0A"/>
+                <w:sz w:val="18"/>
+                <w:szCs w:val="18"/>
+              </w:rPr>
+              <w:t xml:space="preserve">The first no-fault platform regime with multi-app apportionment is being written here. The market is the mainland scheme and Singapore's.</w:t>
+            </w:r>
+          </w:p>
+        </w:tc>
+      </w:tr>
+      <w:tr>
+        <w:trPr>
+          <w:cantSplit/>
+          <w:tblHeader w:val="off"/>
+        </w:trPr>
+        <w:tc>
+          <w:tcPr>
+            <w:tcW w:type="dxa" w:w="7362"/>
+            <w:tcBorders>
+              <w:top w:val="single" w:color="C9C9C4" w:sz="4"/>
+              <w:left w:val="single" w:color="C9C9C4" w:sz="4"/>
+              <w:bottom w:val="single" w:color="C9C9C4" w:sz="4"/>
+              <w:right w:val="single" w:color="C9C9C4" w:sz="4"/>
+            </w:tcBorders>
+            <w:tcMar>
+              <w:top w:type="dxa" w:w="60"/>
+              <w:left w:type="dxa" w:w="100"/>
+              <w:bottom w:type="dxa" w:w="60"/>
+              <w:right w:type="dxa" w:w="100"/>
+            </w:tcMar>
+          </w:tcPr>
+          <w:p>
+            <w:r>
+              <w:rPr>
+                <w:color w:val="0A0A0A"/>
+                <w:sz w:val="18"/>
+                <w:szCs w:val="18"/>
+              </w:rPr>
+              <w:t xml:space="preserve">Your earlier statement cited 13%. Where did it go? (Karina)</w:t>
+            </w:r>
+          </w:p>
+        </w:tc>
+        <w:tc>
+          <w:tcPr>
+            <w:tcW w:type="dxa" w:w="7476"/>
+            <w:tcBorders>
+              <w:top w:val="single" w:color="C9C9C4" w:sz="4"/>
+              <w:left w:val="single" w:color="C9C9C4" w:sz="4"/>
+              <w:bottom w:val="single" w:color="C9C9C4" w:sz="4"/>
+              <w:right w:val="single" w:color="C9C9C4" w:sz="4"/>
+            </w:tcBorders>
+            <w:tcMar>
+              <w:top w:type="dxa" w:w="60"/>
+              <w:left w:type="dxa" w:w="100"/>
+              <w:bottom w:type="dxa" w:w="60"/>
+              <w:right w:type="dxa" w:w="100"/>
+            </w:tcMar>
+          </w:tcPr>
+          <w:p>
+            <w:r>
+              <w:rPr>
+                <w:color w:val="0A0A0A"/>
+                <w:sz w:val="18"/>
+                <w:szCs w:val="18"/>
+              </w:rPr>
+              <w:t xml:space="preserve">We could not trace its original source, so we replaced it with a sourced figure: 2 of 22 injured riders compensated, HKFTU survey of 168 riders, 2021.</w:t>
+            </w:r>
+          </w:p>
+        </w:tc>
+      </w:tr>
+    </w:tbl>
+    <w:p>
+      <w:pPr>
+        <w:spacing w:after="120"/>
+      </w:pPr>
     </w:p>
     <w:p>
       <w:pPr>

</xml_diff>

<commit_message>
Replace placeholder money with a sourced insurance model, answer Imperial's feedback
- insurance_model.py: tier one HK$5,450 (half a month of average rider income, Labour Department survey), premium about HK$85 a rider a month, Hong Kong pilot revenue about HK$0.66m a year with a low to high range
- Parametric conditions, how Metrics connects to a licensed insurer, and the Hong Kong regulatory pathway (Cap 41, ECO s31, Insurtech Sandbox)
- Site, README, script and Q&A use the sourced values; mainland figures updated to 37.27m insured at 0.07 yuan per order
- IMPERIAL_FEEDBACK.md: STEMB, validation, insurance, and privacy and consent mapped to the PDPO principles, plus the 13% correction
</commit_message>
<xml_diff>
--- a/docs/submission/VIDEO_SCRIPT.docx
+++ b/docs/submission/VIDEO_SCRIPT.docx
@@ -3630,7 +3630,7 @@
                 <w:sz w:val="18"/>
                 <w:szCs w:val="18"/>
               </w:rPr>
-              <w:t xml:space="preserve">"The market is next door. China's scheme already covers twelve million riders, with flat premiums and claims checked by hand. Singapore made cover compulsory in 2025."</w:t>
+              <w:t xml:space="preserve">"The market is next door. China's scheme already insures thirty-seven million platform workers, at a flat rate per order, with claims checked by hand. Singapore made cover compulsory in 2025."</w:t>
             </w:r>
           </w:p>
         </w:tc>
@@ -3657,7 +3657,7 @@
                 <w:sz w:val="18"/>
                 <w:szCs w:val="18"/>
               </w:rPr>
-              <w:t xml:space="preserve">Bar chart: 12.3M mainland riders covered, 14 platforms, Meituan over 3bn yuan paid in. Sources: Asia Insurance Review; China Daily; Singapore MOM</w:t>
+              <w:t xml:space="preserve">Bar chart: 37.27M insured, 108.7bn orders, 0.07 yuan per delivery order. Sources: SCIO briefing via Xinhua Finance, Oct 2026; MOHRSS 2025 No. 24; Singapore MOM</w:t>
             </w:r>
           </w:p>
         </w:tc>
@@ -3744,7 +3744,7 @@
                 <w:sz w:val="18"/>
                 <w:szCs w:val="18"/>
               </w:rPr>
-              <w:t xml:space="preserve">"Revenue: per rider per month plus per verified event. Hong Kong pilot: low single-digit HK$ millions a year [modelled]."</w:t>
+              <w:t xml:space="preserve">"Premium about HK$85 a rider a month. Our revenue: a share of it. Hong Kong pilot about HK$0.66m a year, range 0.08m to 10.1m [modelled from sourced inputs]." Source: docs/research/INSURANCE_MODEL.md</w:t>
             </w:r>
           </w:p>
         </w:tc>
@@ -5077,7 +5077,7 @@
                 <w:sz w:val="18"/>
                 <w:szCs w:val="18"/>
               </w:rPr>
-              <w:t xml:space="preserve">Placeholder amounts</w:t>
+              <w:t xml:space="preserve">Modelled amounts: HK$5,450 tier one, half a month of average rider income</w:t>
             </w:r>
           </w:p>
         </w:tc>
@@ -11299,7 +11299,7 @@
                 <w:sz w:val="18"/>
                 <w:szCs w:val="18"/>
               </w:rPr>
-              <w:t xml:space="preserve">Payout and premium are derived from sourced inputs (rider earnings, injury rates, statutory amounts) with a low, central and high range in docs/research/INSURANCE_MODEL.md. Our own fee is a pricing choice and labelled as such.</w:t>
+              <w:t xml:space="preserve">They are modelled from sourced inputs, with a low, central and high case (docs/research/insurance_model.py). Tier one HK$5,450 is half a month of average rider income (HK$10,900, Labour Department survey). The premium comes from injury rates and statutory amounts: about HK$85 a rider a month. Our fee, 5% of premium in the central case, is a pricing choice because no public comparable exists.</w:t>
             </w:r>
           </w:p>
         </w:tc>
@@ -11951,7 +11951,7 @@
         </w:numPr>
       </w:pPr>
       <w:r>
-        <w:t xml:space="preserve">"Synthetic crash window" and "Placeholder amounts" captioned in Part 4; face circle never covers a number</w:t>
+        <w:t xml:space="preserve">"Synthetic crash window" and "Modelled amounts" captioned in Part 4; face circle never covers a number</w:t>
       </w:r>
     </w:p>
     <w:p>

</xml_diff>

<commit_message>
Video script: plainer Part 6
</commit_message>
<xml_diff>
--- a/docs/submission/VIDEO_SCRIPT.docx
+++ b/docs/submission/VIDEO_SCRIPT.docx
@@ -7207,7 +7207,7 @@
                 <w:sz w:val="18"/>
                 <w:szCs w:val="18"/>
               </w:rPr>
-              <w:t xml:space="preserve">Our biggest limit: we trained on volunteers falling onto mats, not road crashes. So riders who opt in can now donate real rides for us to retrain on.</w:t>
+              <w:t xml:space="preserve">Our main limit: we trained on volunteers falling onto mats, not on road crashes. Riders who opt in can now share real rides, so we can retrain on real data.</w:t>
             </w:r>
           </w:p>
         </w:tc>
@@ -7348,7 +7348,7 @@
                 <w:sz w:val="18"/>
                 <w:szCs w:val="18"/>
               </w:rPr>
-              <w:t xml:space="preserve">Will it cry wolf? About ten false alarms an hour of phone handling, one every five hours of real riding. Every alarm cancels in thirty seconds.</w:t>
+              <w:t xml:space="preserve">False alarms: about ten an hour of everyday phone use, and one every five hours on real motorbike rides. Every alarm can be cancelled within thirty seconds.</w:t>
             </w:r>
           </w:p>
         </w:tc>
@@ -7489,7 +7489,7 @@
                 <w:sz w:val="18"/>
                 <w:szCs w:val="18"/>
               </w:rPr>
-              <w:t xml:space="preserve">Imperial asked us for drop test evidence. The protocol is written; we run it before the final and demo it live.</w:t>
+              <w:t xml:space="preserve">Imperial asked us for drop tests. The protocol is written. We will run it on the helmet before the final and show it live.</w:t>
             </w:r>
           </w:p>
         </w:tc>
@@ -7630,7 +7630,7 @@
                 <w:sz w:val="18"/>
                 <w:szCs w:val="18"/>
               </w:rPr>
-              <w:t xml:space="preserve">It never diagnoses, and it can't be turned against riders: they opt in each shift and own their record. No routes, no risk score.</w:t>
+              <w:t xml:space="preserve">It does not diagnose, and it cannot be used against riders. They opt in each shift and own their record. There is no route history and no risk score.</w:t>
             </w:r>
           </w:p>
         </w:tc>
@@ -7771,7 +7771,7 @@
                 <w:sz w:val="18"/>
                 <w:szCs w:val="18"/>
               </w:rPr>
-              <w:t xml:space="preserve">We are not an insurer, and no insurer has signed with us yet. A licensed insurer writes the cover; we supply the trigger: a verified crash that nobody cancelled.</w:t>
+              <w:t xml:space="preserve">We are not an insurer, and no insurer has signed with us yet. A licensed insurer provides the cover. We provide the trigger: a verified crash that nobody cancelled.</w:t>
             </w:r>
           </w:p>
         </w:tc>
@@ -7912,7 +7912,7 @@
                 <w:sz w:val="18"/>
                 <w:szCs w:val="18"/>
               </w:rPr>
-              <w:t xml:space="preserve">It adds to statutory compensation, never replaces it. Next, a licensed insurer takes us into the Insurance Authority's sandbox as its technology partner.</w:t>
+              <w:t xml:space="preserve">This adds to statutory compensation and never replaces it. Our next step is to enter the Insurance Authority's sandbox with an insurer.</w:t>
             </w:r>
           </w:p>
         </w:tc>
@@ -8053,7 +8053,7 @@
                 <w:sz w:val="18"/>
                 <w:szCs w:val="18"/>
               </w:rPr>
-              <w:t xml:space="preserve">Then outdoor workers in the heat, and the mainland and Singapore schemes. One record for all of them.</w:t>
+              <w:t xml:space="preserve">After that: outdoor workers in the heat, and the schemes in mainland China and Singapore.</w:t>
             </w:r>
           </w:p>
         </w:tc>

</xml_diff>

<commit_message>
Video script: Part 6 leads with what is built and measured
</commit_message>
<xml_diff>
--- a/docs/submission/VIDEO_SCRIPT.docx
+++ b/docs/submission/VIDEO_SCRIPT.docx
@@ -7207,7 +7207,7 @@
                 <w:sz w:val="18"/>
                 <w:szCs w:val="18"/>
               </w:rPr>
-              <w:t xml:space="preserve">Our main limit: we trained on volunteers falling onto mats, not on road crashes. Riders who opt in can now share real rides, so we can retrain on real data.</w:t>
+              <w:t xml:space="preserve">We trained on public fall data and tested on over eighteen hundred hours of real riding. Research mode now lets riders share their own rides, so we can retrain on road data.</w:t>
             </w:r>
           </w:p>
         </w:tc>
@@ -7234,7 +7234,7 @@
                 <w:sz w:val="18"/>
                 <w:szCs w:val="18"/>
               </w:rPr>
-              <w:t xml:space="preserve">"Simulated falls. Real rides next." Research mode toggle on /rider</w:t>
+              <w:t xml:space="preserve">"1,865 hours of real riding tested. Research mode live." Research mode toggle on /rider</w:t>
             </w:r>
           </w:p>
         </w:tc>
@@ -7348,7 +7348,7 @@
                 <w:sz w:val="18"/>
                 <w:szCs w:val="18"/>
               </w:rPr>
-              <w:t xml:space="preserve">False alarms: about ten an hour of everyday phone use, and one every five hours on real motorbike rides. Every alarm can be cancelled within thirty seconds.</w:t>
+              <w:t xml:space="preserve">Retraining nearly halved our false alarms. On real motorbike rides it is one every five hours, and any alarm can be cancelled within thirty seconds.</w:t>
             </w:r>
           </w:p>
         </w:tc>
@@ -7489,7 +7489,7 @@
                 <w:sz w:val="18"/>
                 <w:szCs w:val="18"/>
               </w:rPr>
-              <w:t xml:space="preserve">Imperial asked us for drop tests. The protocol is written. We will run it on the helmet before the final and show it live.</w:t>
+              <w:t xml:space="preserve">Following Imperial's feedback, the drop test protocol and data pipeline are ready, and helmet results will be in for the final, next to a live demo.</w:t>
             </w:r>
           </w:p>
         </w:tc>
@@ -7630,7 +7630,7 @@
                 <w:sz w:val="18"/>
                 <w:szCs w:val="18"/>
               </w:rPr>
-              <w:t xml:space="preserve">It does not diagnose, and it cannot be used against riders. They opt in each shift and own their record. There is no route history and no risk score.</w:t>
+              <w:t xml:space="preserve">Privacy is built in, not added on. Riders opt in each shift and own a signed copy of every record. No route history, no risk score. It supports triage; it never diagnoses.</w:t>
             </w:r>
           </w:p>
         </w:tc>
@@ -7771,7 +7771,7 @@
                 <w:sz w:val="18"/>
                 <w:szCs w:val="18"/>
               </w:rPr>
-              <w:t xml:space="preserve">We are not an insurer, and no insurer has signed with us yet. A licensed insurer provides the cover. We provide the trigger: a verified crash that nobody cancelled.</w:t>
+              <w:t xml:space="preserve">The insurance side is mapped end to end. A licensed insurer provides the cover, and we provide the trigger: a verified crash nobody cancelled, priced on sourced Hong Kong data.</w:t>
             </w:r>
           </w:p>
         </w:tc>
@@ -7912,7 +7912,7 @@
                 <w:sz w:val="18"/>
                 <w:szCs w:val="18"/>
               </w:rPr>
-              <w:t xml:space="preserve">This adds to statutory compensation and never replaces it. Our next step is to enter the Insurance Authority's sandbox with an insurer.</w:t>
+              <w:t xml:space="preserve">It sits on top of statutory compensation, and our route to market is the Insurance Authority's sandbox, which is built for insurers and technology partners like us.</w:t>
             </w:r>
           </w:p>
         </w:tc>
@@ -7939,7 +7939,7 @@
                 <w:sz w:val="18"/>
                 <w:szCs w:val="18"/>
               </w:rPr>
-              <w:t xml:space="preserve">"Tier one on top of statutory rights. Next: Insurtech Sandbox pilot."</w:t>
+              <w:t xml:space="preserve">"On top of statutory rights. Route to market: IA Insurtech Sandbox."</w:t>
             </w:r>
           </w:p>
         </w:tc>
@@ -8053,7 +8053,7 @@
                 <w:sz w:val="18"/>
                 <w:szCs w:val="18"/>
               </w:rPr>
-              <w:t xml:space="preserve">After that: outdoor workers in the heat, and the schemes in mainland China and Singapore.</w:t>
+              <w:t xml:space="preserve">And the same record extends to outdoor workers in the heat, and to the schemes in mainland China and Singapore.</w:t>
             </w:r>
           </w:p>
         </w:tc>

</xml_diff>

<commit_message>
Video script: timings for the longer Part 6
</commit_message>
<xml_diff>
--- a/docs/submission/VIDEO_SCRIPT.docx
+++ b/docs/submission/VIDEO_SCRIPT.docx
@@ -23,7 +23,7 @@
         <w:spacing w:after="120"/>
       </w:pPr>
       <w:r>
-        <w:t xml:space="preserve">Hard limit 4:30. Target 4:20. English. Burned-in subtitles on every spoken line. Every member speaks at least twice.</w:t>
+        <w:t xml:space="preserve">Hard limit 4:30. Target 4:27. If the cut runs long, shorten line 10 or 13 first. English. Burned-in subtitles on every spoken line. Every member speaks at least twice.</w:t>
       </w:r>
     </w:p>
     <w:p>
@@ -803,7 +803,7 @@
                 <w:sz w:val="18"/>
                 <w:szCs w:val="18"/>
               </w:rPr>
-              <w:t xml:space="preserve">3:05 to 4:12</w:t>
+              <w:t xml:space="preserve">3:05 to 4:19</w:t>
             </w:r>
           </w:p>
         </w:tc>
@@ -917,7 +917,7 @@
                 <w:sz w:val="18"/>
                 <w:szCs w:val="18"/>
               </w:rPr>
-              <w:t xml:space="preserve">4:12 to 4:20</w:t>
+              <w:t xml:space="preserve">4:19 to 4:27</w:t>
             </w:r>
           </w:p>
         </w:tc>
@@ -6939,7 +6939,7 @@
         <w:pStyle w:val="Heading1"/>
       </w:pPr>
       <w:r>
-        <w:t xml:space="preserve">Part 6. Limits, risks and what comes next (3:05 to 4:12)</w:t>
+        <w:t xml:space="preserve">Part 6. Limits, risks and what comes next (3:05 to 4:19)</w:t>
       </w:r>
     </w:p>
     <w:p>
@@ -8123,7 +8123,7 @@
         <w:spacing w:after="120"/>
       </w:pPr>
       <w:r>
-        <w:t xml:space="preserve">About 170 words, 67 seconds. Lines 14 and 15 run about 10 seconds each; that is fine here.</w:t>
+        <w:t xml:space="preserve">About 190 words, 74 seconds. Lines 14 and 15 run about 10 seconds each; that is fine here.</w:t>
       </w:r>
     </w:p>
     <w:p>
@@ -8131,7 +8131,7 @@
         <w:pStyle w:val="Heading1"/>
       </w:pPr>
       <w:r>
-        <w:t xml:space="preserve">Part 7. End card (4:12 to 4:20)</w:t>
+        <w:t xml:space="preserve">Part 7. End card (4:19 to 4:27)</w:t>
       </w:r>
     </w:p>
     <w:p>

</xml_diff>

<commit_message>
Video script: Part 6 cut to four lines answering Imperial's feedback
</commit_message>
<xml_diff>
--- a/docs/submission/VIDEO_SCRIPT.docx
+++ b/docs/submission/VIDEO_SCRIPT.docx
@@ -23,7 +23,7 @@
         <w:spacing w:after="120"/>
       </w:pPr>
       <w:r>
-        <w:t xml:space="preserve">Hard limit 4:30. Target 4:27. If the cut runs long, shorten line 10 or 13 first. English. Burned-in subtitles on every spoken line. Every member speaks at least twice.</w:t>
+        <w:t xml:space="preserve">Hard limit 4:30. Target 3:53. English. Burned-in subtitles on every spoken line. Every member speaks at least twice.</w:t>
       </w:r>
     </w:p>
     <w:p>
@@ -47,10 +47,10 @@
         </w:tblBorders>
       </w:tblPr>
       <w:tblGrid>
-        <w:gridCol w:w="2935"/>
-        <w:gridCol w:w="1428"/>
-        <w:gridCol w:w="5237"/>
-        <w:gridCol w:w="5238"/>
+        <w:gridCol w:w="3081"/>
+        <w:gridCol w:w="1459"/>
+        <w:gridCol w:w="5351"/>
+        <w:gridCol w:w="4947"/>
       </w:tblGrid>
       <w:tr>
         <w:trPr>
@@ -59,7 +59,7 @@
         </w:trPr>
         <w:tc>
           <w:tcPr>
-            <w:tcW w:type="dxa" w:w="2935"/>
+            <w:tcW w:type="dxa" w:w="3081"/>
             <w:tcBorders>
               <w:top w:val="single" w:color="C9C9C4" w:sz="4"/>
               <w:left w:val="single" w:color="C9C9C4" w:sz="4"/>
@@ -89,7 +89,7 @@
         </w:tc>
         <w:tc>
           <w:tcPr>
-            <w:tcW w:type="dxa" w:w="1428"/>
+            <w:tcW w:type="dxa" w:w="1459"/>
             <w:tcBorders>
               <w:top w:val="single" w:color="C9C9C4" w:sz="4"/>
               <w:left w:val="single" w:color="C9C9C4" w:sz="4"/>
@@ -119,7 +119,7 @@
         </w:tc>
         <w:tc>
           <w:tcPr>
-            <w:tcW w:type="dxa" w:w="5237"/>
+            <w:tcW w:type="dxa" w:w="5351"/>
             <w:tcBorders>
               <w:top w:val="single" w:color="C9C9C4" w:sz="4"/>
               <w:left w:val="single" w:color="C9C9C4" w:sz="4"/>
@@ -149,7 +149,7 @@
         </w:tc>
         <w:tc>
           <w:tcPr>
-            <w:tcW w:type="dxa" w:w="5238"/>
+            <w:tcW w:type="dxa" w:w="4947"/>
             <w:tcBorders>
               <w:top w:val="single" w:color="C9C9C4" w:sz="4"/>
               <w:left w:val="single" w:color="C9C9C4" w:sz="4"/>
@@ -185,7 +185,7 @@
         </w:trPr>
         <w:tc>
           <w:tcPr>
-            <w:tcW w:type="dxa" w:w="2935"/>
+            <w:tcW w:type="dxa" w:w="3081"/>
             <w:tcBorders>
               <w:top w:val="single" w:color="C9C9C4" w:sz="4"/>
               <w:left w:val="single" w:color="C9C9C4" w:sz="4"/>
@@ -212,7 +212,7 @@
         </w:tc>
         <w:tc>
           <w:tcPr>
-            <w:tcW w:type="dxa" w:w="1428"/>
+            <w:tcW w:type="dxa" w:w="1459"/>
             <w:tcBorders>
               <w:top w:val="single" w:color="C9C9C4" w:sz="4"/>
               <w:left w:val="single" w:color="C9C9C4" w:sz="4"/>
@@ -239,7 +239,7 @@
         </w:tc>
         <w:tc>
           <w:tcPr>
-            <w:tcW w:type="dxa" w:w="5237"/>
+            <w:tcW w:type="dxa" w:w="5351"/>
             <w:tcBorders>
               <w:top w:val="single" w:color="C9C9C4" w:sz="4"/>
               <w:left w:val="single" w:color="C9C9C4" w:sz="4"/>
@@ -266,7 +266,7 @@
         </w:tc>
         <w:tc>
           <w:tcPr>
-            <w:tcW w:type="dxa" w:w="5238"/>
+            <w:tcW w:type="dxa" w:w="4947"/>
             <w:tcBorders>
               <w:top w:val="single" w:color="C9C9C4" w:sz="4"/>
               <w:left w:val="single" w:color="C9C9C4" w:sz="4"/>
@@ -299,7 +299,7 @@
         </w:trPr>
         <w:tc>
           <w:tcPr>
-            <w:tcW w:type="dxa" w:w="2935"/>
+            <w:tcW w:type="dxa" w:w="3081"/>
             <w:tcBorders>
               <w:top w:val="single" w:color="C9C9C4" w:sz="4"/>
               <w:left w:val="single" w:color="C9C9C4" w:sz="4"/>
@@ -326,7 +326,7 @@
         </w:tc>
         <w:tc>
           <w:tcPr>
-            <w:tcW w:type="dxa" w:w="1428"/>
+            <w:tcW w:type="dxa" w:w="1459"/>
             <w:tcBorders>
               <w:top w:val="single" w:color="C9C9C4" w:sz="4"/>
               <w:left w:val="single" w:color="C9C9C4" w:sz="4"/>
@@ -353,7 +353,7 @@
         </w:tc>
         <w:tc>
           <w:tcPr>
-            <w:tcW w:type="dxa" w:w="5237"/>
+            <w:tcW w:type="dxa" w:w="5351"/>
             <w:tcBorders>
               <w:top w:val="single" w:color="C9C9C4" w:sz="4"/>
               <w:left w:val="single" w:color="C9C9C4" w:sz="4"/>
@@ -380,7 +380,7 @@
         </w:tc>
         <w:tc>
           <w:tcPr>
-            <w:tcW w:type="dxa" w:w="5238"/>
+            <w:tcW w:type="dxa" w:w="4947"/>
             <w:tcBorders>
               <w:top w:val="single" w:color="C9C9C4" w:sz="4"/>
               <w:left w:val="single" w:color="C9C9C4" w:sz="4"/>
@@ -413,7 +413,7 @@
         </w:trPr>
         <w:tc>
           <w:tcPr>
-            <w:tcW w:type="dxa" w:w="2935"/>
+            <w:tcW w:type="dxa" w:w="3081"/>
             <w:tcBorders>
               <w:top w:val="single" w:color="C9C9C4" w:sz="4"/>
               <w:left w:val="single" w:color="C9C9C4" w:sz="4"/>
@@ -440,7 +440,7 @@
         </w:tc>
         <w:tc>
           <w:tcPr>
-            <w:tcW w:type="dxa" w:w="1428"/>
+            <w:tcW w:type="dxa" w:w="1459"/>
             <w:tcBorders>
               <w:top w:val="single" w:color="C9C9C4" w:sz="4"/>
               <w:left w:val="single" w:color="C9C9C4" w:sz="4"/>
@@ -467,7 +467,7 @@
         </w:tc>
         <w:tc>
           <w:tcPr>
-            <w:tcW w:type="dxa" w:w="5237"/>
+            <w:tcW w:type="dxa" w:w="5351"/>
             <w:tcBorders>
               <w:top w:val="single" w:color="C9C9C4" w:sz="4"/>
               <w:left w:val="single" w:color="C9C9C4" w:sz="4"/>
@@ -494,7 +494,7 @@
         </w:tc>
         <w:tc>
           <w:tcPr>
-            <w:tcW w:type="dxa" w:w="5238"/>
+            <w:tcW w:type="dxa" w:w="4947"/>
             <w:tcBorders>
               <w:top w:val="single" w:color="C9C9C4" w:sz="4"/>
               <w:left w:val="single" w:color="C9C9C4" w:sz="4"/>
@@ -527,7 +527,7 @@
         </w:trPr>
         <w:tc>
           <w:tcPr>
-            <w:tcW w:type="dxa" w:w="2935"/>
+            <w:tcW w:type="dxa" w:w="3081"/>
             <w:tcBorders>
               <w:top w:val="single" w:color="C9C9C4" w:sz="4"/>
               <w:left w:val="single" w:color="C9C9C4" w:sz="4"/>
@@ -554,7 +554,7 @@
         </w:tc>
         <w:tc>
           <w:tcPr>
-            <w:tcW w:type="dxa" w:w="1428"/>
+            <w:tcW w:type="dxa" w:w="1459"/>
             <w:tcBorders>
               <w:top w:val="single" w:color="C9C9C4" w:sz="4"/>
               <w:left w:val="single" w:color="C9C9C4" w:sz="4"/>
@@ -581,7 +581,7 @@
         </w:tc>
         <w:tc>
           <w:tcPr>
-            <w:tcW w:type="dxa" w:w="5237"/>
+            <w:tcW w:type="dxa" w:w="5351"/>
             <w:tcBorders>
               <w:top w:val="single" w:color="C9C9C4" w:sz="4"/>
               <w:left w:val="single" w:color="C9C9C4" w:sz="4"/>
@@ -608,7 +608,7 @@
         </w:tc>
         <w:tc>
           <w:tcPr>
-            <w:tcW w:type="dxa" w:w="5238"/>
+            <w:tcW w:type="dxa" w:w="4947"/>
             <w:tcBorders>
               <w:top w:val="single" w:color="C9C9C4" w:sz="4"/>
               <w:left w:val="single" w:color="C9C9C4" w:sz="4"/>
@@ -641,7 +641,7 @@
         </w:trPr>
         <w:tc>
           <w:tcPr>
-            <w:tcW w:type="dxa" w:w="2935"/>
+            <w:tcW w:type="dxa" w:w="3081"/>
             <w:tcBorders>
               <w:top w:val="single" w:color="C9C9C4" w:sz="4"/>
               <w:left w:val="single" w:color="C9C9C4" w:sz="4"/>
@@ -668,7 +668,7 @@
         </w:tc>
         <w:tc>
           <w:tcPr>
-            <w:tcW w:type="dxa" w:w="1428"/>
+            <w:tcW w:type="dxa" w:w="1459"/>
             <w:tcBorders>
               <w:top w:val="single" w:color="C9C9C4" w:sz="4"/>
               <w:left w:val="single" w:color="C9C9C4" w:sz="4"/>
@@ -695,7 +695,7 @@
         </w:tc>
         <w:tc>
           <w:tcPr>
-            <w:tcW w:type="dxa" w:w="5237"/>
+            <w:tcW w:type="dxa" w:w="5351"/>
             <w:tcBorders>
               <w:top w:val="single" w:color="C9C9C4" w:sz="4"/>
               <w:left w:val="single" w:color="C9C9C4" w:sz="4"/>
@@ -722,7 +722,7 @@
         </w:tc>
         <w:tc>
           <w:tcPr>
-            <w:tcW w:type="dxa" w:w="5238"/>
+            <w:tcW w:type="dxa" w:w="4947"/>
             <w:tcBorders>
               <w:top w:val="single" w:color="C9C9C4" w:sz="4"/>
               <w:left w:val="single" w:color="C9C9C4" w:sz="4"/>
@@ -755,109 +755,109 @@
         </w:trPr>
         <w:tc>
           <w:tcPr>
-            <w:tcW w:type="dxa" w:w="2935"/>
-            <w:tcBorders>
-              <w:top w:val="single" w:color="C9C9C4" w:sz="4"/>
-              <w:left w:val="single" w:color="C9C9C4" w:sz="4"/>
-              <w:bottom w:val="single" w:color="C9C9C4" w:sz="4"/>
-              <w:right w:val="single" w:color="C9C9C4" w:sz="4"/>
-            </w:tcBorders>
-            <w:tcMar>
-              <w:top w:type="dxa" w:w="60"/>
-              <w:left w:type="dxa" w:w="100"/>
-              <w:bottom w:type="dxa" w:w="60"/>
-              <w:right w:type="dxa" w:w="100"/>
-            </w:tcMar>
-          </w:tcPr>
-          <w:p>
-            <w:r>
-              <w:rPr>
-                <w:color w:val="0A0A0A"/>
-                <w:sz w:val="18"/>
-                <w:szCs w:val="18"/>
-              </w:rPr>
-              <w:t xml:space="preserve">6. Limits, risks and next steps</w:t>
-            </w:r>
-          </w:p>
-        </w:tc>
-        <w:tc>
-          <w:tcPr>
-            <w:tcW w:type="dxa" w:w="1428"/>
-            <w:tcBorders>
-              <w:top w:val="single" w:color="C9C9C4" w:sz="4"/>
-              <w:left w:val="single" w:color="C9C9C4" w:sz="4"/>
-              <w:bottom w:val="single" w:color="C9C9C4" w:sz="4"/>
-              <w:right w:val="single" w:color="C9C9C4" w:sz="4"/>
-            </w:tcBorders>
-            <w:tcMar>
-              <w:top w:type="dxa" w:w="60"/>
-              <w:left w:type="dxa" w:w="100"/>
-              <w:bottom w:type="dxa" w:w="60"/>
-              <w:right w:type="dxa" w:w="100"/>
-            </w:tcMar>
-          </w:tcPr>
-          <w:p>
-            <w:r>
-              <w:rPr>
-                <w:color w:val="0A0A0A"/>
-                <w:sz w:val="18"/>
-                <w:szCs w:val="18"/>
-              </w:rPr>
-              <w:t xml:space="preserve">3:05 to 4:19</w:t>
-            </w:r>
-          </w:p>
-        </w:tc>
-        <w:tc>
-          <w:tcPr>
-            <w:tcW w:type="dxa" w:w="5237"/>
-            <w:tcBorders>
-              <w:top w:val="single" w:color="C9C9C4" w:sz="4"/>
-              <w:left w:val="single" w:color="C9C9C4" w:sz="4"/>
-              <w:bottom w:val="single" w:color="C9C9C4" w:sz="4"/>
-              <w:right w:val="single" w:color="C9C9C4" w:sz="4"/>
-            </w:tcBorders>
-            <w:tcMar>
-              <w:top w:type="dxa" w:w="60"/>
-              <w:left w:type="dxa" w:w="100"/>
-              <w:bottom w:type="dxa" w:w="60"/>
-              <w:right w:type="dxa" w:w="100"/>
-            </w:tcMar>
-          </w:tcPr>
-          <w:p>
-            <w:r>
-              <w:rPr>
-                <w:color w:val="0A0A0A"/>
-                <w:sz w:val="18"/>
-                <w:szCs w:val="18"/>
-              </w:rPr>
-              <w:t xml:space="preserve">Team relay: limits, top three barriers, ethics, insurer pathway, answers to Imperial feedback</w:t>
-            </w:r>
-          </w:p>
-        </w:tc>
-        <w:tc>
-          <w:tcPr>
-            <w:tcW w:type="dxa" w:w="5238"/>
-            <w:tcBorders>
-              <w:top w:val="single" w:color="C9C9C4" w:sz="4"/>
-              <w:left w:val="single" w:color="C9C9C4" w:sz="4"/>
-              <w:bottom w:val="single" w:color="C9C9C4" w:sz="4"/>
-              <w:right w:val="single" w:color="C9C9C4" w:sz="4"/>
-            </w:tcBorders>
-            <w:tcMar>
-              <w:top w:type="dxa" w:w="60"/>
-              <w:left w:type="dxa" w:w="100"/>
-              <w:bottom w:type="dxa" w:w="60"/>
-              <w:right w:type="dxa" w:w="100"/>
-            </w:tcMar>
-          </w:tcPr>
-          <w:p>
-            <w:r>
-              <w:rPr>
-                <w:color w:val="0A0A0A"/>
-                <w:sz w:val="18"/>
-                <w:szCs w:val="18"/>
-              </w:rPr>
-              <w:t xml:space="preserve">Validation, risk register, ethics, translation, research integrity</w:t>
+            <w:tcW w:type="dxa" w:w="3081"/>
+            <w:tcBorders>
+              <w:top w:val="single" w:color="C9C9C4" w:sz="4"/>
+              <w:left w:val="single" w:color="C9C9C4" w:sz="4"/>
+              <w:bottom w:val="single" w:color="C9C9C4" w:sz="4"/>
+              <w:right w:val="single" w:color="C9C9C4" w:sz="4"/>
+            </w:tcBorders>
+            <w:tcMar>
+              <w:top w:type="dxa" w:w="60"/>
+              <w:left w:type="dxa" w:w="100"/>
+              <w:bottom w:type="dxa" w:w="60"/>
+              <w:right w:type="dxa" w:w="100"/>
+            </w:tcMar>
+          </w:tcPr>
+          <w:p>
+            <w:r>
+              <w:rPr>
+                <w:color w:val="0A0A0A"/>
+                <w:sz w:val="18"/>
+                <w:szCs w:val="18"/>
+              </w:rPr>
+              <w:t xml:space="preserve">6. Answering Imperial's feedback</w:t>
+            </w:r>
+          </w:p>
+        </w:tc>
+        <w:tc>
+          <w:tcPr>
+            <w:tcW w:type="dxa" w:w="1459"/>
+            <w:tcBorders>
+              <w:top w:val="single" w:color="C9C9C4" w:sz="4"/>
+              <w:left w:val="single" w:color="C9C9C4" w:sz="4"/>
+              <w:bottom w:val="single" w:color="C9C9C4" w:sz="4"/>
+              <w:right w:val="single" w:color="C9C9C4" w:sz="4"/>
+            </w:tcBorders>
+            <w:tcMar>
+              <w:top w:type="dxa" w:w="60"/>
+              <w:left w:type="dxa" w:w="100"/>
+              <w:bottom w:type="dxa" w:w="60"/>
+              <w:right w:type="dxa" w:w="100"/>
+            </w:tcMar>
+          </w:tcPr>
+          <w:p>
+            <w:r>
+              <w:rPr>
+                <w:color w:val="0A0A0A"/>
+                <w:sz w:val="18"/>
+                <w:szCs w:val="18"/>
+              </w:rPr>
+              <w:t xml:space="preserve">3:05 to 3:45</w:t>
+            </w:r>
+          </w:p>
+        </w:tc>
+        <w:tc>
+          <w:tcPr>
+            <w:tcW w:type="dxa" w:w="5351"/>
+            <w:tcBorders>
+              <w:top w:val="single" w:color="C9C9C4" w:sz="4"/>
+              <w:left w:val="single" w:color="C9C9C4" w:sz="4"/>
+              <w:bottom w:val="single" w:color="C9C9C4" w:sz="4"/>
+              <w:right w:val="single" w:color="C9C9C4" w:sz="4"/>
+            </w:tcBorders>
+            <w:tcMar>
+              <w:top w:type="dxa" w:w="60"/>
+              <w:left w:type="dxa" w:w="100"/>
+              <w:bottom w:type="dxa" w:w="60"/>
+              <w:right w:type="dxa" w:w="100"/>
+            </w:tcMar>
+          </w:tcPr>
+          <w:p>
+            <w:r>
+              <w:rPr>
+                <w:color w:val="0A0A0A"/>
+                <w:sz w:val="18"/>
+                <w:szCs w:val="18"/>
+              </w:rPr>
+              <w:t xml:space="preserve">Four lines: validation, drop tests, data privacy, insurance mechanism</w:t>
+            </w:r>
+          </w:p>
+        </w:tc>
+        <w:tc>
+          <w:tcPr>
+            <w:tcW w:type="dxa" w:w="4947"/>
+            <w:tcBorders>
+              <w:top w:val="single" w:color="C9C9C4" w:sz="4"/>
+              <w:left w:val="single" w:color="C9C9C4" w:sz="4"/>
+              <w:bottom w:val="single" w:color="C9C9C4" w:sz="4"/>
+              <w:right w:val="single" w:color="C9C9C4" w:sz="4"/>
+            </w:tcBorders>
+            <w:tcMar>
+              <w:top w:type="dxa" w:w="60"/>
+              <w:left w:type="dxa" w:w="100"/>
+              <w:bottom w:type="dxa" w:w="60"/>
+              <w:right w:type="dxa" w:w="100"/>
+            </w:tcMar>
+          </w:tcPr>
+          <w:p>
+            <w:r>
+              <w:rPr>
+                <w:color w:val="0A0A0A"/>
+                <w:sz w:val="18"/>
+                <w:szCs w:val="18"/>
+              </w:rPr>
+              <w:t xml:space="preserve">Validation, ethics, translation, research integrity</w:t>
             </w:r>
           </w:p>
         </w:tc>
@@ -869,7 +869,7 @@
         </w:trPr>
         <w:tc>
           <w:tcPr>
-            <w:tcW w:type="dxa" w:w="2935"/>
+            <w:tcW w:type="dxa" w:w="3081"/>
             <w:tcBorders>
               <w:top w:val="single" w:color="C9C9C4" w:sz="4"/>
               <w:left w:val="single" w:color="C9C9C4" w:sz="4"/>
@@ -896,34 +896,34 @@
         </w:tc>
         <w:tc>
           <w:tcPr>
-            <w:tcW w:type="dxa" w:w="1428"/>
-            <w:tcBorders>
-              <w:top w:val="single" w:color="C9C9C4" w:sz="4"/>
-              <w:left w:val="single" w:color="C9C9C4" w:sz="4"/>
-              <w:bottom w:val="single" w:color="C9C9C4" w:sz="4"/>
-              <w:right w:val="single" w:color="C9C9C4" w:sz="4"/>
-            </w:tcBorders>
-            <w:tcMar>
-              <w:top w:type="dxa" w:w="60"/>
-              <w:left w:type="dxa" w:w="100"/>
-              <w:bottom w:type="dxa" w:w="60"/>
-              <w:right w:type="dxa" w:w="100"/>
-            </w:tcMar>
-          </w:tcPr>
-          <w:p>
-            <w:r>
-              <w:rPr>
-                <w:color w:val="0A0A0A"/>
-                <w:sz w:val="18"/>
-                <w:szCs w:val="18"/>
-              </w:rPr>
-              <w:t xml:space="preserve">4:19 to 4:27</w:t>
-            </w:r>
-          </w:p>
-        </w:tc>
-        <w:tc>
-          <w:tcPr>
-            <w:tcW w:type="dxa" w:w="5237"/>
+            <w:tcW w:type="dxa" w:w="1459"/>
+            <w:tcBorders>
+              <w:top w:val="single" w:color="C9C9C4" w:sz="4"/>
+              <w:left w:val="single" w:color="C9C9C4" w:sz="4"/>
+              <w:bottom w:val="single" w:color="C9C9C4" w:sz="4"/>
+              <w:right w:val="single" w:color="C9C9C4" w:sz="4"/>
+            </w:tcBorders>
+            <w:tcMar>
+              <w:top w:type="dxa" w:w="60"/>
+              <w:left w:type="dxa" w:w="100"/>
+              <w:bottom w:type="dxa" w:w="60"/>
+              <w:right w:type="dxa" w:w="100"/>
+            </w:tcMar>
+          </w:tcPr>
+          <w:p>
+            <w:r>
+              <w:rPr>
+                <w:color w:val="0A0A0A"/>
+                <w:sz w:val="18"/>
+                <w:szCs w:val="18"/>
+              </w:rPr>
+              <w:t xml:space="preserve">3:45 to 3:53</w:t>
+            </w:r>
+          </w:p>
+        </w:tc>
+        <w:tc>
+          <w:tcPr>
+            <w:tcW w:type="dxa" w:w="5351"/>
             <w:tcBorders>
               <w:top w:val="single" w:color="C9C9C4" w:sz="4"/>
               <w:left w:val="single" w:color="C9C9C4" w:sz="4"/>
@@ -950,7 +950,7 @@
         </w:tc>
         <w:tc>
           <w:tcPr>
-            <w:tcW w:type="dxa" w:w="5238"/>
+            <w:tcW w:type="dxa" w:w="4947"/>
             <w:tcBorders>
               <w:top w:val="single" w:color="C9C9C4" w:sz="4"/>
               <w:left w:val="single" w:color="C9C9C4" w:sz="4"/>
@@ -1023,7 +1023,7 @@
         </w:numPr>
       </w:pPr>
       <w:r>
-        <w:t xml:space="preserve">No line longer than nine seconds in the relays, except lines 14 and 15 in Part 6. Cut on every line.</w:t>
+        <w:t xml:space="preserve">No line longer than nine seconds in the relays, except line 13 in Part 6. Cut on every line.</w:t>
       </w:r>
     </w:p>
     <w:p>
@@ -6939,7 +6939,7 @@
         <w:pStyle w:val="Heading1"/>
       </w:pPr>
       <w:r>
-        <w:t xml:space="preserve">Part 6. Limits, risks and what comes next (3:05 to 4:19)</w:t>
+        <w:t xml:space="preserve">Part 6. Answering Imperial's feedback (3:05 to 3:45)</w:t>
       </w:r>
     </w:p>
     <w:p>
@@ -6947,7 +6947,7 @@
         <w:spacing w:after="120"/>
       </w:pPr>
       <w:r>
-        <w:t xml:space="preserve">Relay, one line each, each person on their own field. A single card behind each line. This part answers, before anyone asks: what the evidence does not prove, the top three barriers (accuracy, rider trust, insurer and regulator), the dual use risk, and each point in Imperial's feedback on our problem statement.</w:t>
+        <w:t xml:space="preserve">Four lines, one for each point Imperial raised on our problem statement: validation, the prototype and drop tests, data privacy and consent, and the insurance mechanism. Each person speaks on their own field. A single card behind each line.</w:t>
       </w:r>
     </w:p>
     <w:tbl>
@@ -6963,11 +6963,11 @@
         </w:tblBorders>
       </w:tblPr>
       <w:tblGrid>
-        <w:gridCol w:w="877"/>
-        <w:gridCol w:w="877"/>
-        <w:gridCol w:w="4360"/>
-        <w:gridCol w:w="4360"/>
-        <w:gridCol w:w="4364"/>
+        <w:gridCol w:w="880"/>
+        <w:gridCol w:w="906"/>
+        <w:gridCol w:w="4606"/>
+        <w:gridCol w:w="4606"/>
+        <w:gridCol w:w="3840"/>
       </w:tblGrid>
       <w:tr>
         <w:trPr>
@@ -6976,7 +6976,7 @@
         </w:trPr>
         <w:tc>
           <w:tcPr>
-            <w:tcW w:type="dxa" w:w="877"/>
+            <w:tcW w:type="dxa" w:w="880"/>
             <w:tcBorders>
               <w:top w:val="single" w:color="C9C9C4" w:sz="4"/>
               <w:left w:val="single" w:color="C9C9C4" w:sz="4"/>
@@ -7006,7 +7006,7 @@
         </w:tc>
         <w:tc>
           <w:tcPr>
-            <w:tcW w:type="dxa" w:w="877"/>
+            <w:tcW w:type="dxa" w:w="906"/>
             <w:tcBorders>
               <w:top w:val="single" w:color="C9C9C4" w:sz="4"/>
               <w:left w:val="single" w:color="C9C9C4" w:sz="4"/>
@@ -7036,7 +7036,7 @@
         </w:tc>
         <w:tc>
           <w:tcPr>
-            <w:tcW w:type="dxa" w:w="4360"/>
+            <w:tcW w:type="dxa" w:w="4606"/>
             <w:tcBorders>
               <w:top w:val="single" w:color="C9C9C4" w:sz="4"/>
               <w:left w:val="single" w:color="C9C9C4" w:sz="4"/>
@@ -7066,7 +7066,7 @@
         </w:tc>
         <w:tc>
           <w:tcPr>
-            <w:tcW w:type="dxa" w:w="4360"/>
+            <w:tcW w:type="dxa" w:w="4606"/>
             <w:tcBorders>
               <w:top w:val="single" w:color="C9C9C4" w:sz="4"/>
               <w:left w:val="single" w:color="C9C9C4" w:sz="4"/>
@@ -7096,7 +7096,7 @@
         </w:tc>
         <w:tc>
           <w:tcPr>
-            <w:tcW w:type="dxa" w:w="4364"/>
+            <w:tcW w:type="dxa" w:w="3840"/>
             <w:tcBorders>
               <w:top w:val="single" w:color="C9C9C4" w:sz="4"/>
               <w:left w:val="single" w:color="C9C9C4" w:sz="4"/>
@@ -7132,7 +7132,7 @@
         </w:trPr>
         <w:tc>
           <w:tcPr>
-            <w:tcW w:type="dxa" w:w="877"/>
+            <w:tcW w:type="dxa" w:w="880"/>
             <w:tcBorders>
               <w:top w:val="single" w:color="C9C9C4" w:sz="4"/>
               <w:left w:val="single" w:color="C9C9C4" w:sz="4"/>
@@ -7159,109 +7159,109 @@
         </w:tc>
         <w:tc>
           <w:tcPr>
-            <w:tcW w:type="dxa" w:w="877"/>
-            <w:tcBorders>
-              <w:top w:val="single" w:color="C9C9C4" w:sz="4"/>
-              <w:left w:val="single" w:color="C9C9C4" w:sz="4"/>
-              <w:bottom w:val="single" w:color="C9C9C4" w:sz="4"/>
-              <w:right w:val="single" w:color="C9C9C4" w:sz="4"/>
-            </w:tcBorders>
-            <w:tcMar>
-              <w:top w:type="dxa" w:w="60"/>
-              <w:left w:type="dxa" w:w="100"/>
-              <w:bottom w:type="dxa" w:w="60"/>
-              <w:right w:type="dxa" w:w="100"/>
-            </w:tcMar>
-          </w:tcPr>
-          <w:p>
-            <w:r>
-              <w:rPr>
-                <w:color w:val="0A0A0A"/>
-                <w:sz w:val="18"/>
-                <w:szCs w:val="18"/>
-              </w:rPr>
-              <w:t xml:space="preserve">Karina</w:t>
-            </w:r>
-          </w:p>
-        </w:tc>
-        <w:tc>
-          <w:tcPr>
-            <w:tcW w:type="dxa" w:w="4360"/>
-            <w:tcBorders>
-              <w:top w:val="single" w:color="C9C9C4" w:sz="4"/>
-              <w:left w:val="single" w:color="C9C9C4" w:sz="4"/>
-              <w:bottom w:val="single" w:color="C9C9C4" w:sz="4"/>
-              <w:right w:val="single" w:color="C9C9C4" w:sz="4"/>
-            </w:tcBorders>
-            <w:tcMar>
-              <w:top w:type="dxa" w:w="60"/>
-              <w:left w:type="dxa" w:w="100"/>
-              <w:bottom w:type="dxa" w:w="60"/>
-              <w:right w:type="dxa" w:w="100"/>
-            </w:tcMar>
-          </w:tcPr>
-          <w:p>
-            <w:r>
-              <w:rPr>
-                <w:color w:val="0A0A0A"/>
-                <w:sz w:val="18"/>
-                <w:szCs w:val="18"/>
-              </w:rPr>
-              <w:t xml:space="preserve">We trained on public fall data and tested on over eighteen hundred hours of real riding. Research mode now lets riders share their own rides, so we can retrain on road data.</w:t>
-            </w:r>
-          </w:p>
-        </w:tc>
-        <w:tc>
-          <w:tcPr>
-            <w:tcW w:type="dxa" w:w="4360"/>
-            <w:tcBorders>
-              <w:top w:val="single" w:color="C9C9C4" w:sz="4"/>
-              <w:left w:val="single" w:color="C9C9C4" w:sz="4"/>
-              <w:bottom w:val="single" w:color="C9C9C4" w:sz="4"/>
-              <w:right w:val="single" w:color="C9C9C4" w:sz="4"/>
-            </w:tcBorders>
-            <w:tcMar>
-              <w:top w:type="dxa" w:w="60"/>
-              <w:left w:type="dxa" w:w="100"/>
-              <w:bottom w:type="dxa" w:w="60"/>
-              <w:right w:type="dxa" w:w="100"/>
-            </w:tcMar>
-          </w:tcPr>
-          <w:p>
-            <w:r>
-              <w:rPr>
-                <w:color w:val="0A0A0A"/>
-                <w:sz w:val="18"/>
-                <w:szCs w:val="18"/>
-              </w:rPr>
-              <w:t xml:space="preserve">"1,865 hours of real riding tested. Research mode live." Research mode toggle on /rider</w:t>
-            </w:r>
-          </w:p>
-        </w:tc>
-        <w:tc>
-          <w:tcPr>
-            <w:tcW w:type="dxa" w:w="4364"/>
-            <w:tcBorders>
-              <w:top w:val="single" w:color="C9C9C4" w:sz="4"/>
-              <w:left w:val="single" w:color="C9C9C4" w:sz="4"/>
-              <w:bottom w:val="single" w:color="C9C9C4" w:sz="4"/>
-              <w:right w:val="single" w:color="C9C9C4" w:sz="4"/>
-            </w:tcBorders>
-            <w:tcMar>
-              <w:top w:type="dxa" w:w="60"/>
-              <w:left w:type="dxa" w:w="100"/>
-              <w:bottom w:type="dxa" w:w="60"/>
-              <w:right w:type="dxa" w:w="100"/>
-            </w:tcMar>
-          </w:tcPr>
-          <w:p>
-            <w:r>
-              <w:rPr>
-                <w:color w:val="0A0A0A"/>
-                <w:sz w:val="18"/>
-                <w:szCs w:val="18"/>
-              </w:rPr>
-              <w:t xml:space="preserve">Limits of the evidence, further research</w:t>
+            <w:tcW w:type="dxa" w:w="906"/>
+            <w:tcBorders>
+              <w:top w:val="single" w:color="C9C9C4" w:sz="4"/>
+              <w:left w:val="single" w:color="C9C9C4" w:sz="4"/>
+              <w:bottom w:val="single" w:color="C9C9C4" w:sz="4"/>
+              <w:right w:val="single" w:color="C9C9C4" w:sz="4"/>
+            </w:tcBorders>
+            <w:tcMar>
+              <w:top w:type="dxa" w:w="60"/>
+              <w:left w:type="dxa" w:w="100"/>
+              <w:bottom w:type="dxa" w:w="60"/>
+              <w:right w:type="dxa" w:w="100"/>
+            </w:tcMar>
+          </w:tcPr>
+          <w:p>
+            <w:r>
+              <w:rPr>
+                <w:color w:val="0A0A0A"/>
+                <w:sz w:val="18"/>
+                <w:szCs w:val="18"/>
+              </w:rPr>
+              <w:t xml:space="preserve">Simone</w:t>
+            </w:r>
+          </w:p>
+        </w:tc>
+        <w:tc>
+          <w:tcPr>
+            <w:tcW w:type="dxa" w:w="4606"/>
+            <w:tcBorders>
+              <w:top w:val="single" w:color="C9C9C4" w:sz="4"/>
+              <w:left w:val="single" w:color="C9C9C4" w:sz="4"/>
+              <w:bottom w:val="single" w:color="C9C9C4" w:sz="4"/>
+              <w:right w:val="single" w:color="C9C9C4" w:sz="4"/>
+            </w:tcBorders>
+            <w:tcMar>
+              <w:top w:type="dxa" w:w="60"/>
+              <w:left w:type="dxa" w:w="100"/>
+              <w:bottom w:type="dxa" w:w="60"/>
+              <w:right w:type="dxa" w:w="100"/>
+            </w:tcMar>
+          </w:tcPr>
+          <w:p>
+            <w:r>
+              <w:rPr>
+                <w:color w:val="0A0A0A"/>
+                <w:sz w:val="18"/>
+                <w:szCs w:val="18"/>
+              </w:rPr>
+              <w:t xml:space="preserve">We tested on over eighteen hundred hours of real riding, and retraining nearly halved our false alarms. Any alarm can be cancelled within thirty seconds.</w:t>
+            </w:r>
+          </w:p>
+        </w:tc>
+        <w:tc>
+          <w:tcPr>
+            <w:tcW w:type="dxa" w:w="4606"/>
+            <w:tcBorders>
+              <w:top w:val="single" w:color="C9C9C4" w:sz="4"/>
+              <w:left w:val="single" w:color="C9C9C4" w:sz="4"/>
+              <w:bottom w:val="single" w:color="C9C9C4" w:sz="4"/>
+              <w:right w:val="single" w:color="C9C9C4" w:sz="4"/>
+            </w:tcBorders>
+            <w:tcMar>
+              <w:top w:type="dxa" w:w="60"/>
+              <w:left w:type="dxa" w:w="100"/>
+              <w:bottom w:type="dxa" w:w="60"/>
+              <w:right w:type="dxa" w:w="100"/>
+            </w:tcMar>
+          </w:tcPr>
+          <w:p>
+            <w:r>
+              <w:rPr>
+                <w:color w:val="0A0A0A"/>
+                <w:sz w:val="18"/>
+                <w:szCs w:val="18"/>
+              </w:rPr>
+              <w:t xml:space="preserve">"1,865 h of real riding tested. False alarms 19.2 to 10.5 an hour." Sources: ml/PUBLIC_RIDES.md; ml/STREAMING.md</w:t>
+            </w:r>
+          </w:p>
+        </w:tc>
+        <w:tc>
+          <w:tcPr>
+            <w:tcW w:type="dxa" w:w="3840"/>
+            <w:tcBorders>
+              <w:top w:val="single" w:color="C9C9C4" w:sz="4"/>
+              <w:left w:val="single" w:color="C9C9C4" w:sz="4"/>
+              <w:bottom w:val="single" w:color="C9C9C4" w:sz="4"/>
+              <w:right w:val="single" w:color="C9C9C4" w:sz="4"/>
+            </w:tcBorders>
+            <w:tcMar>
+              <w:top w:type="dxa" w:w="60"/>
+              <w:left w:type="dxa" w:w="100"/>
+              <w:bottom w:type="dxa" w:w="60"/>
+              <w:right w:type="dxa" w:w="100"/>
+            </w:tcMar>
+          </w:tcPr>
+          <w:p>
+            <w:r>
+              <w:rPr>
+                <w:color w:val="0A0A0A"/>
+                <w:sz w:val="18"/>
+                <w:szCs w:val="18"/>
+              </w:rPr>
+              <w:t xml:space="preserve">Validation, accuracy barrier</w:t>
             </w:r>
           </w:p>
         </w:tc>
@@ -7273,7 +7273,7 @@
         </w:trPr>
         <w:tc>
           <w:tcPr>
-            <w:tcW w:type="dxa" w:w="877"/>
+            <w:tcW w:type="dxa" w:w="880"/>
             <w:tcBorders>
               <w:top w:val="single" w:color="C9C9C4" w:sz="4"/>
               <w:left w:val="single" w:color="C9C9C4" w:sz="4"/>
@@ -7300,109 +7300,109 @@
         </w:tc>
         <w:tc>
           <w:tcPr>
-            <w:tcW w:type="dxa" w:w="877"/>
-            <w:tcBorders>
-              <w:top w:val="single" w:color="C9C9C4" w:sz="4"/>
-              <w:left w:val="single" w:color="C9C9C4" w:sz="4"/>
-              <w:bottom w:val="single" w:color="C9C9C4" w:sz="4"/>
-              <w:right w:val="single" w:color="C9C9C4" w:sz="4"/>
-            </w:tcBorders>
-            <w:tcMar>
-              <w:top w:type="dxa" w:w="60"/>
-              <w:left w:type="dxa" w:w="100"/>
-              <w:bottom w:type="dxa" w:w="60"/>
-              <w:right w:type="dxa" w:w="100"/>
-            </w:tcMar>
-          </w:tcPr>
-          <w:p>
-            <w:r>
-              <w:rPr>
-                <w:color w:val="0A0A0A"/>
-                <w:sz w:val="18"/>
-                <w:szCs w:val="18"/>
-              </w:rPr>
-              <w:t xml:space="preserve">Simone</w:t>
-            </w:r>
-          </w:p>
-        </w:tc>
-        <w:tc>
-          <w:tcPr>
-            <w:tcW w:type="dxa" w:w="4360"/>
-            <w:tcBorders>
-              <w:top w:val="single" w:color="C9C9C4" w:sz="4"/>
-              <w:left w:val="single" w:color="C9C9C4" w:sz="4"/>
-              <w:bottom w:val="single" w:color="C9C9C4" w:sz="4"/>
-              <w:right w:val="single" w:color="C9C9C4" w:sz="4"/>
-            </w:tcBorders>
-            <w:tcMar>
-              <w:top w:type="dxa" w:w="60"/>
-              <w:left w:type="dxa" w:w="100"/>
-              <w:bottom w:type="dxa" w:w="60"/>
-              <w:right w:type="dxa" w:w="100"/>
-            </w:tcMar>
-          </w:tcPr>
-          <w:p>
-            <w:r>
-              <w:rPr>
-                <w:color w:val="0A0A0A"/>
-                <w:sz w:val="18"/>
-                <w:szCs w:val="18"/>
-              </w:rPr>
-              <w:t xml:space="preserve">Retraining nearly halved our false alarms. On real motorbike rides it is one every five hours, and any alarm can be cancelled within thirty seconds.</w:t>
-            </w:r>
-          </w:p>
-        </w:tc>
-        <w:tc>
-          <w:tcPr>
-            <w:tcW w:type="dxa" w:w="4360"/>
-            <w:tcBorders>
-              <w:top w:val="single" w:color="C9C9C4" w:sz="4"/>
-              <w:left w:val="single" w:color="C9C9C4" w:sz="4"/>
-              <w:bottom w:val="single" w:color="C9C9C4" w:sz="4"/>
-              <w:right w:val="single" w:color="C9C9C4" w:sz="4"/>
-            </w:tcBorders>
-            <w:tcMar>
-              <w:top w:type="dxa" w:w="60"/>
-              <w:left w:type="dxa" w:w="100"/>
-              <w:bottom w:type="dxa" w:w="60"/>
-              <w:right w:type="dxa" w:w="100"/>
-            </w:tcMar>
-          </w:tcPr>
-          <w:p>
-            <w:r>
-              <w:rPr>
-                <w:color w:val="0A0A0A"/>
-                <w:sz w:val="18"/>
-                <w:szCs w:val="18"/>
-              </w:rPr>
-              <w:t xml:space="preserve">"10.5 per hour handling. 0.2 per hour real riding." Sources: ml/STREAMING.md; TU Wien dataset</w:t>
-            </w:r>
-          </w:p>
-        </w:tc>
-        <w:tc>
-          <w:tcPr>
-            <w:tcW w:type="dxa" w:w="4364"/>
-            <w:tcBorders>
-              <w:top w:val="single" w:color="C9C9C4" w:sz="4"/>
-              <w:left w:val="single" w:color="C9C9C4" w:sz="4"/>
-              <w:bottom w:val="single" w:color="C9C9C4" w:sz="4"/>
-              <w:right w:val="single" w:color="C9C9C4" w:sz="4"/>
-            </w:tcBorders>
-            <w:tcMar>
-              <w:top w:type="dxa" w:w="60"/>
-              <w:left w:type="dxa" w:w="100"/>
-              <w:bottom w:type="dxa" w:w="60"/>
-              <w:right w:type="dxa" w:w="100"/>
-            </w:tcMar>
-          </w:tcPr>
-          <w:p>
-            <w:r>
-              <w:rPr>
-                <w:color w:val="0A0A0A"/>
-                <w:sz w:val="18"/>
-                <w:szCs w:val="18"/>
-              </w:rPr>
-              <w:t xml:space="preserve">Barrier one: accuracy</w:t>
+            <w:tcW w:type="dxa" w:w="906"/>
+            <w:tcBorders>
+              <w:top w:val="single" w:color="C9C9C4" w:sz="4"/>
+              <w:left w:val="single" w:color="C9C9C4" w:sz="4"/>
+              <w:bottom w:val="single" w:color="C9C9C4" w:sz="4"/>
+              <w:right w:val="single" w:color="C9C9C4" w:sz="4"/>
+            </w:tcBorders>
+            <w:tcMar>
+              <w:top w:type="dxa" w:w="60"/>
+              <w:left w:type="dxa" w:w="100"/>
+              <w:bottom w:type="dxa" w:w="60"/>
+              <w:right w:type="dxa" w:w="100"/>
+            </w:tcMar>
+          </w:tcPr>
+          <w:p>
+            <w:r>
+              <w:rPr>
+                <w:color w:val="0A0A0A"/>
+                <w:sz w:val="18"/>
+                <w:szCs w:val="18"/>
+              </w:rPr>
+              <w:t xml:space="preserve">Hannes</w:t>
+            </w:r>
+          </w:p>
+        </w:tc>
+        <w:tc>
+          <w:tcPr>
+            <w:tcW w:type="dxa" w:w="4606"/>
+            <w:tcBorders>
+              <w:top w:val="single" w:color="C9C9C4" w:sz="4"/>
+              <w:left w:val="single" w:color="C9C9C4" w:sz="4"/>
+              <w:bottom w:val="single" w:color="C9C9C4" w:sz="4"/>
+              <w:right w:val="single" w:color="C9C9C4" w:sz="4"/>
+            </w:tcBorders>
+            <w:tcMar>
+              <w:top w:type="dxa" w:w="60"/>
+              <w:left w:type="dxa" w:w="100"/>
+              <w:bottom w:type="dxa" w:w="60"/>
+              <w:right w:type="dxa" w:w="100"/>
+            </w:tcMar>
+          </w:tcPr>
+          <w:p>
+            <w:r>
+              <w:rPr>
+                <w:color w:val="0A0A0A"/>
+                <w:sz w:val="18"/>
+                <w:szCs w:val="18"/>
+              </w:rPr>
+              <w:t xml:space="preserve">Following Imperial's feedback, the drop test protocol and data pipeline are ready, and helmet results will be in for the final, next to a live demo.</w:t>
+            </w:r>
+          </w:p>
+        </w:tc>
+        <w:tc>
+          <w:tcPr>
+            <w:tcW w:type="dxa" w:w="4606"/>
+            <w:tcBorders>
+              <w:top w:val="single" w:color="C9C9C4" w:sz="4"/>
+              <w:left w:val="single" w:color="C9C9C4" w:sz="4"/>
+              <w:bottom w:val="single" w:color="C9C9C4" w:sz="4"/>
+              <w:right w:val="single" w:color="C9C9C4" w:sz="4"/>
+            </w:tcBorders>
+            <w:tcMar>
+              <w:top w:type="dxa" w:w="60"/>
+              <w:left w:type="dxa" w:w="100"/>
+              <w:bottom w:type="dxa" w:w="60"/>
+              <w:right w:type="dxa" w:w="100"/>
+            </w:tcMar>
+          </w:tcPr>
+          <w:p>
+            <w:r>
+              <w:rPr>
+                <w:color w:val="0A0A0A"/>
+                <w:sz w:val="18"/>
+                <w:szCs w:val="18"/>
+              </w:rPr>
+              <w:t xml:space="preserve">Drop test protocol page; helmet on the bench</w:t>
+            </w:r>
+          </w:p>
+        </w:tc>
+        <w:tc>
+          <w:tcPr>
+            <w:tcW w:type="dxa" w:w="3840"/>
+            <w:tcBorders>
+              <w:top w:val="single" w:color="C9C9C4" w:sz="4"/>
+              <w:left w:val="single" w:color="C9C9C4" w:sz="4"/>
+              <w:bottom w:val="single" w:color="C9C9C4" w:sz="4"/>
+              <w:right w:val="single" w:color="C9C9C4" w:sz="4"/>
+            </w:tcBorders>
+            <w:tcMar>
+              <w:top w:type="dxa" w:w="60"/>
+              <w:left w:type="dxa" w:w="100"/>
+              <w:bottom w:type="dxa" w:w="60"/>
+              <w:right w:type="dxa" w:w="100"/>
+            </w:tcMar>
+          </w:tcPr>
+          <w:p>
+            <w:r>
+              <w:rPr>
+                <w:color w:val="0A0A0A"/>
+                <w:sz w:val="18"/>
+                <w:szCs w:val="18"/>
+              </w:rPr>
+              <w:t xml:space="preserve">Prototype and drop test validation</w:t>
             </w:r>
           </w:p>
         </w:tc>
@@ -7414,7 +7414,7 @@
         </w:trPr>
         <w:tc>
           <w:tcPr>
-            <w:tcW w:type="dxa" w:w="877"/>
+            <w:tcW w:type="dxa" w:w="880"/>
             <w:tcBorders>
               <w:top w:val="single" w:color="C9C9C4" w:sz="4"/>
               <w:left w:val="single" w:color="C9C9C4" w:sz="4"/>
@@ -7441,109 +7441,109 @@
         </w:tc>
         <w:tc>
           <w:tcPr>
-            <w:tcW w:type="dxa" w:w="877"/>
-            <w:tcBorders>
-              <w:top w:val="single" w:color="C9C9C4" w:sz="4"/>
-              <w:left w:val="single" w:color="C9C9C4" w:sz="4"/>
-              <w:bottom w:val="single" w:color="C9C9C4" w:sz="4"/>
-              <w:right w:val="single" w:color="C9C9C4" w:sz="4"/>
-            </w:tcBorders>
-            <w:tcMar>
-              <w:top w:type="dxa" w:w="60"/>
-              <w:left w:type="dxa" w:w="100"/>
-              <w:bottom w:type="dxa" w:w="60"/>
-              <w:right w:type="dxa" w:w="100"/>
-            </w:tcMar>
-          </w:tcPr>
-          <w:p>
-            <w:r>
-              <w:rPr>
-                <w:color w:val="0A0A0A"/>
-                <w:sz w:val="18"/>
-                <w:szCs w:val="18"/>
-              </w:rPr>
-              <w:t xml:space="preserve">Hannes</w:t>
-            </w:r>
-          </w:p>
-        </w:tc>
-        <w:tc>
-          <w:tcPr>
-            <w:tcW w:type="dxa" w:w="4360"/>
-            <w:tcBorders>
-              <w:top w:val="single" w:color="C9C9C4" w:sz="4"/>
-              <w:left w:val="single" w:color="C9C9C4" w:sz="4"/>
-              <w:bottom w:val="single" w:color="C9C9C4" w:sz="4"/>
-              <w:right w:val="single" w:color="C9C9C4" w:sz="4"/>
-            </w:tcBorders>
-            <w:tcMar>
-              <w:top w:type="dxa" w:w="60"/>
-              <w:left w:type="dxa" w:w="100"/>
-              <w:bottom w:type="dxa" w:w="60"/>
-              <w:right w:type="dxa" w:w="100"/>
-            </w:tcMar>
-          </w:tcPr>
-          <w:p>
-            <w:r>
-              <w:rPr>
-                <w:color w:val="0A0A0A"/>
-                <w:sz w:val="18"/>
-                <w:szCs w:val="18"/>
-              </w:rPr>
-              <w:t xml:space="preserve">Following Imperial's feedback, the drop test protocol and data pipeline are ready, and helmet results will be in for the final, next to a live demo.</w:t>
-            </w:r>
-          </w:p>
-        </w:tc>
-        <w:tc>
-          <w:tcPr>
-            <w:tcW w:type="dxa" w:w="4360"/>
-            <w:tcBorders>
-              <w:top w:val="single" w:color="C9C9C4" w:sz="4"/>
-              <w:left w:val="single" w:color="C9C9C4" w:sz="4"/>
-              <w:bottom w:val="single" w:color="C9C9C4" w:sz="4"/>
-              <w:right w:val="single" w:color="C9C9C4" w:sz="4"/>
-            </w:tcBorders>
-            <w:tcMar>
-              <w:top w:type="dxa" w:w="60"/>
-              <w:left w:type="dxa" w:w="100"/>
-              <w:bottom w:type="dxa" w:w="60"/>
-              <w:right w:type="dxa" w:w="100"/>
-            </w:tcMar>
-          </w:tcPr>
-          <w:p>
-            <w:r>
-              <w:rPr>
-                <w:color w:val="0A0A0A"/>
-                <w:sz w:val="18"/>
-                <w:szCs w:val="18"/>
-              </w:rPr>
-              <w:t xml:space="preserve">Drop test protocol page; helmet on the bench</w:t>
-            </w:r>
-          </w:p>
-        </w:tc>
-        <w:tc>
-          <w:tcPr>
-            <w:tcW w:type="dxa" w:w="4364"/>
-            <w:tcBorders>
-              <w:top w:val="single" w:color="C9C9C4" w:sz="4"/>
-              <w:left w:val="single" w:color="C9C9C4" w:sz="4"/>
-              <w:bottom w:val="single" w:color="C9C9C4" w:sz="4"/>
-              <w:right w:val="single" w:color="C9C9C4" w:sz="4"/>
-            </w:tcBorders>
-            <w:tcMar>
-              <w:top w:type="dxa" w:w="60"/>
-              <w:left w:type="dxa" w:w="100"/>
-              <w:bottom w:type="dxa" w:w="60"/>
-              <w:right w:type="dxa" w:w="100"/>
-            </w:tcMar>
-          </w:tcPr>
-          <w:p>
-            <w:r>
-              <w:rPr>
-                <w:color w:val="0A0A0A"/>
-                <w:sz w:val="18"/>
-                <w:szCs w:val="18"/>
-              </w:rPr>
-              <w:t xml:space="preserve">Feedback: prototype and validation</w:t>
+            <w:tcW w:type="dxa" w:w="906"/>
+            <w:tcBorders>
+              <w:top w:val="single" w:color="C9C9C4" w:sz="4"/>
+              <w:left w:val="single" w:color="C9C9C4" w:sz="4"/>
+              <w:bottom w:val="single" w:color="C9C9C4" w:sz="4"/>
+              <w:right w:val="single" w:color="C9C9C4" w:sz="4"/>
+            </w:tcBorders>
+            <w:tcMar>
+              <w:top w:type="dxa" w:w="60"/>
+              <w:left w:type="dxa" w:w="100"/>
+              <w:bottom w:type="dxa" w:w="60"/>
+              <w:right w:type="dxa" w:w="100"/>
+            </w:tcMar>
+          </w:tcPr>
+          <w:p>
+            <w:r>
+              <w:rPr>
+                <w:color w:val="0A0A0A"/>
+                <w:sz w:val="18"/>
+                <w:szCs w:val="18"/>
+              </w:rPr>
+              <w:t xml:space="preserve">Maalon</w:t>
+            </w:r>
+          </w:p>
+        </w:tc>
+        <w:tc>
+          <w:tcPr>
+            <w:tcW w:type="dxa" w:w="4606"/>
+            <w:tcBorders>
+              <w:top w:val="single" w:color="C9C9C4" w:sz="4"/>
+              <w:left w:val="single" w:color="C9C9C4" w:sz="4"/>
+              <w:bottom w:val="single" w:color="C9C9C4" w:sz="4"/>
+              <w:right w:val="single" w:color="C9C9C4" w:sz="4"/>
+            </w:tcBorders>
+            <w:tcMar>
+              <w:top w:type="dxa" w:w="60"/>
+              <w:left w:type="dxa" w:w="100"/>
+              <w:bottom w:type="dxa" w:w="60"/>
+              <w:right w:type="dxa" w:w="100"/>
+            </w:tcMar>
+          </w:tcPr>
+          <w:p>
+            <w:r>
+              <w:rPr>
+                <w:color w:val="0A0A0A"/>
+                <w:sz w:val="18"/>
+                <w:szCs w:val="18"/>
+              </w:rPr>
+              <w:t xml:space="preserve">Privacy is built in, not added on. Riders opt in each shift and own a signed copy of every record. No route history, no risk score.</w:t>
+            </w:r>
+          </w:p>
+        </w:tc>
+        <w:tc>
+          <w:tcPr>
+            <w:tcW w:type="dxa" w:w="4606"/>
+            <w:tcBorders>
+              <w:top w:val="single" w:color="C9C9C4" w:sz="4"/>
+              <w:left w:val="single" w:color="C9C9C4" w:sz="4"/>
+              <w:bottom w:val="single" w:color="C9C9C4" w:sz="4"/>
+              <w:right w:val="single" w:color="C9C9C4" w:sz="4"/>
+            </w:tcBorders>
+            <w:tcMar>
+              <w:top w:type="dxa" w:w="60"/>
+              <w:left w:type="dxa" w:w="100"/>
+              <w:bottom w:type="dxa" w:w="60"/>
+              <w:right w:type="dxa" w:w="100"/>
+            </w:tcMar>
+          </w:tcPr>
+          <w:p>
+            <w:r>
+              <w:rPr>
+                <w:color w:val="0A0A0A"/>
+                <w:sz w:val="18"/>
+                <w:szCs w:val="18"/>
+              </w:rPr>
+              <w:t xml:space="preserve">Consent screen, then the who-sees-what matrix</w:t>
+            </w:r>
+          </w:p>
+        </w:tc>
+        <w:tc>
+          <w:tcPr>
+            <w:tcW w:type="dxa" w:w="3840"/>
+            <w:tcBorders>
+              <w:top w:val="single" w:color="C9C9C4" w:sz="4"/>
+              <w:left w:val="single" w:color="C9C9C4" w:sz="4"/>
+              <w:bottom w:val="single" w:color="C9C9C4" w:sz="4"/>
+              <w:right w:val="single" w:color="C9C9C4" w:sz="4"/>
+            </w:tcBorders>
+            <w:tcMar>
+              <w:top w:type="dxa" w:w="60"/>
+              <w:left w:type="dxa" w:w="100"/>
+              <w:bottom w:type="dxa" w:w="60"/>
+              <w:right w:type="dxa" w:w="100"/>
+            </w:tcMar>
+          </w:tcPr>
+          <w:p>
+            <w:r>
+              <w:rPr>
+                <w:color w:val="0A0A0A"/>
+                <w:sz w:val="18"/>
+                <w:szCs w:val="18"/>
+              </w:rPr>
+              <w:t xml:space="preserve">Consent, data ownership, not used against workers</w:t>
             </w:r>
           </w:p>
         </w:tc>
@@ -7555,7 +7555,7 @@
         </w:trPr>
         <w:tc>
           <w:tcPr>
-            <w:tcW w:type="dxa" w:w="877"/>
+            <w:tcW w:type="dxa" w:w="880"/>
             <w:tcBorders>
               <w:top w:val="single" w:color="C9C9C4" w:sz="4"/>
               <w:left w:val="single" w:color="C9C9C4" w:sz="4"/>
@@ -7582,148 +7582,7 @@
         </w:tc>
         <w:tc>
           <w:tcPr>
-            <w:tcW w:type="dxa" w:w="877"/>
-            <w:tcBorders>
-              <w:top w:val="single" w:color="C9C9C4" w:sz="4"/>
-              <w:left w:val="single" w:color="C9C9C4" w:sz="4"/>
-              <w:bottom w:val="single" w:color="C9C9C4" w:sz="4"/>
-              <w:right w:val="single" w:color="C9C9C4" w:sz="4"/>
-            </w:tcBorders>
-            <w:tcMar>
-              <w:top w:type="dxa" w:w="60"/>
-              <w:left w:type="dxa" w:w="100"/>
-              <w:bottom w:type="dxa" w:w="60"/>
-              <w:right w:type="dxa" w:w="100"/>
-            </w:tcMar>
-          </w:tcPr>
-          <w:p>
-            <w:r>
-              <w:rPr>
-                <w:color w:val="0A0A0A"/>
-                <w:sz w:val="18"/>
-                <w:szCs w:val="18"/>
-              </w:rPr>
-              <w:t xml:space="preserve">Maalon</w:t>
-            </w:r>
-          </w:p>
-        </w:tc>
-        <w:tc>
-          <w:tcPr>
-            <w:tcW w:type="dxa" w:w="4360"/>
-            <w:tcBorders>
-              <w:top w:val="single" w:color="C9C9C4" w:sz="4"/>
-              <w:left w:val="single" w:color="C9C9C4" w:sz="4"/>
-              <w:bottom w:val="single" w:color="C9C9C4" w:sz="4"/>
-              <w:right w:val="single" w:color="C9C9C4" w:sz="4"/>
-            </w:tcBorders>
-            <w:tcMar>
-              <w:top w:type="dxa" w:w="60"/>
-              <w:left w:type="dxa" w:w="100"/>
-              <w:bottom w:type="dxa" w:w="60"/>
-              <w:right w:type="dxa" w:w="100"/>
-            </w:tcMar>
-          </w:tcPr>
-          <w:p>
-            <w:r>
-              <w:rPr>
-                <w:color w:val="0A0A0A"/>
-                <w:sz w:val="18"/>
-                <w:szCs w:val="18"/>
-              </w:rPr>
-              <w:t xml:space="preserve">Privacy is built in, not added on. Riders opt in each shift and own a signed copy of every record. No route history, no risk score. It supports triage; it never diagnoses.</w:t>
-            </w:r>
-          </w:p>
-        </w:tc>
-        <w:tc>
-          <w:tcPr>
-            <w:tcW w:type="dxa" w:w="4360"/>
-            <w:tcBorders>
-              <w:top w:val="single" w:color="C9C9C4" w:sz="4"/>
-              <w:left w:val="single" w:color="C9C9C4" w:sz="4"/>
-              <w:bottom w:val="single" w:color="C9C9C4" w:sz="4"/>
-              <w:right w:val="single" w:color="C9C9C4" w:sz="4"/>
-            </w:tcBorders>
-            <w:tcMar>
-              <w:top w:type="dxa" w:w="60"/>
-              <w:left w:type="dxa" w:w="100"/>
-              <w:bottom w:type="dxa" w:w="60"/>
-              <w:right w:type="dxa" w:w="100"/>
-            </w:tcMar>
-          </w:tcPr>
-          <w:p>
-            <w:r>
-              <w:rPr>
-                <w:color w:val="0A0A0A"/>
-                <w:sz w:val="18"/>
-                <w:szCs w:val="18"/>
-              </w:rPr>
-              <w:t xml:space="preserve">Consent screen, then the who-sees-what matrix</w:t>
-            </w:r>
-          </w:p>
-        </w:tc>
-        <w:tc>
-          <w:tcPr>
-            <w:tcW w:type="dxa" w:w="4364"/>
-            <w:tcBorders>
-              <w:top w:val="single" w:color="C9C9C4" w:sz="4"/>
-              <w:left w:val="single" w:color="C9C9C4" w:sz="4"/>
-              <w:bottom w:val="single" w:color="C9C9C4" w:sz="4"/>
-              <w:right w:val="single" w:color="C9C9C4" w:sz="4"/>
-            </w:tcBorders>
-            <w:tcMar>
-              <w:top w:type="dxa" w:w="60"/>
-              <w:left w:type="dxa" w:w="100"/>
-              <w:bottom w:type="dxa" w:w="60"/>
-              <w:right w:type="dxa" w:w="100"/>
-            </w:tcMar>
-          </w:tcPr>
-          <w:p>
-            <w:r>
-              <w:rPr>
-                <w:color w:val="0A0A0A"/>
-                <w:sz w:val="18"/>
-                <w:szCs w:val="18"/>
-              </w:rPr>
-              <w:t xml:space="preserve">Barrier two: rider trust. Feedback: consent, ownership, dual use</w:t>
-            </w:r>
-          </w:p>
-        </w:tc>
-      </w:tr>
-      <w:tr>
-        <w:trPr>
-          <w:cantSplit/>
-          <w:tblHeader w:val="off"/>
-        </w:trPr>
-        <w:tc>
-          <w:tcPr>
-            <w:tcW w:type="dxa" w:w="877"/>
-            <w:tcBorders>
-              <w:top w:val="single" w:color="C9C9C4" w:sz="4"/>
-              <w:left w:val="single" w:color="C9C9C4" w:sz="4"/>
-              <w:bottom w:val="single" w:color="C9C9C4" w:sz="4"/>
-              <w:right w:val="single" w:color="C9C9C4" w:sz="4"/>
-            </w:tcBorders>
-            <w:tcMar>
-              <w:top w:type="dxa" w:w="60"/>
-              <w:left w:type="dxa" w:w="100"/>
-              <w:bottom w:type="dxa" w:w="60"/>
-              <w:right w:type="dxa" w:w="100"/>
-            </w:tcMar>
-          </w:tcPr>
-          <w:p>
-            <w:r>
-              <w:rPr>
-                <w:color w:val="0A0A0A"/>
-                <w:sz w:val="18"/>
-                <w:szCs w:val="18"/>
-              </w:rPr>
-              <w:t xml:space="preserve">14</w:t>
-            </w:r>
-          </w:p>
-        </w:tc>
-        <w:tc>
-          <w:tcPr>
-            <w:tcW w:type="dxa" w:w="877"/>
+            <w:tcW w:type="dxa" w:w="906"/>
             <w:tcBorders>
               <w:top w:val="single" w:color="C9C9C4" w:sz="4"/>
               <w:left w:val="single" w:color="C9C9C4" w:sz="4"/>
@@ -7750,364 +7609,82 @@
         </w:tc>
         <w:tc>
           <w:tcPr>
-            <w:tcW w:type="dxa" w:w="4360"/>
-            <w:tcBorders>
-              <w:top w:val="single" w:color="C9C9C4" w:sz="4"/>
-              <w:left w:val="single" w:color="C9C9C4" w:sz="4"/>
-              <w:bottom w:val="single" w:color="C9C9C4" w:sz="4"/>
-              <w:right w:val="single" w:color="C9C9C4" w:sz="4"/>
-            </w:tcBorders>
-            <w:tcMar>
-              <w:top w:type="dxa" w:w="60"/>
-              <w:left w:type="dxa" w:w="100"/>
-              <w:bottom w:type="dxa" w:w="60"/>
-              <w:right w:type="dxa" w:w="100"/>
-            </w:tcMar>
-          </w:tcPr>
-          <w:p>
-            <w:r>
-              <w:rPr>
-                <w:color w:val="0A0A0A"/>
-                <w:sz w:val="18"/>
-                <w:szCs w:val="18"/>
-              </w:rPr>
-              <w:t xml:space="preserve">The insurance side is mapped end to end. A licensed insurer provides the cover, and we provide the trigger: a verified crash nobody cancelled, priced on sourced Hong Kong data.</w:t>
-            </w:r>
-          </w:p>
-        </w:tc>
-        <w:tc>
-          <w:tcPr>
-            <w:tcW w:type="dxa" w:w="4360"/>
-            <w:tcBorders>
-              <w:top w:val="single" w:color="C9C9C4" w:sz="4"/>
-              <w:left w:val="single" w:color="C9C9C4" w:sz="4"/>
-              <w:bottom w:val="single" w:color="C9C9C4" w:sz="4"/>
-              <w:right w:val="single" w:color="C9C9C4" w:sz="4"/>
-            </w:tcBorders>
-            <w:tcMar>
-              <w:top w:type="dxa" w:w="60"/>
-              <w:left w:type="dxa" w:w="100"/>
-              <w:bottom w:type="dxa" w:w="60"/>
-              <w:right w:type="dxa" w:w="100"/>
-            </w:tcMar>
-          </w:tcPr>
-          <w:p>
-            <w:r>
-              <w:rPr>
-                <w:color w:val="0A0A0A"/>
-                <w:sz w:val="18"/>
-                <w:szCs w:val="18"/>
-              </w:rPr>
-              <w:t xml:space="preserve">Diagram: rider, Metrics trigger, licensed insurer, platform</w:t>
-            </w:r>
-          </w:p>
-        </w:tc>
-        <w:tc>
-          <w:tcPr>
-            <w:tcW w:type="dxa" w:w="4364"/>
-            <w:tcBorders>
-              <w:top w:val="single" w:color="C9C9C4" w:sz="4"/>
-              <w:left w:val="single" w:color="C9C9C4" w:sz="4"/>
-              <w:bottom w:val="single" w:color="C9C9C4" w:sz="4"/>
-              <w:right w:val="single" w:color="C9C9C4" w:sz="4"/>
-            </w:tcBorders>
-            <w:tcMar>
-              <w:top w:type="dxa" w:w="60"/>
-              <w:left w:type="dxa" w:w="100"/>
-              <w:bottom w:type="dxa" w:w="60"/>
-              <w:right w:type="dxa" w:w="100"/>
-            </w:tcMar>
-          </w:tcPr>
-          <w:p>
-            <w:r>
-              <w:rPr>
-                <w:color w:val="0A0A0A"/>
-                <w:sz w:val="18"/>
-                <w:szCs w:val="18"/>
-              </w:rPr>
-              <w:t xml:space="preserve">Barrier three: insurer and regulator. Feedback: insurance mechanism</w:t>
-            </w:r>
-          </w:p>
-        </w:tc>
-      </w:tr>
-      <w:tr>
-        <w:trPr>
-          <w:cantSplit/>
-          <w:tblHeader w:val="off"/>
-        </w:trPr>
-        <w:tc>
-          <w:tcPr>
-            <w:tcW w:type="dxa" w:w="877"/>
-            <w:tcBorders>
-              <w:top w:val="single" w:color="C9C9C4" w:sz="4"/>
-              <w:left w:val="single" w:color="C9C9C4" w:sz="4"/>
-              <w:bottom w:val="single" w:color="C9C9C4" w:sz="4"/>
-              <w:right w:val="single" w:color="C9C9C4" w:sz="4"/>
-            </w:tcBorders>
-            <w:tcMar>
-              <w:top w:type="dxa" w:w="60"/>
-              <w:left w:type="dxa" w:w="100"/>
-              <w:bottom w:type="dxa" w:w="60"/>
-              <w:right w:type="dxa" w:w="100"/>
-            </w:tcMar>
-          </w:tcPr>
-          <w:p>
-            <w:r>
-              <w:rPr>
-                <w:color w:val="0A0A0A"/>
-                <w:sz w:val="18"/>
-                <w:szCs w:val="18"/>
-              </w:rPr>
-              <w:t xml:space="preserve">15</w:t>
-            </w:r>
-          </w:p>
-        </w:tc>
-        <w:tc>
-          <w:tcPr>
-            <w:tcW w:type="dxa" w:w="877"/>
-            <w:tcBorders>
-              <w:top w:val="single" w:color="C9C9C4" w:sz="4"/>
-              <w:left w:val="single" w:color="C9C9C4" w:sz="4"/>
-              <w:bottom w:val="single" w:color="C9C9C4" w:sz="4"/>
-              <w:right w:val="single" w:color="C9C9C4" w:sz="4"/>
-            </w:tcBorders>
-            <w:tcMar>
-              <w:top w:type="dxa" w:w="60"/>
-              <w:left w:type="dxa" w:w="100"/>
-              <w:bottom w:type="dxa" w:w="60"/>
-              <w:right w:type="dxa" w:w="100"/>
-            </w:tcMar>
-          </w:tcPr>
-          <w:p>
-            <w:r>
-              <w:rPr>
-                <w:color w:val="0A0A0A"/>
-                <w:sz w:val="18"/>
-                <w:szCs w:val="18"/>
-              </w:rPr>
-              <w:t xml:space="preserve">Alysa</w:t>
-            </w:r>
-          </w:p>
-        </w:tc>
-        <w:tc>
-          <w:tcPr>
-            <w:tcW w:type="dxa" w:w="4360"/>
-            <w:tcBorders>
-              <w:top w:val="single" w:color="C9C9C4" w:sz="4"/>
-              <w:left w:val="single" w:color="C9C9C4" w:sz="4"/>
-              <w:bottom w:val="single" w:color="C9C9C4" w:sz="4"/>
-              <w:right w:val="single" w:color="C9C9C4" w:sz="4"/>
-            </w:tcBorders>
-            <w:tcMar>
-              <w:top w:type="dxa" w:w="60"/>
-              <w:left w:type="dxa" w:w="100"/>
-              <w:bottom w:type="dxa" w:w="60"/>
-              <w:right w:type="dxa" w:w="100"/>
-            </w:tcMar>
-          </w:tcPr>
-          <w:p>
-            <w:r>
-              <w:rPr>
-                <w:color w:val="0A0A0A"/>
-                <w:sz w:val="18"/>
-                <w:szCs w:val="18"/>
-              </w:rPr>
-              <w:t xml:space="preserve">It sits on top of statutory compensation, and our route to market is the Insurance Authority's sandbox, which is built for insurers and technology partners like us.</w:t>
-            </w:r>
-          </w:p>
-        </w:tc>
-        <w:tc>
-          <w:tcPr>
-            <w:tcW w:type="dxa" w:w="4360"/>
-            <w:tcBorders>
-              <w:top w:val="single" w:color="C9C9C4" w:sz="4"/>
-              <w:left w:val="single" w:color="C9C9C4" w:sz="4"/>
-              <w:bottom w:val="single" w:color="C9C9C4" w:sz="4"/>
-              <w:right w:val="single" w:color="C9C9C4" w:sz="4"/>
-            </w:tcBorders>
-            <w:tcMar>
-              <w:top w:type="dxa" w:w="60"/>
-              <w:left w:type="dxa" w:w="100"/>
-              <w:bottom w:type="dxa" w:w="60"/>
-              <w:right w:type="dxa" w:w="100"/>
-            </w:tcMar>
-          </w:tcPr>
-          <w:p>
-            <w:r>
-              <w:rPr>
-                <w:color w:val="0A0A0A"/>
-                <w:sz w:val="18"/>
-                <w:szCs w:val="18"/>
-              </w:rPr>
-              <w:t xml:space="preserve">"On top of statutory rights. Route to market: IA Insurtech Sandbox."</w:t>
-            </w:r>
-          </w:p>
-        </w:tc>
-        <w:tc>
-          <w:tcPr>
-            <w:tcW w:type="dxa" w:w="4364"/>
-            <w:tcBorders>
-              <w:top w:val="single" w:color="C9C9C4" w:sz="4"/>
-              <w:left w:val="single" w:color="C9C9C4" w:sz="4"/>
-              <w:bottom w:val="single" w:color="C9C9C4" w:sz="4"/>
-              <w:right w:val="single" w:color="C9C9C4" w:sz="4"/>
-            </w:tcBorders>
-            <w:tcMar>
-              <w:top w:type="dxa" w:w="60"/>
-              <w:left w:type="dxa" w:w="100"/>
-              <w:bottom w:type="dxa" w:w="60"/>
-              <w:right w:type="dxa" w:w="100"/>
-            </w:tcMar>
-          </w:tcPr>
-          <w:p>
-            <w:r>
-              <w:rPr>
-                <w:color w:val="0A0A0A"/>
-                <w:sz w:val="18"/>
-                <w:szCs w:val="18"/>
-              </w:rPr>
-              <w:t xml:space="preserve">Feedback: Hong Kong regulatory framework</w:t>
-            </w:r>
-          </w:p>
-        </w:tc>
-      </w:tr>
-      <w:tr>
-        <w:trPr>
-          <w:cantSplit/>
-          <w:tblHeader w:val="off"/>
-        </w:trPr>
-        <w:tc>
-          <w:tcPr>
-            <w:tcW w:type="dxa" w:w="877"/>
-            <w:tcBorders>
-              <w:top w:val="single" w:color="C9C9C4" w:sz="4"/>
-              <w:left w:val="single" w:color="C9C9C4" w:sz="4"/>
-              <w:bottom w:val="single" w:color="C9C9C4" w:sz="4"/>
-              <w:right w:val="single" w:color="C9C9C4" w:sz="4"/>
-            </w:tcBorders>
-            <w:tcMar>
-              <w:top w:type="dxa" w:w="60"/>
-              <w:left w:type="dxa" w:w="100"/>
-              <w:bottom w:type="dxa" w:w="60"/>
-              <w:right w:type="dxa" w:w="100"/>
-            </w:tcMar>
-          </w:tcPr>
-          <w:p>
-            <w:r>
-              <w:rPr>
-                <w:color w:val="0A0A0A"/>
-                <w:sz w:val="18"/>
-                <w:szCs w:val="18"/>
-              </w:rPr>
-              <w:t xml:space="preserve">16</w:t>
-            </w:r>
-          </w:p>
-        </w:tc>
-        <w:tc>
-          <w:tcPr>
-            <w:tcW w:type="dxa" w:w="877"/>
-            <w:tcBorders>
-              <w:top w:val="single" w:color="C9C9C4" w:sz="4"/>
-              <w:left w:val="single" w:color="C9C9C4" w:sz="4"/>
-              <w:bottom w:val="single" w:color="C9C9C4" w:sz="4"/>
-              <w:right w:val="single" w:color="C9C9C4" w:sz="4"/>
-            </w:tcBorders>
-            <w:tcMar>
-              <w:top w:type="dxa" w:w="60"/>
-              <w:left w:type="dxa" w:w="100"/>
-              <w:bottom w:type="dxa" w:w="60"/>
-              <w:right w:type="dxa" w:w="100"/>
-            </w:tcMar>
-          </w:tcPr>
-          <w:p>
-            <w:r>
-              <w:rPr>
-                <w:color w:val="0A0A0A"/>
-                <w:sz w:val="18"/>
-                <w:szCs w:val="18"/>
-              </w:rPr>
-              <w:t xml:space="preserve">Maalon</w:t>
-            </w:r>
-          </w:p>
-        </w:tc>
-        <w:tc>
-          <w:tcPr>
-            <w:tcW w:type="dxa" w:w="4360"/>
-            <w:tcBorders>
-              <w:top w:val="single" w:color="C9C9C4" w:sz="4"/>
-              <w:left w:val="single" w:color="C9C9C4" w:sz="4"/>
-              <w:bottom w:val="single" w:color="C9C9C4" w:sz="4"/>
-              <w:right w:val="single" w:color="C9C9C4" w:sz="4"/>
-            </w:tcBorders>
-            <w:tcMar>
-              <w:top w:type="dxa" w:w="60"/>
-              <w:left w:type="dxa" w:w="100"/>
-              <w:bottom w:type="dxa" w:w="60"/>
-              <w:right w:type="dxa" w:w="100"/>
-            </w:tcMar>
-          </w:tcPr>
-          <w:p>
-            <w:r>
-              <w:rPr>
-                <w:color w:val="0A0A0A"/>
-                <w:sz w:val="18"/>
-                <w:szCs w:val="18"/>
-              </w:rPr>
-              <w:t xml:space="preserve">And the same record extends to outdoor workers in the heat, and to the schemes in mainland China and Singapore.</w:t>
-            </w:r>
-          </w:p>
-        </w:tc>
-        <w:tc>
-          <w:tcPr>
-            <w:tcW w:type="dxa" w:w="4360"/>
-            <w:tcBorders>
-              <w:top w:val="single" w:color="C9C9C4" w:sz="4"/>
-              <w:left w:val="single" w:color="C9C9C4" w:sz="4"/>
-              <w:bottom w:val="single" w:color="C9C9C4" w:sz="4"/>
-              <w:right w:val="single" w:color="C9C9C4" w:sz="4"/>
-            </w:tcBorders>
-            <w:tcMar>
-              <w:top w:type="dxa" w:w="60"/>
-              <w:left w:type="dxa" w:w="100"/>
-              <w:bottom w:type="dxa" w:w="60"/>
-              <w:right w:type="dxa" w:w="100"/>
-            </w:tcMar>
-          </w:tcPr>
-          <w:p>
-            <w:r>
-              <w:rPr>
-                <w:color w:val="0A0A0A"/>
-                <w:sz w:val="18"/>
-                <w:szCs w:val="18"/>
-              </w:rPr>
-              <w:t xml:space="preserve">Map card: Hong Kong, Shenzhen, Singapore</w:t>
-            </w:r>
-          </w:p>
-        </w:tc>
-        <w:tc>
-          <w:tcPr>
-            <w:tcW w:type="dxa" w:w="4364"/>
-            <w:tcBorders>
-              <w:top w:val="single" w:color="C9C9C4" w:sz="4"/>
-              <w:left w:val="single" w:color="C9C9C4" w:sz="4"/>
-              <w:bottom w:val="single" w:color="C9C9C4" w:sz="4"/>
-              <w:right w:val="single" w:color="C9C9C4" w:sz="4"/>
-            </w:tcBorders>
-            <w:tcMar>
-              <w:top w:type="dxa" w:w="60"/>
-              <w:left w:type="dxa" w:w="100"/>
-              <w:bottom w:type="dxa" w:w="60"/>
-              <w:right w:type="dxa" w:w="100"/>
-            </w:tcMar>
-          </w:tcPr>
-          <w:p>
-            <w:r>
-              <w:rPr>
-                <w:color w:val="0A0A0A"/>
-                <w:sz w:val="18"/>
-                <w:szCs w:val="18"/>
-              </w:rPr>
-              <w:t xml:space="preserve">Vision and scale</w:t>
+            <w:tcW w:type="dxa" w:w="4606"/>
+            <w:tcBorders>
+              <w:top w:val="single" w:color="C9C9C4" w:sz="4"/>
+              <w:left w:val="single" w:color="C9C9C4" w:sz="4"/>
+              <w:bottom w:val="single" w:color="C9C9C4" w:sz="4"/>
+              <w:right w:val="single" w:color="C9C9C4" w:sz="4"/>
+            </w:tcBorders>
+            <w:tcMar>
+              <w:top w:type="dxa" w:w="60"/>
+              <w:left w:type="dxa" w:w="100"/>
+              <w:bottom w:type="dxa" w:w="60"/>
+              <w:right w:type="dxa" w:w="100"/>
+            </w:tcMar>
+          </w:tcPr>
+          <w:p>
+            <w:r>
+              <w:rPr>
+                <w:color w:val="0A0A0A"/>
+                <w:sz w:val="18"/>
+                <w:szCs w:val="18"/>
+              </w:rPr>
+              <w:t xml:space="preserve">A licensed insurer provides the cover; we provide the trigger, a verified crash nobody cancelled. It adds to statutory compensation, and our route to market is the Insurance Authority's sandbox.</w:t>
+            </w:r>
+          </w:p>
+        </w:tc>
+        <w:tc>
+          <w:tcPr>
+            <w:tcW w:type="dxa" w:w="4606"/>
+            <w:tcBorders>
+              <w:top w:val="single" w:color="C9C9C4" w:sz="4"/>
+              <w:left w:val="single" w:color="C9C9C4" w:sz="4"/>
+              <w:bottom w:val="single" w:color="C9C9C4" w:sz="4"/>
+              <w:right w:val="single" w:color="C9C9C4" w:sz="4"/>
+            </w:tcBorders>
+            <w:tcMar>
+              <w:top w:type="dxa" w:w="60"/>
+              <w:left w:type="dxa" w:w="100"/>
+              <w:bottom w:type="dxa" w:w="60"/>
+              <w:right w:type="dxa" w:w="100"/>
+            </w:tcMar>
+          </w:tcPr>
+          <w:p>
+            <w:r>
+              <w:rPr>
+                <w:color w:val="0A0A0A"/>
+                <w:sz w:val="18"/>
+                <w:szCs w:val="18"/>
+              </w:rPr>
+              <w:t xml:space="preserve">Diagram: rider, Metrics trigger, licensed insurer, platform. "On top of statutory rights. Route: IA Insurtech Sandbox."</w:t>
+            </w:r>
+          </w:p>
+        </w:tc>
+        <w:tc>
+          <w:tcPr>
+            <w:tcW w:type="dxa" w:w="3840"/>
+            <w:tcBorders>
+              <w:top w:val="single" w:color="C9C9C4" w:sz="4"/>
+              <w:left w:val="single" w:color="C9C9C4" w:sz="4"/>
+              <w:bottom w:val="single" w:color="C9C9C4" w:sz="4"/>
+              <w:right w:val="single" w:color="C9C9C4" w:sz="4"/>
+            </w:tcBorders>
+            <w:tcMar>
+              <w:top w:type="dxa" w:w="60"/>
+              <w:left w:type="dxa" w:w="100"/>
+              <w:bottom w:type="dxa" w:w="60"/>
+              <w:right w:type="dxa" w:w="100"/>
+            </w:tcMar>
+          </w:tcPr>
+          <w:p>
+            <w:r>
+              <w:rPr>
+                <w:color w:val="0A0A0A"/>
+                <w:sz w:val="18"/>
+                <w:szCs w:val="18"/>
+              </w:rPr>
+              <w:t xml:space="preserve">Insurance mechanism and Hong Kong regulation</w:t>
             </w:r>
           </w:p>
         </w:tc>
@@ -8123,7 +7700,7 @@
         <w:spacing w:after="120"/>
       </w:pPr>
       <w:r>
-        <w:t xml:space="preserve">About 190 words, 74 seconds. Lines 14 and 15 run about 10 seconds each; that is fine here.</w:t>
+        <w:t xml:space="preserve">About 105 words, 40 seconds. Line 13 runs about 11 seconds; that is fine here.</w:t>
       </w:r>
     </w:p>
     <w:p>
@@ -8131,7 +7708,7 @@
         <w:pStyle w:val="Heading1"/>
       </w:pPr>
       <w:r>
-        <w:t xml:space="preserve">Part 7. End card (4:19 to 4:27)</w:t>
+        <w:t xml:space="preserve">Part 7. End card (3:45 to 3:53)</w:t>
       </w:r>
     </w:p>
     <w:p>
@@ -8755,7 +8332,7 @@
                 <w:sz w:val="18"/>
                 <w:szCs w:val="18"/>
               </w:rPr>
-              <w:t xml:space="preserve">Lines 10 and 11</w:t>
+              <w:t xml:space="preserve">Line 10; limits section in the README and Q&amp;A notes</w:t>
             </w:r>
           </w:p>
         </w:tc>
@@ -8875,7 +8452,7 @@
                 <w:sz w:val="18"/>
                 <w:szCs w:val="18"/>
               </w:rPr>
-              <w:t xml:space="preserve">Part 4 live app; line 12 (drop tests before the final, live demo)</w:t>
+              <w:t xml:space="preserve">Part 4 live app; line 11 (drop tests before the final, live demo)</w:t>
             </w:r>
           </w:p>
         </w:tc>
@@ -8935,7 +8512,7 @@
                 <w:sz w:val="18"/>
                 <w:szCs w:val="18"/>
               </w:rPr>
-              <w:t xml:space="preserve">Part 3; lines 14 and 15 (trigger, licensed insurer, on top of statutory rights, sandbox pilot)</w:t>
+              <w:t xml:space="preserve">Part 3; line 13 (trigger, licensed insurer, on top of statutory rights, sandbox)</w:t>
             </w:r>
           </w:p>
         </w:tc>
@@ -8995,7 +8572,7 @@
                 <w:sz w:val="18"/>
                 <w:szCs w:val="18"/>
               </w:rPr>
-              <w:t xml:space="preserve">Part 4 consent screen and labour view; line 13</w:t>
+              <w:t xml:space="preserve">Part 4 consent screen and labour view; line 12</w:t>
             </w:r>
           </w:p>
         </w:tc>
@@ -9055,7 +8632,7 @@
                 <w:sz w:val="18"/>
                 <w:szCs w:val="18"/>
               </w:rPr>
-              <w:t xml:space="preserve">Part 4 (held-out people, 95% CIs, real riding hours); line 11</w:t>
+              <w:t xml:space="preserve">Part 4 (held-out people, 95% CIs, real riding hours); line 10</w:t>
             </w:r>
           </w:p>
         </w:tc>
@@ -9115,7 +8692,7 @@
                 <w:sz w:val="18"/>
                 <w:szCs w:val="18"/>
               </w:rPr>
-              <w:t xml:space="preserve">Part 3 (Labour and Welfare Bureau regime); lines 14 and 15 (licensed insurer, statutory rights kept, Insurance Authority sandbox)</w:t>
+              <w:t xml:space="preserve">Part 3 (Labour and Welfare Bureau regime); line 13 (licensed insurer, statutory rights kept, Insurance Authority sandbox)</w:t>
             </w:r>
           </w:p>
         </w:tc>
@@ -9295,7 +8872,7 @@
                 <w:sz w:val="18"/>
                 <w:szCs w:val="18"/>
               </w:rPr>
-              <w:t xml:space="preserve">Line 11 (accuracy), line 13 (rider trust), lines 14 and 15 (insurer and regulator)</w:t>
+              <w:t xml:space="preserve">Line 10 (accuracy), line 12 (rider trust), line 13 (insurer and regulator)</w:t>
             </w:r>
           </w:p>
         </w:tc>
@@ -9355,7 +8932,7 @@
                 <w:sz w:val="18"/>
                 <w:szCs w:val="18"/>
               </w:rPr>
-              <w:t xml:space="preserve">Line 13 and Part 4 labour view: no route history, no risk score, no platform surveillance</w:t>
+              <w:t xml:space="preserve">Line 12 and Part 4 labour view: no route history, no risk score, no platform surveillance</w:t>
             </w:r>
           </w:p>
         </w:tc>
@@ -9535,7 +9112,7 @@
                 <w:sz w:val="18"/>
                 <w:szCs w:val="18"/>
               </w:rPr>
-              <w:t xml:space="preserve">Line 16</w:t>
+              <w:t xml:space="preserve">Part 3: the mainland and Singapore schemes</w:t>
             </w:r>
           </w:p>
         </w:tc>
@@ -9575,9 +9152,9 @@
         </w:tblBorders>
       </w:tblPr>
       <w:tblGrid>
-        <w:gridCol w:w="1506"/>
-        <w:gridCol w:w="5912"/>
-        <w:gridCol w:w="7420"/>
+        <w:gridCol w:w="1555"/>
+        <w:gridCol w:w="6102"/>
+        <w:gridCol w:w="7181"/>
       </w:tblGrid>
       <w:tr>
         <w:trPr>
@@ -9586,7 +9163,7 @@
         </w:trPr>
         <w:tc>
           <w:tcPr>
-            <w:tcW w:type="dxa" w:w="1506"/>
+            <w:tcW w:type="dxa" w:w="1555"/>
             <w:tcBorders>
               <w:top w:val="single" w:color="C9C9C4" w:sz="4"/>
               <w:left w:val="single" w:color="C9C9C4" w:sz="4"/>
@@ -9616,7 +9193,7 @@
         </w:tc>
         <w:tc>
           <w:tcPr>
-            <w:tcW w:type="dxa" w:w="5912"/>
+            <w:tcW w:type="dxa" w:w="6102"/>
             <w:tcBorders>
               <w:top w:val="single" w:color="C9C9C4" w:sz="4"/>
               <w:left w:val="single" w:color="C9C9C4" w:sz="4"/>
@@ -9646,7 +9223,7 @@
         </w:tc>
         <w:tc>
           <w:tcPr>
-            <w:tcW w:type="dxa" w:w="7420"/>
+            <w:tcW w:type="dxa" w:w="7181"/>
             <w:tcBorders>
               <w:top w:val="single" w:color="C9C9C4" w:sz="4"/>
               <w:left w:val="single" w:color="C9C9C4" w:sz="4"/>
@@ -9682,7 +9259,7 @@
         </w:trPr>
         <w:tc>
           <w:tcPr>
-            <w:tcW w:type="dxa" w:w="1506"/>
+            <w:tcW w:type="dxa" w:w="1555"/>
             <w:tcBorders>
               <w:top w:val="single" w:color="C9C9C4" w:sz="4"/>
               <w:left w:val="single" w:color="C9C9C4" w:sz="4"/>
@@ -9709,7 +9286,7 @@
         </w:tc>
         <w:tc>
           <w:tcPr>
-            <w:tcW w:type="dxa" w:w="5912"/>
+            <w:tcW w:type="dxa" w:w="6102"/>
             <w:tcBorders>
               <w:top w:val="single" w:color="C9C9C4" w:sz="4"/>
               <w:left w:val="single" w:color="C9C9C4" w:sz="4"/>
@@ -9736,28 +9313,28 @@
         </w:tc>
         <w:tc>
           <w:tcPr>
-            <w:tcW w:type="dxa" w:w="7420"/>
-            <w:tcBorders>
-              <w:top w:val="single" w:color="C9C9C4" w:sz="4"/>
-              <w:left w:val="single" w:color="C9C9C4" w:sz="4"/>
-              <w:bottom w:val="single" w:color="C9C9C4" w:sz="4"/>
-              <w:right w:val="single" w:color="C9C9C4" w:sz="4"/>
-            </w:tcBorders>
-            <w:tcMar>
-              <w:top w:type="dxa" w:w="60"/>
-              <w:left w:type="dxa" w:w="100"/>
-              <w:bottom w:type="dxa" w:w="60"/>
-              <w:right w:type="dxa" w:w="100"/>
-            </w:tcMar>
-          </w:tcPr>
-          <w:p>
-            <w:r>
-              <w:rPr>
-                <w:color w:val="0A0A0A"/>
-                <w:sz w:val="18"/>
-                <w:szCs w:val="18"/>
-              </w:rPr>
-              <w:t xml:space="preserve">2, 8, Part 3, Part 5 (twice), 14, 15</w:t>
+            <w:tcW w:type="dxa" w:w="7181"/>
+            <w:tcBorders>
+              <w:top w:val="single" w:color="C9C9C4" w:sz="4"/>
+              <w:left w:val="single" w:color="C9C9C4" w:sz="4"/>
+              <w:bottom w:val="single" w:color="C9C9C4" w:sz="4"/>
+              <w:right w:val="single" w:color="C9C9C4" w:sz="4"/>
+            </w:tcBorders>
+            <w:tcMar>
+              <w:top w:type="dxa" w:w="60"/>
+              <w:left w:type="dxa" w:w="100"/>
+              <w:bottom w:type="dxa" w:w="60"/>
+              <w:right w:type="dxa" w:w="100"/>
+            </w:tcMar>
+          </w:tcPr>
+          <w:p>
+            <w:r>
+              <w:rPr>
+                <w:color w:val="0A0A0A"/>
+                <w:sz w:val="18"/>
+                <w:szCs w:val="18"/>
+              </w:rPr>
+              <w:t xml:space="preserve">2, 8, Part 3, Part 5 (twice), 13</w:t>
             </w:r>
           </w:p>
         </w:tc>
@@ -9769,7 +9346,7 @@
         </w:trPr>
         <w:tc>
           <w:tcPr>
-            <w:tcW w:type="dxa" w:w="1506"/>
+            <w:tcW w:type="dxa" w:w="1555"/>
             <w:tcBorders>
               <w:top w:val="single" w:color="C9C9C4" w:sz="4"/>
               <w:left w:val="single" w:color="C9C9C4" w:sz="4"/>
@@ -9796,7 +9373,7 @@
         </w:tc>
         <w:tc>
           <w:tcPr>
-            <w:tcW w:type="dxa" w:w="5912"/>
+            <w:tcW w:type="dxa" w:w="6102"/>
             <w:tcBorders>
               <w:top w:val="single" w:color="C9C9C4" w:sz="4"/>
               <w:left w:val="single" w:color="C9C9C4" w:sz="4"/>
@@ -9823,28 +9400,28 @@
         </w:tc>
         <w:tc>
           <w:tcPr>
-            <w:tcW w:type="dxa" w:w="7420"/>
-            <w:tcBorders>
-              <w:top w:val="single" w:color="C9C9C4" w:sz="4"/>
-              <w:left w:val="single" w:color="C9C9C4" w:sz="4"/>
-              <w:bottom w:val="single" w:color="C9C9C4" w:sz="4"/>
-              <w:right w:val="single" w:color="C9C9C4" w:sz="4"/>
-            </w:tcBorders>
-            <w:tcMar>
-              <w:top w:type="dxa" w:w="60"/>
-              <w:left w:type="dxa" w:w="100"/>
-              <w:bottom w:type="dxa" w:w="60"/>
-              <w:right w:type="dxa" w:w="100"/>
-            </w:tcMar>
-          </w:tcPr>
-          <w:p>
-            <w:r>
-              <w:rPr>
-                <w:color w:val="0A0A0A"/>
-                <w:sz w:val="18"/>
-                <w:szCs w:val="18"/>
-              </w:rPr>
-              <w:t xml:space="preserve">1, 3, 7, Part 5, 13, 16</w:t>
+            <w:tcW w:type="dxa" w:w="7181"/>
+            <w:tcBorders>
+              <w:top w:val="single" w:color="C9C9C4" w:sz="4"/>
+              <w:left w:val="single" w:color="C9C9C4" w:sz="4"/>
+              <w:bottom w:val="single" w:color="C9C9C4" w:sz="4"/>
+              <w:right w:val="single" w:color="C9C9C4" w:sz="4"/>
+            </w:tcBorders>
+            <w:tcMar>
+              <w:top w:type="dxa" w:w="60"/>
+              <w:left w:type="dxa" w:w="100"/>
+              <w:bottom w:type="dxa" w:w="60"/>
+              <w:right w:type="dxa" w:w="100"/>
+            </w:tcMar>
+          </w:tcPr>
+          <w:p>
+            <w:r>
+              <w:rPr>
+                <w:color w:val="0A0A0A"/>
+                <w:sz w:val="18"/>
+                <w:szCs w:val="18"/>
+              </w:rPr>
+              <w:t xml:space="preserve">1, 3, 7, Part 5, 12</w:t>
             </w:r>
           </w:p>
         </w:tc>
@@ -9856,7 +9433,7 @@
         </w:trPr>
         <w:tc>
           <w:tcPr>
-            <w:tcW w:type="dxa" w:w="1506"/>
+            <w:tcW w:type="dxa" w:w="1555"/>
             <w:tcBorders>
               <w:top w:val="single" w:color="C9C9C4" w:sz="4"/>
               <w:left w:val="single" w:color="C9C9C4" w:sz="4"/>
@@ -9883,7 +9460,7 @@
         </w:tc>
         <w:tc>
           <w:tcPr>
-            <w:tcW w:type="dxa" w:w="5912"/>
+            <w:tcW w:type="dxa" w:w="6102"/>
             <w:tcBorders>
               <w:top w:val="single" w:color="C9C9C4" w:sz="4"/>
               <w:left w:val="single" w:color="C9C9C4" w:sz="4"/>
@@ -9910,28 +9487,28 @@
         </w:tc>
         <w:tc>
           <w:tcPr>
-            <w:tcW w:type="dxa" w:w="7420"/>
-            <w:tcBorders>
-              <w:top w:val="single" w:color="C9C9C4" w:sz="4"/>
-              <w:left w:val="single" w:color="C9C9C4" w:sz="4"/>
-              <w:bottom w:val="single" w:color="C9C9C4" w:sz="4"/>
-              <w:right w:val="single" w:color="C9C9C4" w:sz="4"/>
-            </w:tcBorders>
-            <w:tcMar>
-              <w:top w:type="dxa" w:w="60"/>
-              <w:left w:type="dxa" w:w="100"/>
-              <w:bottom w:type="dxa" w:w="60"/>
-              <w:right w:type="dxa" w:w="100"/>
-            </w:tcMar>
-          </w:tcPr>
-          <w:p>
-            <w:r>
-              <w:rPr>
-                <w:color w:val="0A0A0A"/>
-                <w:sz w:val="18"/>
-                <w:szCs w:val="18"/>
-              </w:rPr>
-              <w:t xml:space="preserve">5, 9, 12</w:t>
+            <w:tcW w:type="dxa" w:w="7181"/>
+            <w:tcBorders>
+              <w:top w:val="single" w:color="C9C9C4" w:sz="4"/>
+              <w:left w:val="single" w:color="C9C9C4" w:sz="4"/>
+              <w:bottom w:val="single" w:color="C9C9C4" w:sz="4"/>
+              <w:right w:val="single" w:color="C9C9C4" w:sz="4"/>
+            </w:tcBorders>
+            <w:tcMar>
+              <w:top w:type="dxa" w:w="60"/>
+              <w:left w:type="dxa" w:w="100"/>
+              <w:bottom w:type="dxa" w:w="60"/>
+              <w:right w:type="dxa" w:w="100"/>
+            </w:tcMar>
+          </w:tcPr>
+          <w:p>
+            <w:r>
+              <w:rPr>
+                <w:color w:val="0A0A0A"/>
+                <w:sz w:val="18"/>
+                <w:szCs w:val="18"/>
+              </w:rPr>
+              <w:t xml:space="preserve">5, 9, 11</w:t>
             </w:r>
           </w:p>
         </w:tc>
@@ -9943,7 +9520,7 @@
         </w:trPr>
         <w:tc>
           <w:tcPr>
-            <w:tcW w:type="dxa" w:w="1506"/>
+            <w:tcW w:type="dxa" w:w="1555"/>
             <w:tcBorders>
               <w:top w:val="single" w:color="C9C9C4" w:sz="4"/>
               <w:left w:val="single" w:color="C9C9C4" w:sz="4"/>
@@ -9970,7 +9547,7 @@
         </w:tc>
         <w:tc>
           <w:tcPr>
-            <w:tcW w:type="dxa" w:w="5912"/>
+            <w:tcW w:type="dxa" w:w="6102"/>
             <w:tcBorders>
               <w:top w:val="single" w:color="C9C9C4" w:sz="4"/>
               <w:left w:val="single" w:color="C9C9C4" w:sz="4"/>
@@ -9997,28 +9574,28 @@
         </w:tc>
         <w:tc>
           <w:tcPr>
-            <w:tcW w:type="dxa" w:w="7420"/>
-            <w:tcBorders>
-              <w:top w:val="single" w:color="C9C9C4" w:sz="4"/>
-              <w:left w:val="single" w:color="C9C9C4" w:sz="4"/>
-              <w:bottom w:val="single" w:color="C9C9C4" w:sz="4"/>
-              <w:right w:val="single" w:color="C9C9C4" w:sz="4"/>
-            </w:tcBorders>
-            <w:tcMar>
-              <w:top w:type="dxa" w:w="60"/>
-              <w:left w:type="dxa" w:w="100"/>
-              <w:bottom w:type="dxa" w:w="60"/>
-              <w:right w:type="dxa" w:w="100"/>
-            </w:tcMar>
-          </w:tcPr>
-          <w:p>
-            <w:r>
-              <w:rPr>
-                <w:color w:val="0A0A0A"/>
-                <w:sz w:val="18"/>
-                <w:szCs w:val="18"/>
-              </w:rPr>
-              <w:t xml:space="preserve">6, Part 4 (all of it, on camera in the corner), Part 5, 10</w:t>
+            <w:tcW w:type="dxa" w:w="7181"/>
+            <w:tcBorders>
+              <w:top w:val="single" w:color="C9C9C4" w:sz="4"/>
+              <w:left w:val="single" w:color="C9C9C4" w:sz="4"/>
+              <w:bottom w:val="single" w:color="C9C9C4" w:sz="4"/>
+              <w:right w:val="single" w:color="C9C9C4" w:sz="4"/>
+            </w:tcBorders>
+            <w:tcMar>
+              <w:top w:type="dxa" w:w="60"/>
+              <w:left w:type="dxa" w:w="100"/>
+              <w:bottom w:type="dxa" w:w="60"/>
+              <w:right w:type="dxa" w:w="100"/>
+            </w:tcMar>
+          </w:tcPr>
+          <w:p>
+            <w:r>
+              <w:rPr>
+                <w:color w:val="0A0A0A"/>
+                <w:sz w:val="18"/>
+                <w:szCs w:val="18"/>
+              </w:rPr>
+              <w:t xml:space="preserve">6, Part 4 (all of it, on camera in the corner), Part 5</w:t>
             </w:r>
           </w:p>
         </w:tc>
@@ -10030,7 +9607,7 @@
         </w:trPr>
         <w:tc>
           <w:tcPr>
-            <w:tcW w:type="dxa" w:w="1506"/>
+            <w:tcW w:type="dxa" w:w="1555"/>
             <w:tcBorders>
               <w:top w:val="single" w:color="C9C9C4" w:sz="4"/>
               <w:left w:val="single" w:color="C9C9C4" w:sz="4"/>
@@ -10057,7 +9634,7 @@
         </w:tc>
         <w:tc>
           <w:tcPr>
-            <w:tcW w:type="dxa" w:w="5912"/>
+            <w:tcW w:type="dxa" w:w="6102"/>
             <w:tcBorders>
               <w:top w:val="single" w:color="C9C9C4" w:sz="4"/>
               <w:left w:val="single" w:color="C9C9C4" w:sz="4"/>
@@ -10084,28 +9661,28 @@
         </w:tc>
         <w:tc>
           <w:tcPr>
-            <w:tcW w:type="dxa" w:w="7420"/>
-            <w:tcBorders>
-              <w:top w:val="single" w:color="C9C9C4" w:sz="4"/>
-              <w:left w:val="single" w:color="C9C9C4" w:sz="4"/>
-              <w:bottom w:val="single" w:color="C9C9C4" w:sz="4"/>
-              <w:right w:val="single" w:color="C9C9C4" w:sz="4"/>
-            </w:tcBorders>
-            <w:tcMar>
-              <w:top w:type="dxa" w:w="60"/>
-              <w:left w:type="dxa" w:w="100"/>
-              <w:bottom w:type="dxa" w:w="60"/>
-              <w:right w:type="dxa" w:w="100"/>
-            </w:tcMar>
-          </w:tcPr>
-          <w:p>
-            <w:r>
-              <w:rPr>
-                <w:color w:val="0A0A0A"/>
-                <w:sz w:val="18"/>
-                <w:szCs w:val="18"/>
-              </w:rPr>
-              <w:t xml:space="preserve">4, 11</w:t>
+            <w:tcW w:type="dxa" w:w="7181"/>
+            <w:tcBorders>
+              <w:top w:val="single" w:color="C9C9C4" w:sz="4"/>
+              <w:left w:val="single" w:color="C9C9C4" w:sz="4"/>
+              <w:bottom w:val="single" w:color="C9C9C4" w:sz="4"/>
+              <w:right w:val="single" w:color="C9C9C4" w:sz="4"/>
+            </w:tcBorders>
+            <w:tcMar>
+              <w:top w:type="dxa" w:w="60"/>
+              <w:left w:type="dxa" w:w="100"/>
+              <w:bottom w:type="dxa" w:w="60"/>
+              <w:right w:type="dxa" w:w="100"/>
+            </w:tcMar>
+          </w:tcPr>
+          <w:p>
+            <w:r>
+              <w:rPr>
+                <w:color w:val="0A0A0A"/>
+                <w:sz w:val="18"/>
+                <w:szCs w:val="18"/>
+              </w:rPr>
+              <w:t xml:space="preserve">4, 10</w:t>
             </w:r>
           </w:p>
         </w:tc>
@@ -10806,7 +10383,7 @@
                 <w:sz w:val="18"/>
                 <w:szCs w:val="18"/>
               </w:rPr>
-              <w:t xml:space="preserve">Lines 1 to 16, each shot twice</w:t>
+              <w:t xml:space="preserve">Lines 1 to 13, each shot twice</w:t>
             </w:r>
           </w:p>
         </w:tc>

</xml_diff>

<commit_message>
Video script: Part 6 in three lines
</commit_message>
<xml_diff>
--- a/docs/submission/VIDEO_SCRIPT.docx
+++ b/docs/submission/VIDEO_SCRIPT.docx
@@ -23,7 +23,7 @@
         <w:spacing w:after="120"/>
       </w:pPr>
       <w:r>
-        <w:t xml:space="preserve">Hard limit 4:30. Target 3:53. English. Burned-in subtitles on every spoken line. Every member speaks at least twice.</w:t>
+        <w:t xml:space="preserve">Hard limit 4:30. Target 3:46. English. Burned-in subtitles on every spoken line. Every member speaks at least twice.</w:t>
       </w:r>
     </w:p>
     <w:p>
@@ -803,7 +803,7 @@
                 <w:sz w:val="18"/>
                 <w:szCs w:val="18"/>
               </w:rPr>
-              <w:t xml:space="preserve">3:05 to 3:45</w:t>
+              <w:t xml:space="preserve">3:05 to 3:38</w:t>
             </w:r>
           </w:p>
         </w:tc>
@@ -830,7 +830,7 @@
                 <w:sz w:val="18"/>
                 <w:szCs w:val="18"/>
               </w:rPr>
-              <w:t xml:space="preserve">Four lines: validation, drop tests, data privacy, insurance mechanism</w:t>
+              <w:t xml:space="preserve">Three lines: validation, data privacy, insurance mechanism</w:t>
             </w:r>
           </w:p>
         </w:tc>
@@ -917,7 +917,7 @@
                 <w:sz w:val="18"/>
                 <w:szCs w:val="18"/>
               </w:rPr>
-              <w:t xml:space="preserve">3:45 to 3:53</w:t>
+              <w:t xml:space="preserve">3:38 to 3:46</w:t>
             </w:r>
           </w:p>
         </w:tc>
@@ -1023,7 +1023,7 @@
         </w:numPr>
       </w:pPr>
       <w:r>
-        <w:t xml:space="preserve">No line longer than nine seconds in the relays, except line 13 in Part 6. Cut on every line.</w:t>
+        <w:t xml:space="preserve">No line longer than nine seconds in the relays, except line 12 in Part 6. Cut on every line.</w:t>
       </w:r>
     </w:p>
     <w:p>
@@ -6939,7 +6939,7 @@
         <w:pStyle w:val="Heading1"/>
       </w:pPr>
       <w:r>
-        <w:t xml:space="preserve">Part 6. Answering Imperial's feedback (3:05 to 3:45)</w:t>
+        <w:t xml:space="preserve">Part 6. Answering Imperial's feedback (3:05 to 3:38)</w:t>
       </w:r>
     </w:p>
     <w:p>
@@ -6947,7 +6947,7 @@
         <w:spacing w:after="120"/>
       </w:pPr>
       <w:r>
-        <w:t xml:space="preserve">Four lines, one for each point Imperial raised on our problem statement: validation, the prototype and drop tests, data privacy and consent, and the insurance mechanism. Each person speaks on their own field. A single card behind each line.</w:t>
+        <w:t xml:space="preserve">Three lines, one for each main point Imperial raised on our problem statement: validation, data privacy and consent, and the insurance mechanism. A single card behind each line.</w:t>
       </w:r>
     </w:p>
     <w:tbl>
@@ -7207,7 +7207,7 @@
                 <w:sz w:val="18"/>
                 <w:szCs w:val="18"/>
               </w:rPr>
-              <w:t xml:space="preserve">We tested on over eighteen hundred hours of real riding, and retraining nearly halved our false alarms. Any alarm can be cancelled within thirty seconds.</w:t>
+              <w:t xml:space="preserve">We tested on over eighteen hundred hours of real riding and nearly halved our false alarms. Helmet drop tests follow for the final, next to a live demo.</w:t>
             </w:r>
           </w:p>
         </w:tc>
@@ -7261,7 +7261,7 @@
                 <w:sz w:val="18"/>
                 <w:szCs w:val="18"/>
               </w:rPr>
-              <w:t xml:space="preserve">Validation, accuracy barrier</w:t>
+              <w:t xml:space="preserve">Validation, prototype and drop tests</w:t>
             </w:r>
           </w:p>
         </w:tc>
@@ -7321,7 +7321,7 @@
                 <w:sz w:val="18"/>
                 <w:szCs w:val="18"/>
               </w:rPr>
-              <w:t xml:space="preserve">Hannes</w:t>
+              <w:t xml:space="preserve">Maalon</w:t>
             </w:r>
           </w:p>
         </w:tc>
@@ -7348,7 +7348,7 @@
                 <w:sz w:val="18"/>
                 <w:szCs w:val="18"/>
               </w:rPr>
-              <w:t xml:space="preserve">Following Imperial's feedback, the drop test protocol and data pipeline are ready, and helmet results will be in for the final, next to a live demo.</w:t>
+              <w:t xml:space="preserve">Privacy is built in, not added on. Riders opt in each shift and own a signed copy of every record. No route history, no risk score.</w:t>
             </w:r>
           </w:p>
         </w:tc>
@@ -7375,7 +7375,7 @@
                 <w:sz w:val="18"/>
                 <w:szCs w:val="18"/>
               </w:rPr>
-              <w:t xml:space="preserve">Drop test protocol page; helmet on the bench</w:t>
+              <w:t xml:space="preserve">Consent screen, then the who-sees-what matrix</w:t>
             </w:r>
           </w:p>
         </w:tc>
@@ -7402,7 +7402,7 @@
                 <w:sz w:val="18"/>
                 <w:szCs w:val="18"/>
               </w:rPr>
-              <w:t xml:space="preserve">Prototype and drop test validation</w:t>
+              <w:t xml:space="preserve">Consent, data ownership, not used against workers</w:t>
             </w:r>
           </w:p>
         </w:tc>
@@ -7436,147 +7436,6 @@
                 <w:szCs w:val="18"/>
               </w:rPr>
               <w:t xml:space="preserve">12</w:t>
-            </w:r>
-          </w:p>
-        </w:tc>
-        <w:tc>
-          <w:tcPr>
-            <w:tcW w:type="dxa" w:w="906"/>
-            <w:tcBorders>
-              <w:top w:val="single" w:color="C9C9C4" w:sz="4"/>
-              <w:left w:val="single" w:color="C9C9C4" w:sz="4"/>
-              <w:bottom w:val="single" w:color="C9C9C4" w:sz="4"/>
-              <w:right w:val="single" w:color="C9C9C4" w:sz="4"/>
-            </w:tcBorders>
-            <w:tcMar>
-              <w:top w:type="dxa" w:w="60"/>
-              <w:left w:type="dxa" w:w="100"/>
-              <w:bottom w:type="dxa" w:w="60"/>
-              <w:right w:type="dxa" w:w="100"/>
-            </w:tcMar>
-          </w:tcPr>
-          <w:p>
-            <w:r>
-              <w:rPr>
-                <w:color w:val="0A0A0A"/>
-                <w:sz w:val="18"/>
-                <w:szCs w:val="18"/>
-              </w:rPr>
-              <w:t xml:space="preserve">Maalon</w:t>
-            </w:r>
-          </w:p>
-        </w:tc>
-        <w:tc>
-          <w:tcPr>
-            <w:tcW w:type="dxa" w:w="4606"/>
-            <w:tcBorders>
-              <w:top w:val="single" w:color="C9C9C4" w:sz="4"/>
-              <w:left w:val="single" w:color="C9C9C4" w:sz="4"/>
-              <w:bottom w:val="single" w:color="C9C9C4" w:sz="4"/>
-              <w:right w:val="single" w:color="C9C9C4" w:sz="4"/>
-            </w:tcBorders>
-            <w:tcMar>
-              <w:top w:type="dxa" w:w="60"/>
-              <w:left w:type="dxa" w:w="100"/>
-              <w:bottom w:type="dxa" w:w="60"/>
-              <w:right w:type="dxa" w:w="100"/>
-            </w:tcMar>
-          </w:tcPr>
-          <w:p>
-            <w:r>
-              <w:rPr>
-                <w:color w:val="0A0A0A"/>
-                <w:sz w:val="18"/>
-                <w:szCs w:val="18"/>
-              </w:rPr>
-              <w:t xml:space="preserve">Privacy is built in, not added on. Riders opt in each shift and own a signed copy of every record. No route history, no risk score.</w:t>
-            </w:r>
-          </w:p>
-        </w:tc>
-        <w:tc>
-          <w:tcPr>
-            <w:tcW w:type="dxa" w:w="4606"/>
-            <w:tcBorders>
-              <w:top w:val="single" w:color="C9C9C4" w:sz="4"/>
-              <w:left w:val="single" w:color="C9C9C4" w:sz="4"/>
-              <w:bottom w:val="single" w:color="C9C9C4" w:sz="4"/>
-              <w:right w:val="single" w:color="C9C9C4" w:sz="4"/>
-            </w:tcBorders>
-            <w:tcMar>
-              <w:top w:type="dxa" w:w="60"/>
-              <w:left w:type="dxa" w:w="100"/>
-              <w:bottom w:type="dxa" w:w="60"/>
-              <w:right w:type="dxa" w:w="100"/>
-            </w:tcMar>
-          </w:tcPr>
-          <w:p>
-            <w:r>
-              <w:rPr>
-                <w:color w:val="0A0A0A"/>
-                <w:sz w:val="18"/>
-                <w:szCs w:val="18"/>
-              </w:rPr>
-              <w:t xml:space="preserve">Consent screen, then the who-sees-what matrix</w:t>
-            </w:r>
-          </w:p>
-        </w:tc>
-        <w:tc>
-          <w:tcPr>
-            <w:tcW w:type="dxa" w:w="3840"/>
-            <w:tcBorders>
-              <w:top w:val="single" w:color="C9C9C4" w:sz="4"/>
-              <w:left w:val="single" w:color="C9C9C4" w:sz="4"/>
-              <w:bottom w:val="single" w:color="C9C9C4" w:sz="4"/>
-              <w:right w:val="single" w:color="C9C9C4" w:sz="4"/>
-            </w:tcBorders>
-            <w:tcMar>
-              <w:top w:type="dxa" w:w="60"/>
-              <w:left w:type="dxa" w:w="100"/>
-              <w:bottom w:type="dxa" w:w="60"/>
-              <w:right w:type="dxa" w:w="100"/>
-            </w:tcMar>
-          </w:tcPr>
-          <w:p>
-            <w:r>
-              <w:rPr>
-                <w:color w:val="0A0A0A"/>
-                <w:sz w:val="18"/>
-                <w:szCs w:val="18"/>
-              </w:rPr>
-              <w:t xml:space="preserve">Consent, data ownership, not used against workers</w:t>
-            </w:r>
-          </w:p>
-        </w:tc>
-      </w:tr>
-      <w:tr>
-        <w:trPr>
-          <w:cantSplit/>
-          <w:tblHeader w:val="off"/>
-        </w:trPr>
-        <w:tc>
-          <w:tcPr>
-            <w:tcW w:type="dxa" w:w="880"/>
-            <w:tcBorders>
-              <w:top w:val="single" w:color="C9C9C4" w:sz="4"/>
-              <w:left w:val="single" w:color="C9C9C4" w:sz="4"/>
-              <w:bottom w:val="single" w:color="C9C9C4" w:sz="4"/>
-              <w:right w:val="single" w:color="C9C9C4" w:sz="4"/>
-            </w:tcBorders>
-            <w:tcMar>
-              <w:top w:type="dxa" w:w="60"/>
-              <w:left w:type="dxa" w:w="100"/>
-              <w:bottom w:type="dxa" w:w="60"/>
-              <w:right w:type="dxa" w:w="100"/>
-            </w:tcMar>
-          </w:tcPr>
-          <w:p>
-            <w:r>
-              <w:rPr>
-                <w:color w:val="0A0A0A"/>
-                <w:sz w:val="18"/>
-                <w:szCs w:val="18"/>
-              </w:rPr>
-              <w:t xml:space="preserve">13</w:t>
             </w:r>
           </w:p>
         </w:tc>
@@ -7700,7 +7559,7 @@
         <w:spacing w:after="120"/>
       </w:pPr>
       <w:r>
-        <w:t xml:space="preserve">About 105 words, 40 seconds. Line 13 runs about 11 seconds; that is fine here.</w:t>
+        <w:t xml:space="preserve">About 85 words, 33 seconds. Line 12 runs about 11 seconds; that is fine here.</w:t>
       </w:r>
     </w:p>
     <w:p>
@@ -7708,7 +7567,7 @@
         <w:pStyle w:val="Heading1"/>
       </w:pPr>
       <w:r>
-        <w:t xml:space="preserve">Part 7. End card (3:45 to 3:53)</w:t>
+        <w:t xml:space="preserve">Part 7. End card (3:38 to 3:46)</w:t>
       </w:r>
     </w:p>
     <w:p>
@@ -8452,7 +8311,7 @@
                 <w:sz w:val="18"/>
                 <w:szCs w:val="18"/>
               </w:rPr>
-              <w:t xml:space="preserve">Part 4 live app; line 11 (drop tests before the final, live demo)</w:t>
+              <w:t xml:space="preserve">Part 4 live app; line 10 (drop tests for the final, live demo)</w:t>
             </w:r>
           </w:p>
         </w:tc>
@@ -8512,7 +8371,7 @@
                 <w:sz w:val="18"/>
                 <w:szCs w:val="18"/>
               </w:rPr>
-              <w:t xml:space="preserve">Part 3; line 13 (trigger, licensed insurer, on top of statutory rights, sandbox)</w:t>
+              <w:t xml:space="preserve">Part 3; line 12 (trigger, licensed insurer, on top of statutory rights, sandbox)</w:t>
             </w:r>
           </w:p>
         </w:tc>
@@ -8572,7 +8431,7 @@
                 <w:sz w:val="18"/>
                 <w:szCs w:val="18"/>
               </w:rPr>
-              <w:t xml:space="preserve">Part 4 consent screen and labour view; line 12</w:t>
+              <w:t xml:space="preserve">Part 4 consent screen and labour view; line 11</w:t>
             </w:r>
           </w:p>
         </w:tc>
@@ -8692,7 +8551,7 @@
                 <w:sz w:val="18"/>
                 <w:szCs w:val="18"/>
               </w:rPr>
-              <w:t xml:space="preserve">Part 3 (Labour and Welfare Bureau regime); line 13 (licensed insurer, statutory rights kept, Insurance Authority sandbox)</w:t>
+              <w:t xml:space="preserve">Part 3 (Labour and Welfare Bureau regime); line 12 (licensed insurer, statutory rights kept, Insurance Authority sandbox)</w:t>
             </w:r>
           </w:p>
         </w:tc>
@@ -8872,7 +8731,7 @@
                 <w:sz w:val="18"/>
                 <w:szCs w:val="18"/>
               </w:rPr>
-              <w:t xml:space="preserve">Line 10 (accuracy), line 12 (rider trust), line 13 (insurer and regulator)</w:t>
+              <w:t xml:space="preserve">Line 10 (accuracy), line 11 (rider trust), line 12 (insurer and regulator)</w:t>
             </w:r>
           </w:p>
         </w:tc>
@@ -8932,7 +8791,7 @@
                 <w:sz w:val="18"/>
                 <w:szCs w:val="18"/>
               </w:rPr>
-              <w:t xml:space="preserve">Line 12 and Part 4 labour view: no route history, no risk score, no platform surveillance</w:t>
+              <w:t xml:space="preserve">Line 11 and Part 4 labour view: no route history, no risk score, no platform surveillance</w:t>
             </w:r>
           </w:p>
         </w:tc>
@@ -9334,7 +9193,7 @@
                 <w:sz w:val="18"/>
                 <w:szCs w:val="18"/>
               </w:rPr>
-              <w:t xml:space="preserve">2, 8, Part 3, Part 5 (twice), 13</w:t>
+              <w:t xml:space="preserve">2, 8, Part 3, Part 5 (twice), 12</w:t>
             </w:r>
           </w:p>
         </w:tc>
@@ -9421,7 +9280,7 @@
                 <w:sz w:val="18"/>
                 <w:szCs w:val="18"/>
               </w:rPr>
-              <w:t xml:space="preserve">1, 3, 7, Part 5, 12</w:t>
+              <w:t xml:space="preserve">1, 3, 7, Part 5, 11</w:t>
             </w:r>
           </w:p>
         </w:tc>
@@ -9508,7 +9367,7 @@
                 <w:sz w:val="18"/>
                 <w:szCs w:val="18"/>
               </w:rPr>
-              <w:t xml:space="preserve">5, 9, 11</w:t>
+              <w:t xml:space="preserve">5, 9</w:t>
             </w:r>
           </w:p>
         </w:tc>
@@ -10383,7 +10242,7 @@
                 <w:sz w:val="18"/>
                 <w:szCs w:val="18"/>
               </w:rPr>
-              <w:t xml:space="preserve">Lines 1 to 13, each shot twice</w:t>
+              <w:t xml:space="preserve">Lines 1 to 12, each shot twice</w:t>
             </w:r>
           </w:p>
         </w:tc>

</xml_diff>